<commit_message>
Update intro and challanges of big data
</commit_message>
<xml_diff>
--- a/BDA CA 1 - Large Scale Data.docx
+++ b/BDA CA 1 - Large Scale Data.docx
@@ -716,10 +716,11 @@
           <w:r>
             <w:fldChar w:fldCharType="separate"/>
           </w:r>
-          <w:hyperlink w:anchor="_Toc229928092" w:history="1">
+          <w:hyperlink w:anchor="_Toc229930926" w:history="1">
             <w:r>
               <w:rPr>
                 <w:rStyle w:val="Hyperlink"/>
+                <w:rFonts w:ascii="Arial" w:hAnsi="Arial" w:cs="Arial"/>
                 <w:noProof/>
               </w:rPr>
               <w:t>Introduction</w:t>
@@ -743,7 +744,7 @@
                 <w:noProof/>
                 <w:webHidden/>
               </w:rPr>
-              <w:instrText xml:space="preserve"> PAGEREF _Toc229928092 \h </w:instrText>
+              <w:instrText xml:space="preserve"> PAGEREF _Toc229930926 \h </w:instrText>
             </w:r>
             <w:r>
               <w:rPr>
@@ -786,10 +787,11 @@
               <w:lang w:eastAsia="en-IE"/>
             </w:rPr>
           </w:pPr>
-          <w:hyperlink w:anchor="_Toc229928093" w:history="1">
+          <w:hyperlink w:anchor="_Toc229930927" w:history="1">
             <w:r>
               <w:rPr>
                 <w:rStyle w:val="Hyperlink"/>
+                <w:rFonts w:ascii="Arial" w:hAnsi="Arial" w:cs="Arial"/>
                 <w:noProof/>
               </w:rPr>
               <w:t>3 Vs of Big Data</w:t>
@@ -813,7 +815,7 @@
                 <w:noProof/>
                 <w:webHidden/>
               </w:rPr>
-              <w:instrText xml:space="preserve"> PAGEREF _Toc229928093 \h </w:instrText>
+              <w:instrText xml:space="preserve"> PAGEREF _Toc229930927 \h </w:instrText>
             </w:r>
             <w:r>
               <w:rPr>
@@ -833,7 +835,220 @@
                 <w:noProof/>
                 <w:webHidden/>
               </w:rPr>
-              <w:t>2</w:t>
+              <w:t>3</w:t>
+            </w:r>
+            <w:r>
+              <w:rPr>
+                <w:noProof/>
+                <w:webHidden/>
+              </w:rPr>
+              <w:fldChar w:fldCharType="end"/>
+            </w:r>
+          </w:hyperlink>
+        </w:p>
+        <w:p>
+          <w:pPr>
+            <w:pStyle w:val="TOC2"/>
+            <w:tabs>
+              <w:tab w:val="right" w:leader="dot" w:pos="9016"/>
+            </w:tabs>
+            <w:rPr>
+              <w:rFonts w:eastAsiaTheme="minorEastAsia"/>
+              <w:noProof/>
+              <w:lang w:eastAsia="en-IE"/>
+            </w:rPr>
+          </w:pPr>
+          <w:hyperlink w:anchor="_Toc229930928" w:history="1">
+            <w:r>
+              <w:rPr>
+                <w:rStyle w:val="Hyperlink"/>
+                <w:rFonts w:ascii="Arial" w:hAnsi="Arial" w:cs="Arial"/>
+                <w:noProof/>
+              </w:rPr>
+              <w:t>Volume</w:t>
+            </w:r>
+            <w:r>
+              <w:rPr>
+                <w:noProof/>
+                <w:webHidden/>
+              </w:rPr>
+              <w:tab/>
+            </w:r>
+            <w:r>
+              <w:rPr>
+                <w:noProof/>
+                <w:webHidden/>
+              </w:rPr>
+              <w:fldChar w:fldCharType="begin"/>
+            </w:r>
+            <w:r>
+              <w:rPr>
+                <w:noProof/>
+                <w:webHidden/>
+              </w:rPr>
+              <w:instrText xml:space="preserve"> PAGEREF _Toc229930928 \h </w:instrText>
+            </w:r>
+            <w:r>
+              <w:rPr>
+                <w:noProof/>
+                <w:webHidden/>
+              </w:rPr>
+            </w:r>
+            <w:r>
+              <w:rPr>
+                <w:noProof/>
+                <w:webHidden/>
+              </w:rPr>
+              <w:fldChar w:fldCharType="separate"/>
+            </w:r>
+            <w:r>
+              <w:rPr>
+                <w:noProof/>
+                <w:webHidden/>
+              </w:rPr>
+              <w:t>3</w:t>
+            </w:r>
+            <w:r>
+              <w:rPr>
+                <w:noProof/>
+                <w:webHidden/>
+              </w:rPr>
+              <w:fldChar w:fldCharType="end"/>
+            </w:r>
+          </w:hyperlink>
+        </w:p>
+        <w:p>
+          <w:pPr>
+            <w:pStyle w:val="TOC2"/>
+            <w:tabs>
+              <w:tab w:val="right" w:leader="dot" w:pos="9016"/>
+            </w:tabs>
+            <w:rPr>
+              <w:rFonts w:eastAsiaTheme="minorEastAsia"/>
+              <w:noProof/>
+              <w:lang w:eastAsia="en-IE"/>
+            </w:rPr>
+          </w:pPr>
+          <w:hyperlink w:anchor="_Toc229930929" w:history="1">
+            <w:r>
+              <w:rPr>
+                <w:rStyle w:val="Hyperlink"/>
+                <w:rFonts w:ascii="Arial" w:hAnsi="Arial" w:cs="Arial"/>
+                <w:noProof/>
+              </w:rPr>
+              <w:t>Velocity</w:t>
+            </w:r>
+            <w:r>
+              <w:rPr>
+                <w:noProof/>
+                <w:webHidden/>
+              </w:rPr>
+              <w:tab/>
+            </w:r>
+            <w:r>
+              <w:rPr>
+                <w:noProof/>
+                <w:webHidden/>
+              </w:rPr>
+              <w:fldChar w:fldCharType="begin"/>
+            </w:r>
+            <w:r>
+              <w:rPr>
+                <w:noProof/>
+                <w:webHidden/>
+              </w:rPr>
+              <w:instrText xml:space="preserve"> PAGEREF _Toc229930929 \h </w:instrText>
+            </w:r>
+            <w:r>
+              <w:rPr>
+                <w:noProof/>
+                <w:webHidden/>
+              </w:rPr>
+            </w:r>
+            <w:r>
+              <w:rPr>
+                <w:noProof/>
+                <w:webHidden/>
+              </w:rPr>
+              <w:fldChar w:fldCharType="separate"/>
+            </w:r>
+            <w:r>
+              <w:rPr>
+                <w:noProof/>
+                <w:webHidden/>
+              </w:rPr>
+              <w:t>3</w:t>
+            </w:r>
+            <w:r>
+              <w:rPr>
+                <w:noProof/>
+                <w:webHidden/>
+              </w:rPr>
+              <w:fldChar w:fldCharType="end"/>
+            </w:r>
+          </w:hyperlink>
+        </w:p>
+        <w:p>
+          <w:pPr>
+            <w:pStyle w:val="TOC2"/>
+            <w:tabs>
+              <w:tab w:val="right" w:leader="dot" w:pos="9016"/>
+            </w:tabs>
+            <w:rPr>
+              <w:rFonts w:eastAsiaTheme="minorEastAsia"/>
+              <w:noProof/>
+              <w:lang w:eastAsia="en-IE"/>
+            </w:rPr>
+          </w:pPr>
+          <w:hyperlink w:anchor="_Toc229930930" w:history="1">
+            <w:r>
+              <w:rPr>
+                <w:rStyle w:val="Hyperlink"/>
+                <w:rFonts w:ascii="Arial" w:hAnsi="Arial" w:cs="Arial"/>
+                <w:noProof/>
+              </w:rPr>
+              <w:t>Variety</w:t>
+            </w:r>
+            <w:r>
+              <w:rPr>
+                <w:noProof/>
+                <w:webHidden/>
+              </w:rPr>
+              <w:tab/>
+            </w:r>
+            <w:r>
+              <w:rPr>
+                <w:noProof/>
+                <w:webHidden/>
+              </w:rPr>
+              <w:fldChar w:fldCharType="begin"/>
+            </w:r>
+            <w:r>
+              <w:rPr>
+                <w:noProof/>
+                <w:webHidden/>
+              </w:rPr>
+              <w:instrText xml:space="preserve"> PAGEREF _Toc229930930 \h </w:instrText>
+            </w:r>
+            <w:r>
+              <w:rPr>
+                <w:noProof/>
+                <w:webHidden/>
+              </w:rPr>
+            </w:r>
+            <w:r>
+              <w:rPr>
+                <w:noProof/>
+                <w:webHidden/>
+              </w:rPr>
+              <w:fldChar w:fldCharType="separate"/>
+            </w:r>
+            <w:r>
+              <w:rPr>
+                <w:noProof/>
+                <w:webHidden/>
+              </w:rPr>
+              <w:t>3</w:t>
             </w:r>
             <w:r>
               <w:rPr>
@@ -933,143 +1148,718 @@
     <w:p>
       <w:pPr>
         <w:rPr>
+          <w:rStyle w:val="Heading1Char"/>
+          <w:rFonts w:ascii="Arial" w:hAnsi="Arial" w:cs="Arial"/>
+        </w:rPr>
+      </w:pPr>
+      <w:bookmarkStart w:id="0" w:name="_Toc229930926"/>
+    </w:p>
+    <w:p>
+      <w:pPr>
+        <w:rPr>
+          <w:rStyle w:val="Heading1Char"/>
+          <w:rFonts w:ascii="Arial" w:hAnsi="Arial" w:cs="Arial"/>
+        </w:rPr>
+      </w:pPr>
+    </w:p>
+    <w:p>
+      <w:pPr>
+        <w:rPr>
+          <w:rStyle w:val="Heading1Char"/>
+          <w:rFonts w:ascii="Arial" w:hAnsi="Arial" w:cs="Arial"/>
+        </w:rPr>
+      </w:pPr>
+    </w:p>
+    <w:p>
+      <w:pPr>
+        <w:rPr>
+          <w:rFonts w:ascii="Arial" w:hAnsi="Arial" w:cs="Arial"/>
+          <w:sz w:val="40"/>
+          <w:szCs w:val="40"/>
+        </w:rPr>
+      </w:pPr>
+      <w:r>
+        <w:rPr>
+          <w:rStyle w:val="Heading1Char"/>
+          <w:rFonts w:ascii="Arial" w:hAnsi="Arial" w:cs="Arial"/>
+        </w:rPr>
+        <w:lastRenderedPageBreak/>
+        <w:t>Introduction</w:t>
+      </w:r>
+      <w:bookmarkEnd w:id="0"/>
+      <w:r>
+        <w:rPr>
+          <w:rFonts w:ascii="Arial" w:hAnsi="Arial" w:cs="Arial"/>
+          <w:sz w:val="40"/>
+          <w:szCs w:val="40"/>
+        </w:rPr>
+        <w:t>:</w:t>
+      </w:r>
+    </w:p>
+    <w:p>
+      <w:pPr>
+        <w:rPr>
+          <w:rFonts w:ascii="Arial" w:hAnsi="Arial" w:cs="Arial"/>
+        </w:rPr>
+      </w:pPr>
+      <w:r>
+        <w:rPr>
+          <w:rFonts w:ascii="Arial" w:hAnsi="Arial" w:cs="Arial"/>
+        </w:rPr>
+        <w:t>Big data refers to extremely large and diverse</w:t>
+      </w:r>
+      <w:r>
+        <w:rPr>
+          <w:rFonts w:ascii="Arial" w:hAnsi="Arial" w:cs="Arial"/>
+        </w:rPr>
+        <w:t xml:space="preserve"> raw data which is </w:t>
+      </w:r>
+      <w:r>
+        <w:rPr>
+          <w:rFonts w:ascii="Arial" w:hAnsi="Arial" w:cs="Arial"/>
+        </w:rPr>
+        <w:t>structured, semi-structured, and unstructured data</w:t>
+      </w:r>
+      <w:r>
+        <w:rPr>
+          <w:rFonts w:ascii="Arial" w:hAnsi="Arial" w:cs="Arial"/>
+        </w:rPr>
+        <w:t xml:space="preserve"> collected from verity of sources </w:t>
+      </w:r>
+      <w:r>
+        <w:rPr>
+          <w:rFonts w:ascii="Arial" w:hAnsi="Arial" w:cs="Arial"/>
+        </w:rPr>
+        <w:t>that grow rapidly over time. The continuous expansion of digital technologies has significantly increased both the volume and availability of data, making it difficult for traditional data management systems to efficiently store, process, and analy</w:t>
+      </w:r>
+      <w:r>
+        <w:rPr>
+          <w:rFonts w:ascii="Arial" w:hAnsi="Arial" w:cs="Arial"/>
+        </w:rPr>
+        <w:t>s</w:t>
+      </w:r>
+      <w:r>
+        <w:rPr>
+          <w:rFonts w:ascii="Arial" w:hAnsi="Arial" w:cs="Arial"/>
+        </w:rPr>
+        <w:t>e such datasets.</w:t>
+      </w:r>
+    </w:p>
+    <w:p>
+      <w:pPr>
+        <w:rPr>
+          <w:rFonts w:ascii="Arial" w:hAnsi="Arial" w:cs="Arial"/>
+        </w:rPr>
+      </w:pPr>
+      <w:r>
+        <w:rPr>
+          <w:rFonts w:ascii="Arial" w:hAnsi="Arial" w:cs="Arial"/>
+        </w:rPr>
+        <w:t>Big data technologies enable organizations to process and analy</w:t>
+      </w:r>
+      <w:r>
+        <w:rPr>
+          <w:rFonts w:ascii="Arial" w:hAnsi="Arial" w:cs="Arial"/>
+        </w:rPr>
+        <w:t>s</w:t>
+      </w:r>
+      <w:r>
+        <w:rPr>
+          <w:rFonts w:ascii="Arial" w:hAnsi="Arial" w:cs="Arial"/>
+        </w:rPr>
+        <w:t>e information in near real time, thereby improving decision-making, enhancing operational efficiency, and supporting predictive analysis. As a result, big data has become widely utilized across various industries for applications such as customer segmentation, fraud detection, and artificial intelligence training.</w:t>
+      </w:r>
+    </w:p>
+    <w:p>
+      <w:pPr>
+        <w:rPr>
+          <w:rStyle w:val="Heading1Char"/>
+          <w:rFonts w:ascii="Arial" w:hAnsi="Arial" w:cs="Arial"/>
+        </w:rPr>
+      </w:pPr>
+      <w:bookmarkStart w:id="1" w:name="_Toc229930927"/>
+    </w:p>
+    <w:p>
+      <w:pPr>
+        <w:rPr>
+          <w:rFonts w:ascii="Arial" w:hAnsi="Arial" w:cs="Arial"/>
+          <w:sz w:val="40"/>
+          <w:szCs w:val="40"/>
+        </w:rPr>
+      </w:pPr>
+      <w:r>
+        <w:rPr>
+          <w:rStyle w:val="Heading1Char"/>
+          <w:rFonts w:ascii="Arial" w:hAnsi="Arial" w:cs="Arial"/>
+        </w:rPr>
+        <w:t>3 Vs of Big Data</w:t>
+      </w:r>
+      <w:bookmarkEnd w:id="1"/>
+      <w:r>
+        <w:rPr>
+          <w:rFonts w:ascii="Arial" w:hAnsi="Arial" w:cs="Arial"/>
+          <w:sz w:val="40"/>
+          <w:szCs w:val="40"/>
+        </w:rPr>
+        <w:t>:</w:t>
+      </w:r>
+    </w:p>
+    <w:p>
+      <w:pPr>
+        <w:rPr>
+          <w:rFonts w:ascii="Arial" w:hAnsi="Arial" w:cs="Arial"/>
+        </w:rPr>
+      </w:pPr>
+      <w:r>
+        <w:rPr>
+          <w:rFonts w:ascii="Arial" w:hAnsi="Arial" w:cs="Arial"/>
+        </w:rPr>
+        <w:t>B</w:t>
+      </w:r>
+      <w:r>
+        <w:rPr>
+          <w:rFonts w:ascii="Arial" w:hAnsi="Arial" w:cs="Arial"/>
+        </w:rPr>
+        <w:t>ig data can be explained by the characteristics referred as “3Vs of big data”.</w:t>
+      </w:r>
+    </w:p>
+    <w:p>
+      <w:pPr>
+        <w:rPr>
+          <w:rFonts w:ascii="Arial" w:hAnsi="Arial" w:cs="Arial"/>
+        </w:rPr>
+      </w:pPr>
+      <w:r>
+        <w:rPr>
+          <w:rFonts w:ascii="Arial" w:hAnsi="Arial" w:cs="Arial"/>
+        </w:rPr>
+        <w:t>The 3Vs of the Big Data model help explain the challenges of today’s large digital world. In today’s technology-driven world, almost every action, interaction, and transaction creates data, so understanding this data has become very important.</w:t>
+      </w:r>
+    </w:p>
+    <w:p>
+      <w:pPr>
+        <w:rPr>
+          <w:rStyle w:val="Heading1Char"/>
+          <w:rFonts w:ascii="Arial" w:eastAsiaTheme="minorHAnsi" w:hAnsi="Arial" w:cs="Arial"/>
+          <w:color w:val="auto"/>
+          <w:sz w:val="24"/>
+          <w:szCs w:val="24"/>
+        </w:rPr>
+      </w:pPr>
+      <w:r>
+        <w:rPr>
+          <w:rFonts w:ascii="Arial" w:hAnsi="Arial" w:cs="Arial"/>
+        </w:rPr>
+        <w:t xml:space="preserve">The 3 Vs </w:t>
+      </w:r>
+      <w:r>
+        <w:rPr>
+          <w:rFonts w:ascii="Arial" w:hAnsi="Arial" w:cs="Arial"/>
+        </w:rPr>
+        <w:t>refers to</w:t>
+      </w:r>
+      <w:r>
+        <w:rPr>
+          <w:rFonts w:ascii="Arial" w:hAnsi="Arial" w:cs="Arial"/>
+        </w:rPr>
+        <w:t xml:space="preserve"> Volume, Velocity and Verity</w:t>
+      </w:r>
+      <w:r>
+        <w:rPr>
+          <w:rFonts w:ascii="Arial" w:hAnsi="Arial" w:cs="Arial"/>
+        </w:rPr>
+        <w:t xml:space="preserve"> define the </w:t>
+      </w:r>
+      <w:proofErr w:type="gramStart"/>
+      <w:r>
+        <w:rPr>
+          <w:rFonts w:ascii="Arial" w:hAnsi="Arial" w:cs="Arial"/>
+        </w:rPr>
+        <w:t>large scale</w:t>
+      </w:r>
+      <w:proofErr w:type="gramEnd"/>
+      <w:r>
+        <w:rPr>
+          <w:rFonts w:ascii="Arial" w:hAnsi="Arial" w:cs="Arial"/>
+        </w:rPr>
+        <w:t xml:space="preserve"> data </w:t>
+      </w:r>
+      <w:r>
+        <w:rPr>
+          <w:rFonts w:ascii="Arial" w:hAnsi="Arial" w:cs="Arial"/>
+        </w:rPr>
+        <w:t>challenges</w:t>
+      </w:r>
+      <w:r>
+        <w:rPr>
+          <w:rFonts w:ascii="Arial" w:hAnsi="Arial" w:cs="Arial"/>
+        </w:rPr>
+        <w:t>.</w:t>
+      </w:r>
+      <w:bookmarkStart w:id="2" w:name="_Toc229930928"/>
+    </w:p>
+    <w:p>
+      <w:pPr>
+        <w:pStyle w:val="Heading2"/>
+        <w:rPr>
+          <w:rFonts w:ascii="Arial" w:hAnsi="Arial" w:cs="Arial"/>
+        </w:rPr>
+      </w:pPr>
+      <w:r>
+        <w:rPr>
+          <w:rStyle w:val="Heading1Char"/>
           <w:rFonts w:ascii="Arial" w:hAnsi="Arial" w:cs="Arial"/>
           <w:sz w:val="32"/>
           <w:szCs w:val="32"/>
         </w:rPr>
-      </w:pPr>
-      <w:bookmarkStart w:id="0" w:name="_Toc229928092"/>
+        <w:t>Volume</w:t>
+      </w:r>
+      <w:bookmarkEnd w:id="2"/>
+    </w:p>
+    <w:p>
+      <w:pPr>
+        <w:rPr>
+          <w:rFonts w:ascii="Arial" w:hAnsi="Arial" w:cs="Arial"/>
+        </w:rPr>
+      </w:pPr>
+      <w:r>
+        <w:rPr>
+          <w:rFonts w:ascii="Arial" w:hAnsi="Arial" w:cs="Arial"/>
+        </w:rPr>
+        <w:t xml:space="preserve">Volume refers to the huge amount of data that is continuously generated and collected from various sources and devices. </w:t>
+      </w:r>
+    </w:p>
+    <w:p>
+      <w:pPr>
+        <w:rPr>
+          <w:rFonts w:ascii="Arial" w:hAnsi="Arial" w:cs="Arial"/>
+        </w:rPr>
+      </w:pPr>
+      <w:r>
+        <w:rPr>
+          <w:rFonts w:ascii="Arial" w:hAnsi="Arial" w:cs="Arial"/>
+        </w:rPr>
+        <w:t>Today, organizations handle data in terabytes and petabytes, which is a significant increase compared to the earlier scale of gigabytes. This rapid growth is driven by sources such as IoT devices, online shopping platforms, and mobile applications.</w:t>
+      </w:r>
+    </w:p>
+    <w:p>
+      <w:pPr>
+        <w:pStyle w:val="Heading2"/>
+        <w:rPr>
+          <w:rFonts w:ascii="Arial" w:hAnsi="Arial" w:cs="Arial"/>
+        </w:rPr>
+      </w:pPr>
+      <w:bookmarkStart w:id="3" w:name="_Toc229930929"/>
       <w:r>
         <w:rPr>
           <w:rStyle w:val="Heading1Char"/>
-        </w:rPr>
-        <w:lastRenderedPageBreak/>
-        <w:t>Introduction</w:t>
-      </w:r>
-      <w:bookmarkEnd w:id="0"/>
-      <w:r>
-        <w:rPr>
           <w:rFonts w:ascii="Arial" w:hAnsi="Arial" w:cs="Arial"/>
           <w:sz w:val="32"/>
           <w:szCs w:val="32"/>
         </w:rPr>
-        <w:t>:</w:t>
-      </w:r>
-    </w:p>
-    <w:p>
-      <w:pPr>
-        <w:rPr>
-          <w:rFonts w:ascii="Arial" w:hAnsi="Arial" w:cs="Arial"/>
-        </w:rPr>
-      </w:pPr>
-      <w:r>
-        <w:rPr>
-          <w:rFonts w:ascii="Arial" w:hAnsi="Arial" w:cs="Arial"/>
-        </w:rPr>
-        <w:t>Big data refers to extremely large and diverse collections of structured, semi-structured, and unstructured data that grow rapidly over time. The continuous expansion of digital technologies has significantly increased both the volume and availability of data, making it difficult for traditional data management systems to efficiently store, process, and analy</w:t>
-      </w:r>
-      <w:r>
-        <w:rPr>
-          <w:rFonts w:ascii="Arial" w:hAnsi="Arial" w:cs="Arial"/>
-        </w:rPr>
-        <w:t>s</w:t>
-      </w:r>
-      <w:r>
-        <w:rPr>
-          <w:rFonts w:ascii="Arial" w:hAnsi="Arial" w:cs="Arial"/>
-        </w:rPr>
-        <w:t>e such datasets.</w:t>
-      </w:r>
-    </w:p>
-    <w:p>
-      <w:pPr>
-        <w:rPr>
-          <w:rFonts w:ascii="Arial" w:hAnsi="Arial" w:cs="Arial"/>
-        </w:rPr>
-      </w:pPr>
-      <w:r>
-        <w:rPr>
-          <w:rFonts w:ascii="Arial" w:hAnsi="Arial" w:cs="Arial"/>
-        </w:rPr>
-        <w:t>Big data technologies enable organizations to process and analy</w:t>
-      </w:r>
-      <w:r>
-        <w:rPr>
-          <w:rFonts w:ascii="Arial" w:hAnsi="Arial" w:cs="Arial"/>
-        </w:rPr>
-        <w:t>s</w:t>
-      </w:r>
-      <w:r>
-        <w:rPr>
-          <w:rFonts w:ascii="Arial" w:hAnsi="Arial" w:cs="Arial"/>
-        </w:rPr>
-        <w:t>e information in near real time, thereby improving decision-making, enhancing operational efficiency, and supporting predictive analysis. As a result, big data has become widely utilized across various industries for applications such as customer segmentation, fraud detection, and artificial intelligence training.</w:t>
-      </w:r>
-    </w:p>
-    <w:p>
-      <w:pPr>
-        <w:rPr>
+        <w:t>V</w:t>
+      </w:r>
+      <w:r>
+        <w:rPr>
+          <w:rStyle w:val="Heading1Char"/>
           <w:rFonts w:ascii="Arial" w:hAnsi="Arial" w:cs="Arial"/>
           <w:sz w:val="32"/>
           <w:szCs w:val="32"/>
         </w:rPr>
-      </w:pPr>
-      <w:bookmarkStart w:id="1" w:name="_Toc229928093"/>
+        <w:t>e</w:t>
+      </w:r>
       <w:r>
         <w:rPr>
           <w:rStyle w:val="Heading1Char"/>
-        </w:rPr>
-        <w:t>3 Vs of Big Data</w:t>
-      </w:r>
-      <w:bookmarkEnd w:id="1"/>
-      <w:r>
-        <w:rPr>
           <w:rFonts w:ascii="Arial" w:hAnsi="Arial" w:cs="Arial"/>
           <w:sz w:val="32"/>
           <w:szCs w:val="32"/>
         </w:rPr>
-        <w:t>:</w:t>
-      </w:r>
-    </w:p>
-    <w:p>
-      <w:pPr>
-        <w:rPr>
-          <w:rFonts w:ascii="Arial" w:hAnsi="Arial" w:cs="Arial"/>
-        </w:rPr>
-      </w:pPr>
-      <w:r>
-        <w:rPr>
-          <w:rFonts w:ascii="Arial" w:hAnsi="Arial" w:cs="Arial"/>
-        </w:rPr>
-        <w:t>B</w:t>
-      </w:r>
-    </w:p>
-    <w:p>
-      <w:pPr>
-        <w:rPr>
+        <w:t>l</w:t>
+      </w:r>
+      <w:r>
+        <w:rPr>
+          <w:rStyle w:val="Heading1Char"/>
           <w:rFonts w:ascii="Arial" w:hAnsi="Arial" w:cs="Arial"/>
           <w:sz w:val="32"/>
           <w:szCs w:val="32"/>
         </w:rPr>
-      </w:pPr>
-    </w:p>
-    <w:p>
-      <w:pPr>
-        <w:rPr>
+        <w:t>ocity</w:t>
+      </w:r>
+      <w:bookmarkEnd w:id="3"/>
+    </w:p>
+    <w:p>
+      <w:pPr>
+        <w:rPr>
+          <w:rFonts w:ascii="Arial" w:hAnsi="Arial" w:cs="Arial"/>
+        </w:rPr>
+      </w:pPr>
+      <w:r>
+        <w:rPr>
+          <w:rFonts w:ascii="Arial" w:hAnsi="Arial" w:cs="Arial"/>
+        </w:rPr>
+        <w:t>V</w:t>
+      </w:r>
+      <w:r>
+        <w:rPr>
+          <w:rFonts w:ascii="Arial" w:hAnsi="Arial" w:cs="Arial"/>
+        </w:rPr>
+        <w:t xml:space="preserve">elocity in big data refers to the speed at which data is created, processed, and made available for use. </w:t>
+      </w:r>
+    </w:p>
+    <w:p>
+      <w:pPr>
+        <w:rPr>
+          <w:rFonts w:ascii="Arial" w:hAnsi="Arial" w:cs="Arial"/>
+        </w:rPr>
+      </w:pPr>
+      <w:r>
+        <w:rPr>
+          <w:rFonts w:ascii="Arial" w:hAnsi="Arial" w:cs="Arial"/>
+        </w:rPr>
+        <w:t>In today’s digital age, data is not only increasing in size but also moving at very high speeds due to factors such as the large number of digital transactions, real-time analytics, social media activity, and the use of IoT devices.</w:t>
+      </w:r>
+    </w:p>
+    <w:p>
+      <w:pPr>
+        <w:rPr>
+          <w:rFonts w:ascii="Arial" w:hAnsi="Arial" w:cs="Arial"/>
+        </w:rPr>
+      </w:pPr>
+    </w:p>
+    <w:p>
+      <w:pPr>
+        <w:pStyle w:val="Heading2"/>
+        <w:rPr>
+          <w:rFonts w:ascii="Arial" w:hAnsi="Arial" w:cs="Arial"/>
+        </w:rPr>
+      </w:pPr>
+      <w:bookmarkStart w:id="4" w:name="_Toc229930930"/>
+      <w:r>
+        <w:rPr>
+          <w:rStyle w:val="Heading1Char"/>
           <w:rFonts w:ascii="Arial" w:hAnsi="Arial" w:cs="Arial"/>
           <w:sz w:val="32"/>
           <w:szCs w:val="32"/>
         </w:rPr>
-      </w:pPr>
-    </w:p>
-    <w:p>
-      <w:pPr>
-        <w:rPr>
+        <w:lastRenderedPageBreak/>
+        <w:t>V</w:t>
+      </w:r>
+      <w:r>
+        <w:rPr>
+          <w:rStyle w:val="Heading1Char"/>
           <w:rFonts w:ascii="Arial" w:hAnsi="Arial" w:cs="Arial"/>
           <w:sz w:val="32"/>
           <w:szCs w:val="32"/>
         </w:rPr>
-      </w:pPr>
+        <w:t>a</w:t>
+      </w:r>
+      <w:r>
+        <w:rPr>
+          <w:rStyle w:val="Heading1Char"/>
+          <w:rFonts w:ascii="Arial" w:hAnsi="Arial" w:cs="Arial"/>
+          <w:sz w:val="32"/>
+          <w:szCs w:val="32"/>
+        </w:rPr>
+        <w:t>r</w:t>
+      </w:r>
+      <w:r>
+        <w:rPr>
+          <w:rStyle w:val="Heading1Char"/>
+          <w:rFonts w:ascii="Arial" w:hAnsi="Arial" w:cs="Arial"/>
+          <w:sz w:val="32"/>
+          <w:szCs w:val="32"/>
+        </w:rPr>
+        <w:t>i</w:t>
+      </w:r>
+      <w:r>
+        <w:rPr>
+          <w:rStyle w:val="Heading1Char"/>
+          <w:rFonts w:ascii="Arial" w:hAnsi="Arial" w:cs="Arial"/>
+          <w:sz w:val="32"/>
+          <w:szCs w:val="32"/>
+        </w:rPr>
+        <w:t>e</w:t>
+      </w:r>
+      <w:r>
+        <w:rPr>
+          <w:rStyle w:val="Heading1Char"/>
+          <w:rFonts w:ascii="Arial" w:hAnsi="Arial" w:cs="Arial"/>
+          <w:sz w:val="32"/>
+          <w:szCs w:val="32"/>
+        </w:rPr>
+        <w:t>ty</w:t>
+      </w:r>
+      <w:bookmarkEnd w:id="4"/>
+    </w:p>
+    <w:p>
+      <w:pPr>
+        <w:rPr>
+          <w:rFonts w:ascii="Arial" w:hAnsi="Arial" w:cs="Arial"/>
+        </w:rPr>
+      </w:pPr>
+      <w:r>
+        <w:rPr>
+          <w:rFonts w:ascii="Arial" w:hAnsi="Arial" w:cs="Arial"/>
+        </w:rPr>
+        <w:t xml:space="preserve">Variety refers to the different types of data that organizations handle, including structured data such as spreadsheets and relational databases, </w:t>
+      </w:r>
+      <w:r>
+        <w:rPr>
+          <w:rFonts w:ascii="Arial" w:hAnsi="Arial" w:cs="Arial"/>
+        </w:rPr>
+        <w:t xml:space="preserve">semi structured data like XML files </w:t>
+      </w:r>
+      <w:r>
+        <w:rPr>
+          <w:rFonts w:ascii="Arial" w:hAnsi="Arial" w:cs="Arial"/>
+        </w:rPr>
+        <w:t>as well as unstructured data like text, images, audio, video files, and sensor-generated data. This data is generally categorized into structured, semi-structured, and unstructured forms.</w:t>
+      </w:r>
+    </w:p>
+    <w:p>
+      <w:pPr>
+        <w:rPr>
+          <w:rFonts w:ascii="Arial" w:hAnsi="Arial" w:cs="Arial"/>
+        </w:rPr>
+      </w:pPr>
+    </w:p>
+    <w:p>
+      <w:pPr>
+        <w:rPr>
+          <w:rFonts w:ascii="Arial" w:hAnsi="Arial" w:cs="Arial"/>
+          <w:sz w:val="40"/>
+          <w:szCs w:val="40"/>
+        </w:rPr>
+      </w:pPr>
+      <w:r>
+        <w:rPr>
+          <w:rStyle w:val="Heading1Char"/>
+          <w:rFonts w:ascii="Arial" w:hAnsi="Arial" w:cs="Arial"/>
+        </w:rPr>
+        <w:t>Challenges of Bi</w:t>
+      </w:r>
+      <w:r>
+        <w:rPr>
+          <w:rStyle w:val="Heading1Char"/>
+          <w:rFonts w:ascii="Arial" w:hAnsi="Arial" w:cs="Arial"/>
+        </w:rPr>
+        <w:t>g Data</w:t>
+      </w:r>
+      <w:r>
+        <w:rPr>
+          <w:rFonts w:ascii="Arial" w:hAnsi="Arial" w:cs="Arial"/>
+          <w:sz w:val="40"/>
+          <w:szCs w:val="40"/>
+        </w:rPr>
+        <w:t>:</w:t>
+      </w:r>
+    </w:p>
+    <w:p>
+      <w:pPr>
+        <w:rPr>
+          <w:rFonts w:ascii="Arial" w:hAnsi="Arial" w:cs="Arial"/>
+        </w:rPr>
+      </w:pPr>
+      <w:r>
+        <w:rPr>
+          <w:rFonts w:ascii="Arial" w:hAnsi="Arial" w:cs="Arial"/>
+        </w:rPr>
+        <w:t xml:space="preserve">In organizations such as </w:t>
+      </w:r>
+      <w:proofErr w:type="spellStart"/>
+      <w:r>
+        <w:rPr>
+          <w:rFonts w:ascii="Arial" w:hAnsi="Arial" w:cs="Arial"/>
+        </w:rPr>
+        <w:t>Ire</w:t>
+      </w:r>
+      <w:r>
+        <w:rPr>
+          <w:rFonts w:ascii="Arial" w:hAnsi="Arial" w:cs="Arial"/>
+        </w:rPr>
+        <w:t>flix</w:t>
+      </w:r>
+      <w:proofErr w:type="spellEnd"/>
+      <w:r>
+        <w:rPr>
+          <w:rFonts w:ascii="Arial" w:hAnsi="Arial" w:cs="Arial"/>
+        </w:rPr>
+        <w:t>, which collect and store data from over 50 million users, there are several challenges associated with large-scale data collection. These include data storage requirements,</w:t>
+      </w:r>
+      <w:r>
+        <w:rPr>
+          <w:rFonts w:ascii="Arial" w:hAnsi="Arial" w:cs="Arial"/>
+        </w:rPr>
+        <w:t xml:space="preserve"> data validation,</w:t>
+      </w:r>
+      <w:r>
+        <w:rPr>
+          <w:rFonts w:ascii="Arial" w:hAnsi="Arial" w:cs="Arial"/>
+        </w:rPr>
+        <w:t xml:space="preserve"> the speed of data processing, privacy concerns, the need for specialized skills, and the overall costs involved.</w:t>
+      </w:r>
+    </w:p>
+    <w:p>
+      <w:pPr>
+        <w:pStyle w:val="Heading2"/>
+        <w:rPr>
+          <w:rFonts w:ascii="Arial" w:hAnsi="Arial" w:cs="Arial"/>
+        </w:rPr>
+      </w:pPr>
+      <w:r>
+        <w:rPr>
+          <w:rStyle w:val="Heading1Char"/>
+          <w:rFonts w:ascii="Arial" w:hAnsi="Arial" w:cs="Arial"/>
+          <w:sz w:val="32"/>
+          <w:szCs w:val="32"/>
+        </w:rPr>
+        <w:t xml:space="preserve">Data </w:t>
+      </w:r>
+      <w:r>
+        <w:rPr>
+          <w:rStyle w:val="Heading1Char"/>
+          <w:rFonts w:ascii="Arial" w:hAnsi="Arial" w:cs="Arial"/>
+          <w:sz w:val="32"/>
+          <w:szCs w:val="32"/>
+        </w:rPr>
+        <w:t>Processing</w:t>
+      </w:r>
+      <w:r>
+        <w:rPr>
+          <w:rStyle w:val="Heading1Char"/>
+          <w:rFonts w:ascii="Arial" w:hAnsi="Arial" w:cs="Arial"/>
+          <w:sz w:val="32"/>
+          <w:szCs w:val="32"/>
+        </w:rPr>
+        <w:t xml:space="preserve"> </w:t>
+      </w:r>
+    </w:p>
+    <w:p>
+      <w:pPr>
+        <w:rPr>
+          <w:rFonts w:ascii="Arial" w:hAnsi="Arial" w:cs="Arial"/>
+        </w:rPr>
+      </w:pPr>
+      <w:r>
+        <w:rPr>
+          <w:rFonts w:ascii="Arial" w:hAnsi="Arial" w:cs="Arial"/>
+        </w:rPr>
+        <w:t xml:space="preserve">Processing large datasets can be both time-consuming and </w:t>
+      </w:r>
+      <w:proofErr w:type="gramStart"/>
+      <w:r>
+        <w:rPr>
+          <w:rFonts w:ascii="Arial" w:hAnsi="Arial" w:cs="Arial"/>
+        </w:rPr>
+        <w:t>memory-intensive</w:t>
+      </w:r>
+      <w:proofErr w:type="gramEnd"/>
+      <w:r>
+        <w:rPr>
+          <w:rFonts w:ascii="Arial" w:hAnsi="Arial" w:cs="Arial"/>
+        </w:rPr>
+        <w:t>. By nature, big data is continuously growing and changing at a rapid pace.</w:t>
+      </w:r>
+      <w:r>
+        <w:rPr>
+          <w:rFonts w:ascii="Arial" w:hAnsi="Arial" w:cs="Arial"/>
+        </w:rPr>
+        <w:t xml:space="preserve"> A</w:t>
+      </w:r>
+      <w:r>
+        <w:rPr>
+          <w:rFonts w:ascii="Arial" w:hAnsi="Arial" w:cs="Arial"/>
+        </w:rPr>
+        <w:t xml:space="preserve"> </w:t>
+      </w:r>
+      <w:r>
+        <w:rPr>
+          <w:rFonts w:ascii="Arial" w:hAnsi="Arial" w:cs="Arial"/>
+        </w:rPr>
+        <w:t>sound</w:t>
+      </w:r>
+      <w:r>
+        <w:rPr>
+          <w:rFonts w:ascii="Arial" w:hAnsi="Arial" w:cs="Arial"/>
+        </w:rPr>
+        <w:t xml:space="preserve"> infrastructure </w:t>
+      </w:r>
+      <w:r>
+        <w:rPr>
+          <w:rFonts w:ascii="Arial" w:hAnsi="Arial" w:cs="Arial"/>
+        </w:rPr>
+        <w:t xml:space="preserve">is required to </w:t>
+      </w:r>
+      <w:r>
+        <w:rPr>
+          <w:rFonts w:ascii="Arial" w:hAnsi="Arial" w:cs="Arial"/>
+        </w:rPr>
+        <w:t>effectively support processing, storage, networking, and security requirements, it becomes highly challenging to manage and maintain such data efficiently.</w:t>
+      </w:r>
+    </w:p>
+    <w:p>
+      <w:pPr>
+        <w:pStyle w:val="Heading2"/>
+        <w:rPr>
+          <w:rFonts w:ascii="Arial" w:hAnsi="Arial" w:cs="Arial"/>
+        </w:rPr>
+      </w:pPr>
+      <w:r>
+        <w:rPr>
+          <w:rStyle w:val="Heading1Char"/>
+          <w:rFonts w:ascii="Arial" w:hAnsi="Arial" w:cs="Arial"/>
+          <w:sz w:val="32"/>
+          <w:szCs w:val="32"/>
+        </w:rPr>
+        <w:t xml:space="preserve">Data </w:t>
+      </w:r>
+      <w:r>
+        <w:rPr>
+          <w:rStyle w:val="Heading1Char"/>
+          <w:rFonts w:ascii="Arial" w:hAnsi="Arial" w:cs="Arial"/>
+          <w:sz w:val="32"/>
+          <w:szCs w:val="32"/>
+        </w:rPr>
+        <w:t>Security</w:t>
+      </w:r>
+      <w:r>
+        <w:rPr>
+          <w:rStyle w:val="Heading1Char"/>
+          <w:rFonts w:ascii="Arial" w:hAnsi="Arial" w:cs="Arial"/>
+          <w:sz w:val="32"/>
+          <w:szCs w:val="32"/>
+        </w:rPr>
+        <w:t xml:space="preserve"> </w:t>
+      </w:r>
+    </w:p>
+    <w:p>
+      <w:pPr>
+        <w:rPr>
+          <w:rFonts w:ascii="Arial" w:hAnsi="Arial" w:cs="Arial"/>
+        </w:rPr>
+      </w:pPr>
+      <w:r>
+        <w:rPr>
+          <w:rFonts w:ascii="Arial" w:hAnsi="Arial" w:cs="Arial"/>
+        </w:rPr>
+        <w:t>Big data typically involves large volumes of sensitive information, which makes it highly vulnerable and a potential target for cyberattacks and malicious actors.</w:t>
+      </w:r>
+    </w:p>
+    <w:p>
+      <w:pPr>
+        <w:rPr>
+          <w:rFonts w:ascii="Arial" w:hAnsi="Arial" w:cs="Arial"/>
+          <w:sz w:val="32"/>
+          <w:szCs w:val="32"/>
+        </w:rPr>
+      </w:pPr>
+      <w:r>
+        <w:rPr>
+          <w:rFonts w:ascii="Arial" w:hAnsi="Arial" w:cs="Arial"/>
+        </w:rPr>
+        <w:t>This also creates challenges in consistently ensuring that data processing and storage comply with privacy regulations, including data localization and data residency requirements.</w:t>
+      </w:r>
     </w:p>
     <w:sectPr>
       <w:pgSz w:w="11906" w:h="16838"/>
@@ -1483,7 +2273,7 @@
   <w:style w:type="paragraph" w:default="1" w:styleId="Normal">
     <w:name w:val="Normal"/>
     <w:qFormat/>
-    <w:rsid w:val="00BE4FED"/>
+    <w:rsid w:val="001328EE"/>
   </w:style>
   <w:style w:type="paragraph" w:styleId="Heading1">
     <w:name w:val="heading 1"/>
@@ -1686,7 +2476,6 @@
   <w:style w:type="character" w:default="1" w:styleId="DefaultParagraphFont">
     <w:name w:val="Default Paragraph Font"/>
     <w:uiPriority w:val="1"/>
-    <w:semiHidden/>
     <w:unhideWhenUsed/>
   </w:style>
   <w:style w:type="table" w:default="1" w:styleId="TableNormal">

</xml_diff>

<commit_message>
3Vs of Big data
</commit_message>
<xml_diff>
--- a/BDA CA 1 - Large Scale Data.docx
+++ b/BDA CA 1 - Large Scale Data.docx
@@ -110,8 +110,8 @@
                                   <w:tblLook w:val="04A0" w:firstRow="1" w:lastRow="0" w:firstColumn="1" w:lastColumn="0" w:noHBand="0" w:noVBand="1"/>
                                 </w:tblPr>
                                 <w:tblGrid>
-                                  <w:gridCol w:w="5550"/>
-                                  <w:gridCol w:w="1922"/>
+                                  <w:gridCol w:w="5922"/>
+                                  <w:gridCol w:w="2265"/>
                                 </w:tblGrid>
                                 <w:tr>
                                   <w:trPr>
@@ -131,10 +131,10 @@
                                           <w:noProof/>
                                         </w:rPr>
                                         <w:drawing>
-                                          <wp:inline distT="0" distB="0" distL="0" distR="0" wp14:anchorId="471E9D0C" wp14:editId="7C7BAF32">
-                                            <wp:extent cx="3065006" cy="3831336"/>
-                                            <wp:effectExtent l="0" t="0" r="2540" b="0"/>
-                                            <wp:docPr id="139" name="Picture 137" descr="A picture of a winding road and trees" title="Road"/>
+                                          <wp:inline distT="0" distB="0" distL="0" distR="0" wp14:anchorId="57737985" wp14:editId="25C5C83A">
+                                            <wp:extent cx="3303451" cy="3532016"/>
+                                            <wp:effectExtent l="0" t="0" r="0" b="0"/>
+                                            <wp:docPr id="1621124600" name="Picture 2"/>
                                             <wp:cNvGraphicFramePr>
                                               <a:graphicFrameLocks xmlns:a="http://schemas.openxmlformats.org/drawingml/2006/main" noChangeAspect="1"/>
                                             </wp:cNvGraphicFramePr>
@@ -142,11 +142,11 @@
                                               <a:graphicData uri="http://schemas.openxmlformats.org/drawingml/2006/picture">
                                                 <pic:pic xmlns:pic="http://schemas.openxmlformats.org/drawingml/2006/picture">
                                                   <pic:nvPicPr>
-                                                    <pic:cNvPr id="2" name="tree crop.jpg"/>
+                                                    <pic:cNvPr id="1621124600" name="Picture 1621124600"/>
                                                     <pic:cNvPicPr/>
                                                   </pic:nvPicPr>
                                                   <pic:blipFill>
-                                                    <a:blip r:embed="rId6" cstate="print">
+                                                    <a:blip r:embed="rId6">
                                                       <a:extLst>
                                                         <a:ext uri="{28A0092B-C50C-407E-A947-70E740481C1C}">
                                                           <a14:useLocalDpi xmlns:a14="http://schemas.microsoft.com/office/drawing/2010/main" val="0"/>
@@ -160,7 +160,7 @@
                                                   <pic:spPr>
                                                     <a:xfrm>
                                                       <a:off x="0" y="0"/>
-                                                      <a:ext cx="3065006" cy="3831336"/>
+                                                      <a:ext cx="3311534" cy="3540659"/>
                                                     </a:xfrm>
                                                     <a:prstGeom prst="rect">
                                                       <a:avLst/>
@@ -207,7 +207,7 @@
                                               <w:sz w:val="72"/>
                                               <w:szCs w:val="72"/>
                                             </w:rPr>
-                                            <w:t xml:space="preserve"> BIG DATA AND LAGACY SYSTEMS </w:t>
+                                            <w:t>BIG DATA AND LAGACY SYSTEMS</w:t>
                                           </w:r>
                                         </w:p>
                                       </w:sdtContent>
@@ -271,7 +271,6 @@
                                         <w:alias w:val="Abstract"/>
                                         <w:tag w:val=""/>
                                         <w:id w:val="-2036181933"/>
-                                        <w:showingPlcHdr/>
                                         <w:dataBinding w:prefixMappings="xmlns:ns0='http://schemas.microsoft.com/office/2006/coverPageProps' " w:xpath="/ns0:CoverPageProperties[1]/ns0:Abstract[1]" w:storeItemID="{55AF091B-3C7A-41E3-B477-F2FDAA23CFDA}"/>
                                         <w:text/>
                                       </w:sdtPr>
@@ -286,7 +285,25 @@
                                             <w:rPr>
                                               <w:color w:val="000000" w:themeColor="text1"/>
                                             </w:rPr>
-                                            <w:t>[Draw your reader in with an engaging abstract. It is typically a short summary of the document. When you’re ready to add your content, just click here and start typing.]</w:t>
+                                            <w:t>This report explores the concept of big data and the challenges associated with handling large-scale datasets. It discusses the key characteristics of big data</w:t>
+                                          </w:r>
+                                          <w:r>
+                                            <w:rPr>
+                                              <w:color w:val="000000" w:themeColor="text1"/>
+                                            </w:rPr>
+                                            <w:t>,</w:t>
+                                          </w:r>
+                                          <w:r>
+                                            <w:rPr>
+                                              <w:color w:val="000000" w:themeColor="text1"/>
+                                            </w:rPr>
+                                            <w:t xml:space="preserve"> as well as the importance of efficient data processing, storage, and security. The report also highlights issues related to</w:t>
+                                          </w:r>
+                                          <w:r>
+                                            <w:rPr>
+                                              <w:color w:val="000000" w:themeColor="text1"/>
+                                            </w:rPr>
+                                            <w:t xml:space="preserve"> handling the big data.</w:t>
                                           </w:r>
                                         </w:p>
                                       </w:sdtContent>
@@ -399,8 +416,8 @@
                             <w:tblLook w:val="04A0" w:firstRow="1" w:lastRow="0" w:firstColumn="1" w:lastColumn="0" w:noHBand="0" w:noVBand="1"/>
                           </w:tblPr>
                           <w:tblGrid>
-                            <w:gridCol w:w="5550"/>
-                            <w:gridCol w:w="1922"/>
+                            <w:gridCol w:w="5922"/>
+                            <w:gridCol w:w="2265"/>
                           </w:tblGrid>
                           <w:tr>
                             <w:trPr>
@@ -420,10 +437,10 @@
                                     <w:noProof/>
                                   </w:rPr>
                                   <w:drawing>
-                                    <wp:inline distT="0" distB="0" distL="0" distR="0" wp14:anchorId="471E9D0C" wp14:editId="7C7BAF32">
-                                      <wp:extent cx="3065006" cy="3831336"/>
-                                      <wp:effectExtent l="0" t="0" r="2540" b="0"/>
-                                      <wp:docPr id="139" name="Picture 137" descr="A picture of a winding road and trees" title="Road"/>
+                                    <wp:inline distT="0" distB="0" distL="0" distR="0" wp14:anchorId="57737985" wp14:editId="25C5C83A">
+                                      <wp:extent cx="3303451" cy="3532016"/>
+                                      <wp:effectExtent l="0" t="0" r="0" b="0"/>
+                                      <wp:docPr id="1621124600" name="Picture 2"/>
                                       <wp:cNvGraphicFramePr>
                                         <a:graphicFrameLocks xmlns:a="http://schemas.openxmlformats.org/drawingml/2006/main" noChangeAspect="1"/>
                                       </wp:cNvGraphicFramePr>
@@ -431,11 +448,11 @@
                                         <a:graphicData uri="http://schemas.openxmlformats.org/drawingml/2006/picture">
                                           <pic:pic xmlns:pic="http://schemas.openxmlformats.org/drawingml/2006/picture">
                                             <pic:nvPicPr>
-                                              <pic:cNvPr id="2" name="tree crop.jpg"/>
+                                              <pic:cNvPr id="1621124600" name="Picture 1621124600"/>
                                               <pic:cNvPicPr/>
                                             </pic:nvPicPr>
                                             <pic:blipFill>
-                                              <a:blip r:embed="rId6" cstate="print">
+                                              <a:blip r:embed="rId6">
                                                 <a:extLst>
                                                   <a:ext uri="{28A0092B-C50C-407E-A947-70E740481C1C}">
                                                     <a14:useLocalDpi xmlns:a14="http://schemas.microsoft.com/office/drawing/2010/main" val="0"/>
@@ -449,7 +466,7 @@
                                             <pic:spPr>
                                               <a:xfrm>
                                                 <a:off x="0" y="0"/>
-                                                <a:ext cx="3065006" cy="3831336"/>
+                                                <a:ext cx="3311534" cy="3540659"/>
                                               </a:xfrm>
                                               <a:prstGeom prst="rect">
                                                 <a:avLst/>
@@ -496,7 +513,7 @@
                                         <w:sz w:val="72"/>
                                         <w:szCs w:val="72"/>
                                       </w:rPr>
-                                      <w:t xml:space="preserve"> BIG DATA AND LAGACY SYSTEMS </w:t>
+                                      <w:t>BIG DATA AND LAGACY SYSTEMS</w:t>
                                     </w:r>
                                   </w:p>
                                 </w:sdtContent>
@@ -560,7 +577,6 @@
                                   <w:alias w:val="Abstract"/>
                                   <w:tag w:val=""/>
                                   <w:id w:val="-2036181933"/>
-                                  <w:showingPlcHdr/>
                                   <w:dataBinding w:prefixMappings="xmlns:ns0='http://schemas.microsoft.com/office/2006/coverPageProps' " w:xpath="/ns0:CoverPageProperties[1]/ns0:Abstract[1]" w:storeItemID="{55AF091B-3C7A-41E3-B477-F2FDAA23CFDA}"/>
                                   <w:text/>
                                 </w:sdtPr>
@@ -575,7 +591,25 @@
                                       <w:rPr>
                                         <w:color w:val="000000" w:themeColor="text1"/>
                                       </w:rPr>
-                                      <w:t>[Draw your reader in with an engaging abstract. It is typically a short summary of the document. When you’re ready to add your content, just click here and start typing.]</w:t>
+                                      <w:t>This report explores the concept of big data and the challenges associated with handling large-scale datasets. It discusses the key characteristics of big data</w:t>
+                                    </w:r>
+                                    <w:r>
+                                      <w:rPr>
+                                        <w:color w:val="000000" w:themeColor="text1"/>
+                                      </w:rPr>
+                                      <w:t>,</w:t>
+                                    </w:r>
+                                    <w:r>
+                                      <w:rPr>
+                                        <w:color w:val="000000" w:themeColor="text1"/>
+                                      </w:rPr>
+                                      <w:t xml:space="preserve"> as well as the importance of efficient data processing, storage, and security. The report also highlights issues related to</w:t>
+                                    </w:r>
+                                    <w:r>
+                                      <w:rPr>
+                                        <w:color w:val="000000" w:themeColor="text1"/>
+                                      </w:rPr>
+                                      <w:t xml:space="preserve"> handling the big data.</w:t>
                                     </w:r>
                                   </w:p>
                                 </w:sdtContent>
@@ -661,11 +695,31 @@
             </w:rPr>
             <w:br w:type="page"/>
           </w:r>
+          <w:r>
+            <w:rPr>
+              <w:rFonts w:ascii="Arial" w:eastAsiaTheme="minorEastAsia" w:hAnsi="Arial" w:cs="Arial"/>
+              <w:caps/>
+              <w:color w:val="191919" w:themeColor="text1" w:themeTint="E6"/>
+              <w:sz w:val="36"/>
+              <w:szCs w:val="36"/>
+            </w:rPr>
+            <w:lastRenderedPageBreak/>
+            <w:t>,</w:t>
+          </w:r>
         </w:p>
       </w:sdtContent>
     </w:sdt>
     <w:sdt>
       <w:sdtPr>
+        <w:rPr>
+          <w:rFonts w:asciiTheme="minorHAnsi" w:eastAsiaTheme="minorHAnsi" w:hAnsiTheme="minorHAnsi" w:cstheme="minorBidi"/>
+          <w:color w:val="auto"/>
+          <w:kern w:val="2"/>
+          <w:sz w:val="24"/>
+          <w:szCs w:val="24"/>
+          <w:lang w:val="en-IE"/>
+          <w14:ligatures w14:val="standardContextual"/>
+        </w:rPr>
         <w:id w:val="-15073236"/>
         <w:docPartObj>
           <w:docPartGallery w:val="Table of Contents"/>
@@ -674,16 +728,9 @@
       </w:sdtPr>
       <w:sdtEndPr>
         <w:rPr>
-          <w:rFonts w:asciiTheme="minorHAnsi" w:eastAsiaTheme="minorHAnsi" w:hAnsiTheme="minorHAnsi" w:cstheme="minorBidi"/>
           <w:b/>
           <w:bCs/>
           <w:noProof/>
-          <w:color w:val="auto"/>
-          <w:kern w:val="2"/>
-          <w:sz w:val="24"/>
-          <w:szCs w:val="24"/>
-          <w:lang w:val="en-IE"/>
-          <w14:ligatures w14:val="standardContextual"/>
         </w:rPr>
       </w:sdtEndPr>
       <w:sdtContent>
@@ -716,7 +763,7 @@
           <w:r>
             <w:fldChar w:fldCharType="separate"/>
           </w:r>
-          <w:hyperlink w:anchor="_Toc229930926" w:history="1">
+          <w:hyperlink w:anchor="_Toc230028886" w:history="1">
             <w:r>
               <w:rPr>
                 <w:rStyle w:val="Hyperlink"/>
@@ -744,7 +791,7 @@
                 <w:noProof/>
                 <w:webHidden/>
               </w:rPr>
-              <w:instrText xml:space="preserve"> PAGEREF _Toc229930926 \h </w:instrText>
+              <w:instrText xml:space="preserve"> PAGEREF _Toc230028886 \h </w:instrText>
             </w:r>
             <w:r>
               <w:rPr>
@@ -764,7 +811,7 @@
                 <w:noProof/>
                 <w:webHidden/>
               </w:rPr>
-              <w:t>2</w:t>
+              <w:t>3</w:t>
             </w:r>
             <w:r>
               <w:rPr>
@@ -787,7 +834,7 @@
               <w:lang w:eastAsia="en-IE"/>
             </w:rPr>
           </w:pPr>
-          <w:hyperlink w:anchor="_Toc229930927" w:history="1">
+          <w:hyperlink w:anchor="_Toc230028887" w:history="1">
             <w:r>
               <w:rPr>
                 <w:rStyle w:val="Hyperlink"/>
@@ -815,7 +862,7 @@
                 <w:noProof/>
                 <w:webHidden/>
               </w:rPr>
-              <w:instrText xml:space="preserve"> PAGEREF _Toc229930927 \h </w:instrText>
+              <w:instrText xml:space="preserve"> PAGEREF _Toc230028887 \h </w:instrText>
             </w:r>
             <w:r>
               <w:rPr>
@@ -858,7 +905,7 @@
               <w:lang w:eastAsia="en-IE"/>
             </w:rPr>
           </w:pPr>
-          <w:hyperlink w:anchor="_Toc229930928" w:history="1">
+          <w:hyperlink w:anchor="_Toc230028888" w:history="1">
             <w:r>
               <w:rPr>
                 <w:rStyle w:val="Hyperlink"/>
@@ -886,7 +933,7 @@
                 <w:noProof/>
                 <w:webHidden/>
               </w:rPr>
-              <w:instrText xml:space="preserve"> PAGEREF _Toc229930928 \h </w:instrText>
+              <w:instrText xml:space="preserve"> PAGEREF _Toc230028888 \h </w:instrText>
             </w:r>
             <w:r>
               <w:rPr>
@@ -929,7 +976,7 @@
               <w:lang w:eastAsia="en-IE"/>
             </w:rPr>
           </w:pPr>
-          <w:hyperlink w:anchor="_Toc229930929" w:history="1">
+          <w:hyperlink w:anchor="_Toc230028889" w:history="1">
             <w:r>
               <w:rPr>
                 <w:rStyle w:val="Hyperlink"/>
@@ -957,7 +1004,7 @@
                 <w:noProof/>
                 <w:webHidden/>
               </w:rPr>
-              <w:instrText xml:space="preserve"> PAGEREF _Toc229930929 \h </w:instrText>
+              <w:instrText xml:space="preserve"> PAGEREF _Toc230028889 \h </w:instrText>
             </w:r>
             <w:r>
               <w:rPr>
@@ -1000,7 +1047,7 @@
               <w:lang w:eastAsia="en-IE"/>
             </w:rPr>
           </w:pPr>
-          <w:hyperlink w:anchor="_Toc229930930" w:history="1">
+          <w:hyperlink w:anchor="_Toc230028890" w:history="1">
             <w:r>
               <w:rPr>
                 <w:rStyle w:val="Hyperlink"/>
@@ -1028,7 +1075,7 @@
                 <w:noProof/>
                 <w:webHidden/>
               </w:rPr>
-              <w:instrText xml:space="preserve"> PAGEREF _Toc229930930 \h </w:instrText>
+              <w:instrText xml:space="preserve"> PAGEREF _Toc230028890 \h </w:instrText>
             </w:r>
             <w:r>
               <w:rPr>
@@ -1048,7 +1095,220 @@
                 <w:noProof/>
                 <w:webHidden/>
               </w:rPr>
-              <w:t>3</w:t>
+              <w:t>4</w:t>
+            </w:r>
+            <w:r>
+              <w:rPr>
+                <w:noProof/>
+                <w:webHidden/>
+              </w:rPr>
+              <w:fldChar w:fldCharType="end"/>
+            </w:r>
+          </w:hyperlink>
+        </w:p>
+        <w:p>
+          <w:pPr>
+            <w:pStyle w:val="TOC1"/>
+            <w:tabs>
+              <w:tab w:val="right" w:leader="dot" w:pos="9016"/>
+            </w:tabs>
+            <w:rPr>
+              <w:rFonts w:eastAsiaTheme="minorEastAsia"/>
+              <w:noProof/>
+              <w:lang w:eastAsia="en-IE"/>
+            </w:rPr>
+          </w:pPr>
+          <w:hyperlink w:anchor="_Toc230028891" w:history="1">
+            <w:r>
+              <w:rPr>
+                <w:rStyle w:val="Hyperlink"/>
+                <w:rFonts w:ascii="Arial" w:hAnsi="Arial" w:cs="Arial"/>
+                <w:noProof/>
+              </w:rPr>
+              <w:t>Challenges of Big Data</w:t>
+            </w:r>
+            <w:r>
+              <w:rPr>
+                <w:noProof/>
+                <w:webHidden/>
+              </w:rPr>
+              <w:tab/>
+            </w:r>
+            <w:r>
+              <w:rPr>
+                <w:noProof/>
+                <w:webHidden/>
+              </w:rPr>
+              <w:fldChar w:fldCharType="begin"/>
+            </w:r>
+            <w:r>
+              <w:rPr>
+                <w:noProof/>
+                <w:webHidden/>
+              </w:rPr>
+              <w:instrText xml:space="preserve"> PAGEREF _Toc230028891 \h </w:instrText>
+            </w:r>
+            <w:r>
+              <w:rPr>
+                <w:noProof/>
+                <w:webHidden/>
+              </w:rPr>
+            </w:r>
+            <w:r>
+              <w:rPr>
+                <w:noProof/>
+                <w:webHidden/>
+              </w:rPr>
+              <w:fldChar w:fldCharType="separate"/>
+            </w:r>
+            <w:r>
+              <w:rPr>
+                <w:noProof/>
+                <w:webHidden/>
+              </w:rPr>
+              <w:t>4</w:t>
+            </w:r>
+            <w:r>
+              <w:rPr>
+                <w:noProof/>
+                <w:webHidden/>
+              </w:rPr>
+              <w:fldChar w:fldCharType="end"/>
+            </w:r>
+          </w:hyperlink>
+        </w:p>
+        <w:p>
+          <w:pPr>
+            <w:pStyle w:val="TOC2"/>
+            <w:tabs>
+              <w:tab w:val="right" w:leader="dot" w:pos="9016"/>
+            </w:tabs>
+            <w:rPr>
+              <w:rFonts w:eastAsiaTheme="minorEastAsia"/>
+              <w:noProof/>
+              <w:lang w:eastAsia="en-IE"/>
+            </w:rPr>
+          </w:pPr>
+          <w:hyperlink w:anchor="_Toc230028892" w:history="1">
+            <w:r>
+              <w:rPr>
+                <w:rStyle w:val="Hyperlink"/>
+                <w:rFonts w:ascii="Arial" w:hAnsi="Arial" w:cs="Arial"/>
+                <w:noProof/>
+              </w:rPr>
+              <w:t>Data Processing</w:t>
+            </w:r>
+            <w:r>
+              <w:rPr>
+                <w:noProof/>
+                <w:webHidden/>
+              </w:rPr>
+              <w:tab/>
+            </w:r>
+            <w:r>
+              <w:rPr>
+                <w:noProof/>
+                <w:webHidden/>
+              </w:rPr>
+              <w:fldChar w:fldCharType="begin"/>
+            </w:r>
+            <w:r>
+              <w:rPr>
+                <w:noProof/>
+                <w:webHidden/>
+              </w:rPr>
+              <w:instrText xml:space="preserve"> PAGEREF _Toc230028892 \h </w:instrText>
+            </w:r>
+            <w:r>
+              <w:rPr>
+                <w:noProof/>
+                <w:webHidden/>
+              </w:rPr>
+            </w:r>
+            <w:r>
+              <w:rPr>
+                <w:noProof/>
+                <w:webHidden/>
+              </w:rPr>
+              <w:fldChar w:fldCharType="separate"/>
+            </w:r>
+            <w:r>
+              <w:rPr>
+                <w:noProof/>
+                <w:webHidden/>
+              </w:rPr>
+              <w:t>4</w:t>
+            </w:r>
+            <w:r>
+              <w:rPr>
+                <w:noProof/>
+                <w:webHidden/>
+              </w:rPr>
+              <w:fldChar w:fldCharType="end"/>
+            </w:r>
+          </w:hyperlink>
+        </w:p>
+        <w:p>
+          <w:pPr>
+            <w:pStyle w:val="TOC2"/>
+            <w:tabs>
+              <w:tab w:val="right" w:leader="dot" w:pos="9016"/>
+            </w:tabs>
+            <w:rPr>
+              <w:rFonts w:eastAsiaTheme="minorEastAsia"/>
+              <w:noProof/>
+              <w:lang w:eastAsia="en-IE"/>
+            </w:rPr>
+          </w:pPr>
+          <w:hyperlink w:anchor="_Toc230028893" w:history="1">
+            <w:r>
+              <w:rPr>
+                <w:rStyle w:val="Hyperlink"/>
+                <w:rFonts w:ascii="Arial" w:hAnsi="Arial" w:cs="Arial"/>
+                <w:noProof/>
+              </w:rPr>
+              <w:t>Data Security</w:t>
+            </w:r>
+            <w:r>
+              <w:rPr>
+                <w:noProof/>
+                <w:webHidden/>
+              </w:rPr>
+              <w:tab/>
+            </w:r>
+            <w:r>
+              <w:rPr>
+                <w:noProof/>
+                <w:webHidden/>
+              </w:rPr>
+              <w:fldChar w:fldCharType="begin"/>
+            </w:r>
+            <w:r>
+              <w:rPr>
+                <w:noProof/>
+                <w:webHidden/>
+              </w:rPr>
+              <w:instrText xml:space="preserve"> PAGEREF _Toc230028893 \h </w:instrText>
+            </w:r>
+            <w:r>
+              <w:rPr>
+                <w:noProof/>
+                <w:webHidden/>
+              </w:rPr>
+            </w:r>
+            <w:r>
+              <w:rPr>
+                <w:noProof/>
+                <w:webHidden/>
+              </w:rPr>
+              <w:fldChar w:fldCharType="separate"/>
+            </w:r>
+            <w:r>
+              <w:rPr>
+                <w:noProof/>
+                <w:webHidden/>
+              </w:rPr>
+              <w:t>4</w:t>
             </w:r>
             <w:r>
               <w:rPr>
@@ -1118,57 +1378,12 @@
     </w:p>
     <w:p>
       <w:pPr>
-        <w:pStyle w:val="Heading1"/>
-      </w:pPr>
-    </w:p>
-    <w:p>
-      <w:pPr>
-        <w:pStyle w:val="Heading1"/>
-      </w:pPr>
-    </w:p>
-    <w:p>
-      <w:pPr>
-        <w:pStyle w:val="Heading1"/>
-      </w:pPr>
-    </w:p>
-    <w:p>
-      <w:pPr>
-        <w:rPr>
-          <w:rStyle w:val="Heading2Char"/>
-        </w:rPr>
-      </w:pPr>
-    </w:p>
-    <w:p>
-      <w:pPr>
-        <w:rPr>
-          <w:rStyle w:val="Heading2Char"/>
-        </w:rPr>
-      </w:pPr>
-    </w:p>
-    <w:p>
-      <w:pPr>
         <w:rPr>
           <w:rStyle w:val="Heading1Char"/>
           <w:rFonts w:ascii="Arial" w:hAnsi="Arial" w:cs="Arial"/>
         </w:rPr>
       </w:pPr>
-      <w:bookmarkStart w:id="0" w:name="_Toc229930926"/>
-    </w:p>
-    <w:p>
-      <w:pPr>
-        <w:rPr>
-          <w:rStyle w:val="Heading1Char"/>
-          <w:rFonts w:ascii="Arial" w:hAnsi="Arial" w:cs="Arial"/>
-        </w:rPr>
-      </w:pPr>
-    </w:p>
-    <w:p>
-      <w:pPr>
-        <w:rPr>
-          <w:rStyle w:val="Heading1Char"/>
-          <w:rFonts w:ascii="Arial" w:hAnsi="Arial" w:cs="Arial"/>
-        </w:rPr>
-      </w:pPr>
+      <w:bookmarkStart w:id="0" w:name="_Toc230028886"/>
     </w:p>
     <w:p>
       <w:pPr>
@@ -1277,7 +1492,6 @@
           <w:rFonts w:ascii="Arial" w:hAnsi="Arial" w:cs="Arial"/>
         </w:rPr>
       </w:pPr>
-      <w:bookmarkStart w:id="1" w:name="_Toc229930927"/>
     </w:p>
     <w:p>
       <w:pPr>
@@ -1287,6 +1501,7 @@
           <w:szCs w:val="40"/>
         </w:rPr>
       </w:pPr>
+      <w:bookmarkStart w:id="1" w:name="_Toc230028887"/>
       <w:r>
         <w:rPr>
           <w:rStyle w:val="Heading1Char"/>
@@ -1396,7 +1611,6 @@
         </w:rPr>
         <w:t>.</w:t>
       </w:r>
-      <w:bookmarkStart w:id="2" w:name="_Toc229930928"/>
     </w:p>
     <w:p>
       <w:pPr>
@@ -1405,6 +1619,7 @@
           <w:rFonts w:ascii="Arial" w:hAnsi="Arial" w:cs="Arial"/>
         </w:rPr>
       </w:pPr>
+      <w:bookmarkStart w:id="2" w:name="_Toc230028888"/>
       <w:r>
         <w:rPr>
           <w:rStyle w:val="Heading1Char"/>
@@ -1449,7 +1664,7 @@
           <w:rFonts w:ascii="Arial" w:hAnsi="Arial" w:cs="Arial"/>
         </w:rPr>
       </w:pPr>
-      <w:bookmarkStart w:id="3" w:name="_Toc229930929"/>
+      <w:bookmarkStart w:id="3" w:name="_Toc230028889"/>
       <w:r>
         <w:rPr>
           <w:rStyle w:val="Heading1Char"/>
@@ -1534,7 +1749,7 @@
           <w:rFonts w:ascii="Arial" w:hAnsi="Arial" w:cs="Arial"/>
         </w:rPr>
       </w:pPr>
-      <w:bookmarkStart w:id="4" w:name="_Toc229930930"/>
+      <w:bookmarkStart w:id="4" w:name="_Toc230028890"/>
       <w:r>
         <w:rPr>
           <w:rStyle w:val="Heading1Char"/>
@@ -1561,8 +1776,121 @@
           <w:sz w:val="32"/>
           <w:szCs w:val="32"/>
         </w:rPr>
-        <w:t>r</w:t>
-      </w:r>
+        <w:t>riety</w:t>
+      </w:r>
+      <w:bookmarkEnd w:id="4"/>
+    </w:p>
+    <w:p>
+      <w:pPr>
+        <w:rPr>
+          <w:rFonts w:ascii="Arial" w:hAnsi="Arial" w:cs="Arial"/>
+        </w:rPr>
+      </w:pPr>
+      <w:r>
+        <w:rPr>
+          <w:rFonts w:ascii="Arial" w:hAnsi="Arial" w:cs="Arial"/>
+        </w:rPr>
+        <w:t xml:space="preserve">Variety refers to the different types of data that organizations handle, including structured data such as spreadsheets and relational databases, </w:t>
+      </w:r>
+      <w:r>
+        <w:rPr>
+          <w:rFonts w:ascii="Arial" w:hAnsi="Arial" w:cs="Arial"/>
+        </w:rPr>
+        <w:t xml:space="preserve">semi structured data like XML files </w:t>
+      </w:r>
+      <w:r>
+        <w:rPr>
+          <w:rFonts w:ascii="Arial" w:hAnsi="Arial" w:cs="Arial"/>
+        </w:rPr>
+        <w:t>as well as unstructured data like text, images, audio, video files, and sensor-generated data. This data is generally categorized into structured, semi-structured, and unstructured forms.</w:t>
+      </w:r>
+    </w:p>
+    <w:p>
+      <w:pPr>
+        <w:rPr>
+          <w:rFonts w:ascii="Arial" w:hAnsi="Arial" w:cs="Arial"/>
+        </w:rPr>
+      </w:pPr>
+    </w:p>
+    <w:p>
+      <w:pPr>
+        <w:rPr>
+          <w:rFonts w:ascii="Arial" w:hAnsi="Arial" w:cs="Arial"/>
+          <w:sz w:val="40"/>
+          <w:szCs w:val="40"/>
+        </w:rPr>
+      </w:pPr>
+      <w:bookmarkStart w:id="5" w:name="_Toc230028891"/>
+      <w:r>
+        <w:rPr>
+          <w:rStyle w:val="Heading1Char"/>
+          <w:rFonts w:ascii="Arial" w:hAnsi="Arial" w:cs="Arial"/>
+        </w:rPr>
+        <w:t>Challenges of Big Data</w:t>
+      </w:r>
+      <w:bookmarkEnd w:id="5"/>
+      <w:r>
+        <w:rPr>
+          <w:rFonts w:ascii="Arial" w:hAnsi="Arial" w:cs="Arial"/>
+          <w:sz w:val="40"/>
+          <w:szCs w:val="40"/>
+        </w:rPr>
+        <w:t>:</w:t>
+      </w:r>
+    </w:p>
+    <w:p>
+      <w:pPr>
+        <w:rPr>
+          <w:rFonts w:ascii="Arial" w:hAnsi="Arial" w:cs="Arial"/>
+        </w:rPr>
+      </w:pPr>
+      <w:r>
+        <w:rPr>
+          <w:rFonts w:ascii="Arial" w:hAnsi="Arial" w:cs="Arial"/>
+        </w:rPr>
+        <w:t xml:space="preserve">In organizations such as </w:t>
+      </w:r>
+      <w:proofErr w:type="spellStart"/>
+      <w:r>
+        <w:rPr>
+          <w:rFonts w:ascii="Arial" w:hAnsi="Arial" w:cs="Arial"/>
+        </w:rPr>
+        <w:t>Ire</w:t>
+      </w:r>
+      <w:r>
+        <w:rPr>
+          <w:rFonts w:ascii="Arial" w:hAnsi="Arial" w:cs="Arial"/>
+        </w:rPr>
+        <w:t>flix</w:t>
+      </w:r>
+      <w:proofErr w:type="spellEnd"/>
+      <w:r>
+        <w:rPr>
+          <w:rFonts w:ascii="Arial" w:hAnsi="Arial" w:cs="Arial"/>
+        </w:rPr>
+        <w:t>, which collect and store data from over 50 million users, there are several challenges associated with large-scale data collection. These include data storage requirements,</w:t>
+      </w:r>
+      <w:r>
+        <w:rPr>
+          <w:rFonts w:ascii="Arial" w:hAnsi="Arial" w:cs="Arial"/>
+        </w:rPr>
+        <w:t xml:space="preserve"> data validation,</w:t>
+      </w:r>
+      <w:r>
+        <w:rPr>
+          <w:rFonts w:ascii="Arial" w:hAnsi="Arial" w:cs="Arial"/>
+        </w:rPr>
+        <w:t xml:space="preserve"> the speed of data processing, privacy concerns, the need for specialized skills, and the overall costs involved.</w:t>
+      </w:r>
+    </w:p>
+    <w:p>
+      <w:pPr>
+        <w:pStyle w:val="Heading2"/>
+        <w:rPr>
+          <w:rFonts w:ascii="Arial" w:hAnsi="Arial" w:cs="Arial"/>
+        </w:rPr>
+      </w:pPr>
+      <w:bookmarkStart w:id="6" w:name="_Toc230028892"/>
       <w:r>
         <w:rPr>
           <w:rStyle w:val="Heading1Char"/>
@@ -1570,7 +1898,7 @@
           <w:sz w:val="32"/>
           <w:szCs w:val="32"/>
         </w:rPr>
-        <w:t>i</w:t>
+        <w:t xml:space="preserve">Data </w:t>
       </w:r>
       <w:r>
         <w:rPr>
@@ -1579,8 +1907,9 @@
           <w:sz w:val="32"/>
           <w:szCs w:val="32"/>
         </w:rPr>
-        <w:t>e</w:t>
-      </w:r>
+        <w:t>Processing</w:t>
+      </w:r>
+      <w:bookmarkEnd w:id="6"/>
       <w:r>
         <w:rPr>
           <w:rStyle w:val="Heading1Char"/>
@@ -1588,116 +1917,70 @@
           <w:sz w:val="32"/>
           <w:szCs w:val="32"/>
         </w:rPr>
-        <w:t>ty</w:t>
-      </w:r>
-      <w:bookmarkEnd w:id="4"/>
-    </w:p>
-    <w:p>
-      <w:pPr>
-        <w:rPr>
-          <w:rFonts w:ascii="Arial" w:hAnsi="Arial" w:cs="Arial"/>
-        </w:rPr>
-      </w:pPr>
-      <w:r>
-        <w:rPr>
-          <w:rFonts w:ascii="Arial" w:hAnsi="Arial" w:cs="Arial"/>
-        </w:rPr>
-        <w:t xml:space="preserve">Variety refers to the different types of data that organizations handle, including structured data such as spreadsheets and relational databases, </w:t>
-      </w:r>
-      <w:r>
-        <w:rPr>
-          <w:rFonts w:ascii="Arial" w:hAnsi="Arial" w:cs="Arial"/>
-        </w:rPr>
-        <w:t xml:space="preserve">semi structured data like XML files </w:t>
-      </w:r>
-      <w:r>
-        <w:rPr>
-          <w:rFonts w:ascii="Arial" w:hAnsi="Arial" w:cs="Arial"/>
-        </w:rPr>
-        <w:t>as well as unstructured data like text, images, audio, video files, and sensor-generated data. This data is generally categorized into structured, semi-structured, and unstructured forms.</w:t>
-      </w:r>
-    </w:p>
-    <w:p>
-      <w:pPr>
-        <w:rPr>
-          <w:rFonts w:ascii="Arial" w:hAnsi="Arial" w:cs="Arial"/>
-        </w:rPr>
-      </w:pPr>
-    </w:p>
-    <w:p>
-      <w:pPr>
-        <w:rPr>
-          <w:rFonts w:ascii="Arial" w:hAnsi="Arial" w:cs="Arial"/>
-          <w:sz w:val="40"/>
-          <w:szCs w:val="40"/>
-        </w:rPr>
-      </w:pPr>
-      <w:r>
-        <w:rPr>
-          <w:rStyle w:val="Heading1Char"/>
-          <w:rFonts w:ascii="Arial" w:hAnsi="Arial" w:cs="Arial"/>
-        </w:rPr>
-        <w:t>Challenges of Bi</w:t>
-      </w:r>
-      <w:r>
-        <w:rPr>
-          <w:rStyle w:val="Heading1Char"/>
-          <w:rFonts w:ascii="Arial" w:hAnsi="Arial" w:cs="Arial"/>
-        </w:rPr>
-        <w:t>g Data</w:t>
-      </w:r>
-      <w:r>
-        <w:rPr>
-          <w:rFonts w:ascii="Arial" w:hAnsi="Arial" w:cs="Arial"/>
-          <w:sz w:val="40"/>
-          <w:szCs w:val="40"/>
-        </w:rPr>
-        <w:t>:</w:t>
-      </w:r>
-    </w:p>
-    <w:p>
-      <w:pPr>
-        <w:rPr>
-          <w:rFonts w:ascii="Arial" w:hAnsi="Arial" w:cs="Arial"/>
-        </w:rPr>
-      </w:pPr>
-      <w:r>
-        <w:rPr>
-          <w:rFonts w:ascii="Arial" w:hAnsi="Arial" w:cs="Arial"/>
-        </w:rPr>
-        <w:t xml:space="preserve">In organizations such as </w:t>
-      </w:r>
-      <w:proofErr w:type="spellStart"/>
-      <w:r>
-        <w:rPr>
-          <w:rFonts w:ascii="Arial" w:hAnsi="Arial" w:cs="Arial"/>
-        </w:rPr>
-        <w:t>Ire</w:t>
-      </w:r>
-      <w:r>
-        <w:rPr>
-          <w:rFonts w:ascii="Arial" w:hAnsi="Arial" w:cs="Arial"/>
-        </w:rPr>
-        <w:t>flix</w:t>
-      </w:r>
-      <w:proofErr w:type="spellEnd"/>
-      <w:r>
-        <w:rPr>
-          <w:rFonts w:ascii="Arial" w:hAnsi="Arial" w:cs="Arial"/>
-        </w:rPr>
-        <w:t>, which collect and store data from over 50 million users, there are several challenges associated with large-scale data collection. These include data storage requirements,</w:t>
-      </w:r>
-      <w:r>
-        <w:rPr>
-          <w:rFonts w:ascii="Arial" w:hAnsi="Arial" w:cs="Arial"/>
-        </w:rPr>
-        <w:t xml:space="preserve"> data validation,</w:t>
-      </w:r>
-      <w:r>
-        <w:rPr>
-          <w:rFonts w:ascii="Arial" w:hAnsi="Arial" w:cs="Arial"/>
-        </w:rPr>
-        <w:t xml:space="preserve"> the speed of data processing, privacy concerns, the need for specialized skills, and the overall costs involved.</w:t>
+        <w:t xml:space="preserve"> </w:t>
+      </w:r>
+    </w:p>
+    <w:p>
+      <w:pPr>
+        <w:rPr>
+          <w:rFonts w:ascii="Arial" w:hAnsi="Arial" w:cs="Arial"/>
+        </w:rPr>
+      </w:pPr>
+      <w:r>
+        <w:rPr>
+          <w:rFonts w:ascii="Arial" w:hAnsi="Arial" w:cs="Arial"/>
+        </w:rPr>
+        <w:t xml:space="preserve">Processing large datasets can be both time-consuming and </w:t>
+      </w:r>
+      <w:proofErr w:type="gramStart"/>
+      <w:r>
+        <w:rPr>
+          <w:rFonts w:ascii="Arial" w:hAnsi="Arial" w:cs="Arial"/>
+        </w:rPr>
+        <w:t>memory-intensive</w:t>
+      </w:r>
+      <w:proofErr w:type="gramEnd"/>
+      <w:r>
+        <w:rPr>
+          <w:rFonts w:ascii="Arial" w:hAnsi="Arial" w:cs="Arial"/>
+        </w:rPr>
+        <w:t>. By nature, big data is continuously growing and changing at a rapid pace.</w:t>
+      </w:r>
+      <w:r>
+        <w:rPr>
+          <w:rFonts w:ascii="Arial" w:hAnsi="Arial" w:cs="Arial"/>
+        </w:rPr>
+        <w:t xml:space="preserve"> A</w:t>
+      </w:r>
+      <w:r>
+        <w:rPr>
+          <w:rFonts w:ascii="Arial" w:hAnsi="Arial" w:cs="Arial"/>
+        </w:rPr>
+        <w:t xml:space="preserve"> </w:t>
+      </w:r>
+      <w:r>
+        <w:rPr>
+          <w:rFonts w:ascii="Arial" w:hAnsi="Arial" w:cs="Arial"/>
+        </w:rPr>
+        <w:t>sound</w:t>
+      </w:r>
+      <w:r>
+        <w:rPr>
+          <w:rFonts w:ascii="Arial" w:hAnsi="Arial" w:cs="Arial"/>
+        </w:rPr>
+        <w:t xml:space="preserve"> infrastructure </w:t>
+      </w:r>
+      <w:r>
+        <w:rPr>
+          <w:rFonts w:ascii="Arial" w:hAnsi="Arial" w:cs="Arial"/>
+        </w:rPr>
+        <w:t xml:space="preserve">is required to </w:t>
+      </w:r>
+      <w:r>
+        <w:rPr>
+          <w:rFonts w:ascii="Arial" w:hAnsi="Arial" w:cs="Arial"/>
+        </w:rPr>
+        <w:t>effectively support processing, storage, networking, and security requirements, it becomes highly challenging to manage and maintain such data efficiently.</w:t>
       </w:r>
     </w:p>
     <w:p>
@@ -1707,6 +1990,7 @@
           <w:rFonts w:ascii="Arial" w:hAnsi="Arial" w:cs="Arial"/>
         </w:rPr>
       </w:pPr>
+      <w:bookmarkStart w:id="7" w:name="_Toc230028893"/>
       <w:r>
         <w:rPr>
           <w:rStyle w:val="Heading1Char"/>
@@ -1714,8 +1998,9 @@
           <w:sz w:val="32"/>
           <w:szCs w:val="32"/>
         </w:rPr>
-        <w:t xml:space="preserve">Data </w:t>
-      </w:r>
+        <w:t>Data Security</w:t>
+      </w:r>
+      <w:bookmarkEnd w:id="7"/>
       <w:r>
         <w:rPr>
           <w:rStyle w:val="Heading1Char"/>
@@ -1723,143 +2008,43 @@
           <w:sz w:val="32"/>
           <w:szCs w:val="32"/>
         </w:rPr>
-        <w:t>Processing</w:t>
-      </w:r>
-      <w:r>
-        <w:rPr>
-          <w:rStyle w:val="Heading1Char"/>
+        <w:t xml:space="preserve"> </w:t>
+      </w:r>
+    </w:p>
+    <w:p>
+      <w:pPr>
+        <w:rPr>
+          <w:rFonts w:ascii="Arial" w:hAnsi="Arial" w:cs="Arial"/>
+        </w:rPr>
+      </w:pPr>
+      <w:r>
+        <w:rPr>
+          <w:rFonts w:ascii="Arial" w:hAnsi="Arial" w:cs="Arial"/>
+        </w:rPr>
+        <w:t>Big data typically involves large volumes of sensitive information, which makes it highly vulnerable and a potential target for cyberattacks and malicious actors.</w:t>
+      </w:r>
+    </w:p>
+    <w:p>
+      <w:pPr>
+        <w:rPr>
+          <w:rFonts w:ascii="Arial" w:hAnsi="Arial" w:cs="Arial"/>
+        </w:rPr>
+      </w:pPr>
+      <w:r>
+        <w:rPr>
+          <w:rFonts w:ascii="Arial" w:hAnsi="Arial" w:cs="Arial"/>
+        </w:rPr>
+        <w:t>This also creates challenges in consistently ensuring that data processing and storage comply with privacy regulations, including data localization and data residency requirements.</w:t>
+      </w:r>
+    </w:p>
+    <w:p>
+      <w:pPr>
+        <w:rPr>
           <w:rFonts w:ascii="Arial" w:hAnsi="Arial" w:cs="Arial"/>
           <w:sz w:val="32"/>
           <w:szCs w:val="32"/>
         </w:rPr>
-        <w:t xml:space="preserve"> </w:t>
-      </w:r>
-    </w:p>
-    <w:p>
-      <w:pPr>
-        <w:rPr>
-          <w:rFonts w:ascii="Arial" w:hAnsi="Arial" w:cs="Arial"/>
-        </w:rPr>
-      </w:pPr>
-      <w:r>
-        <w:rPr>
-          <w:rFonts w:ascii="Arial" w:hAnsi="Arial" w:cs="Arial"/>
-        </w:rPr>
-        <w:t xml:space="preserve">Processing large datasets can be both time-consuming and </w:t>
-      </w:r>
-      <w:proofErr w:type="gramStart"/>
-      <w:r>
-        <w:rPr>
-          <w:rFonts w:ascii="Arial" w:hAnsi="Arial" w:cs="Arial"/>
-        </w:rPr>
-        <w:t>memory-intensive</w:t>
-      </w:r>
-      <w:proofErr w:type="gramEnd"/>
-      <w:r>
-        <w:rPr>
-          <w:rFonts w:ascii="Arial" w:hAnsi="Arial" w:cs="Arial"/>
-        </w:rPr>
-        <w:t>. By nature, big data is continuously growing and changing at a rapid pace.</w:t>
-      </w:r>
-      <w:r>
-        <w:rPr>
-          <w:rFonts w:ascii="Arial" w:hAnsi="Arial" w:cs="Arial"/>
-        </w:rPr>
-        <w:t xml:space="preserve"> A</w:t>
-      </w:r>
-      <w:r>
-        <w:rPr>
-          <w:rFonts w:ascii="Arial" w:hAnsi="Arial" w:cs="Arial"/>
-        </w:rPr>
-        <w:t xml:space="preserve"> </w:t>
-      </w:r>
-      <w:r>
-        <w:rPr>
-          <w:rFonts w:ascii="Arial" w:hAnsi="Arial" w:cs="Arial"/>
-        </w:rPr>
-        <w:t>sound</w:t>
-      </w:r>
-      <w:r>
-        <w:rPr>
-          <w:rFonts w:ascii="Arial" w:hAnsi="Arial" w:cs="Arial"/>
-        </w:rPr>
-        <w:t xml:space="preserve"> infrastructure </w:t>
-      </w:r>
-      <w:r>
-        <w:rPr>
-          <w:rFonts w:ascii="Arial" w:hAnsi="Arial" w:cs="Arial"/>
-        </w:rPr>
-        <w:t xml:space="preserve">is required to </w:t>
-      </w:r>
-      <w:r>
-        <w:rPr>
-          <w:rFonts w:ascii="Arial" w:hAnsi="Arial" w:cs="Arial"/>
-        </w:rPr>
-        <w:t>effectively support processing, storage, networking, and security requirements, it becomes highly challenging to manage and maintain such data efficiently.</w:t>
-      </w:r>
-    </w:p>
-    <w:p>
-      <w:pPr>
-        <w:pStyle w:val="Heading2"/>
-        <w:rPr>
-          <w:rFonts w:ascii="Arial" w:hAnsi="Arial" w:cs="Arial"/>
-        </w:rPr>
-      </w:pPr>
-      <w:r>
-        <w:rPr>
-          <w:rStyle w:val="Heading1Char"/>
-          <w:rFonts w:ascii="Arial" w:hAnsi="Arial" w:cs="Arial"/>
-          <w:sz w:val="32"/>
-          <w:szCs w:val="32"/>
-        </w:rPr>
-        <w:t xml:space="preserve">Data </w:t>
-      </w:r>
-      <w:r>
-        <w:rPr>
-          <w:rStyle w:val="Heading1Char"/>
-          <w:rFonts w:ascii="Arial" w:hAnsi="Arial" w:cs="Arial"/>
-          <w:sz w:val="32"/>
-          <w:szCs w:val="32"/>
-        </w:rPr>
-        <w:t>Security</w:t>
-      </w:r>
-      <w:r>
-        <w:rPr>
-          <w:rStyle w:val="Heading1Char"/>
-          <w:rFonts w:ascii="Arial" w:hAnsi="Arial" w:cs="Arial"/>
-          <w:sz w:val="32"/>
-          <w:szCs w:val="32"/>
-        </w:rPr>
-        <w:t xml:space="preserve"> </w:t>
-      </w:r>
-    </w:p>
-    <w:p>
-      <w:pPr>
-        <w:rPr>
-          <w:rFonts w:ascii="Arial" w:hAnsi="Arial" w:cs="Arial"/>
-        </w:rPr>
-      </w:pPr>
-      <w:r>
-        <w:rPr>
-          <w:rFonts w:ascii="Arial" w:hAnsi="Arial" w:cs="Arial"/>
-        </w:rPr>
-        <w:t>Big data typically involves large volumes of sensitive information, which makes it highly vulnerable and a potential target for cyberattacks and malicious actors.</w:t>
-      </w:r>
-    </w:p>
-    <w:p>
-      <w:pPr>
-        <w:rPr>
-          <w:rFonts w:ascii="Arial" w:hAnsi="Arial" w:cs="Arial"/>
-          <w:sz w:val="32"/>
-          <w:szCs w:val="32"/>
-        </w:rPr>
-      </w:pPr>
-      <w:r>
-        <w:rPr>
-          <w:rFonts w:ascii="Arial" w:hAnsi="Arial" w:cs="Arial"/>
-        </w:rPr>
-        <w:t>This also creates challenges in consistently ensuring that data processing and storage comply with privacy regulations, including data localization and data residency requirements.</w:t>
-      </w:r>
+      </w:pPr>
     </w:p>
     <w:sectPr>
       <w:pgSz w:w="11906" w:h="16838"/>
@@ -2476,6 +2661,7 @@
   <w:style w:type="character" w:default="1" w:styleId="DefaultParagraphFont">
     <w:name w:val="Default Paragraph Font"/>
     <w:uiPriority w:val="1"/>
+    <w:semiHidden/>
     <w:unhideWhenUsed/>
   </w:style>
   <w:style w:type="table" w:default="1" w:styleId="TableNormal">
@@ -3198,7 +3384,7 @@
 <file path=customXml/item1.xml><?xml version="1.0" encoding="utf-8"?>
 <CoverPageProperties xmlns="http://schemas.microsoft.com/office/2006/coverPageProps">
   <PublishDate/>
-  <Abstract/>
+  <Abstract>This report explores the concept of big data and the challenges associated with handling large-scale datasets. It discusses the key characteristics of big data, as well as the importance of efficient data processing, storage, and security. The report also highlights issues related to handling the big data.</Abstract>
   <CompanyAddress/>
   <CompanyPhone/>
   <CompanyFax/>

</xml_diff>

<commit_message>
completed report for Big data and lagacy system
</commit_message>
<xml_diff>
--- a/BDA CA 1 - Large Scale Data.docx
+++ b/BDA CA 1 - Large Scale Data.docx
@@ -146,7 +146,7 @@
                                                     <pic:cNvPicPr/>
                                                   </pic:nvPicPr>
                                                   <pic:blipFill>
-                                                    <a:blip r:embed="rId6">
+                                                    <a:blip r:embed="rId7">
                                                       <a:extLst>
                                                         <a:ext uri="{28A0092B-C50C-407E-A947-70E740481C1C}">
                                                           <a14:useLocalDpi xmlns:a14="http://schemas.microsoft.com/office/drawing/2010/main" val="0"/>
@@ -452,7 +452,7 @@
                                               <pic:cNvPicPr/>
                                             </pic:nvPicPr>
                                             <pic:blipFill>
-                                              <a:blip r:embed="rId6">
+                                              <a:blip r:embed="rId7">
                                                 <a:extLst>
                                                   <a:ext uri="{28A0092B-C50C-407E-A947-70E740481C1C}">
                                                     <a14:useLocalDpi xmlns:a14="http://schemas.microsoft.com/office/drawing/2010/main" val="0"/>
@@ -695,17 +695,6 @@
             </w:rPr>
             <w:br w:type="page"/>
           </w:r>
-          <w:r>
-            <w:rPr>
-              <w:rFonts w:ascii="Arial" w:eastAsiaTheme="minorEastAsia" w:hAnsi="Arial" w:cs="Arial"/>
-              <w:caps/>
-              <w:color w:val="191919" w:themeColor="text1" w:themeTint="E6"/>
-              <w:sz w:val="36"/>
-              <w:szCs w:val="36"/>
-            </w:rPr>
-            <w:lastRenderedPageBreak/>
-            <w:t>,</w:t>
-          </w:r>
         </w:p>
       </w:sdtContent>
     </w:sdt>
@@ -763,11 +752,13 @@
           <w:r>
             <w:fldChar w:fldCharType="separate"/>
           </w:r>
-          <w:hyperlink w:anchor="_Toc230028886" w:history="1">
+          <w:hyperlink w:anchor="_Toc230521452" w:history="1">
             <w:r>
               <w:rPr>
                 <w:rStyle w:val="Hyperlink"/>
                 <w:rFonts w:ascii="Arial" w:hAnsi="Arial" w:cs="Arial"/>
+                <w:b/>
+                <w:bCs/>
                 <w:noProof/>
               </w:rPr>
               <w:t>Introduction</w:t>
@@ -791,7 +782,7 @@
                 <w:noProof/>
                 <w:webHidden/>
               </w:rPr>
-              <w:instrText xml:space="preserve"> PAGEREF _Toc230028886 \h </w:instrText>
+              <w:instrText xml:space="preserve"> PAGEREF _Toc230521452 \h </w:instrText>
             </w:r>
             <w:r>
               <w:rPr>
@@ -811,7 +802,7 @@
                 <w:noProof/>
                 <w:webHidden/>
               </w:rPr>
-              <w:t>3</w:t>
+              <w:t>1</w:t>
             </w:r>
             <w:r>
               <w:rPr>
@@ -834,11 +825,13 @@
               <w:lang w:eastAsia="en-IE"/>
             </w:rPr>
           </w:pPr>
-          <w:hyperlink w:anchor="_Toc230028887" w:history="1">
+          <w:hyperlink w:anchor="_Toc230521453" w:history="1">
             <w:r>
               <w:rPr>
                 <w:rStyle w:val="Hyperlink"/>
                 <w:rFonts w:ascii="Arial" w:hAnsi="Arial" w:cs="Arial"/>
+                <w:b/>
+                <w:bCs/>
                 <w:noProof/>
               </w:rPr>
               <w:t>3 Vs of Big Data</w:t>
@@ -862,7 +855,7 @@
                 <w:noProof/>
                 <w:webHidden/>
               </w:rPr>
-              <w:instrText xml:space="preserve"> PAGEREF _Toc230028887 \h </w:instrText>
+              <w:instrText xml:space="preserve"> PAGEREF _Toc230521453 \h </w:instrText>
             </w:r>
             <w:r>
               <w:rPr>
@@ -882,7 +875,7 @@
                 <w:noProof/>
                 <w:webHidden/>
               </w:rPr>
-              <w:t>3</w:t>
+              <w:t>2</w:t>
             </w:r>
             <w:r>
               <w:rPr>
@@ -905,7 +898,7 @@
               <w:lang w:eastAsia="en-IE"/>
             </w:rPr>
           </w:pPr>
-          <w:hyperlink w:anchor="_Toc230028888" w:history="1">
+          <w:hyperlink w:anchor="_Toc230521454" w:history="1">
             <w:r>
               <w:rPr>
                 <w:rStyle w:val="Hyperlink"/>
@@ -933,7 +926,7 @@
                 <w:noProof/>
                 <w:webHidden/>
               </w:rPr>
-              <w:instrText xml:space="preserve"> PAGEREF _Toc230028888 \h </w:instrText>
+              <w:instrText xml:space="preserve"> PAGEREF _Toc230521454 \h </w:instrText>
             </w:r>
             <w:r>
               <w:rPr>
@@ -953,7 +946,7 @@
                 <w:noProof/>
                 <w:webHidden/>
               </w:rPr>
-              <w:t>3</w:t>
+              <w:t>2</w:t>
             </w:r>
             <w:r>
               <w:rPr>
@@ -976,7 +969,7 @@
               <w:lang w:eastAsia="en-IE"/>
             </w:rPr>
           </w:pPr>
-          <w:hyperlink w:anchor="_Toc230028889" w:history="1">
+          <w:hyperlink w:anchor="_Toc230521455" w:history="1">
             <w:r>
               <w:rPr>
                 <w:rStyle w:val="Hyperlink"/>
@@ -1004,7 +997,7 @@
                 <w:noProof/>
                 <w:webHidden/>
               </w:rPr>
-              <w:instrText xml:space="preserve"> PAGEREF _Toc230028889 \h </w:instrText>
+              <w:instrText xml:space="preserve"> PAGEREF _Toc230521455 \h </w:instrText>
             </w:r>
             <w:r>
               <w:rPr>
@@ -1024,7 +1017,7 @@
                 <w:noProof/>
                 <w:webHidden/>
               </w:rPr>
-              <w:t>3</w:t>
+              <w:t>2</w:t>
             </w:r>
             <w:r>
               <w:rPr>
@@ -1047,7 +1040,7 @@
               <w:lang w:eastAsia="en-IE"/>
             </w:rPr>
           </w:pPr>
-          <w:hyperlink w:anchor="_Toc230028890" w:history="1">
+          <w:hyperlink w:anchor="_Toc230521456" w:history="1">
             <w:r>
               <w:rPr>
                 <w:rStyle w:val="Hyperlink"/>
@@ -1075,7 +1068,7 @@
                 <w:noProof/>
                 <w:webHidden/>
               </w:rPr>
-              <w:instrText xml:space="preserve"> PAGEREF _Toc230028890 \h </w:instrText>
+              <w:instrText xml:space="preserve"> PAGEREF _Toc230521456 \h </w:instrText>
             </w:r>
             <w:r>
               <w:rPr>
@@ -1095,7 +1088,7 @@
                 <w:noProof/>
                 <w:webHidden/>
               </w:rPr>
-              <w:t>4</w:t>
+              <w:t>2</w:t>
             </w:r>
             <w:r>
               <w:rPr>
@@ -1118,11 +1111,13 @@
               <w:lang w:eastAsia="en-IE"/>
             </w:rPr>
           </w:pPr>
-          <w:hyperlink w:anchor="_Toc230028891" w:history="1">
+          <w:hyperlink w:anchor="_Toc230521457" w:history="1">
             <w:r>
               <w:rPr>
                 <w:rStyle w:val="Hyperlink"/>
                 <w:rFonts w:ascii="Arial" w:hAnsi="Arial" w:cs="Arial"/>
+                <w:b/>
+                <w:bCs/>
                 <w:noProof/>
               </w:rPr>
               <w:t>Challenges of Big Data</w:t>
@@ -1146,7 +1141,7 @@
                 <w:noProof/>
                 <w:webHidden/>
               </w:rPr>
-              <w:instrText xml:space="preserve"> PAGEREF _Toc230028891 \h </w:instrText>
+              <w:instrText xml:space="preserve"> PAGEREF _Toc230521457 \h </w:instrText>
             </w:r>
             <w:r>
               <w:rPr>
@@ -1166,7 +1161,7 @@
                 <w:noProof/>
                 <w:webHidden/>
               </w:rPr>
-              <w:t>4</w:t>
+              <w:t>3</w:t>
             </w:r>
             <w:r>
               <w:rPr>
@@ -1189,7 +1184,7 @@
               <w:lang w:eastAsia="en-IE"/>
             </w:rPr>
           </w:pPr>
-          <w:hyperlink w:anchor="_Toc230028892" w:history="1">
+          <w:hyperlink w:anchor="_Toc230521458" w:history="1">
             <w:r>
               <w:rPr>
                 <w:rStyle w:val="Hyperlink"/>
@@ -1217,7 +1212,7 @@
                 <w:noProof/>
                 <w:webHidden/>
               </w:rPr>
-              <w:instrText xml:space="preserve"> PAGEREF _Toc230028892 \h </w:instrText>
+              <w:instrText xml:space="preserve"> PAGEREF _Toc230521458 \h </w:instrText>
             </w:r>
             <w:r>
               <w:rPr>
@@ -1237,7 +1232,7 @@
                 <w:noProof/>
                 <w:webHidden/>
               </w:rPr>
-              <w:t>4</w:t>
+              <w:t>3</w:t>
             </w:r>
             <w:r>
               <w:rPr>
@@ -1260,7 +1255,7 @@
               <w:lang w:eastAsia="en-IE"/>
             </w:rPr>
           </w:pPr>
-          <w:hyperlink w:anchor="_Toc230028893" w:history="1">
+          <w:hyperlink w:anchor="_Toc230521459" w:history="1">
             <w:r>
               <w:rPr>
                 <w:rStyle w:val="Hyperlink"/>
@@ -1288,7 +1283,7 @@
                 <w:noProof/>
                 <w:webHidden/>
               </w:rPr>
-              <w:instrText xml:space="preserve"> PAGEREF _Toc230028893 \h </w:instrText>
+              <w:instrText xml:space="preserve"> PAGEREF _Toc230521459 \h </w:instrText>
             </w:r>
             <w:r>
               <w:rPr>
@@ -1308,7 +1303,7 @@
                 <w:noProof/>
                 <w:webHidden/>
               </w:rPr>
-              <w:t>4</w:t>
+              <w:t>3</w:t>
             </w:r>
             <w:r>
               <w:rPr>
@@ -1320,6 +1315,660 @@
           </w:hyperlink>
         </w:p>
         <w:p>
+          <w:pPr>
+            <w:pStyle w:val="TOC1"/>
+            <w:tabs>
+              <w:tab w:val="right" w:leader="dot" w:pos="9016"/>
+            </w:tabs>
+            <w:rPr>
+              <w:rFonts w:eastAsiaTheme="minorEastAsia"/>
+              <w:noProof/>
+              <w:lang w:eastAsia="en-IE"/>
+            </w:rPr>
+          </w:pPr>
+          <w:hyperlink w:anchor="_Toc230521460" w:history="1">
+            <w:r>
+              <w:rPr>
+                <w:rStyle w:val="Hyperlink"/>
+                <w:rFonts w:ascii="Arial" w:hAnsi="Arial" w:cs="Arial"/>
+                <w:b/>
+                <w:bCs/>
+                <w:noProof/>
+              </w:rPr>
+              <w:t>Horizontal Vs Vertical Scaling</w:t>
+            </w:r>
+            <w:r>
+              <w:rPr>
+                <w:noProof/>
+                <w:webHidden/>
+              </w:rPr>
+              <w:tab/>
+            </w:r>
+            <w:r>
+              <w:rPr>
+                <w:noProof/>
+                <w:webHidden/>
+              </w:rPr>
+              <w:fldChar w:fldCharType="begin"/>
+            </w:r>
+            <w:r>
+              <w:rPr>
+                <w:noProof/>
+                <w:webHidden/>
+              </w:rPr>
+              <w:instrText xml:space="preserve"> PAGEREF _Toc230521460 \h </w:instrText>
+            </w:r>
+            <w:r>
+              <w:rPr>
+                <w:noProof/>
+                <w:webHidden/>
+              </w:rPr>
+            </w:r>
+            <w:r>
+              <w:rPr>
+                <w:noProof/>
+                <w:webHidden/>
+              </w:rPr>
+              <w:fldChar w:fldCharType="separate"/>
+            </w:r>
+            <w:r>
+              <w:rPr>
+                <w:noProof/>
+                <w:webHidden/>
+              </w:rPr>
+              <w:t>3</w:t>
+            </w:r>
+            <w:r>
+              <w:rPr>
+                <w:noProof/>
+                <w:webHidden/>
+              </w:rPr>
+              <w:fldChar w:fldCharType="end"/>
+            </w:r>
+          </w:hyperlink>
+        </w:p>
+        <w:p>
+          <w:pPr>
+            <w:pStyle w:val="TOC2"/>
+            <w:tabs>
+              <w:tab w:val="right" w:leader="dot" w:pos="9016"/>
+            </w:tabs>
+            <w:rPr>
+              <w:rFonts w:eastAsiaTheme="minorEastAsia"/>
+              <w:noProof/>
+              <w:lang w:eastAsia="en-IE"/>
+            </w:rPr>
+          </w:pPr>
+          <w:hyperlink w:anchor="_Toc230521461" w:history="1">
+            <w:r>
+              <w:rPr>
+                <w:rStyle w:val="Hyperlink"/>
+                <w:rFonts w:ascii="Arial" w:hAnsi="Arial" w:cs="Arial"/>
+                <w:b/>
+                <w:bCs/>
+                <w:noProof/>
+              </w:rPr>
+              <w:t>Key Differences Between Vertical and Horizontal Scaling</w:t>
+            </w:r>
+            <w:r>
+              <w:rPr>
+                <w:noProof/>
+                <w:webHidden/>
+              </w:rPr>
+              <w:tab/>
+            </w:r>
+            <w:r>
+              <w:rPr>
+                <w:noProof/>
+                <w:webHidden/>
+              </w:rPr>
+              <w:fldChar w:fldCharType="begin"/>
+            </w:r>
+            <w:r>
+              <w:rPr>
+                <w:noProof/>
+                <w:webHidden/>
+              </w:rPr>
+              <w:instrText xml:space="preserve"> PAGEREF _Toc230521461 \h </w:instrText>
+            </w:r>
+            <w:r>
+              <w:rPr>
+                <w:noProof/>
+                <w:webHidden/>
+              </w:rPr>
+            </w:r>
+            <w:r>
+              <w:rPr>
+                <w:noProof/>
+                <w:webHidden/>
+              </w:rPr>
+              <w:fldChar w:fldCharType="separate"/>
+            </w:r>
+            <w:r>
+              <w:rPr>
+                <w:noProof/>
+                <w:webHidden/>
+              </w:rPr>
+              <w:t>4</w:t>
+            </w:r>
+            <w:r>
+              <w:rPr>
+                <w:noProof/>
+                <w:webHidden/>
+              </w:rPr>
+              <w:fldChar w:fldCharType="end"/>
+            </w:r>
+          </w:hyperlink>
+        </w:p>
+        <w:p>
+          <w:pPr>
+            <w:pStyle w:val="TOC3"/>
+            <w:tabs>
+              <w:tab w:val="right" w:leader="dot" w:pos="9016"/>
+            </w:tabs>
+            <w:rPr>
+              <w:rFonts w:eastAsiaTheme="minorEastAsia"/>
+              <w:noProof/>
+              <w:lang w:eastAsia="en-IE"/>
+            </w:rPr>
+          </w:pPr>
+          <w:hyperlink w:anchor="_Toc230521462" w:history="1">
+            <w:r>
+              <w:rPr>
+                <w:rStyle w:val="Hyperlink"/>
+                <w:rFonts w:ascii="Arial" w:hAnsi="Arial" w:cs="Arial"/>
+                <w:noProof/>
+              </w:rPr>
+              <w:t>Scalability</w:t>
+            </w:r>
+            <w:r>
+              <w:rPr>
+                <w:noProof/>
+                <w:webHidden/>
+              </w:rPr>
+              <w:tab/>
+            </w:r>
+            <w:r>
+              <w:rPr>
+                <w:noProof/>
+                <w:webHidden/>
+              </w:rPr>
+              <w:fldChar w:fldCharType="begin"/>
+            </w:r>
+            <w:r>
+              <w:rPr>
+                <w:noProof/>
+                <w:webHidden/>
+              </w:rPr>
+              <w:instrText xml:space="preserve"> PAGEREF _Toc230521462 \h </w:instrText>
+            </w:r>
+            <w:r>
+              <w:rPr>
+                <w:noProof/>
+                <w:webHidden/>
+              </w:rPr>
+            </w:r>
+            <w:r>
+              <w:rPr>
+                <w:noProof/>
+                <w:webHidden/>
+              </w:rPr>
+              <w:fldChar w:fldCharType="separate"/>
+            </w:r>
+            <w:r>
+              <w:rPr>
+                <w:noProof/>
+                <w:webHidden/>
+              </w:rPr>
+              <w:t>4</w:t>
+            </w:r>
+            <w:r>
+              <w:rPr>
+                <w:noProof/>
+                <w:webHidden/>
+              </w:rPr>
+              <w:fldChar w:fldCharType="end"/>
+            </w:r>
+          </w:hyperlink>
+        </w:p>
+        <w:p>
+          <w:pPr>
+            <w:pStyle w:val="TOC3"/>
+            <w:tabs>
+              <w:tab w:val="right" w:leader="dot" w:pos="9016"/>
+            </w:tabs>
+            <w:rPr>
+              <w:rFonts w:eastAsiaTheme="minorEastAsia"/>
+              <w:noProof/>
+              <w:lang w:eastAsia="en-IE"/>
+            </w:rPr>
+          </w:pPr>
+          <w:hyperlink w:anchor="_Toc230521463" w:history="1">
+            <w:r>
+              <w:rPr>
+                <w:rStyle w:val="Hyperlink"/>
+                <w:rFonts w:ascii="Arial" w:hAnsi="Arial" w:cs="Arial"/>
+                <w:noProof/>
+              </w:rPr>
+              <w:t>System resiliency</w:t>
+            </w:r>
+            <w:r>
+              <w:rPr>
+                <w:noProof/>
+                <w:webHidden/>
+              </w:rPr>
+              <w:tab/>
+            </w:r>
+            <w:r>
+              <w:rPr>
+                <w:noProof/>
+                <w:webHidden/>
+              </w:rPr>
+              <w:fldChar w:fldCharType="begin"/>
+            </w:r>
+            <w:r>
+              <w:rPr>
+                <w:noProof/>
+                <w:webHidden/>
+              </w:rPr>
+              <w:instrText xml:space="preserve"> PAGEREF _Toc230521463 \h </w:instrText>
+            </w:r>
+            <w:r>
+              <w:rPr>
+                <w:noProof/>
+                <w:webHidden/>
+              </w:rPr>
+            </w:r>
+            <w:r>
+              <w:rPr>
+                <w:noProof/>
+                <w:webHidden/>
+              </w:rPr>
+              <w:fldChar w:fldCharType="separate"/>
+            </w:r>
+            <w:r>
+              <w:rPr>
+                <w:noProof/>
+                <w:webHidden/>
+              </w:rPr>
+              <w:t>4</w:t>
+            </w:r>
+            <w:r>
+              <w:rPr>
+                <w:noProof/>
+                <w:webHidden/>
+              </w:rPr>
+              <w:fldChar w:fldCharType="end"/>
+            </w:r>
+          </w:hyperlink>
+        </w:p>
+        <w:p>
+          <w:pPr>
+            <w:pStyle w:val="TOC3"/>
+            <w:tabs>
+              <w:tab w:val="right" w:leader="dot" w:pos="9016"/>
+            </w:tabs>
+            <w:rPr>
+              <w:rFonts w:eastAsiaTheme="minorEastAsia"/>
+              <w:noProof/>
+              <w:lang w:eastAsia="en-IE"/>
+            </w:rPr>
+          </w:pPr>
+          <w:hyperlink w:anchor="_Toc230521464" w:history="1">
+            <w:r>
+              <w:rPr>
+                <w:rStyle w:val="Hyperlink"/>
+                <w:rFonts w:ascii="Arial" w:hAnsi="Arial" w:cs="Arial"/>
+                <w:noProof/>
+              </w:rPr>
+              <w:t>Complexity</w:t>
+            </w:r>
+            <w:r>
+              <w:rPr>
+                <w:noProof/>
+                <w:webHidden/>
+              </w:rPr>
+              <w:tab/>
+            </w:r>
+            <w:r>
+              <w:rPr>
+                <w:noProof/>
+                <w:webHidden/>
+              </w:rPr>
+              <w:fldChar w:fldCharType="begin"/>
+            </w:r>
+            <w:r>
+              <w:rPr>
+                <w:noProof/>
+                <w:webHidden/>
+              </w:rPr>
+              <w:instrText xml:space="preserve"> PAGEREF _Toc230521464 \h </w:instrText>
+            </w:r>
+            <w:r>
+              <w:rPr>
+                <w:noProof/>
+                <w:webHidden/>
+              </w:rPr>
+            </w:r>
+            <w:r>
+              <w:rPr>
+                <w:noProof/>
+                <w:webHidden/>
+              </w:rPr>
+              <w:fldChar w:fldCharType="separate"/>
+            </w:r>
+            <w:r>
+              <w:rPr>
+                <w:noProof/>
+                <w:webHidden/>
+              </w:rPr>
+              <w:t>4</w:t>
+            </w:r>
+            <w:r>
+              <w:rPr>
+                <w:noProof/>
+                <w:webHidden/>
+              </w:rPr>
+              <w:fldChar w:fldCharType="end"/>
+            </w:r>
+          </w:hyperlink>
+        </w:p>
+        <w:p>
+          <w:pPr>
+            <w:pStyle w:val="TOC3"/>
+            <w:tabs>
+              <w:tab w:val="right" w:leader="dot" w:pos="9016"/>
+            </w:tabs>
+            <w:rPr>
+              <w:rFonts w:eastAsiaTheme="minorEastAsia"/>
+              <w:noProof/>
+              <w:lang w:eastAsia="en-IE"/>
+            </w:rPr>
+          </w:pPr>
+          <w:hyperlink w:anchor="_Toc230521465" w:history="1">
+            <w:r>
+              <w:rPr>
+                <w:rStyle w:val="Hyperlink"/>
+                <w:rFonts w:ascii="Arial" w:hAnsi="Arial" w:cs="Arial"/>
+                <w:noProof/>
+              </w:rPr>
+              <w:t>Skill requirements</w:t>
+            </w:r>
+            <w:r>
+              <w:rPr>
+                <w:noProof/>
+                <w:webHidden/>
+              </w:rPr>
+              <w:tab/>
+            </w:r>
+            <w:r>
+              <w:rPr>
+                <w:noProof/>
+                <w:webHidden/>
+              </w:rPr>
+              <w:fldChar w:fldCharType="begin"/>
+            </w:r>
+            <w:r>
+              <w:rPr>
+                <w:noProof/>
+                <w:webHidden/>
+              </w:rPr>
+              <w:instrText xml:space="preserve"> PAGEREF _Toc230521465 \h </w:instrText>
+            </w:r>
+            <w:r>
+              <w:rPr>
+                <w:noProof/>
+                <w:webHidden/>
+              </w:rPr>
+            </w:r>
+            <w:r>
+              <w:rPr>
+                <w:noProof/>
+                <w:webHidden/>
+              </w:rPr>
+              <w:fldChar w:fldCharType="separate"/>
+            </w:r>
+            <w:r>
+              <w:rPr>
+                <w:noProof/>
+                <w:webHidden/>
+              </w:rPr>
+              <w:t>4</w:t>
+            </w:r>
+            <w:r>
+              <w:rPr>
+                <w:noProof/>
+                <w:webHidden/>
+              </w:rPr>
+              <w:fldChar w:fldCharType="end"/>
+            </w:r>
+          </w:hyperlink>
+        </w:p>
+        <w:p>
+          <w:pPr>
+            <w:pStyle w:val="TOC3"/>
+            <w:tabs>
+              <w:tab w:val="right" w:leader="dot" w:pos="9016"/>
+            </w:tabs>
+            <w:rPr>
+              <w:rFonts w:eastAsiaTheme="minorEastAsia"/>
+              <w:noProof/>
+              <w:lang w:eastAsia="en-IE"/>
+            </w:rPr>
+          </w:pPr>
+          <w:hyperlink w:anchor="_Toc230521466" w:history="1">
+            <w:r>
+              <w:rPr>
+                <w:rStyle w:val="Hyperlink"/>
+                <w:rFonts w:ascii="Arial" w:hAnsi="Arial" w:cs="Arial"/>
+                <w:noProof/>
+              </w:rPr>
+              <w:t>Costs</w:t>
+            </w:r>
+            <w:r>
+              <w:rPr>
+                <w:noProof/>
+                <w:webHidden/>
+              </w:rPr>
+              <w:tab/>
+            </w:r>
+            <w:r>
+              <w:rPr>
+                <w:noProof/>
+                <w:webHidden/>
+              </w:rPr>
+              <w:fldChar w:fldCharType="begin"/>
+            </w:r>
+            <w:r>
+              <w:rPr>
+                <w:noProof/>
+                <w:webHidden/>
+              </w:rPr>
+              <w:instrText xml:space="preserve"> PAGEREF _Toc230521466 \h </w:instrText>
+            </w:r>
+            <w:r>
+              <w:rPr>
+                <w:noProof/>
+                <w:webHidden/>
+              </w:rPr>
+            </w:r>
+            <w:r>
+              <w:rPr>
+                <w:noProof/>
+                <w:webHidden/>
+              </w:rPr>
+              <w:fldChar w:fldCharType="separate"/>
+            </w:r>
+            <w:r>
+              <w:rPr>
+                <w:noProof/>
+                <w:webHidden/>
+              </w:rPr>
+              <w:t>5</w:t>
+            </w:r>
+            <w:r>
+              <w:rPr>
+                <w:noProof/>
+                <w:webHidden/>
+              </w:rPr>
+              <w:fldChar w:fldCharType="end"/>
+            </w:r>
+          </w:hyperlink>
+        </w:p>
+        <w:p>
+          <w:pPr>
+            <w:pStyle w:val="TOC2"/>
+            <w:tabs>
+              <w:tab w:val="right" w:leader="dot" w:pos="9016"/>
+            </w:tabs>
+            <w:rPr>
+              <w:rFonts w:eastAsiaTheme="minorEastAsia"/>
+              <w:noProof/>
+              <w:lang w:eastAsia="en-IE"/>
+            </w:rPr>
+          </w:pPr>
+          <w:hyperlink w:anchor="_Toc230521467" w:history="1">
+            <w:r>
+              <w:rPr>
+                <w:rStyle w:val="Hyperlink"/>
+                <w:rFonts w:ascii="Arial" w:hAnsi="Arial" w:cs="Arial"/>
+                <w:b/>
+                <w:bCs/>
+                <w:noProof/>
+              </w:rPr>
+              <w:t>Consideration for choosing Right Approach</w:t>
+            </w:r>
+            <w:r>
+              <w:rPr>
+                <w:noProof/>
+                <w:webHidden/>
+              </w:rPr>
+              <w:tab/>
+            </w:r>
+            <w:r>
+              <w:rPr>
+                <w:noProof/>
+                <w:webHidden/>
+              </w:rPr>
+              <w:fldChar w:fldCharType="begin"/>
+            </w:r>
+            <w:r>
+              <w:rPr>
+                <w:noProof/>
+                <w:webHidden/>
+              </w:rPr>
+              <w:instrText xml:space="preserve"> PAGEREF _Toc230521467 \h </w:instrText>
+            </w:r>
+            <w:r>
+              <w:rPr>
+                <w:noProof/>
+                <w:webHidden/>
+              </w:rPr>
+            </w:r>
+            <w:r>
+              <w:rPr>
+                <w:noProof/>
+                <w:webHidden/>
+              </w:rPr>
+              <w:fldChar w:fldCharType="separate"/>
+            </w:r>
+            <w:r>
+              <w:rPr>
+                <w:noProof/>
+                <w:webHidden/>
+              </w:rPr>
+              <w:t>5</w:t>
+            </w:r>
+            <w:r>
+              <w:rPr>
+                <w:noProof/>
+                <w:webHidden/>
+              </w:rPr>
+              <w:fldChar w:fldCharType="end"/>
+            </w:r>
+          </w:hyperlink>
+        </w:p>
+        <w:p>
+          <w:pPr>
+            <w:pStyle w:val="TOC2"/>
+            <w:tabs>
+              <w:tab w:val="right" w:leader="dot" w:pos="9016"/>
+            </w:tabs>
+            <w:rPr>
+              <w:rFonts w:eastAsiaTheme="minorEastAsia"/>
+              <w:noProof/>
+              <w:lang w:eastAsia="en-IE"/>
+            </w:rPr>
+          </w:pPr>
+          <w:hyperlink w:anchor="_Toc230521468" w:history="1">
+            <w:r>
+              <w:rPr>
+                <w:rStyle w:val="Hyperlink"/>
+                <w:rFonts w:ascii="Arial" w:hAnsi="Arial" w:cs="Arial"/>
+                <w:b/>
+                <w:bCs/>
+                <w:noProof/>
+              </w:rPr>
+              <w:t>Recommendation</w:t>
+            </w:r>
+            <w:r>
+              <w:rPr>
+                <w:noProof/>
+                <w:webHidden/>
+              </w:rPr>
+              <w:tab/>
+            </w:r>
+            <w:r>
+              <w:rPr>
+                <w:noProof/>
+                <w:webHidden/>
+              </w:rPr>
+              <w:fldChar w:fldCharType="begin"/>
+            </w:r>
+            <w:r>
+              <w:rPr>
+                <w:noProof/>
+                <w:webHidden/>
+              </w:rPr>
+              <w:instrText xml:space="preserve"> PAGEREF _Toc230521468 \h </w:instrText>
+            </w:r>
+            <w:r>
+              <w:rPr>
+                <w:noProof/>
+                <w:webHidden/>
+              </w:rPr>
+            </w:r>
+            <w:r>
+              <w:rPr>
+                <w:noProof/>
+                <w:webHidden/>
+              </w:rPr>
+              <w:fldChar w:fldCharType="separate"/>
+            </w:r>
+            <w:r>
+              <w:rPr>
+                <w:noProof/>
+                <w:webHidden/>
+              </w:rPr>
+              <w:t>5</w:t>
+            </w:r>
+            <w:r>
+              <w:rPr>
+                <w:noProof/>
+                <w:webHidden/>
+              </w:rPr>
+              <w:fldChar w:fldCharType="end"/>
+            </w:r>
+          </w:hyperlink>
+        </w:p>
+        <w:p>
+          <w:pPr>
+            <w:rPr>
+              <w:b/>
+              <w:bCs/>
+              <w:noProof/>
+            </w:rPr>
+          </w:pPr>
           <w:r>
             <w:rPr>
               <w:b/>
@@ -1329,6 +1978,7 @@
             <w:fldChar w:fldCharType="end"/>
           </w:r>
         </w:p>
+        <w:p/>
       </w:sdtContent>
     </w:sdt>
     <w:p>
@@ -1348,55 +1998,45 @@
     </w:p>
     <w:p>
       <w:pPr>
-        <w:pStyle w:val="Heading1"/>
-      </w:pPr>
-    </w:p>
-    <w:p>
-      <w:pPr>
-        <w:pStyle w:val="Heading1"/>
-      </w:pPr>
-    </w:p>
-    <w:p>
-      <w:pPr>
-        <w:pStyle w:val="Heading1"/>
-      </w:pPr>
-    </w:p>
-    <w:p>
-      <w:pPr>
-        <w:pStyle w:val="Heading1"/>
-      </w:pPr>
-    </w:p>
-    <w:p>
-      <w:pPr>
-        <w:pStyle w:val="Heading1"/>
-      </w:pPr>
-    </w:p>
-    <w:p>
-      <w:pPr>
-        <w:pStyle w:val="Heading1"/>
-      </w:pPr>
-    </w:p>
-    <w:p>
-      <w:pPr>
         <w:rPr>
           <w:rStyle w:val="Heading1Char"/>
           <w:rFonts w:ascii="Arial" w:hAnsi="Arial" w:cs="Arial"/>
         </w:rPr>
       </w:pPr>
-      <w:bookmarkStart w:id="0" w:name="_Toc230028886"/>
-    </w:p>
-    <w:p>
-      <w:pPr>
-        <w:rPr>
-          <w:rFonts w:ascii="Arial" w:hAnsi="Arial" w:cs="Arial"/>
+    </w:p>
+    <w:p>
+      <w:pPr>
+        <w:rPr>
+          <w:rStyle w:val="Heading1Char"/>
+          <w:rFonts w:ascii="Arial" w:hAnsi="Arial" w:cs="Arial"/>
+        </w:rPr>
+      </w:pPr>
+    </w:p>
+    <w:p>
+      <w:pPr>
+        <w:rPr>
+          <w:rStyle w:val="Heading1Char"/>
+          <w:rFonts w:ascii="Arial" w:hAnsi="Arial" w:cs="Arial"/>
+        </w:rPr>
+      </w:pPr>
+    </w:p>
+    <w:p>
+      <w:pPr>
+        <w:rPr>
+          <w:rFonts w:ascii="Arial" w:hAnsi="Arial" w:cs="Arial"/>
+          <w:b/>
+          <w:bCs/>
           <w:sz w:val="40"/>
           <w:szCs w:val="40"/>
         </w:rPr>
       </w:pPr>
+      <w:bookmarkStart w:id="0" w:name="_Toc230521452"/>
       <w:r>
         <w:rPr>
           <w:rStyle w:val="Heading1Char"/>
           <w:rFonts w:ascii="Arial" w:hAnsi="Arial" w:cs="Arial"/>
+          <w:b/>
+          <w:bCs/>
         </w:rPr>
         <w:lastRenderedPageBreak/>
         <w:t>Introduction</w:t>
@@ -1405,6 +2045,8 @@
       <w:r>
         <w:rPr>
           <w:rFonts w:ascii="Arial" w:hAnsi="Arial" w:cs="Arial"/>
+          <w:b/>
+          <w:bCs/>
           <w:sz w:val="40"/>
           <w:szCs w:val="40"/>
         </w:rPr>
@@ -1421,68 +2063,80 @@
         <w:rPr>
           <w:rFonts w:ascii="Arial" w:hAnsi="Arial" w:cs="Arial"/>
         </w:rPr>
-        <w:t>Big data refers to extremely large and diverse</w:t>
-      </w:r>
-      <w:r>
-        <w:rPr>
-          <w:rFonts w:ascii="Arial" w:hAnsi="Arial" w:cs="Arial"/>
-        </w:rPr>
-        <w:t xml:space="preserve"> raw data which is </w:t>
-      </w:r>
-      <w:r>
-        <w:rPr>
-          <w:rFonts w:ascii="Arial" w:hAnsi="Arial" w:cs="Arial"/>
-        </w:rPr>
-        <w:t>structured, semi-structured, and unstructured data</w:t>
-      </w:r>
-      <w:r>
-        <w:rPr>
-          <w:rFonts w:ascii="Arial" w:hAnsi="Arial" w:cs="Arial"/>
-        </w:rPr>
-        <w:t xml:space="preserve"> collected from verity of sources </w:t>
-      </w:r>
-      <w:r>
-        <w:rPr>
-          <w:rFonts w:ascii="Arial" w:hAnsi="Arial" w:cs="Arial"/>
-        </w:rPr>
-        <w:t>that grow rapidly over time. The continuous expansion of digital technologies has significantly increased both the volume and availability of data, making it difficult for traditional data management systems to efficiently store, process, and analy</w:t>
-      </w:r>
-      <w:r>
-        <w:rPr>
-          <w:rFonts w:ascii="Arial" w:hAnsi="Arial" w:cs="Arial"/>
-        </w:rPr>
-        <w:t>s</w:t>
-      </w:r>
-      <w:r>
-        <w:rPr>
-          <w:rFonts w:ascii="Arial" w:hAnsi="Arial" w:cs="Arial"/>
-        </w:rPr>
-        <w:t>e such datasets.</w:t>
-      </w:r>
-    </w:p>
-    <w:p>
-      <w:pPr>
-        <w:rPr>
-          <w:rFonts w:ascii="Arial" w:hAnsi="Arial" w:cs="Arial"/>
-        </w:rPr>
-      </w:pPr>
-      <w:r>
-        <w:rPr>
-          <w:rFonts w:ascii="Arial" w:hAnsi="Arial" w:cs="Arial"/>
-        </w:rPr>
-        <w:t>Big data technologies enable organizations to process and analy</w:t>
-      </w:r>
-      <w:r>
-        <w:rPr>
-          <w:rFonts w:ascii="Arial" w:hAnsi="Arial" w:cs="Arial"/>
-        </w:rPr>
-        <w:t>s</w:t>
-      </w:r>
-      <w:r>
-        <w:rPr>
-          <w:rFonts w:ascii="Arial" w:hAnsi="Arial" w:cs="Arial"/>
-        </w:rPr>
-        <w:t>e information in near real time, thereby improving decision-making, enhancing operational efficiency, and supporting predictive analysis. As a result, big data has become widely utilized across various industries for applications such as customer segmentation, fraud detection, and artificial intelligence training.</w:t>
+        <w:t xml:space="preserve">Big </w:t>
+      </w:r>
+      <w:r>
+        <w:rPr>
+          <w:rFonts w:ascii="Arial" w:hAnsi="Arial" w:cs="Arial"/>
+        </w:rPr>
+        <w:t xml:space="preserve">data refers to extremely large and diverse datasets, including structured, semi-structured, and unstructured data collected from multiple rapidly growing sources. As digital technologies expand, traditional systems struggle to store and analyse this data efficiently. </w:t>
+      </w:r>
+    </w:p>
+    <w:p>
+      <w:pPr>
+        <w:rPr>
+          <w:rFonts w:ascii="Arial" w:hAnsi="Arial" w:cs="Arial"/>
+        </w:rPr>
+      </w:pPr>
+      <w:r>
+        <w:rPr>
+          <w:rFonts w:ascii="Arial" w:hAnsi="Arial" w:cs="Arial"/>
+        </w:rPr>
+        <w:t>Big data technologies enable real-time processing, improving decision-making, efficiency, and predictive analytics across industries.</w:t>
+      </w:r>
+    </w:p>
+    <w:p>
+      <w:pPr>
+        <w:rPr>
+          <w:rFonts w:ascii="Arial" w:hAnsi="Arial" w:cs="Arial"/>
+        </w:rPr>
+      </w:pPr>
+      <w:r>
+        <w:rPr>
+          <w:rFonts w:ascii="Arial" w:hAnsi="Arial" w:cs="Arial"/>
+          <w:noProof/>
+        </w:rPr>
+        <w:drawing>
+          <wp:inline distT="0" distB="0" distL="0" distR="0" wp14:anchorId="7209BD84" wp14:editId="09C562F8">
+            <wp:extent cx="3835716" cy="2797628"/>
+            <wp:effectExtent l="0" t="0" r="0" b="3175"/>
+            <wp:docPr id="1665619175" name="Picture 5"/>
+            <wp:cNvGraphicFramePr>
+              <a:graphicFrameLocks xmlns:a="http://schemas.openxmlformats.org/drawingml/2006/main" noChangeAspect="1"/>
+            </wp:cNvGraphicFramePr>
+            <a:graphic xmlns:a="http://schemas.openxmlformats.org/drawingml/2006/main">
+              <a:graphicData uri="http://schemas.openxmlformats.org/drawingml/2006/picture">
+                <pic:pic xmlns:pic="http://schemas.openxmlformats.org/drawingml/2006/picture">
+                  <pic:nvPicPr>
+                    <pic:cNvPr id="1665619175" name="Picture 1665619175"/>
+                    <pic:cNvPicPr/>
+                  </pic:nvPicPr>
+                  <pic:blipFill>
+                    <a:blip r:embed="rId8" cstate="print">
+                      <a:extLst>
+                        <a:ext uri="{28A0092B-C50C-407E-A947-70E740481C1C}">
+                          <a14:useLocalDpi xmlns:a14="http://schemas.microsoft.com/office/drawing/2010/main" val="0"/>
+                        </a:ext>
+                      </a:extLst>
+                    </a:blip>
+                    <a:stretch>
+                      <a:fillRect/>
+                    </a:stretch>
+                  </pic:blipFill>
+                  <pic:spPr>
+                    <a:xfrm>
+                      <a:off x="0" y="0"/>
+                      <a:ext cx="3842965" cy="2802915"/>
+                    </a:xfrm>
+                    <a:prstGeom prst="rect">
+                      <a:avLst/>
+                    </a:prstGeom>
+                  </pic:spPr>
+                </pic:pic>
+              </a:graphicData>
+            </a:graphic>
+          </wp:inline>
+        </w:drawing>
       </w:r>
     </w:p>
     <w:p>
@@ -1497,15 +2151,19 @@
       <w:pPr>
         <w:rPr>
           <w:rFonts w:ascii="Arial" w:hAnsi="Arial" w:cs="Arial"/>
+          <w:b/>
+          <w:bCs/>
           <w:sz w:val="40"/>
           <w:szCs w:val="40"/>
         </w:rPr>
       </w:pPr>
-      <w:bookmarkStart w:id="1" w:name="_Toc230028887"/>
+      <w:bookmarkStart w:id="1" w:name="_Toc230521453"/>
       <w:r>
         <w:rPr>
           <w:rStyle w:val="Heading1Char"/>
           <w:rFonts w:ascii="Arial" w:hAnsi="Arial" w:cs="Arial"/>
+          <w:b/>
+          <w:bCs/>
         </w:rPr>
         <w:t>3 Vs of Big Data</w:t>
       </w:r>
@@ -1513,42 +2171,12 @@
       <w:r>
         <w:rPr>
           <w:rFonts w:ascii="Arial" w:hAnsi="Arial" w:cs="Arial"/>
+          <w:b/>
+          <w:bCs/>
           <w:sz w:val="40"/>
           <w:szCs w:val="40"/>
         </w:rPr>
         <w:t>:</w:t>
-      </w:r>
-    </w:p>
-    <w:p>
-      <w:pPr>
-        <w:rPr>
-          <w:rFonts w:ascii="Arial" w:hAnsi="Arial" w:cs="Arial"/>
-        </w:rPr>
-      </w:pPr>
-      <w:r>
-        <w:rPr>
-          <w:rFonts w:ascii="Arial" w:hAnsi="Arial" w:cs="Arial"/>
-        </w:rPr>
-        <w:t>B</w:t>
-      </w:r>
-      <w:r>
-        <w:rPr>
-          <w:rFonts w:ascii="Arial" w:hAnsi="Arial" w:cs="Arial"/>
-        </w:rPr>
-        <w:t>ig data can be explained by the characteristics referred as “3Vs of big data”.</w:t>
-      </w:r>
-    </w:p>
-    <w:p>
-      <w:pPr>
-        <w:rPr>
-          <w:rFonts w:ascii="Arial" w:hAnsi="Arial" w:cs="Arial"/>
-        </w:rPr>
-      </w:pPr>
-      <w:r>
-        <w:rPr>
-          <w:rFonts w:ascii="Arial" w:hAnsi="Arial" w:cs="Arial"/>
-        </w:rPr>
-        <w:t>The 3Vs of the Big Data model help explain the challenges of today’s large digital world. In today’s technology-driven world, almost every action, interaction, and transaction creates data, so understanding this data has become very important.</w:t>
       </w:r>
     </w:p>
     <w:p>
@@ -1565,51 +2193,7 @@
         <w:rPr>
           <w:rFonts w:ascii="Arial" w:hAnsi="Arial" w:cs="Arial"/>
         </w:rPr>
-        <w:t xml:space="preserve">The 3 Vs </w:t>
-      </w:r>
-      <w:r>
-        <w:rPr>
-          <w:rFonts w:ascii="Arial" w:hAnsi="Arial" w:cs="Arial"/>
-        </w:rPr>
-        <w:t>refers to</w:t>
-      </w:r>
-      <w:r>
-        <w:rPr>
-          <w:rFonts w:ascii="Arial" w:hAnsi="Arial" w:cs="Arial"/>
-        </w:rPr>
-        <w:t xml:space="preserve"> Volume, Velocity and Verity</w:t>
-      </w:r>
-      <w:r>
-        <w:rPr>
-          <w:rFonts w:ascii="Arial" w:hAnsi="Arial" w:cs="Arial"/>
-        </w:rPr>
-        <w:t xml:space="preserve"> define the </w:t>
-      </w:r>
-      <w:proofErr w:type="gramStart"/>
-      <w:r>
-        <w:rPr>
-          <w:rFonts w:ascii="Arial" w:hAnsi="Arial" w:cs="Arial"/>
-        </w:rPr>
-        <w:t>large scale</w:t>
-      </w:r>
-      <w:proofErr w:type="gramEnd"/>
-      <w:r>
-        <w:rPr>
-          <w:rFonts w:ascii="Arial" w:hAnsi="Arial" w:cs="Arial"/>
-        </w:rPr>
-        <w:t xml:space="preserve"> data </w:t>
-      </w:r>
-      <w:r>
-        <w:rPr>
-          <w:rFonts w:ascii="Arial" w:hAnsi="Arial" w:cs="Arial"/>
-        </w:rPr>
-        <w:t>challenges</w:t>
-      </w:r>
-      <w:r>
-        <w:rPr>
-          <w:rFonts w:ascii="Arial" w:hAnsi="Arial" w:cs="Arial"/>
-        </w:rPr>
-        <w:t>.</w:t>
+        <w:t>Big data can be explained using the “3 Vs model,” which describes the main challenges of managing large-scale digital data in today’s technology-driven world. As almost every online action, interaction, and transaction generates data, understanding and managing it has become increasingly important.</w:t>
       </w:r>
     </w:p>
     <w:p>
@@ -1619,7 +2203,7 @@
           <w:rFonts w:ascii="Arial" w:hAnsi="Arial" w:cs="Arial"/>
         </w:rPr>
       </w:pPr>
-      <w:bookmarkStart w:id="2" w:name="_Toc230028888"/>
+      <w:bookmarkStart w:id="2" w:name="_Toc230521454"/>
       <w:r>
         <w:rPr>
           <w:rStyle w:val="Heading1Char"/>
@@ -1641,20 +2225,19 @@
         <w:rPr>
           <w:rFonts w:ascii="Arial" w:hAnsi="Arial" w:cs="Arial"/>
         </w:rPr>
-        <w:t xml:space="preserve">Volume refers to the huge amount of data that is continuously generated and collected from various sources and devices. </w:t>
-      </w:r>
-    </w:p>
-    <w:p>
-      <w:pPr>
-        <w:rPr>
-          <w:rFonts w:ascii="Arial" w:hAnsi="Arial" w:cs="Arial"/>
-        </w:rPr>
-      </w:pPr>
-      <w:r>
-        <w:rPr>
-          <w:rFonts w:ascii="Arial" w:hAnsi="Arial" w:cs="Arial"/>
-        </w:rPr>
-        <w:t>Today, organizations handle data in terabytes and petabytes, which is a significant increase compared to the earlier scale of gigabytes. This rapid growth is driven by sources such as IoT devices, online shopping platforms, and mobile applications.</w:t>
+        <w:t xml:space="preserve">Volume </w:t>
+      </w:r>
+      <w:r>
+        <w:rPr>
+          <w:rFonts w:ascii="Arial" w:hAnsi="Arial" w:cs="Arial"/>
+        </w:rPr>
+        <w:t>r</w:t>
+      </w:r>
+      <w:r>
+        <w:rPr>
+          <w:rFonts w:ascii="Arial" w:hAnsi="Arial" w:cs="Arial"/>
+        </w:rPr>
+        <w:t>efers to the vast amount of data generated from multiple sources such as IoT devices, mobile apps, and online platforms. Organizations now manage data in terabytes and petabytes, a major increase from earlier gigabyte-scale systems.</w:t>
       </w:r>
     </w:p>
     <w:p>
@@ -1664,7 +2247,7 @@
           <w:rFonts w:ascii="Arial" w:hAnsi="Arial" w:cs="Arial"/>
         </w:rPr>
       </w:pPr>
-      <w:bookmarkStart w:id="3" w:name="_Toc230028889"/>
+      <w:bookmarkStart w:id="3" w:name="_Toc230521455"/>
       <w:r>
         <w:rPr>
           <w:rStyle w:val="Heading1Char"/>
@@ -1719,20 +2302,13 @@
         <w:rPr>
           <w:rFonts w:ascii="Arial" w:hAnsi="Arial" w:cs="Arial"/>
         </w:rPr>
-        <w:t xml:space="preserve">elocity in big data refers to the speed at which data is created, processed, and made available for use. </w:t>
-      </w:r>
-    </w:p>
-    <w:p>
-      <w:pPr>
-        <w:rPr>
-          <w:rFonts w:ascii="Arial" w:hAnsi="Arial" w:cs="Arial"/>
-        </w:rPr>
-      </w:pPr>
-      <w:r>
-        <w:rPr>
-          <w:rFonts w:ascii="Arial" w:hAnsi="Arial" w:cs="Arial"/>
-        </w:rPr>
-        <w:t>In today’s digital age, data is not only increasing in size but also moving at very high speeds due to factors such as the large number of digital transactions, real-time analytics, social media activity, and the use of IoT devices.</w:t>
+        <w:t xml:space="preserve">elocity </w:t>
+      </w:r>
+      <w:r>
+        <w:rPr>
+          <w:rFonts w:ascii="Arial" w:hAnsi="Arial" w:cs="Arial"/>
+        </w:rPr>
+        <w:t>describes the speed at which data is created, processed, and analysed. With real-time systems, social media activity, digital transactions, and IoT devices, data is continuously generated at extremely high speed, requiring fast processing for timely insights.</w:t>
       </w:r>
     </w:p>
     <w:p>
@@ -1749,7 +2325,7 @@
           <w:rFonts w:ascii="Arial" w:hAnsi="Arial" w:cs="Arial"/>
         </w:rPr>
       </w:pPr>
-      <w:bookmarkStart w:id="4" w:name="_Toc230028890"/>
+      <w:bookmarkStart w:id="4" w:name="_Toc230521456"/>
       <w:r>
         <w:rPr>
           <w:rStyle w:val="Heading1Char"/>
@@ -1757,7 +2333,6 @@
           <w:sz w:val="32"/>
           <w:szCs w:val="32"/>
         </w:rPr>
-        <w:lastRenderedPageBreak/>
         <w:t>V</w:t>
       </w:r>
       <w:r>
@@ -1790,41 +2365,112 @@
         <w:rPr>
           <w:rFonts w:ascii="Arial" w:hAnsi="Arial" w:cs="Arial"/>
         </w:rPr>
-        <w:t xml:space="preserve">Variety refers to the different types of data that organizations handle, including structured data such as spreadsheets and relational databases, </w:t>
-      </w:r>
-      <w:r>
-        <w:rPr>
-          <w:rFonts w:ascii="Arial" w:hAnsi="Arial" w:cs="Arial"/>
-        </w:rPr>
-        <w:t xml:space="preserve">semi structured data like XML files </w:t>
-      </w:r>
-      <w:r>
-        <w:rPr>
-          <w:rFonts w:ascii="Arial" w:hAnsi="Arial" w:cs="Arial"/>
-        </w:rPr>
-        <w:t>as well as unstructured data like text, images, audio, video files, and sensor-generated data. This data is generally categorized into structured, semi-structured, and unstructured forms.</w:t>
-      </w:r>
-    </w:p>
-    <w:p>
-      <w:pPr>
-        <w:rPr>
-          <w:rFonts w:ascii="Arial" w:hAnsi="Arial" w:cs="Arial"/>
-        </w:rPr>
-      </w:pPr>
-    </w:p>
-    <w:p>
-      <w:pPr>
-        <w:rPr>
-          <w:rFonts w:ascii="Arial" w:hAnsi="Arial" w:cs="Arial"/>
+        <w:t xml:space="preserve">Variety </w:t>
+      </w:r>
+      <w:r>
+        <w:rPr>
+          <w:rFonts w:ascii="Arial" w:hAnsi="Arial" w:cs="Arial"/>
+        </w:rPr>
+        <w:t>r</w:t>
+      </w:r>
+      <w:r>
+        <w:rPr>
+          <w:rFonts w:ascii="Arial" w:hAnsi="Arial" w:cs="Arial"/>
+        </w:rPr>
+        <w:t>efers to the different types of data handled by organizations. This includes structured data like tables and databases, semi-structured data such as XML files, and unstructured data like images, videos, audio, and text</w:t>
+      </w:r>
+      <w:r>
+        <w:rPr>
+          <w:rFonts w:ascii="Arial" w:hAnsi="Arial" w:cs="Arial"/>
+        </w:rPr>
+        <w:t>.</w:t>
+      </w:r>
+    </w:p>
+    <w:p>
+      <w:pPr>
+        <w:rPr>
+          <w:rFonts w:ascii="Arial" w:hAnsi="Arial" w:cs="Arial"/>
+        </w:rPr>
+      </w:pPr>
+    </w:p>
+    <w:p>
+      <w:pPr>
+        <w:rPr>
+          <w:rFonts w:ascii="Arial" w:hAnsi="Arial" w:cs="Arial"/>
+        </w:rPr>
+      </w:pPr>
+      <w:r>
+        <w:rPr>
+          <w:rFonts w:ascii="Arial" w:hAnsi="Arial" w:cs="Arial"/>
+          <w:noProof/>
+        </w:rPr>
+        <w:drawing>
+          <wp:inline distT="0" distB="0" distL="0" distR="0" wp14:anchorId="60AE92EF" wp14:editId="429FFC78">
+            <wp:extent cx="4140986" cy="2579370"/>
+            <wp:effectExtent l="0" t="0" r="0" b="0"/>
+            <wp:docPr id="1646605404" name="Picture 4"/>
+            <wp:cNvGraphicFramePr>
+              <a:graphicFrameLocks xmlns:a="http://schemas.openxmlformats.org/drawingml/2006/main" noChangeAspect="1"/>
+            </wp:cNvGraphicFramePr>
+            <a:graphic xmlns:a="http://schemas.openxmlformats.org/drawingml/2006/main">
+              <a:graphicData uri="http://schemas.openxmlformats.org/drawingml/2006/picture">
+                <pic:pic xmlns:pic="http://schemas.openxmlformats.org/drawingml/2006/picture">
+                  <pic:nvPicPr>
+                    <pic:cNvPr id="1646605404" name="Picture 1646605404"/>
+                    <pic:cNvPicPr/>
+                  </pic:nvPicPr>
+                  <pic:blipFill>
+                    <a:blip r:embed="rId9" cstate="print">
+                      <a:extLst>
+                        <a:ext uri="{28A0092B-C50C-407E-A947-70E740481C1C}">
+                          <a14:useLocalDpi xmlns:a14="http://schemas.microsoft.com/office/drawing/2010/main" val="0"/>
+                        </a:ext>
+                      </a:extLst>
+                    </a:blip>
+                    <a:stretch>
+                      <a:fillRect/>
+                    </a:stretch>
+                  </pic:blipFill>
+                  <pic:spPr>
+                    <a:xfrm>
+                      <a:off x="0" y="0"/>
+                      <a:ext cx="4147175" cy="2583225"/>
+                    </a:xfrm>
+                    <a:prstGeom prst="rect">
+                      <a:avLst/>
+                    </a:prstGeom>
+                  </pic:spPr>
+                </pic:pic>
+              </a:graphicData>
+            </a:graphic>
+          </wp:inline>
+        </w:drawing>
+      </w:r>
+    </w:p>
+    <w:p>
+      <w:pPr>
+        <w:rPr>
+          <w:rFonts w:ascii="Arial" w:hAnsi="Arial" w:cs="Arial"/>
+        </w:rPr>
+      </w:pPr>
+    </w:p>
+    <w:p>
+      <w:pPr>
+        <w:rPr>
+          <w:rFonts w:ascii="Arial" w:hAnsi="Arial" w:cs="Arial"/>
+          <w:b/>
+          <w:bCs/>
           <w:sz w:val="40"/>
           <w:szCs w:val="40"/>
         </w:rPr>
       </w:pPr>
-      <w:bookmarkStart w:id="5" w:name="_Toc230028891"/>
+      <w:bookmarkStart w:id="5" w:name="_Toc230521457"/>
       <w:r>
         <w:rPr>
           <w:rStyle w:val="Heading1Char"/>
           <w:rFonts w:ascii="Arial" w:hAnsi="Arial" w:cs="Arial"/>
+          <w:b/>
+          <w:bCs/>
         </w:rPr>
         <w:t>Challenges of Big Data</w:t>
       </w:r>
@@ -1832,6 +2478,8 @@
       <w:r>
         <w:rPr>
           <w:rFonts w:ascii="Arial" w:hAnsi="Arial" w:cs="Arial"/>
+          <w:b/>
+          <w:bCs/>
           <w:sz w:val="40"/>
           <w:szCs w:val="40"/>
         </w:rPr>
@@ -1848,49 +2496,36 @@
         <w:rPr>
           <w:rFonts w:ascii="Arial" w:hAnsi="Arial" w:cs="Arial"/>
         </w:rPr>
-        <w:t xml:space="preserve">In organizations such as </w:t>
+        <w:t xml:space="preserve">In organizations </w:t>
+      </w:r>
+      <w:bookmarkStart w:id="6" w:name="_Toc230521458"/>
+      <w:r>
+        <w:rPr>
+          <w:rFonts w:ascii="Arial" w:hAnsi="Arial" w:cs="Arial"/>
+        </w:rPr>
+        <w:t xml:space="preserve">such as </w:t>
       </w:r>
       <w:proofErr w:type="spellStart"/>
       <w:r>
         <w:rPr>
           <w:rFonts w:ascii="Arial" w:hAnsi="Arial" w:cs="Arial"/>
         </w:rPr>
-        <w:t>Ire</w:t>
-      </w:r>
-      <w:r>
-        <w:rPr>
-          <w:rFonts w:ascii="Arial" w:hAnsi="Arial" w:cs="Arial"/>
-        </w:rPr>
-        <w:t>flix</w:t>
+        <w:t>Ireflix</w:t>
       </w:r>
       <w:proofErr w:type="spellEnd"/>
       <w:r>
         <w:rPr>
           <w:rFonts w:ascii="Arial" w:hAnsi="Arial" w:cs="Arial"/>
         </w:rPr>
-        <w:t>, which collect and store data from over 50 million users, there are several challenges associated with large-scale data collection. These include data storage requirements,</w:t>
-      </w:r>
-      <w:r>
-        <w:rPr>
-          <w:rFonts w:ascii="Arial" w:hAnsi="Arial" w:cs="Arial"/>
-        </w:rPr>
-        <w:t xml:space="preserve"> data validation,</w:t>
-      </w:r>
-      <w:r>
-        <w:rPr>
-          <w:rFonts w:ascii="Arial" w:hAnsi="Arial" w:cs="Arial"/>
-        </w:rPr>
-        <w:t xml:space="preserve"> the speed of data processing, privacy concerns, the need for specialized skills, and the overall costs involved.</w:t>
-      </w:r>
-    </w:p>
-    <w:p>
-      <w:pPr>
-        <w:pStyle w:val="Heading2"/>
-        <w:rPr>
-          <w:rFonts w:ascii="Arial" w:hAnsi="Arial" w:cs="Arial"/>
-        </w:rPr>
-      </w:pPr>
-      <w:bookmarkStart w:id="6" w:name="_Toc230028892"/>
+        <w:t>, which collect data from over 50 million users, face several challenges in managing large-scale data. These include storage requirements, data validation, processing speed, privacy concerns, skill shortages, and high costs.</w:t>
+      </w:r>
+    </w:p>
+    <w:p>
+      <w:pPr>
+        <w:rPr>
+          <w:rFonts w:ascii="Arial" w:hAnsi="Arial" w:cs="Arial"/>
+        </w:rPr>
+      </w:pPr>
       <w:r>
         <w:rPr>
           <w:rStyle w:val="Heading1Char"/>
@@ -1930,58 +2565,42 @@
         <w:rPr>
           <w:rFonts w:ascii="Arial" w:hAnsi="Arial" w:cs="Arial"/>
         </w:rPr>
-        <w:t xml:space="preserve">Processing large datasets can be both time-consuming and </w:t>
-      </w:r>
+        <w:t>Data p</w:t>
+      </w:r>
+      <w:r>
+        <w:rPr>
+          <w:rFonts w:ascii="Arial" w:hAnsi="Arial" w:cs="Arial"/>
+        </w:rPr>
+        <w:t xml:space="preserve">rocessing </w:t>
+      </w:r>
+      <w:r>
+        <w:rPr>
+          <w:rFonts w:ascii="Arial" w:hAnsi="Arial" w:cs="Arial"/>
+        </w:rPr>
+        <w:t xml:space="preserve">is a major challenge, as large datasets are continuously growing and changing. It requires strong infrastructure for storage, networking, processing, and security, making efficient management difficult and resource </w:t>
+      </w:r>
+      <w:proofErr w:type="spellStart"/>
       <w:proofErr w:type="gramStart"/>
       <w:r>
         <w:rPr>
           <w:rFonts w:ascii="Arial" w:hAnsi="Arial" w:cs="Arial"/>
         </w:rPr>
-        <w:t>memory-intensive</w:t>
+        <w:t>intensiv</w:t>
+      </w:r>
+      <w:proofErr w:type="spellEnd"/>
+      <w:r>
+        <w:rPr>
+          <w:rFonts w:ascii="Arial" w:hAnsi="Arial" w:cs="Arial"/>
+        </w:rPr>
+        <w:t>.</w:t>
+      </w:r>
+      <w:r>
+        <w:rPr>
+          <w:rFonts w:ascii="Arial" w:hAnsi="Arial" w:cs="Arial"/>
+        </w:rPr>
+        <w:t>.</w:t>
       </w:r>
       <w:proofErr w:type="gramEnd"/>
-      <w:r>
-        <w:rPr>
-          <w:rFonts w:ascii="Arial" w:hAnsi="Arial" w:cs="Arial"/>
-        </w:rPr>
-        <w:t>. By nature, big data is continuously growing and changing at a rapid pace.</w:t>
-      </w:r>
-      <w:r>
-        <w:rPr>
-          <w:rFonts w:ascii="Arial" w:hAnsi="Arial" w:cs="Arial"/>
-        </w:rPr>
-        <w:t xml:space="preserve"> A</w:t>
-      </w:r>
-      <w:r>
-        <w:rPr>
-          <w:rFonts w:ascii="Arial" w:hAnsi="Arial" w:cs="Arial"/>
-        </w:rPr>
-        <w:t xml:space="preserve"> </w:t>
-      </w:r>
-      <w:r>
-        <w:rPr>
-          <w:rFonts w:ascii="Arial" w:hAnsi="Arial" w:cs="Arial"/>
-        </w:rPr>
-        <w:t>sound</w:t>
-      </w:r>
-      <w:r>
-        <w:rPr>
-          <w:rFonts w:ascii="Arial" w:hAnsi="Arial" w:cs="Arial"/>
-        </w:rPr>
-        <w:t xml:space="preserve"> infrastructure </w:t>
-      </w:r>
-      <w:r>
-        <w:rPr>
-          <w:rFonts w:ascii="Arial" w:hAnsi="Arial" w:cs="Arial"/>
-        </w:rPr>
-        <w:t xml:space="preserve">is required to </w:t>
-      </w:r>
-      <w:r>
-        <w:rPr>
-          <w:rFonts w:ascii="Arial" w:hAnsi="Arial" w:cs="Arial"/>
-        </w:rPr>
-        <w:t>effectively support processing, storage, networking, and security requirements, it becomes highly challenging to manage and maintain such data efficiently.</w:t>
-      </w:r>
     </w:p>
     <w:p>
       <w:pPr>
@@ -1990,7 +2609,7 @@
           <w:rFonts w:ascii="Arial" w:hAnsi="Arial" w:cs="Arial"/>
         </w:rPr>
       </w:pPr>
-      <w:bookmarkStart w:id="7" w:name="_Toc230028893"/>
+      <w:bookmarkStart w:id="7" w:name="_Toc230521459"/>
       <w:r>
         <w:rPr>
           <w:rStyle w:val="Heading1Char"/>
@@ -2021,30 +2640,1175 @@
         <w:rPr>
           <w:rFonts w:ascii="Arial" w:hAnsi="Arial" w:cs="Arial"/>
         </w:rPr>
-        <w:t>Big data typically involves large volumes of sensitive information, which makes it highly vulnerable and a potential target for cyberattacks and malicious actors.</w:t>
-      </w:r>
-    </w:p>
-    <w:p>
-      <w:pPr>
-        <w:rPr>
-          <w:rFonts w:ascii="Arial" w:hAnsi="Arial" w:cs="Arial"/>
-        </w:rPr>
-      </w:pPr>
-      <w:r>
-        <w:rPr>
-          <w:rFonts w:ascii="Arial" w:hAnsi="Arial" w:cs="Arial"/>
-        </w:rPr>
-        <w:t>This also creates challenges in consistently ensuring that data processing and storage comply with privacy regulations, including data localization and data residency requirements.</w:t>
-      </w:r>
-    </w:p>
-    <w:p>
-      <w:pPr>
-        <w:rPr>
-          <w:rFonts w:ascii="Arial" w:hAnsi="Arial" w:cs="Arial"/>
-          <w:sz w:val="32"/>
-          <w:szCs w:val="32"/>
-        </w:rPr>
-      </w:pPr>
+        <w:t xml:space="preserve">Dat security </w:t>
+      </w:r>
+      <w:r>
+        <w:rPr>
+          <w:rFonts w:ascii="Arial" w:hAnsi="Arial" w:cs="Arial"/>
+        </w:rPr>
+        <w:t>is another key issue because big data often contains sensitive information, making it a target for cyberattacks. Organizations must ensure strong protection measures while also complying with data privacy regulations, including data residency and localization laws.</w:t>
+      </w:r>
+    </w:p>
+    <w:p>
+      <w:pPr>
+        <w:rPr>
+          <w:rFonts w:ascii="Arial" w:hAnsi="Arial" w:cs="Arial"/>
+        </w:rPr>
+      </w:pPr>
+      <w:r>
+        <w:rPr>
+          <w:rFonts w:ascii="Arial" w:hAnsi="Arial" w:cs="Arial"/>
+        </w:rPr>
+        <w:t>Overall, handling big data requires advanced systems and careful management to ensure efficiency, security, and compliance.</w:t>
+      </w:r>
+    </w:p>
+    <w:p>
+      <w:pPr>
+        <w:rPr>
+          <w:rFonts w:ascii="Arial" w:hAnsi="Arial" w:cs="Arial"/>
+        </w:rPr>
+      </w:pPr>
+    </w:p>
+    <w:p>
+      <w:pPr>
+        <w:rPr>
+          <w:rFonts w:ascii="Arial" w:hAnsi="Arial" w:cs="Arial"/>
+        </w:rPr>
+      </w:pPr>
+    </w:p>
+    <w:p>
+      <w:pPr>
+        <w:rPr>
+          <w:rFonts w:ascii="Arial" w:hAnsi="Arial" w:cs="Arial"/>
+          <w:b/>
+          <w:bCs/>
+          <w:sz w:val="40"/>
+          <w:szCs w:val="40"/>
+        </w:rPr>
+      </w:pPr>
+      <w:bookmarkStart w:id="8" w:name="_Toc230521460"/>
+      <w:r>
+        <w:rPr>
+          <w:rStyle w:val="Heading1Char"/>
+          <w:rFonts w:ascii="Arial" w:hAnsi="Arial" w:cs="Arial"/>
+          <w:b/>
+          <w:bCs/>
+        </w:rPr>
+        <w:t xml:space="preserve">Horizontal Vs </w:t>
+      </w:r>
+      <w:r>
+        <w:rPr>
+          <w:rStyle w:val="Heading1Char"/>
+          <w:rFonts w:ascii="Arial" w:hAnsi="Arial" w:cs="Arial"/>
+          <w:b/>
+          <w:bCs/>
+        </w:rPr>
+        <w:t>Vertical</w:t>
+      </w:r>
+      <w:r>
+        <w:rPr>
+          <w:rStyle w:val="Heading1Char"/>
+          <w:rFonts w:ascii="Arial" w:hAnsi="Arial" w:cs="Arial"/>
+          <w:b/>
+          <w:bCs/>
+        </w:rPr>
+        <w:t xml:space="preserve"> Scaling</w:t>
+      </w:r>
+      <w:bookmarkEnd w:id="8"/>
+      <w:r>
+        <w:rPr>
+          <w:rFonts w:ascii="Arial" w:hAnsi="Arial" w:cs="Arial"/>
+          <w:b/>
+          <w:bCs/>
+          <w:sz w:val="40"/>
+          <w:szCs w:val="40"/>
+        </w:rPr>
+        <w:t>:</w:t>
+      </w:r>
+    </w:p>
+    <w:p>
+      <w:pPr>
+        <w:rPr>
+          <w:rFonts w:ascii="Arial" w:hAnsi="Arial" w:cs="Arial"/>
+        </w:rPr>
+      </w:pPr>
+      <w:r>
+        <w:rPr>
+          <w:rFonts w:ascii="Arial" w:hAnsi="Arial" w:cs="Arial"/>
+        </w:rPr>
+        <w:t xml:space="preserve">Vertical scaling (“scaling up”) increases the resources of a single machine by upgrading CPU, RAM, or storage to improve performance and handle growing data needs. </w:t>
+      </w:r>
+    </w:p>
+    <w:p>
+      <w:pPr>
+        <w:rPr>
+          <w:rFonts w:ascii="Arial" w:hAnsi="Arial" w:cs="Arial"/>
+        </w:rPr>
+      </w:pPr>
+      <w:r>
+        <w:rPr>
+          <w:rFonts w:ascii="Arial" w:hAnsi="Arial" w:cs="Arial"/>
+        </w:rPr>
+        <w:t xml:space="preserve">Horizontal scaling (“scaling out”) adds more machines to distribute workload and expand capacity and processing power. </w:t>
+      </w:r>
+    </w:p>
+    <w:p>
+      <w:pPr>
+        <w:rPr>
+          <w:rFonts w:ascii="Arial" w:hAnsi="Arial" w:cs="Arial"/>
+        </w:rPr>
+      </w:pPr>
+      <w:r>
+        <w:rPr>
+          <w:rFonts w:ascii="Arial" w:hAnsi="Arial" w:cs="Arial"/>
+        </w:rPr>
+        <w:t>Vertical scaling is simpler but limited by a single server’s maximum capacity. Horizontal scaling is more scalable, offering predictable costs, better performance, and improved user experience.</w:t>
+      </w:r>
+      <w:r>
+        <w:rPr>
+          <w:rFonts w:ascii="Arial" w:hAnsi="Arial" w:cs="Arial"/>
+          <w:noProof/>
+        </w:rPr>
+        <w:drawing>
+          <wp:inline distT="0" distB="0" distL="0" distR="0" wp14:anchorId="61EA504B" wp14:editId="30C729EC">
+            <wp:extent cx="5731510" cy="2018030"/>
+            <wp:effectExtent l="0" t="0" r="2540" b="1270"/>
+            <wp:docPr id="1404958638" name="Picture 2"/>
+            <wp:cNvGraphicFramePr>
+              <a:graphicFrameLocks xmlns:a="http://schemas.openxmlformats.org/drawingml/2006/main" noChangeAspect="1"/>
+            </wp:cNvGraphicFramePr>
+            <a:graphic xmlns:a="http://schemas.openxmlformats.org/drawingml/2006/main">
+              <a:graphicData uri="http://schemas.openxmlformats.org/drawingml/2006/picture">
+                <pic:pic xmlns:pic="http://schemas.openxmlformats.org/drawingml/2006/picture">
+                  <pic:nvPicPr>
+                    <pic:cNvPr id="1404958638" name="Picture 1404958638"/>
+                    <pic:cNvPicPr/>
+                  </pic:nvPicPr>
+                  <pic:blipFill>
+                    <a:blip r:embed="rId10" cstate="print">
+                      <a:extLst>
+                        <a:ext uri="{28A0092B-C50C-407E-A947-70E740481C1C}">
+                          <a14:useLocalDpi xmlns:a14="http://schemas.microsoft.com/office/drawing/2010/main" val="0"/>
+                        </a:ext>
+                      </a:extLst>
+                    </a:blip>
+                    <a:stretch>
+                      <a:fillRect/>
+                    </a:stretch>
+                  </pic:blipFill>
+                  <pic:spPr>
+                    <a:xfrm>
+                      <a:off x="0" y="0"/>
+                      <a:ext cx="5731510" cy="2018030"/>
+                    </a:xfrm>
+                    <a:prstGeom prst="rect">
+                      <a:avLst/>
+                    </a:prstGeom>
+                  </pic:spPr>
+                </pic:pic>
+              </a:graphicData>
+            </a:graphic>
+          </wp:inline>
+        </w:drawing>
+      </w:r>
+      <w:r>
+        <w:rPr>
+          <w:rFonts w:ascii="Arial" w:hAnsi="Arial" w:cs="Arial"/>
+        </w:rPr>
+        <w:t xml:space="preserve"> </w:t>
+      </w:r>
+    </w:p>
+    <w:p>
+      <w:bookmarkStart w:id="9" w:name="_Toc230521461"/>
+      <w:r>
+        <w:rPr>
+          <w:rStyle w:val="Heading2Char"/>
+          <w:rFonts w:ascii="Arial" w:hAnsi="Arial" w:cs="Arial"/>
+          <w:b/>
+          <w:bCs/>
+        </w:rPr>
+        <w:t>Key Differences</w:t>
+      </w:r>
+      <w:r>
+        <w:rPr>
+          <w:rStyle w:val="Heading2Char"/>
+          <w:rFonts w:ascii="Arial" w:hAnsi="Arial" w:cs="Arial"/>
+          <w:b/>
+          <w:bCs/>
+        </w:rPr>
+        <w:t xml:space="preserve"> Between Vertical and Horizontal Scaling</w:t>
+      </w:r>
+      <w:bookmarkEnd w:id="9"/>
+      <w:r>
+        <w:t>:</w:t>
+      </w:r>
+    </w:p>
+    <w:p>
+      <w:pPr>
+        <w:pStyle w:val="Heading3"/>
+        <w:rPr>
+          <w:rFonts w:ascii="Arial" w:hAnsi="Arial" w:cs="Arial"/>
+          <w:color w:val="auto"/>
+        </w:rPr>
+      </w:pPr>
+      <w:bookmarkStart w:id="10" w:name="_Toc230521462"/>
+      <w:r>
+        <w:rPr>
+          <w:rFonts w:ascii="Arial" w:hAnsi="Arial" w:cs="Arial"/>
+          <w:color w:val="auto"/>
+        </w:rPr>
+        <w:t>Scalability</w:t>
+      </w:r>
+      <w:bookmarkEnd w:id="10"/>
+      <w:r>
+        <w:rPr>
+          <w:rFonts w:ascii="Arial" w:hAnsi="Arial" w:cs="Arial"/>
+          <w:color w:val="auto"/>
+        </w:rPr>
+        <w:t xml:space="preserve"> </w:t>
+      </w:r>
+    </w:p>
+    <w:p>
+      <w:pPr>
+        <w:numPr>
+          <w:ilvl w:val="0"/>
+          <w:numId w:val="1"/>
+        </w:numPr>
+      </w:pPr>
+      <w:r>
+        <w:t xml:space="preserve">Vertical: Limited by the maximum capacity of a single machine and upgrade options. </w:t>
+      </w:r>
+    </w:p>
+    <w:p>
+      <w:pPr>
+        <w:numPr>
+          <w:ilvl w:val="0"/>
+          <w:numId w:val="1"/>
+        </w:numPr>
+      </w:pPr>
+      <w:r>
+        <w:t xml:space="preserve">Horizontal: Highly scalable by adding more machines as needed. </w:t>
+      </w:r>
+    </w:p>
+    <w:p>
+      <w:pPr>
+        <w:pStyle w:val="Heading3"/>
+        <w:rPr>
+          <w:rFonts w:ascii="Arial" w:hAnsi="Arial" w:cs="Arial"/>
+          <w:color w:val="auto"/>
+        </w:rPr>
+      </w:pPr>
+      <w:bookmarkStart w:id="11" w:name="_Toc230521463"/>
+      <w:r>
+        <w:rPr>
+          <w:rFonts w:ascii="Arial" w:hAnsi="Arial" w:cs="Arial"/>
+          <w:color w:val="auto"/>
+        </w:rPr>
+        <w:t>System resiliency</w:t>
+      </w:r>
+      <w:bookmarkEnd w:id="11"/>
+      <w:r>
+        <w:rPr>
+          <w:rFonts w:ascii="Arial" w:hAnsi="Arial" w:cs="Arial"/>
+          <w:color w:val="auto"/>
+        </w:rPr>
+        <w:t xml:space="preserve"> </w:t>
+      </w:r>
+    </w:p>
+    <w:p>
+      <w:pPr>
+        <w:numPr>
+          <w:ilvl w:val="0"/>
+          <w:numId w:val="2"/>
+        </w:numPr>
+      </w:pPr>
+      <w:r>
+        <w:t xml:space="preserve">Vertical: Higher risk of downtime since everything depends on one machine. </w:t>
+      </w:r>
+    </w:p>
+    <w:p>
+      <w:pPr>
+        <w:numPr>
+          <w:ilvl w:val="0"/>
+          <w:numId w:val="2"/>
+        </w:numPr>
+      </w:pPr>
+      <w:r>
+        <w:t xml:space="preserve">Horizontal: More resilient, as workload is shared across multiple machines. </w:t>
+      </w:r>
+    </w:p>
+    <w:p>
+      <w:pPr>
+        <w:pStyle w:val="Heading3"/>
+        <w:rPr>
+          <w:rFonts w:ascii="Arial" w:hAnsi="Arial" w:cs="Arial"/>
+          <w:color w:val="auto"/>
+        </w:rPr>
+      </w:pPr>
+      <w:bookmarkStart w:id="12" w:name="_Toc230521464"/>
+      <w:r>
+        <w:rPr>
+          <w:rFonts w:ascii="Arial" w:hAnsi="Arial" w:cs="Arial"/>
+          <w:color w:val="auto"/>
+        </w:rPr>
+        <w:t>Complexity</w:t>
+      </w:r>
+      <w:bookmarkEnd w:id="12"/>
+      <w:r>
+        <w:rPr>
+          <w:rFonts w:ascii="Arial" w:hAnsi="Arial" w:cs="Arial"/>
+          <w:color w:val="auto"/>
+        </w:rPr>
+        <w:t xml:space="preserve"> </w:t>
+      </w:r>
+    </w:p>
+    <w:p>
+      <w:pPr>
+        <w:numPr>
+          <w:ilvl w:val="0"/>
+          <w:numId w:val="3"/>
+        </w:numPr>
+      </w:pPr>
+      <w:r>
+        <w:t xml:space="preserve">Vertical: Simple to manage with a single system. </w:t>
+      </w:r>
+    </w:p>
+    <w:p>
+      <w:pPr>
+        <w:numPr>
+          <w:ilvl w:val="0"/>
+          <w:numId w:val="3"/>
+        </w:numPr>
+      </w:pPr>
+      <w:r>
+        <w:t xml:space="preserve">Horizontal: More complex due to multiple machines and coordination needs. </w:t>
+      </w:r>
+    </w:p>
+    <w:p>
+      <w:pPr>
+        <w:pStyle w:val="Heading3"/>
+        <w:rPr>
+          <w:rFonts w:ascii="Arial" w:hAnsi="Arial" w:cs="Arial"/>
+          <w:color w:val="auto"/>
+        </w:rPr>
+      </w:pPr>
+      <w:bookmarkStart w:id="13" w:name="_Toc230521465"/>
+      <w:r>
+        <w:rPr>
+          <w:rFonts w:ascii="Arial" w:hAnsi="Arial" w:cs="Arial"/>
+          <w:color w:val="auto"/>
+        </w:rPr>
+        <w:t>Skill requirements</w:t>
+      </w:r>
+      <w:bookmarkEnd w:id="13"/>
+      <w:r>
+        <w:rPr>
+          <w:rFonts w:ascii="Arial" w:hAnsi="Arial" w:cs="Arial"/>
+          <w:color w:val="auto"/>
+        </w:rPr>
+        <w:t xml:space="preserve"> </w:t>
+      </w:r>
+    </w:p>
+    <w:p>
+      <w:pPr>
+        <w:numPr>
+          <w:ilvl w:val="0"/>
+          <w:numId w:val="4"/>
+        </w:numPr>
+      </w:pPr>
+      <w:r>
+        <w:t xml:space="preserve">Vertical: Focus on hardware upgrades and single-server optimization. </w:t>
+      </w:r>
+    </w:p>
+    <w:p>
+      <w:pPr>
+        <w:numPr>
+          <w:ilvl w:val="0"/>
+          <w:numId w:val="4"/>
+        </w:numPr>
+      </w:pPr>
+      <w:r>
+        <w:lastRenderedPageBreak/>
+        <w:t xml:space="preserve">Horizontal: Requires networking, distributed systems, load balancing, and orchestration skills. </w:t>
+      </w:r>
+    </w:p>
+    <w:p>
+      <w:pPr>
+        <w:pStyle w:val="Heading3"/>
+        <w:rPr>
+          <w:rFonts w:ascii="Arial" w:hAnsi="Arial" w:cs="Arial"/>
+        </w:rPr>
+      </w:pPr>
+      <w:bookmarkStart w:id="14" w:name="_Toc230521466"/>
+      <w:r>
+        <w:rPr>
+          <w:rFonts w:ascii="Arial" w:hAnsi="Arial" w:cs="Arial"/>
+          <w:color w:val="auto"/>
+        </w:rPr>
+        <w:t>Costs</w:t>
+      </w:r>
+      <w:bookmarkEnd w:id="14"/>
+      <w:r>
+        <w:rPr>
+          <w:rFonts w:ascii="Arial" w:hAnsi="Arial" w:cs="Arial"/>
+        </w:rPr>
+        <w:t xml:space="preserve"> </w:t>
+      </w:r>
+    </w:p>
+    <w:p>
+      <w:pPr>
+        <w:numPr>
+          <w:ilvl w:val="0"/>
+          <w:numId w:val="5"/>
+        </w:numPr>
+      </w:pPr>
+      <w:r>
+        <w:t xml:space="preserve">Vertical: Lower initial cost but limited long-term scalability. </w:t>
+      </w:r>
+    </w:p>
+    <w:p>
+      <w:pPr>
+        <w:numPr>
+          <w:ilvl w:val="0"/>
+          <w:numId w:val="5"/>
+        </w:numPr>
+      </w:pPr>
+      <w:r>
+        <w:t>Horizontal: More predictable, incremental costs but higher ongoing management effort.</w:t>
+      </w:r>
+    </w:p>
+    <w:p>
+      <w:pPr>
+        <w:ind w:left="720"/>
+      </w:pPr>
+      <w:r>
+        <w:rPr>
+          <w:noProof/>
+        </w:rPr>
+        <w:drawing>
+          <wp:inline distT="0" distB="0" distL="0" distR="0" wp14:anchorId="118EE933" wp14:editId="2F5C22FE">
+            <wp:extent cx="3628815" cy="2286000"/>
+            <wp:effectExtent l="0" t="0" r="0" b="0"/>
+            <wp:docPr id="355682930" name="Picture 3"/>
+            <wp:cNvGraphicFramePr>
+              <a:graphicFrameLocks xmlns:a="http://schemas.openxmlformats.org/drawingml/2006/main" noChangeAspect="1"/>
+            </wp:cNvGraphicFramePr>
+            <a:graphic xmlns:a="http://schemas.openxmlformats.org/drawingml/2006/main">
+              <a:graphicData uri="http://schemas.openxmlformats.org/drawingml/2006/picture">
+                <pic:pic xmlns:pic="http://schemas.openxmlformats.org/drawingml/2006/picture">
+                  <pic:nvPicPr>
+                    <pic:cNvPr id="355682930" name="Picture 355682930"/>
+                    <pic:cNvPicPr/>
+                  </pic:nvPicPr>
+                  <pic:blipFill>
+                    <a:blip r:embed="rId11" cstate="print">
+                      <a:extLst>
+                        <a:ext uri="{28A0092B-C50C-407E-A947-70E740481C1C}">
+                          <a14:useLocalDpi xmlns:a14="http://schemas.microsoft.com/office/drawing/2010/main" val="0"/>
+                        </a:ext>
+                      </a:extLst>
+                    </a:blip>
+                    <a:stretch>
+                      <a:fillRect/>
+                    </a:stretch>
+                  </pic:blipFill>
+                  <pic:spPr>
+                    <a:xfrm>
+                      <a:off x="0" y="0"/>
+                      <a:ext cx="3641046" cy="2293705"/>
+                    </a:xfrm>
+                    <a:prstGeom prst="rect">
+                      <a:avLst/>
+                    </a:prstGeom>
+                  </pic:spPr>
+                </pic:pic>
+              </a:graphicData>
+            </a:graphic>
+          </wp:inline>
+        </w:drawing>
+      </w:r>
+    </w:p>
+    <w:p>
+      <w:bookmarkStart w:id="15" w:name="_Toc230521467"/>
+      <w:r>
+        <w:rPr>
+          <w:rStyle w:val="Heading2Char"/>
+          <w:rFonts w:ascii="Arial" w:hAnsi="Arial" w:cs="Arial"/>
+          <w:b/>
+          <w:bCs/>
+        </w:rPr>
+        <w:t>Consideration for choosing Right Approach</w:t>
+      </w:r>
+      <w:bookmarkEnd w:id="15"/>
+      <w:r>
+        <w:t>:</w:t>
+      </w:r>
+    </w:p>
+    <w:p>
+      <w:pPr>
+        <w:rPr>
+          <w:rFonts w:ascii="Arial" w:hAnsi="Arial" w:cs="Arial"/>
+        </w:rPr>
+      </w:pPr>
+      <w:r>
+        <w:rPr>
+          <w:rFonts w:ascii="Arial" w:hAnsi="Arial" w:cs="Arial"/>
+        </w:rPr>
+        <w:t>When choosing the right database scaling strategy, several factors need to be considered, including scalability, resiliency, and cost/timing</w:t>
+      </w:r>
+      <w:r>
+        <w:rPr>
+          <w:rFonts w:ascii="Arial" w:hAnsi="Arial" w:cs="Arial"/>
+        </w:rPr>
+        <w:t>.</w:t>
+      </w:r>
+    </w:p>
+    <w:p>
+      <w:pPr>
+        <w:spacing w:after="0" w:line="240" w:lineRule="auto"/>
+        <w:rPr>
+          <w:rFonts w:ascii="Arial" w:hAnsi="Arial" w:cs="Arial"/>
+          <w:sz w:val="28"/>
+          <w:szCs w:val="28"/>
+        </w:rPr>
+      </w:pPr>
+      <w:r>
+        <w:rPr>
+          <w:rFonts w:ascii="Arial" w:hAnsi="Arial" w:cs="Arial"/>
+          <w:sz w:val="28"/>
+          <w:szCs w:val="28"/>
+        </w:rPr>
+        <w:t>Scalability</w:t>
+      </w:r>
+    </w:p>
+    <w:p>
+      <w:pPr>
+        <w:spacing w:after="0" w:line="240" w:lineRule="auto"/>
+        <w:rPr>
+          <w:rFonts w:ascii="Arial" w:hAnsi="Arial" w:cs="Arial"/>
+        </w:rPr>
+      </w:pPr>
+      <w:r>
+        <w:rPr>
+          <w:rFonts w:ascii="Arial" w:hAnsi="Arial" w:cs="Arial"/>
+        </w:rPr>
+        <w:br/>
+      </w:r>
+      <w:r>
+        <w:rPr>
+          <w:rFonts w:ascii="Arial" w:hAnsi="Arial" w:cs="Arial"/>
+        </w:rPr>
+        <w:t>A key factor is the reason for scaling and whether demand is temporary or expected to grow long term. It is also important to consider if user demand will fluctuate or remain consistently high. Organizations should also assess long-term capacity needs alongside their available budget</w:t>
+      </w:r>
+      <w:r>
+        <w:rPr>
+          <w:rFonts w:ascii="Arial" w:hAnsi="Arial" w:cs="Arial"/>
+        </w:rPr>
+        <w:t>.</w:t>
+      </w:r>
+    </w:p>
+    <w:p>
+      <w:pPr>
+        <w:spacing w:after="0" w:line="240" w:lineRule="auto"/>
+        <w:rPr>
+          <w:rFonts w:ascii="Arial" w:hAnsi="Arial" w:cs="Arial"/>
+          <w:sz w:val="28"/>
+          <w:szCs w:val="28"/>
+        </w:rPr>
+      </w:pPr>
+    </w:p>
+    <w:p>
+      <w:bookmarkStart w:id="16" w:name="_Toc230521468"/>
+      <w:r>
+        <w:rPr>
+          <w:rStyle w:val="Heading2Char"/>
+          <w:rFonts w:ascii="Arial" w:hAnsi="Arial" w:cs="Arial"/>
+          <w:b/>
+          <w:bCs/>
+        </w:rPr>
+        <w:t>Recommendation</w:t>
+      </w:r>
+      <w:bookmarkEnd w:id="16"/>
+      <w:r>
+        <w:t>:</w:t>
+      </w:r>
+      <w:r>
+        <w:t xml:space="preserve"> </w:t>
+      </w:r>
+    </w:p>
+    <w:p>
+      <w:pPr>
+        <w:rPr>
+          <w:rFonts w:ascii="Arial" w:hAnsi="Arial" w:cs="Arial"/>
+        </w:rPr>
+      </w:pPr>
+      <w:proofErr w:type="spellStart"/>
+      <w:r>
+        <w:rPr>
+          <w:rFonts w:ascii="Arial" w:hAnsi="Arial" w:cs="Arial"/>
+        </w:rPr>
+        <w:t>Irelax</w:t>
+      </w:r>
+      <w:proofErr w:type="spellEnd"/>
+      <w:r>
+        <w:rPr>
+          <w:rFonts w:ascii="Arial" w:hAnsi="Arial" w:cs="Arial"/>
+        </w:rPr>
+        <w:t xml:space="preserve"> is currently in its early stage and can scale vertically to support databases with larger storage capacity. If more storage is required, horizontal scaling will be used, where the database is split into shards and each shard manages part of the data.</w:t>
+      </w:r>
+    </w:p>
+    <w:p>
+      <w:pPr>
+        <w:pStyle w:val="Heading1"/>
+        <w:spacing w:before="0" w:after="0"/>
+        <w:rPr>
+          <w:rFonts w:ascii="Arial" w:hAnsi="Arial" w:cs="Arial"/>
+          <w:b/>
+          <w:bCs/>
+        </w:rPr>
+      </w:pPr>
+    </w:p>
+    <w:p>
+      <w:pPr>
+        <w:pStyle w:val="Heading1"/>
+        <w:spacing w:before="0"/>
+        <w:rPr>
+          <w:rFonts w:ascii="Arial" w:hAnsi="Arial" w:cs="Arial"/>
+          <w:b/>
+          <w:bCs/>
+        </w:rPr>
+      </w:pPr>
+      <w:r>
+        <w:rPr>
+          <w:rFonts w:ascii="Arial" w:hAnsi="Arial" w:cs="Arial"/>
+          <w:b/>
+          <w:bCs/>
+        </w:rPr>
+        <w:t>Analysis of Real-World Organisations Using Big Data</w:t>
+      </w:r>
+      <w:r>
+        <w:rPr>
+          <w:rFonts w:ascii="Arial" w:hAnsi="Arial" w:cs="Arial"/>
+          <w:b/>
+          <w:bCs/>
+        </w:rPr>
+        <w:t>:</w:t>
+      </w:r>
+    </w:p>
+    <w:p>
+      <w:pPr>
+        <w:rPr>
+          <w:rFonts w:ascii="Arial" w:hAnsi="Arial" w:cs="Arial"/>
+        </w:rPr>
+      </w:pPr>
+      <w:r>
+        <w:rPr>
+          <w:rFonts w:ascii="Arial" w:hAnsi="Arial" w:cs="Arial"/>
+        </w:rPr>
+        <w:t>Below are the three organisations using big data technologies including the tools used to process and store big data</w:t>
+      </w:r>
+      <w:r>
+        <w:rPr>
+          <w:rFonts w:ascii="Arial" w:hAnsi="Arial" w:cs="Arial"/>
+        </w:rPr>
+        <w:t>.</w:t>
+      </w:r>
+    </w:p>
+    <w:p>
+      <w:pPr>
+        <w:pStyle w:val="Heading2"/>
+      </w:pPr>
+      <w:proofErr w:type="spellStart"/>
+      <w:r>
+        <w:rPr>
+          <w:rStyle w:val="Heading2Char"/>
+          <w:rFonts w:ascii="Arial" w:hAnsi="Arial" w:cs="Arial"/>
+          <w:b/>
+          <w:bCs/>
+        </w:rPr>
+        <w:lastRenderedPageBreak/>
+        <w:t>Netfix</w:t>
+      </w:r>
+      <w:proofErr w:type="spellEnd"/>
+    </w:p>
+    <w:p>
+      <w:pPr>
+        <w:pStyle w:val="Heading2"/>
+        <w:rPr>
+          <w:rFonts w:ascii="Arial" w:eastAsiaTheme="minorHAnsi" w:hAnsi="Arial" w:cs="Arial"/>
+          <w:color w:val="auto"/>
+          <w:sz w:val="24"/>
+          <w:szCs w:val="24"/>
+        </w:rPr>
+      </w:pPr>
+      <w:r>
+        <w:rPr>
+          <w:rFonts w:ascii="Arial" w:eastAsiaTheme="minorHAnsi" w:hAnsi="Arial" w:cs="Arial"/>
+          <w:color w:val="auto"/>
+          <w:sz w:val="24"/>
+          <w:szCs w:val="24"/>
+        </w:rPr>
+        <w:t xml:space="preserve">Netflix </w:t>
+      </w:r>
+      <w:r>
+        <w:rPr>
+          <w:rFonts w:ascii="Arial" w:eastAsiaTheme="minorHAnsi" w:hAnsi="Arial" w:cs="Arial"/>
+          <w:color w:val="auto"/>
+          <w:sz w:val="24"/>
+          <w:szCs w:val="24"/>
+        </w:rPr>
+        <w:t>analyses</w:t>
+      </w:r>
+      <w:r>
+        <w:rPr>
+          <w:rFonts w:ascii="Arial" w:eastAsiaTheme="minorHAnsi" w:hAnsi="Arial" w:cs="Arial"/>
+          <w:color w:val="auto"/>
+          <w:sz w:val="24"/>
+          <w:szCs w:val="24"/>
+        </w:rPr>
+        <w:t xml:space="preserve"> billions of real-time user interactions, including clicks, searches, viewing </w:t>
+      </w:r>
+      <w:r>
+        <w:rPr>
+          <w:rFonts w:ascii="Arial" w:eastAsiaTheme="minorHAnsi" w:hAnsi="Arial" w:cs="Arial"/>
+          <w:color w:val="auto"/>
+          <w:sz w:val="24"/>
+          <w:szCs w:val="24"/>
+        </w:rPr>
+        <w:t>behaviours</w:t>
+      </w:r>
+      <w:r>
+        <w:rPr>
+          <w:rFonts w:ascii="Arial" w:eastAsiaTheme="minorHAnsi" w:hAnsi="Arial" w:cs="Arial"/>
+          <w:color w:val="auto"/>
+          <w:sz w:val="24"/>
+          <w:szCs w:val="24"/>
+        </w:rPr>
+        <w:t xml:space="preserve">, and streaming data. </w:t>
+      </w:r>
+    </w:p>
+    <w:p>
+      <w:pPr>
+        <w:pStyle w:val="Heading2"/>
+        <w:rPr>
+          <w:rFonts w:ascii="Arial" w:eastAsiaTheme="minorHAnsi" w:hAnsi="Arial" w:cs="Arial"/>
+          <w:color w:val="auto"/>
+          <w:sz w:val="24"/>
+          <w:szCs w:val="24"/>
+        </w:rPr>
+      </w:pPr>
+      <w:r>
+        <w:rPr>
+          <w:rFonts w:ascii="Arial" w:eastAsiaTheme="minorHAnsi" w:hAnsi="Arial" w:cs="Arial"/>
+          <w:color w:val="auto"/>
+          <w:sz w:val="24"/>
+          <w:szCs w:val="24"/>
+        </w:rPr>
+        <w:t xml:space="preserve">It uses Apache Spark, Flink, Kafka, and AWS to power recommendations, improving accuracy, increasing watch time, and reducing customer loss (churn). </w:t>
+      </w:r>
+    </w:p>
+    <w:p>
+      <w:pPr>
+        <w:pStyle w:val="Heading2"/>
+        <w:rPr>
+          <w:rFonts w:ascii="Arial" w:eastAsiaTheme="minorHAnsi" w:hAnsi="Arial" w:cs="Arial"/>
+          <w:color w:val="auto"/>
+          <w:sz w:val="24"/>
+          <w:szCs w:val="24"/>
+        </w:rPr>
+      </w:pPr>
+      <w:r>
+        <w:rPr>
+          <w:rFonts w:ascii="Arial" w:eastAsiaTheme="minorHAnsi" w:hAnsi="Arial" w:cs="Arial"/>
+          <w:color w:val="auto"/>
+          <w:sz w:val="24"/>
+          <w:szCs w:val="24"/>
+        </w:rPr>
+        <w:t>It enables real-time analytics and scalable, reliable cloud performance.</w:t>
+      </w:r>
+      <w:r>
+        <w:rPr>
+          <w:rFonts w:ascii="Arial" w:eastAsiaTheme="minorHAnsi" w:hAnsi="Arial" w:cs="Arial"/>
+          <w:color w:val="auto"/>
+          <w:sz w:val="24"/>
+          <w:szCs w:val="24"/>
+        </w:rPr>
+        <w:t xml:space="preserve"> </w:t>
+      </w:r>
+    </w:p>
+    <w:p>
+      <w:pPr>
+        <w:ind w:left="720"/>
+        <w:rPr>
+          <w:rFonts w:ascii="Arial" w:hAnsi="Arial" w:cs="Arial"/>
+        </w:rPr>
+      </w:pPr>
+      <w:r>
+        <w:rPr>
+          <w:noProof/>
+        </w:rPr>
+        <w:drawing>
+          <wp:inline distT="0" distB="0" distL="0" distR="0" wp14:anchorId="5234E344" wp14:editId="0312C2D8">
+            <wp:extent cx="2756100" cy="1834243"/>
+            <wp:effectExtent l="0" t="0" r="6350" b="0"/>
+            <wp:docPr id="1473325837" name="Picture 6"/>
+            <wp:cNvGraphicFramePr>
+              <a:graphicFrameLocks xmlns:a="http://schemas.openxmlformats.org/drawingml/2006/main" noChangeAspect="1"/>
+            </wp:cNvGraphicFramePr>
+            <a:graphic xmlns:a="http://schemas.openxmlformats.org/drawingml/2006/main">
+              <a:graphicData uri="http://schemas.openxmlformats.org/drawingml/2006/picture">
+                <pic:pic xmlns:pic="http://schemas.openxmlformats.org/drawingml/2006/picture">
+                  <pic:nvPicPr>
+                    <pic:cNvPr id="1473325837" name="Picture 1473325837"/>
+                    <pic:cNvPicPr/>
+                  </pic:nvPicPr>
+                  <pic:blipFill>
+                    <a:blip r:embed="rId12" cstate="print">
+                      <a:extLst>
+                        <a:ext uri="{28A0092B-C50C-407E-A947-70E740481C1C}">
+                          <a14:useLocalDpi xmlns:a14="http://schemas.microsoft.com/office/drawing/2010/main" val="0"/>
+                        </a:ext>
+                      </a:extLst>
+                    </a:blip>
+                    <a:stretch>
+                      <a:fillRect/>
+                    </a:stretch>
+                  </pic:blipFill>
+                  <pic:spPr>
+                    <a:xfrm>
+                      <a:off x="0" y="0"/>
+                      <a:ext cx="2768566" cy="1842540"/>
+                    </a:xfrm>
+                    <a:prstGeom prst="rect">
+                      <a:avLst/>
+                    </a:prstGeom>
+                  </pic:spPr>
+                </pic:pic>
+              </a:graphicData>
+            </a:graphic>
+          </wp:inline>
+        </w:drawing>
+      </w:r>
+    </w:p>
+    <w:p>
+      <w:pPr>
+        <w:pStyle w:val="Heading2"/>
+      </w:pPr>
+      <w:r>
+        <w:rPr>
+          <w:rStyle w:val="Heading2Char"/>
+          <w:rFonts w:ascii="Arial" w:hAnsi="Arial" w:cs="Arial"/>
+          <w:b/>
+          <w:bCs/>
+        </w:rPr>
+        <w:t>Amazon</w:t>
+      </w:r>
+    </w:p>
+    <w:p>
+      <w:pPr>
+        <w:rPr>
+          <w:rFonts w:ascii="Arial" w:hAnsi="Arial" w:cs="Arial"/>
+        </w:rPr>
+      </w:pPr>
+      <w:r>
+        <w:rPr>
+          <w:rFonts w:ascii="Arial" w:hAnsi="Arial" w:cs="Arial"/>
+        </w:rPr>
+        <w:t xml:space="preserve">Amazon analyses customer behaviour, purchase history, and browsing patterns to improve recommendations, pricing, and logistics using AWS tools like Redshift, Athena, S3, EMR, Kinesis, Glue, SageMaker, and SAP ERP. </w:t>
+      </w:r>
+    </w:p>
+    <w:p>
+      <w:pPr>
+        <w:rPr>
+          <w:rFonts w:ascii="Arial" w:hAnsi="Arial" w:cs="Arial"/>
+        </w:rPr>
+      </w:pPr>
+      <w:r>
+        <w:rPr>
+          <w:rFonts w:ascii="Arial" w:hAnsi="Arial" w:cs="Arial"/>
+        </w:rPr>
+        <w:t>It enables personalised sales, real-time inventory management, scalable infrastructure, and data-driven decision-making.</w:t>
+      </w:r>
+    </w:p>
+    <w:p>
+      <w:pPr>
+        <w:rPr>
+          <w:rFonts w:ascii="Arial" w:hAnsi="Arial" w:cs="Arial"/>
+        </w:rPr>
+      </w:pPr>
+      <w:r>
+        <w:rPr>
+          <w:rFonts w:ascii="Arial" w:hAnsi="Arial" w:cs="Arial"/>
+        </w:rPr>
+        <w:t xml:space="preserve">              </w:t>
+      </w:r>
+      <w:r>
+        <w:rPr>
+          <w:rFonts w:ascii="Arial" w:hAnsi="Arial" w:cs="Arial"/>
+          <w:noProof/>
+        </w:rPr>
+        <mc:AlternateContent>
+          <mc:Choice Requires="wpg">
+            <w:drawing>
+              <wp:inline distT="0" distB="0" distL="0" distR="0" wp14:anchorId="2314C1F3" wp14:editId="1E4B638E">
+                <wp:extent cx="3630022" cy="859972"/>
+                <wp:effectExtent l="0" t="0" r="8890" b="0"/>
+                <wp:docPr id="994652266" name="Group 9"/>
+                <wp:cNvGraphicFramePr/>
+                <a:graphic xmlns:a="http://schemas.openxmlformats.org/drawingml/2006/main">
+                  <a:graphicData uri="http://schemas.microsoft.com/office/word/2010/wordprocessingGroup">
+                    <wpg:wgp>
+                      <wpg:cNvGrpSpPr/>
+                      <wpg:grpSpPr>
+                        <a:xfrm>
+                          <a:off x="0" y="0"/>
+                          <a:ext cx="3630022" cy="859972"/>
+                          <a:chOff x="0" y="0"/>
+                          <a:chExt cx="5731510" cy="1702472"/>
+                        </a:xfrm>
+                      </wpg:grpSpPr>
+                      <pic:pic xmlns:pic="http://schemas.openxmlformats.org/drawingml/2006/picture">
+                        <pic:nvPicPr>
+                          <pic:cNvPr id="1063530170" name="Picture 7"/>
+                          <pic:cNvPicPr>
+                            <a:picLocks noChangeAspect="1"/>
+                          </pic:cNvPicPr>
+                        </pic:nvPicPr>
+                        <pic:blipFill>
+                          <a:blip r:embed="rId13">
+                            <a:extLst>
+                              <a:ext uri="{28A0092B-C50C-407E-A947-70E740481C1C}">
+                                <a14:useLocalDpi xmlns:a14="http://schemas.microsoft.com/office/drawing/2010/main" val="0"/>
+                              </a:ext>
+                              <a:ext uri="{837473B0-CC2E-450A-ABE3-18F120FF3D39}">
+                                <a1611:picAttrSrcUrl xmlns:a1611="http://schemas.microsoft.com/office/drawing/2016/11/main" r:id="rId14"/>
+                              </a:ext>
+                            </a:extLst>
+                          </a:blip>
+                          <a:stretch>
+                            <a:fillRect/>
+                          </a:stretch>
+                        </pic:blipFill>
+                        <pic:spPr>
+                          <a:xfrm>
+                            <a:off x="0" y="0"/>
+                            <a:ext cx="5731510" cy="1348105"/>
+                          </a:xfrm>
+                          <a:prstGeom prst="rect">
+                            <a:avLst/>
+                          </a:prstGeom>
+                        </pic:spPr>
+                      </pic:pic>
+                      <wps:wsp>
+                        <wps:cNvPr id="1957705604" name="Text Box 8"/>
+                        <wps:cNvSpPr txBox="1"/>
+                        <wps:spPr>
+                          <a:xfrm>
+                            <a:off x="0" y="1347507"/>
+                            <a:ext cx="5731510" cy="354965"/>
+                          </a:xfrm>
+                          <a:prstGeom prst="rect">
+                            <a:avLst/>
+                          </a:prstGeom>
+                          <a:solidFill>
+                            <a:prstClr val="white"/>
+                          </a:solidFill>
+                          <a:ln>
+                            <a:noFill/>
+                          </a:ln>
+                        </wps:spPr>
+                        <wps:txbx>
+                          <w:txbxContent>
+                            <w:p>
+                              <w:pPr>
+                                <w:rPr>
+                                  <w:sz w:val="18"/>
+                                  <w:szCs w:val="18"/>
+                                </w:rPr>
+                              </w:pPr>
+                            </w:p>
+                          </w:txbxContent>
+                        </wps:txbx>
+                        <wps:bodyPr rot="0" spcFirstLastPara="0" vertOverflow="overflow" horzOverflow="overflow" vert="horz" wrap="square" lIns="91440" tIns="45720" rIns="91440" bIns="45720" numCol="1" spcCol="0" rtlCol="0" fromWordArt="0" anchor="t" anchorCtr="0" forceAA="0" compatLnSpc="1">
+                          <a:prstTxWarp prst="textNoShape">
+                            <a:avLst/>
+                          </a:prstTxWarp>
+                          <a:noAutofit/>
+                        </wps:bodyPr>
+                      </wps:wsp>
+                    </wpg:wgp>
+                  </a:graphicData>
+                </a:graphic>
+              </wp:inline>
+            </w:drawing>
+          </mc:Choice>
+          <mc:Fallback>
+            <w:pict>
+              <v:group w14:anchorId="2314C1F3" id="Group 9" o:spid="_x0000_s1027" style="width:285.85pt;height:67.7pt;mso-position-horizontal-relative:char;mso-position-vertical-relative:line" coordsize="57315,17024" o:gfxdata="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">
+                <v:shapetype id="_x0000_t75" coordsize="21600,21600" o:spt="75" o:preferrelative="t" path="m@4@5l@4@11@9@11@9@5xe" filled="f" stroked="f">
+                  <v:stroke joinstyle="miter"/>
+                  <v:formulas>
+                    <v:f eqn="if lineDrawn pixelLineWidth 0"/>
+                    <v:f eqn="sum @0 1 0"/>
+                    <v:f eqn="sum 0 0 @1"/>
+                    <v:f eqn="prod @2 1 2"/>
+                    <v:f eqn="prod @3 21600 pixelWidth"/>
+                    <v:f eqn="prod @3 21600 pixelHeight"/>
+                    <v:f eqn="sum @0 0 1"/>
+                    <v:f eqn="prod @6 1 2"/>
+                    <v:f eqn="prod @7 21600 pixelWidth"/>
+                    <v:f eqn="sum @8 21600 0"/>
+                    <v:f eqn="prod @7 21600 pixelHeight"/>
+                    <v:f eqn="sum @10 21600 0"/>
+                  </v:formulas>
+                  <v:path o:extrusionok="f" gradientshapeok="t" o:connecttype="rect"/>
+                  <o:lock v:ext="edit" aspectratio="t"/>
+                </v:shapetype>
+                <v:shape id="Picture 7" o:spid="_x0000_s1028" type="#_x0000_t75" style="position:absolute;width:57315;height:13481;visibility:visible;mso-wrap-style:square" o:gfxdata="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">
+                  <v:imagedata r:id="rId15" o:title=""/>
+                </v:shape>
+                <v:shape id="Text Box 8" o:spid="_x0000_s1029" type="#_x0000_t202" style="position:absolute;top:13475;width:57315;height:3549;visibility:visible;mso-wrap-style:square;v-text-anchor:top" o:gfxdata="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" stroked="f">
+                  <v:textbox>
+                    <w:txbxContent>
+                      <w:p>
+                        <w:pPr>
+                          <w:rPr>
+                            <w:sz w:val="18"/>
+                            <w:szCs w:val="18"/>
+                          </w:rPr>
+                        </w:pPr>
+                      </w:p>
+                    </w:txbxContent>
+                  </v:textbox>
+                </v:shape>
+                <w10:anchorlock/>
+              </v:group>
+            </w:pict>
+          </mc:Fallback>
+        </mc:AlternateContent>
+      </w:r>
+    </w:p>
+    <w:p>
+      <w:pPr>
+        <w:pStyle w:val="Heading2"/>
+      </w:pPr>
+      <w:r>
+        <w:rPr>
+          <w:rStyle w:val="Heading2Char"/>
+          <w:rFonts w:ascii="Arial" w:hAnsi="Arial" w:cs="Arial"/>
+          <w:b/>
+          <w:bCs/>
+        </w:rPr>
+        <w:t>Google</w:t>
+      </w:r>
+      <w:r>
+        <w:rPr>
+          <w:rStyle w:val="Heading2Char"/>
+          <w:rFonts w:ascii="Arial" w:hAnsi="Arial" w:cs="Arial"/>
+          <w:b/>
+          <w:bCs/>
+        </w:rPr>
+        <w:t xml:space="preserve">   </w:t>
+      </w:r>
+    </w:p>
+    <w:p>
+      <w:pPr>
+        <w:rPr>
+          <w:rFonts w:ascii="Arial" w:hAnsi="Arial" w:cs="Arial"/>
+        </w:rPr>
+      </w:pPr>
+      <w:r>
+        <w:rPr>
+          <w:rFonts w:ascii="Arial" w:hAnsi="Arial" w:cs="Arial"/>
+        </w:rPr>
+        <w:t xml:space="preserve">Google is a leading technology company that uses a powerful ecosystem of tools like </w:t>
+      </w:r>
+      <w:proofErr w:type="spellStart"/>
+      <w:r>
+        <w:rPr>
+          <w:rFonts w:ascii="Arial" w:hAnsi="Arial" w:cs="Arial"/>
+        </w:rPr>
+        <w:t>BigQuery</w:t>
+      </w:r>
+      <w:proofErr w:type="spellEnd"/>
+      <w:r>
+        <w:rPr>
+          <w:rFonts w:ascii="Arial" w:hAnsi="Arial" w:cs="Arial"/>
+        </w:rPr>
+        <w:t>, Hadoop, TensorFlow, Spanner, and MapReduce to process and analyse massive datasets. It enables fast processing, scalable infrastructure, improved search accuracy, strong AI integration, and better ad relevance.</w:t>
+      </w:r>
+    </w:p>
+    <w:p>
+      <w:pPr>
+        <w:rPr>
+          <w:rFonts w:ascii="Arial" w:hAnsi="Arial" w:cs="Arial"/>
+        </w:rPr>
+      </w:pPr>
+      <w:r>
+        <w:rPr>
+          <w:rFonts w:ascii="Arial" w:hAnsi="Arial" w:cs="Arial"/>
+        </w:rPr>
+        <w:t xml:space="preserve">             </w:t>
+      </w:r>
+      <w:r>
+        <w:rPr>
+          <w:rFonts w:ascii="Arial" w:hAnsi="Arial" w:cs="Arial"/>
+        </w:rPr>
+        <w:t xml:space="preserve">       </w:t>
+      </w:r>
+      <w:r>
+        <w:rPr>
+          <w:rFonts w:ascii="Arial" w:hAnsi="Arial" w:cs="Arial"/>
+        </w:rPr>
+        <w:t xml:space="preserve">     </w:t>
+      </w:r>
+      <w:r>
+        <w:rPr>
+          <w:rFonts w:ascii="Arial" w:hAnsi="Arial" w:cs="Arial"/>
+          <w:noProof/>
+        </w:rPr>
+        <w:drawing>
+          <wp:inline distT="0" distB="0" distL="0" distR="0" wp14:anchorId="18108F58" wp14:editId="7C6DBED0">
+            <wp:extent cx="3064329" cy="919447"/>
+            <wp:effectExtent l="0" t="0" r="3175" b="0"/>
+            <wp:docPr id="1951376379" name="Picture 16"/>
+            <wp:cNvGraphicFramePr>
+              <a:graphicFrameLocks xmlns:a="http://schemas.openxmlformats.org/drawingml/2006/main" noChangeAspect="1"/>
+            </wp:cNvGraphicFramePr>
+            <a:graphic xmlns:a="http://schemas.openxmlformats.org/drawingml/2006/main">
+              <a:graphicData uri="http://schemas.openxmlformats.org/drawingml/2006/picture">
+                <pic:pic xmlns:pic="http://schemas.openxmlformats.org/drawingml/2006/picture">
+                  <pic:nvPicPr>
+                    <pic:cNvPr id="1951376379" name="Picture 1951376379"/>
+                    <pic:cNvPicPr/>
+                  </pic:nvPicPr>
+                  <pic:blipFill>
+                    <a:blip r:embed="rId16">
+                      <a:extLst>
+                        <a:ext uri="{28A0092B-C50C-407E-A947-70E740481C1C}">
+                          <a14:useLocalDpi xmlns:a14="http://schemas.microsoft.com/office/drawing/2010/main" val="0"/>
+                        </a:ext>
+                      </a:extLst>
+                    </a:blip>
+                    <a:stretch>
+                      <a:fillRect/>
+                    </a:stretch>
+                  </pic:blipFill>
+                  <pic:spPr>
+                    <a:xfrm>
+                      <a:off x="0" y="0"/>
+                      <a:ext cx="3090292" cy="927237"/>
+                    </a:xfrm>
+                    <a:prstGeom prst="rect">
+                      <a:avLst/>
+                    </a:prstGeom>
+                  </pic:spPr>
+                </pic:pic>
+              </a:graphicData>
+            </a:graphic>
+          </wp:inline>
+        </w:drawing>
+      </w:r>
     </w:p>
     <w:sectPr>
       <w:pgSz w:w="11906" w:h="16838"/>
@@ -2056,6 +3820,1075 @@
     </w:sectPr>
   </w:body>
 </w:document>
+</file>
+
+<file path=word/numbering.xml><?xml version="1.0" encoding="utf-8"?>
+<w:numbering xmlns:wpc="http://schemas.microsoft.com/office/word/2010/wordprocessingCanvas" xmlns:cx="http://schemas.microsoft.com/office/drawing/2014/chartex" xmlns:cx1="http://schemas.microsoft.com/office/drawing/2015/9/8/chartex" xmlns:cx2="http://schemas.microsoft.com/office/drawing/2015/10/21/chartex" xmlns:cx3="http://schemas.microsoft.com/office/drawing/2016/5/9/chartex" xmlns:cx4="http://schemas.microsoft.com/office/drawing/2016/5/10/chartex" xmlns:cx5="http://schemas.microsoft.com/office/drawing/2016/5/11/chartex" xmlns:cx6="http://schemas.microsoft.com/office/drawing/2016/5/12/chartex" xmlns:cx7="http://schemas.microsoft.com/office/drawing/2016/5/13/chartex" xmlns:cx8="http://schemas.microsoft.com/office/drawing/2016/5/14/chartex" xmlns:mc="http://schemas.openxmlformats.org/markup-compatibility/2006" xmlns:aink="http://schemas.microsoft.com/office/drawing/2016/ink" xmlns:am3d="http://schemas.microsoft.com/office/drawing/2017/model3d" xmlns:o="urn:schemas-microsoft-com:office:office" xmlns:oel="http://schemas.microsoft.com/office/2019/extlst" xmlns:r="http://schemas.openxmlformats.org/officeDocument/2006/relationships" xmlns:m="http://schemas.openxmlformats.org/officeDocument/2006/math" xmlns:v="urn:schemas-microsoft-com:vml" xmlns:wp14="http://schemas.microsoft.com/office/word/2010/wordprocessingDrawing" xmlns:wp="http://schemas.openxmlformats.org/drawingml/2006/wordprocessingDrawing" xmlns:w10="urn:schemas-microsoft-com:office:word" xmlns:w="http://schemas.openxmlformats.org/wordprocessingml/2006/main" xmlns:w14="http://schemas.microsoft.com/office/word/2010/wordml" xmlns:w15="http://schemas.microsoft.com/office/word/2012/wordml" xmlns:w16cex="http://schemas.microsoft.com/office/word/2018/wordml/cex" xmlns:w16cid="http://schemas.microsoft.com/office/word/2016/wordml/cid" xmlns:w16="http://schemas.microsoft.com/office/word/2018/wordml" xmlns:w16du="http://schemas.microsoft.com/office/word/2023/wordml/word16du" xmlns:w16sdtdh="http://schemas.microsoft.com/office/word/2020/wordml/sdtdatahash" xmlns:w16sdtfl="http://schemas.microsoft.com/office/word/2024/wordml/sdtformatlock" xmlns:w16se="http://schemas.microsoft.com/office/word/2015/wordml/symex" xmlns:wpg="http://schemas.microsoft.com/office/word/2010/wordprocessingGroup" xmlns:wpi="http://schemas.microsoft.com/office/word/2010/wordprocessingInk" xmlns:wne="http://schemas.microsoft.com/office/word/2006/wordml" xmlns:wps="http://schemas.microsoft.com/office/word/2010/wordprocessingShape" mc:Ignorable="w14 w15 w16se w16cid w16 w16cex w16sdtdh w16sdtfl w16du wp14">
+  <w:abstractNum w:abstractNumId="0" w15:restartNumberingAfterBreak="0">
+    <w:nsid w:val="10E37F74"/>
+    <w:multiLevelType w:val="multilevel"/>
+    <w:tmpl w:val="AA4A4BF0"/>
+    <w:lvl w:ilvl="0">
+      <w:start w:val="1"/>
+      <w:numFmt w:val="bullet"/>
+      <w:lvlText w:val=""/>
+      <w:lvlJc w:val="left"/>
+      <w:pPr>
+        <w:tabs>
+          <w:tab w:val="num" w:pos="720"/>
+        </w:tabs>
+        <w:ind w:left="720" w:hanging="360"/>
+      </w:pPr>
+      <w:rPr>
+        <w:rFonts w:ascii="Symbol" w:hAnsi="Symbol" w:hint="default"/>
+        <w:sz w:val="20"/>
+      </w:rPr>
+    </w:lvl>
+    <w:lvl w:ilvl="1" w:tentative="1">
+      <w:start w:val="1"/>
+      <w:numFmt w:val="bullet"/>
+      <w:lvlText w:val="o"/>
+      <w:lvlJc w:val="left"/>
+      <w:pPr>
+        <w:tabs>
+          <w:tab w:val="num" w:pos="1440"/>
+        </w:tabs>
+        <w:ind w:left="1440" w:hanging="360"/>
+      </w:pPr>
+      <w:rPr>
+        <w:rFonts w:ascii="Courier New" w:hAnsi="Courier New" w:hint="default"/>
+        <w:sz w:val="20"/>
+      </w:rPr>
+    </w:lvl>
+    <w:lvl w:ilvl="2" w:tentative="1">
+      <w:start w:val="1"/>
+      <w:numFmt w:val="bullet"/>
+      <w:lvlText w:val=""/>
+      <w:lvlJc w:val="left"/>
+      <w:pPr>
+        <w:tabs>
+          <w:tab w:val="num" w:pos="2160"/>
+        </w:tabs>
+        <w:ind w:left="2160" w:hanging="360"/>
+      </w:pPr>
+      <w:rPr>
+        <w:rFonts w:ascii="Wingdings" w:hAnsi="Wingdings" w:hint="default"/>
+        <w:sz w:val="20"/>
+      </w:rPr>
+    </w:lvl>
+    <w:lvl w:ilvl="3" w:tentative="1">
+      <w:start w:val="1"/>
+      <w:numFmt w:val="bullet"/>
+      <w:lvlText w:val=""/>
+      <w:lvlJc w:val="left"/>
+      <w:pPr>
+        <w:tabs>
+          <w:tab w:val="num" w:pos="2880"/>
+        </w:tabs>
+        <w:ind w:left="2880" w:hanging="360"/>
+      </w:pPr>
+      <w:rPr>
+        <w:rFonts w:ascii="Wingdings" w:hAnsi="Wingdings" w:hint="default"/>
+        <w:sz w:val="20"/>
+      </w:rPr>
+    </w:lvl>
+    <w:lvl w:ilvl="4" w:tentative="1">
+      <w:start w:val="1"/>
+      <w:numFmt w:val="bullet"/>
+      <w:lvlText w:val=""/>
+      <w:lvlJc w:val="left"/>
+      <w:pPr>
+        <w:tabs>
+          <w:tab w:val="num" w:pos="3600"/>
+        </w:tabs>
+        <w:ind w:left="3600" w:hanging="360"/>
+      </w:pPr>
+      <w:rPr>
+        <w:rFonts w:ascii="Wingdings" w:hAnsi="Wingdings" w:hint="default"/>
+        <w:sz w:val="20"/>
+      </w:rPr>
+    </w:lvl>
+    <w:lvl w:ilvl="5" w:tentative="1">
+      <w:start w:val="1"/>
+      <w:numFmt w:val="bullet"/>
+      <w:lvlText w:val=""/>
+      <w:lvlJc w:val="left"/>
+      <w:pPr>
+        <w:tabs>
+          <w:tab w:val="num" w:pos="4320"/>
+        </w:tabs>
+        <w:ind w:left="4320" w:hanging="360"/>
+      </w:pPr>
+      <w:rPr>
+        <w:rFonts w:ascii="Wingdings" w:hAnsi="Wingdings" w:hint="default"/>
+        <w:sz w:val="20"/>
+      </w:rPr>
+    </w:lvl>
+    <w:lvl w:ilvl="6" w:tentative="1">
+      <w:start w:val="1"/>
+      <w:numFmt w:val="bullet"/>
+      <w:lvlText w:val=""/>
+      <w:lvlJc w:val="left"/>
+      <w:pPr>
+        <w:tabs>
+          <w:tab w:val="num" w:pos="5040"/>
+        </w:tabs>
+        <w:ind w:left="5040" w:hanging="360"/>
+      </w:pPr>
+      <w:rPr>
+        <w:rFonts w:ascii="Wingdings" w:hAnsi="Wingdings" w:hint="default"/>
+        <w:sz w:val="20"/>
+      </w:rPr>
+    </w:lvl>
+    <w:lvl w:ilvl="7" w:tentative="1">
+      <w:start w:val="1"/>
+      <w:numFmt w:val="bullet"/>
+      <w:lvlText w:val=""/>
+      <w:lvlJc w:val="left"/>
+      <w:pPr>
+        <w:tabs>
+          <w:tab w:val="num" w:pos="5760"/>
+        </w:tabs>
+        <w:ind w:left="5760" w:hanging="360"/>
+      </w:pPr>
+      <w:rPr>
+        <w:rFonts w:ascii="Wingdings" w:hAnsi="Wingdings" w:hint="default"/>
+        <w:sz w:val="20"/>
+      </w:rPr>
+    </w:lvl>
+    <w:lvl w:ilvl="8" w:tentative="1">
+      <w:start w:val="1"/>
+      <w:numFmt w:val="bullet"/>
+      <w:lvlText w:val=""/>
+      <w:lvlJc w:val="left"/>
+      <w:pPr>
+        <w:tabs>
+          <w:tab w:val="num" w:pos="6480"/>
+        </w:tabs>
+        <w:ind w:left="6480" w:hanging="360"/>
+      </w:pPr>
+      <w:rPr>
+        <w:rFonts w:ascii="Wingdings" w:hAnsi="Wingdings" w:hint="default"/>
+        <w:sz w:val="20"/>
+      </w:rPr>
+    </w:lvl>
+  </w:abstractNum>
+  <w:abstractNum w:abstractNumId="1" w15:restartNumberingAfterBreak="0">
+    <w:nsid w:val="259A49A8"/>
+    <w:multiLevelType w:val="multilevel"/>
+    <w:tmpl w:val="E3245D72"/>
+    <w:lvl w:ilvl="0">
+      <w:start w:val="1"/>
+      <w:numFmt w:val="bullet"/>
+      <w:lvlText w:val=""/>
+      <w:lvlJc w:val="left"/>
+      <w:pPr>
+        <w:tabs>
+          <w:tab w:val="num" w:pos="720"/>
+        </w:tabs>
+        <w:ind w:left="720" w:hanging="360"/>
+      </w:pPr>
+      <w:rPr>
+        <w:rFonts w:ascii="Symbol" w:hAnsi="Symbol" w:hint="default"/>
+        <w:sz w:val="20"/>
+      </w:rPr>
+    </w:lvl>
+    <w:lvl w:ilvl="1" w:tentative="1">
+      <w:start w:val="1"/>
+      <w:numFmt w:val="bullet"/>
+      <w:lvlText w:val="o"/>
+      <w:lvlJc w:val="left"/>
+      <w:pPr>
+        <w:tabs>
+          <w:tab w:val="num" w:pos="1440"/>
+        </w:tabs>
+        <w:ind w:left="1440" w:hanging="360"/>
+      </w:pPr>
+      <w:rPr>
+        <w:rFonts w:ascii="Courier New" w:hAnsi="Courier New" w:hint="default"/>
+        <w:sz w:val="20"/>
+      </w:rPr>
+    </w:lvl>
+    <w:lvl w:ilvl="2" w:tentative="1">
+      <w:start w:val="1"/>
+      <w:numFmt w:val="bullet"/>
+      <w:lvlText w:val=""/>
+      <w:lvlJc w:val="left"/>
+      <w:pPr>
+        <w:tabs>
+          <w:tab w:val="num" w:pos="2160"/>
+        </w:tabs>
+        <w:ind w:left="2160" w:hanging="360"/>
+      </w:pPr>
+      <w:rPr>
+        <w:rFonts w:ascii="Wingdings" w:hAnsi="Wingdings" w:hint="default"/>
+        <w:sz w:val="20"/>
+      </w:rPr>
+    </w:lvl>
+    <w:lvl w:ilvl="3" w:tentative="1">
+      <w:start w:val="1"/>
+      <w:numFmt w:val="bullet"/>
+      <w:lvlText w:val=""/>
+      <w:lvlJc w:val="left"/>
+      <w:pPr>
+        <w:tabs>
+          <w:tab w:val="num" w:pos="2880"/>
+        </w:tabs>
+        <w:ind w:left="2880" w:hanging="360"/>
+      </w:pPr>
+      <w:rPr>
+        <w:rFonts w:ascii="Wingdings" w:hAnsi="Wingdings" w:hint="default"/>
+        <w:sz w:val="20"/>
+      </w:rPr>
+    </w:lvl>
+    <w:lvl w:ilvl="4" w:tentative="1">
+      <w:start w:val="1"/>
+      <w:numFmt w:val="bullet"/>
+      <w:lvlText w:val=""/>
+      <w:lvlJc w:val="left"/>
+      <w:pPr>
+        <w:tabs>
+          <w:tab w:val="num" w:pos="3600"/>
+        </w:tabs>
+        <w:ind w:left="3600" w:hanging="360"/>
+      </w:pPr>
+      <w:rPr>
+        <w:rFonts w:ascii="Wingdings" w:hAnsi="Wingdings" w:hint="default"/>
+        <w:sz w:val="20"/>
+      </w:rPr>
+    </w:lvl>
+    <w:lvl w:ilvl="5" w:tentative="1">
+      <w:start w:val="1"/>
+      <w:numFmt w:val="bullet"/>
+      <w:lvlText w:val=""/>
+      <w:lvlJc w:val="left"/>
+      <w:pPr>
+        <w:tabs>
+          <w:tab w:val="num" w:pos="4320"/>
+        </w:tabs>
+        <w:ind w:left="4320" w:hanging="360"/>
+      </w:pPr>
+      <w:rPr>
+        <w:rFonts w:ascii="Wingdings" w:hAnsi="Wingdings" w:hint="default"/>
+        <w:sz w:val="20"/>
+      </w:rPr>
+    </w:lvl>
+    <w:lvl w:ilvl="6" w:tentative="1">
+      <w:start w:val="1"/>
+      <w:numFmt w:val="bullet"/>
+      <w:lvlText w:val=""/>
+      <w:lvlJc w:val="left"/>
+      <w:pPr>
+        <w:tabs>
+          <w:tab w:val="num" w:pos="5040"/>
+        </w:tabs>
+        <w:ind w:left="5040" w:hanging="360"/>
+      </w:pPr>
+      <w:rPr>
+        <w:rFonts w:ascii="Wingdings" w:hAnsi="Wingdings" w:hint="default"/>
+        <w:sz w:val="20"/>
+      </w:rPr>
+    </w:lvl>
+    <w:lvl w:ilvl="7" w:tentative="1">
+      <w:start w:val="1"/>
+      <w:numFmt w:val="bullet"/>
+      <w:lvlText w:val=""/>
+      <w:lvlJc w:val="left"/>
+      <w:pPr>
+        <w:tabs>
+          <w:tab w:val="num" w:pos="5760"/>
+        </w:tabs>
+        <w:ind w:left="5760" w:hanging="360"/>
+      </w:pPr>
+      <w:rPr>
+        <w:rFonts w:ascii="Wingdings" w:hAnsi="Wingdings" w:hint="default"/>
+        <w:sz w:val="20"/>
+      </w:rPr>
+    </w:lvl>
+    <w:lvl w:ilvl="8" w:tentative="1">
+      <w:start w:val="1"/>
+      <w:numFmt w:val="bullet"/>
+      <w:lvlText w:val=""/>
+      <w:lvlJc w:val="left"/>
+      <w:pPr>
+        <w:tabs>
+          <w:tab w:val="num" w:pos="6480"/>
+        </w:tabs>
+        <w:ind w:left="6480" w:hanging="360"/>
+      </w:pPr>
+      <w:rPr>
+        <w:rFonts w:ascii="Wingdings" w:hAnsi="Wingdings" w:hint="default"/>
+        <w:sz w:val="20"/>
+      </w:rPr>
+    </w:lvl>
+  </w:abstractNum>
+  <w:abstractNum w:abstractNumId="2" w15:restartNumberingAfterBreak="0">
+    <w:nsid w:val="42027775"/>
+    <w:multiLevelType w:val="multilevel"/>
+    <w:tmpl w:val="4E880F74"/>
+    <w:lvl w:ilvl="0">
+      <w:start w:val="1"/>
+      <w:numFmt w:val="bullet"/>
+      <w:lvlText w:val=""/>
+      <w:lvlJc w:val="left"/>
+      <w:pPr>
+        <w:tabs>
+          <w:tab w:val="num" w:pos="720"/>
+        </w:tabs>
+        <w:ind w:left="720" w:hanging="360"/>
+      </w:pPr>
+      <w:rPr>
+        <w:rFonts w:ascii="Symbol" w:hAnsi="Symbol" w:hint="default"/>
+        <w:sz w:val="20"/>
+      </w:rPr>
+    </w:lvl>
+    <w:lvl w:ilvl="1" w:tentative="1">
+      <w:start w:val="1"/>
+      <w:numFmt w:val="bullet"/>
+      <w:lvlText w:val="o"/>
+      <w:lvlJc w:val="left"/>
+      <w:pPr>
+        <w:tabs>
+          <w:tab w:val="num" w:pos="1440"/>
+        </w:tabs>
+        <w:ind w:left="1440" w:hanging="360"/>
+      </w:pPr>
+      <w:rPr>
+        <w:rFonts w:ascii="Courier New" w:hAnsi="Courier New" w:hint="default"/>
+        <w:sz w:val="20"/>
+      </w:rPr>
+    </w:lvl>
+    <w:lvl w:ilvl="2" w:tentative="1">
+      <w:start w:val="1"/>
+      <w:numFmt w:val="bullet"/>
+      <w:lvlText w:val=""/>
+      <w:lvlJc w:val="left"/>
+      <w:pPr>
+        <w:tabs>
+          <w:tab w:val="num" w:pos="2160"/>
+        </w:tabs>
+        <w:ind w:left="2160" w:hanging="360"/>
+      </w:pPr>
+      <w:rPr>
+        <w:rFonts w:ascii="Wingdings" w:hAnsi="Wingdings" w:hint="default"/>
+        <w:sz w:val="20"/>
+      </w:rPr>
+    </w:lvl>
+    <w:lvl w:ilvl="3" w:tentative="1">
+      <w:start w:val="1"/>
+      <w:numFmt w:val="bullet"/>
+      <w:lvlText w:val=""/>
+      <w:lvlJc w:val="left"/>
+      <w:pPr>
+        <w:tabs>
+          <w:tab w:val="num" w:pos="2880"/>
+        </w:tabs>
+        <w:ind w:left="2880" w:hanging="360"/>
+      </w:pPr>
+      <w:rPr>
+        <w:rFonts w:ascii="Wingdings" w:hAnsi="Wingdings" w:hint="default"/>
+        <w:sz w:val="20"/>
+      </w:rPr>
+    </w:lvl>
+    <w:lvl w:ilvl="4" w:tentative="1">
+      <w:start w:val="1"/>
+      <w:numFmt w:val="bullet"/>
+      <w:lvlText w:val=""/>
+      <w:lvlJc w:val="left"/>
+      <w:pPr>
+        <w:tabs>
+          <w:tab w:val="num" w:pos="3600"/>
+        </w:tabs>
+        <w:ind w:left="3600" w:hanging="360"/>
+      </w:pPr>
+      <w:rPr>
+        <w:rFonts w:ascii="Wingdings" w:hAnsi="Wingdings" w:hint="default"/>
+        <w:sz w:val="20"/>
+      </w:rPr>
+    </w:lvl>
+    <w:lvl w:ilvl="5" w:tentative="1">
+      <w:start w:val="1"/>
+      <w:numFmt w:val="bullet"/>
+      <w:lvlText w:val=""/>
+      <w:lvlJc w:val="left"/>
+      <w:pPr>
+        <w:tabs>
+          <w:tab w:val="num" w:pos="4320"/>
+        </w:tabs>
+        <w:ind w:left="4320" w:hanging="360"/>
+      </w:pPr>
+      <w:rPr>
+        <w:rFonts w:ascii="Wingdings" w:hAnsi="Wingdings" w:hint="default"/>
+        <w:sz w:val="20"/>
+      </w:rPr>
+    </w:lvl>
+    <w:lvl w:ilvl="6" w:tentative="1">
+      <w:start w:val="1"/>
+      <w:numFmt w:val="bullet"/>
+      <w:lvlText w:val=""/>
+      <w:lvlJc w:val="left"/>
+      <w:pPr>
+        <w:tabs>
+          <w:tab w:val="num" w:pos="5040"/>
+        </w:tabs>
+        <w:ind w:left="5040" w:hanging="360"/>
+      </w:pPr>
+      <w:rPr>
+        <w:rFonts w:ascii="Wingdings" w:hAnsi="Wingdings" w:hint="default"/>
+        <w:sz w:val="20"/>
+      </w:rPr>
+    </w:lvl>
+    <w:lvl w:ilvl="7" w:tentative="1">
+      <w:start w:val="1"/>
+      <w:numFmt w:val="bullet"/>
+      <w:lvlText w:val=""/>
+      <w:lvlJc w:val="left"/>
+      <w:pPr>
+        <w:tabs>
+          <w:tab w:val="num" w:pos="5760"/>
+        </w:tabs>
+        <w:ind w:left="5760" w:hanging="360"/>
+      </w:pPr>
+      <w:rPr>
+        <w:rFonts w:ascii="Wingdings" w:hAnsi="Wingdings" w:hint="default"/>
+        <w:sz w:val="20"/>
+      </w:rPr>
+    </w:lvl>
+    <w:lvl w:ilvl="8" w:tentative="1">
+      <w:start w:val="1"/>
+      <w:numFmt w:val="bullet"/>
+      <w:lvlText w:val=""/>
+      <w:lvlJc w:val="left"/>
+      <w:pPr>
+        <w:tabs>
+          <w:tab w:val="num" w:pos="6480"/>
+        </w:tabs>
+        <w:ind w:left="6480" w:hanging="360"/>
+      </w:pPr>
+      <w:rPr>
+        <w:rFonts w:ascii="Wingdings" w:hAnsi="Wingdings" w:hint="default"/>
+        <w:sz w:val="20"/>
+      </w:rPr>
+    </w:lvl>
+  </w:abstractNum>
+  <w:abstractNum w:abstractNumId="3" w15:restartNumberingAfterBreak="0">
+    <w:nsid w:val="472F2540"/>
+    <w:multiLevelType w:val="multilevel"/>
+    <w:tmpl w:val="9FDAF4BC"/>
+    <w:lvl w:ilvl="0">
+      <w:start w:val="1"/>
+      <w:numFmt w:val="bullet"/>
+      <w:lvlText w:val=""/>
+      <w:lvlJc w:val="left"/>
+      <w:pPr>
+        <w:tabs>
+          <w:tab w:val="num" w:pos="720"/>
+        </w:tabs>
+        <w:ind w:left="720" w:hanging="360"/>
+      </w:pPr>
+      <w:rPr>
+        <w:rFonts w:ascii="Symbol" w:hAnsi="Symbol" w:hint="default"/>
+        <w:sz w:val="20"/>
+      </w:rPr>
+    </w:lvl>
+    <w:lvl w:ilvl="1" w:tentative="1">
+      <w:start w:val="1"/>
+      <w:numFmt w:val="bullet"/>
+      <w:lvlText w:val="o"/>
+      <w:lvlJc w:val="left"/>
+      <w:pPr>
+        <w:tabs>
+          <w:tab w:val="num" w:pos="1440"/>
+        </w:tabs>
+        <w:ind w:left="1440" w:hanging="360"/>
+      </w:pPr>
+      <w:rPr>
+        <w:rFonts w:ascii="Courier New" w:hAnsi="Courier New" w:hint="default"/>
+        <w:sz w:val="20"/>
+      </w:rPr>
+    </w:lvl>
+    <w:lvl w:ilvl="2" w:tentative="1">
+      <w:start w:val="1"/>
+      <w:numFmt w:val="bullet"/>
+      <w:lvlText w:val=""/>
+      <w:lvlJc w:val="left"/>
+      <w:pPr>
+        <w:tabs>
+          <w:tab w:val="num" w:pos="2160"/>
+        </w:tabs>
+        <w:ind w:left="2160" w:hanging="360"/>
+      </w:pPr>
+      <w:rPr>
+        <w:rFonts w:ascii="Wingdings" w:hAnsi="Wingdings" w:hint="default"/>
+        <w:sz w:val="20"/>
+      </w:rPr>
+    </w:lvl>
+    <w:lvl w:ilvl="3" w:tentative="1">
+      <w:start w:val="1"/>
+      <w:numFmt w:val="bullet"/>
+      <w:lvlText w:val=""/>
+      <w:lvlJc w:val="left"/>
+      <w:pPr>
+        <w:tabs>
+          <w:tab w:val="num" w:pos="2880"/>
+        </w:tabs>
+        <w:ind w:left="2880" w:hanging="360"/>
+      </w:pPr>
+      <w:rPr>
+        <w:rFonts w:ascii="Wingdings" w:hAnsi="Wingdings" w:hint="default"/>
+        <w:sz w:val="20"/>
+      </w:rPr>
+    </w:lvl>
+    <w:lvl w:ilvl="4" w:tentative="1">
+      <w:start w:val="1"/>
+      <w:numFmt w:val="bullet"/>
+      <w:lvlText w:val=""/>
+      <w:lvlJc w:val="left"/>
+      <w:pPr>
+        <w:tabs>
+          <w:tab w:val="num" w:pos="3600"/>
+        </w:tabs>
+        <w:ind w:left="3600" w:hanging="360"/>
+      </w:pPr>
+      <w:rPr>
+        <w:rFonts w:ascii="Wingdings" w:hAnsi="Wingdings" w:hint="default"/>
+        <w:sz w:val="20"/>
+      </w:rPr>
+    </w:lvl>
+    <w:lvl w:ilvl="5" w:tentative="1">
+      <w:start w:val="1"/>
+      <w:numFmt w:val="bullet"/>
+      <w:lvlText w:val=""/>
+      <w:lvlJc w:val="left"/>
+      <w:pPr>
+        <w:tabs>
+          <w:tab w:val="num" w:pos="4320"/>
+        </w:tabs>
+        <w:ind w:left="4320" w:hanging="360"/>
+      </w:pPr>
+      <w:rPr>
+        <w:rFonts w:ascii="Wingdings" w:hAnsi="Wingdings" w:hint="default"/>
+        <w:sz w:val="20"/>
+      </w:rPr>
+    </w:lvl>
+    <w:lvl w:ilvl="6" w:tentative="1">
+      <w:start w:val="1"/>
+      <w:numFmt w:val="bullet"/>
+      <w:lvlText w:val=""/>
+      <w:lvlJc w:val="left"/>
+      <w:pPr>
+        <w:tabs>
+          <w:tab w:val="num" w:pos="5040"/>
+        </w:tabs>
+        <w:ind w:left="5040" w:hanging="360"/>
+      </w:pPr>
+      <w:rPr>
+        <w:rFonts w:ascii="Wingdings" w:hAnsi="Wingdings" w:hint="default"/>
+        <w:sz w:val="20"/>
+      </w:rPr>
+    </w:lvl>
+    <w:lvl w:ilvl="7" w:tentative="1">
+      <w:start w:val="1"/>
+      <w:numFmt w:val="bullet"/>
+      <w:lvlText w:val=""/>
+      <w:lvlJc w:val="left"/>
+      <w:pPr>
+        <w:tabs>
+          <w:tab w:val="num" w:pos="5760"/>
+        </w:tabs>
+        <w:ind w:left="5760" w:hanging="360"/>
+      </w:pPr>
+      <w:rPr>
+        <w:rFonts w:ascii="Wingdings" w:hAnsi="Wingdings" w:hint="default"/>
+        <w:sz w:val="20"/>
+      </w:rPr>
+    </w:lvl>
+    <w:lvl w:ilvl="8" w:tentative="1">
+      <w:start w:val="1"/>
+      <w:numFmt w:val="bullet"/>
+      <w:lvlText w:val=""/>
+      <w:lvlJc w:val="left"/>
+      <w:pPr>
+        <w:tabs>
+          <w:tab w:val="num" w:pos="6480"/>
+        </w:tabs>
+        <w:ind w:left="6480" w:hanging="360"/>
+      </w:pPr>
+      <w:rPr>
+        <w:rFonts w:ascii="Wingdings" w:hAnsi="Wingdings" w:hint="default"/>
+        <w:sz w:val="20"/>
+      </w:rPr>
+    </w:lvl>
+  </w:abstractNum>
+  <w:abstractNum w:abstractNumId="4" w15:restartNumberingAfterBreak="0">
+    <w:nsid w:val="5A326C1E"/>
+    <w:multiLevelType w:val="multilevel"/>
+    <w:tmpl w:val="23DC0050"/>
+    <w:lvl w:ilvl="0">
+      <w:start w:val="1"/>
+      <w:numFmt w:val="bullet"/>
+      <w:lvlText w:val=""/>
+      <w:lvlJc w:val="left"/>
+      <w:pPr>
+        <w:tabs>
+          <w:tab w:val="num" w:pos="720"/>
+        </w:tabs>
+        <w:ind w:left="720" w:hanging="360"/>
+      </w:pPr>
+      <w:rPr>
+        <w:rFonts w:ascii="Symbol" w:hAnsi="Symbol" w:hint="default"/>
+        <w:sz w:val="20"/>
+      </w:rPr>
+    </w:lvl>
+    <w:lvl w:ilvl="1" w:tentative="1">
+      <w:start w:val="1"/>
+      <w:numFmt w:val="bullet"/>
+      <w:lvlText w:val="o"/>
+      <w:lvlJc w:val="left"/>
+      <w:pPr>
+        <w:tabs>
+          <w:tab w:val="num" w:pos="1440"/>
+        </w:tabs>
+        <w:ind w:left="1440" w:hanging="360"/>
+      </w:pPr>
+      <w:rPr>
+        <w:rFonts w:ascii="Courier New" w:hAnsi="Courier New" w:hint="default"/>
+        <w:sz w:val="20"/>
+      </w:rPr>
+    </w:lvl>
+    <w:lvl w:ilvl="2" w:tentative="1">
+      <w:start w:val="1"/>
+      <w:numFmt w:val="bullet"/>
+      <w:lvlText w:val=""/>
+      <w:lvlJc w:val="left"/>
+      <w:pPr>
+        <w:tabs>
+          <w:tab w:val="num" w:pos="2160"/>
+        </w:tabs>
+        <w:ind w:left="2160" w:hanging="360"/>
+      </w:pPr>
+      <w:rPr>
+        <w:rFonts w:ascii="Wingdings" w:hAnsi="Wingdings" w:hint="default"/>
+        <w:sz w:val="20"/>
+      </w:rPr>
+    </w:lvl>
+    <w:lvl w:ilvl="3" w:tentative="1">
+      <w:start w:val="1"/>
+      <w:numFmt w:val="bullet"/>
+      <w:lvlText w:val=""/>
+      <w:lvlJc w:val="left"/>
+      <w:pPr>
+        <w:tabs>
+          <w:tab w:val="num" w:pos="2880"/>
+        </w:tabs>
+        <w:ind w:left="2880" w:hanging="360"/>
+      </w:pPr>
+      <w:rPr>
+        <w:rFonts w:ascii="Wingdings" w:hAnsi="Wingdings" w:hint="default"/>
+        <w:sz w:val="20"/>
+      </w:rPr>
+    </w:lvl>
+    <w:lvl w:ilvl="4" w:tentative="1">
+      <w:start w:val="1"/>
+      <w:numFmt w:val="bullet"/>
+      <w:lvlText w:val=""/>
+      <w:lvlJc w:val="left"/>
+      <w:pPr>
+        <w:tabs>
+          <w:tab w:val="num" w:pos="3600"/>
+        </w:tabs>
+        <w:ind w:left="3600" w:hanging="360"/>
+      </w:pPr>
+      <w:rPr>
+        <w:rFonts w:ascii="Wingdings" w:hAnsi="Wingdings" w:hint="default"/>
+        <w:sz w:val="20"/>
+      </w:rPr>
+    </w:lvl>
+    <w:lvl w:ilvl="5" w:tentative="1">
+      <w:start w:val="1"/>
+      <w:numFmt w:val="bullet"/>
+      <w:lvlText w:val=""/>
+      <w:lvlJc w:val="left"/>
+      <w:pPr>
+        <w:tabs>
+          <w:tab w:val="num" w:pos="4320"/>
+        </w:tabs>
+        <w:ind w:left="4320" w:hanging="360"/>
+      </w:pPr>
+      <w:rPr>
+        <w:rFonts w:ascii="Wingdings" w:hAnsi="Wingdings" w:hint="default"/>
+        <w:sz w:val="20"/>
+      </w:rPr>
+    </w:lvl>
+    <w:lvl w:ilvl="6" w:tentative="1">
+      <w:start w:val="1"/>
+      <w:numFmt w:val="bullet"/>
+      <w:lvlText w:val=""/>
+      <w:lvlJc w:val="left"/>
+      <w:pPr>
+        <w:tabs>
+          <w:tab w:val="num" w:pos="5040"/>
+        </w:tabs>
+        <w:ind w:left="5040" w:hanging="360"/>
+      </w:pPr>
+      <w:rPr>
+        <w:rFonts w:ascii="Wingdings" w:hAnsi="Wingdings" w:hint="default"/>
+        <w:sz w:val="20"/>
+      </w:rPr>
+    </w:lvl>
+    <w:lvl w:ilvl="7" w:tentative="1">
+      <w:start w:val="1"/>
+      <w:numFmt w:val="bullet"/>
+      <w:lvlText w:val=""/>
+      <w:lvlJc w:val="left"/>
+      <w:pPr>
+        <w:tabs>
+          <w:tab w:val="num" w:pos="5760"/>
+        </w:tabs>
+        <w:ind w:left="5760" w:hanging="360"/>
+      </w:pPr>
+      <w:rPr>
+        <w:rFonts w:ascii="Wingdings" w:hAnsi="Wingdings" w:hint="default"/>
+        <w:sz w:val="20"/>
+      </w:rPr>
+    </w:lvl>
+    <w:lvl w:ilvl="8" w:tentative="1">
+      <w:start w:val="1"/>
+      <w:numFmt w:val="bullet"/>
+      <w:lvlText w:val=""/>
+      <w:lvlJc w:val="left"/>
+      <w:pPr>
+        <w:tabs>
+          <w:tab w:val="num" w:pos="6480"/>
+        </w:tabs>
+        <w:ind w:left="6480" w:hanging="360"/>
+      </w:pPr>
+      <w:rPr>
+        <w:rFonts w:ascii="Wingdings" w:hAnsi="Wingdings" w:hint="default"/>
+        <w:sz w:val="20"/>
+      </w:rPr>
+    </w:lvl>
+  </w:abstractNum>
+  <w:abstractNum w:abstractNumId="5" w15:restartNumberingAfterBreak="0">
+    <w:nsid w:val="7A986C4F"/>
+    <w:multiLevelType w:val="multilevel"/>
+    <w:tmpl w:val="A772320A"/>
+    <w:lvl w:ilvl="0">
+      <w:start w:val="1"/>
+      <w:numFmt w:val="bullet"/>
+      <w:lvlText w:val=""/>
+      <w:lvlJc w:val="left"/>
+      <w:pPr>
+        <w:tabs>
+          <w:tab w:val="num" w:pos="720"/>
+        </w:tabs>
+        <w:ind w:left="720" w:hanging="360"/>
+      </w:pPr>
+      <w:rPr>
+        <w:rFonts w:ascii="Symbol" w:hAnsi="Symbol" w:hint="default"/>
+        <w:sz w:val="20"/>
+      </w:rPr>
+    </w:lvl>
+    <w:lvl w:ilvl="1" w:tentative="1">
+      <w:start w:val="1"/>
+      <w:numFmt w:val="bullet"/>
+      <w:lvlText w:val="o"/>
+      <w:lvlJc w:val="left"/>
+      <w:pPr>
+        <w:tabs>
+          <w:tab w:val="num" w:pos="1440"/>
+        </w:tabs>
+        <w:ind w:left="1440" w:hanging="360"/>
+      </w:pPr>
+      <w:rPr>
+        <w:rFonts w:ascii="Courier New" w:hAnsi="Courier New" w:hint="default"/>
+        <w:sz w:val="20"/>
+      </w:rPr>
+    </w:lvl>
+    <w:lvl w:ilvl="2" w:tentative="1">
+      <w:start w:val="1"/>
+      <w:numFmt w:val="bullet"/>
+      <w:lvlText w:val=""/>
+      <w:lvlJc w:val="left"/>
+      <w:pPr>
+        <w:tabs>
+          <w:tab w:val="num" w:pos="2160"/>
+        </w:tabs>
+        <w:ind w:left="2160" w:hanging="360"/>
+      </w:pPr>
+      <w:rPr>
+        <w:rFonts w:ascii="Wingdings" w:hAnsi="Wingdings" w:hint="default"/>
+        <w:sz w:val="20"/>
+      </w:rPr>
+    </w:lvl>
+    <w:lvl w:ilvl="3" w:tentative="1">
+      <w:start w:val="1"/>
+      <w:numFmt w:val="bullet"/>
+      <w:lvlText w:val=""/>
+      <w:lvlJc w:val="left"/>
+      <w:pPr>
+        <w:tabs>
+          <w:tab w:val="num" w:pos="2880"/>
+        </w:tabs>
+        <w:ind w:left="2880" w:hanging="360"/>
+      </w:pPr>
+      <w:rPr>
+        <w:rFonts w:ascii="Wingdings" w:hAnsi="Wingdings" w:hint="default"/>
+        <w:sz w:val="20"/>
+      </w:rPr>
+    </w:lvl>
+    <w:lvl w:ilvl="4" w:tentative="1">
+      <w:start w:val="1"/>
+      <w:numFmt w:val="bullet"/>
+      <w:lvlText w:val=""/>
+      <w:lvlJc w:val="left"/>
+      <w:pPr>
+        <w:tabs>
+          <w:tab w:val="num" w:pos="3600"/>
+        </w:tabs>
+        <w:ind w:left="3600" w:hanging="360"/>
+      </w:pPr>
+      <w:rPr>
+        <w:rFonts w:ascii="Wingdings" w:hAnsi="Wingdings" w:hint="default"/>
+        <w:sz w:val="20"/>
+      </w:rPr>
+    </w:lvl>
+    <w:lvl w:ilvl="5" w:tentative="1">
+      <w:start w:val="1"/>
+      <w:numFmt w:val="bullet"/>
+      <w:lvlText w:val=""/>
+      <w:lvlJc w:val="left"/>
+      <w:pPr>
+        <w:tabs>
+          <w:tab w:val="num" w:pos="4320"/>
+        </w:tabs>
+        <w:ind w:left="4320" w:hanging="360"/>
+      </w:pPr>
+      <w:rPr>
+        <w:rFonts w:ascii="Wingdings" w:hAnsi="Wingdings" w:hint="default"/>
+        <w:sz w:val="20"/>
+      </w:rPr>
+    </w:lvl>
+    <w:lvl w:ilvl="6" w:tentative="1">
+      <w:start w:val="1"/>
+      <w:numFmt w:val="bullet"/>
+      <w:lvlText w:val=""/>
+      <w:lvlJc w:val="left"/>
+      <w:pPr>
+        <w:tabs>
+          <w:tab w:val="num" w:pos="5040"/>
+        </w:tabs>
+        <w:ind w:left="5040" w:hanging="360"/>
+      </w:pPr>
+      <w:rPr>
+        <w:rFonts w:ascii="Wingdings" w:hAnsi="Wingdings" w:hint="default"/>
+        <w:sz w:val="20"/>
+      </w:rPr>
+    </w:lvl>
+    <w:lvl w:ilvl="7" w:tentative="1">
+      <w:start w:val="1"/>
+      <w:numFmt w:val="bullet"/>
+      <w:lvlText w:val=""/>
+      <w:lvlJc w:val="left"/>
+      <w:pPr>
+        <w:tabs>
+          <w:tab w:val="num" w:pos="5760"/>
+        </w:tabs>
+        <w:ind w:left="5760" w:hanging="360"/>
+      </w:pPr>
+      <w:rPr>
+        <w:rFonts w:ascii="Wingdings" w:hAnsi="Wingdings" w:hint="default"/>
+        <w:sz w:val="20"/>
+      </w:rPr>
+    </w:lvl>
+    <w:lvl w:ilvl="8" w:tentative="1">
+      <w:start w:val="1"/>
+      <w:numFmt w:val="bullet"/>
+      <w:lvlText w:val=""/>
+      <w:lvlJc w:val="left"/>
+      <w:pPr>
+        <w:tabs>
+          <w:tab w:val="num" w:pos="6480"/>
+        </w:tabs>
+        <w:ind w:left="6480" w:hanging="360"/>
+      </w:pPr>
+      <w:rPr>
+        <w:rFonts w:ascii="Wingdings" w:hAnsi="Wingdings" w:hint="default"/>
+        <w:sz w:val="20"/>
+      </w:rPr>
+    </w:lvl>
+  </w:abstractNum>
+  <w:abstractNum w:abstractNumId="6" w15:restartNumberingAfterBreak="0">
+    <w:nsid w:val="7E376132"/>
+    <w:multiLevelType w:val="multilevel"/>
+    <w:tmpl w:val="0E1CCB86"/>
+    <w:lvl w:ilvl="0">
+      <w:start w:val="1"/>
+      <w:numFmt w:val="bullet"/>
+      <w:lvlText w:val=""/>
+      <w:lvlJc w:val="left"/>
+      <w:pPr>
+        <w:tabs>
+          <w:tab w:val="num" w:pos="720"/>
+        </w:tabs>
+        <w:ind w:left="720" w:hanging="360"/>
+      </w:pPr>
+      <w:rPr>
+        <w:rFonts w:ascii="Symbol" w:hAnsi="Symbol" w:hint="default"/>
+        <w:sz w:val="20"/>
+      </w:rPr>
+    </w:lvl>
+    <w:lvl w:ilvl="1" w:tentative="1">
+      <w:start w:val="1"/>
+      <w:numFmt w:val="bullet"/>
+      <w:lvlText w:val="o"/>
+      <w:lvlJc w:val="left"/>
+      <w:pPr>
+        <w:tabs>
+          <w:tab w:val="num" w:pos="1440"/>
+        </w:tabs>
+        <w:ind w:left="1440" w:hanging="360"/>
+      </w:pPr>
+      <w:rPr>
+        <w:rFonts w:ascii="Courier New" w:hAnsi="Courier New" w:hint="default"/>
+        <w:sz w:val="20"/>
+      </w:rPr>
+    </w:lvl>
+    <w:lvl w:ilvl="2" w:tentative="1">
+      <w:start w:val="1"/>
+      <w:numFmt w:val="bullet"/>
+      <w:lvlText w:val=""/>
+      <w:lvlJc w:val="left"/>
+      <w:pPr>
+        <w:tabs>
+          <w:tab w:val="num" w:pos="2160"/>
+        </w:tabs>
+        <w:ind w:left="2160" w:hanging="360"/>
+      </w:pPr>
+      <w:rPr>
+        <w:rFonts w:ascii="Wingdings" w:hAnsi="Wingdings" w:hint="default"/>
+        <w:sz w:val="20"/>
+      </w:rPr>
+    </w:lvl>
+    <w:lvl w:ilvl="3" w:tentative="1">
+      <w:start w:val="1"/>
+      <w:numFmt w:val="bullet"/>
+      <w:lvlText w:val=""/>
+      <w:lvlJc w:val="left"/>
+      <w:pPr>
+        <w:tabs>
+          <w:tab w:val="num" w:pos="2880"/>
+        </w:tabs>
+        <w:ind w:left="2880" w:hanging="360"/>
+      </w:pPr>
+      <w:rPr>
+        <w:rFonts w:ascii="Wingdings" w:hAnsi="Wingdings" w:hint="default"/>
+        <w:sz w:val="20"/>
+      </w:rPr>
+    </w:lvl>
+    <w:lvl w:ilvl="4" w:tentative="1">
+      <w:start w:val="1"/>
+      <w:numFmt w:val="bullet"/>
+      <w:lvlText w:val=""/>
+      <w:lvlJc w:val="left"/>
+      <w:pPr>
+        <w:tabs>
+          <w:tab w:val="num" w:pos="3600"/>
+        </w:tabs>
+        <w:ind w:left="3600" w:hanging="360"/>
+      </w:pPr>
+      <w:rPr>
+        <w:rFonts w:ascii="Wingdings" w:hAnsi="Wingdings" w:hint="default"/>
+        <w:sz w:val="20"/>
+      </w:rPr>
+    </w:lvl>
+    <w:lvl w:ilvl="5" w:tentative="1">
+      <w:start w:val="1"/>
+      <w:numFmt w:val="bullet"/>
+      <w:lvlText w:val=""/>
+      <w:lvlJc w:val="left"/>
+      <w:pPr>
+        <w:tabs>
+          <w:tab w:val="num" w:pos="4320"/>
+        </w:tabs>
+        <w:ind w:left="4320" w:hanging="360"/>
+      </w:pPr>
+      <w:rPr>
+        <w:rFonts w:ascii="Wingdings" w:hAnsi="Wingdings" w:hint="default"/>
+        <w:sz w:val="20"/>
+      </w:rPr>
+    </w:lvl>
+    <w:lvl w:ilvl="6" w:tentative="1">
+      <w:start w:val="1"/>
+      <w:numFmt w:val="bullet"/>
+      <w:lvlText w:val=""/>
+      <w:lvlJc w:val="left"/>
+      <w:pPr>
+        <w:tabs>
+          <w:tab w:val="num" w:pos="5040"/>
+        </w:tabs>
+        <w:ind w:left="5040" w:hanging="360"/>
+      </w:pPr>
+      <w:rPr>
+        <w:rFonts w:ascii="Wingdings" w:hAnsi="Wingdings" w:hint="default"/>
+        <w:sz w:val="20"/>
+      </w:rPr>
+    </w:lvl>
+    <w:lvl w:ilvl="7" w:tentative="1">
+      <w:start w:val="1"/>
+      <w:numFmt w:val="bullet"/>
+      <w:lvlText w:val=""/>
+      <w:lvlJc w:val="left"/>
+      <w:pPr>
+        <w:tabs>
+          <w:tab w:val="num" w:pos="5760"/>
+        </w:tabs>
+        <w:ind w:left="5760" w:hanging="360"/>
+      </w:pPr>
+      <w:rPr>
+        <w:rFonts w:ascii="Wingdings" w:hAnsi="Wingdings" w:hint="default"/>
+        <w:sz w:val="20"/>
+      </w:rPr>
+    </w:lvl>
+    <w:lvl w:ilvl="8" w:tentative="1">
+      <w:start w:val="1"/>
+      <w:numFmt w:val="bullet"/>
+      <w:lvlText w:val=""/>
+      <w:lvlJc w:val="left"/>
+      <w:pPr>
+        <w:tabs>
+          <w:tab w:val="num" w:pos="6480"/>
+        </w:tabs>
+        <w:ind w:left="6480" w:hanging="360"/>
+      </w:pPr>
+      <w:rPr>
+        <w:rFonts w:ascii="Wingdings" w:hAnsi="Wingdings" w:hint="default"/>
+        <w:sz w:val="20"/>
+      </w:rPr>
+    </w:lvl>
+  </w:abstractNum>
+  <w:num w:numId="1" w16cid:durableId="669212486">
+    <w:abstractNumId w:val="1"/>
+  </w:num>
+  <w:num w:numId="2" w16cid:durableId="527184827">
+    <w:abstractNumId w:val="2"/>
+  </w:num>
+  <w:num w:numId="3" w16cid:durableId="729382596">
+    <w:abstractNumId w:val="4"/>
+  </w:num>
+  <w:num w:numId="4" w16cid:durableId="1211838518">
+    <w:abstractNumId w:val="6"/>
+  </w:num>
+  <w:num w:numId="5" w16cid:durableId="879240494">
+    <w:abstractNumId w:val="3"/>
+  </w:num>
+  <w:num w:numId="6" w16cid:durableId="1165436424">
+    <w:abstractNumId w:val="0"/>
+  </w:num>
+  <w:num w:numId="7" w16cid:durableId="2117213431">
+    <w:abstractNumId w:val="5"/>
+  </w:num>
+</w:numbering>
 </file>
 
 <file path=word/styles.xml><?xml version="1.0" encoding="utf-8"?>
@@ -2458,7 +5291,7 @@
   <w:style w:type="paragraph" w:default="1" w:styleId="Normal">
     <w:name w:val="Normal"/>
     <w:qFormat/>
-    <w:rsid w:val="001328EE"/>
+    <w:rsid w:val="00F96F6D"/>
   </w:style>
   <w:style w:type="paragraph" w:styleId="Heading1">
     <w:name w:val="heading 1"/>
@@ -2509,7 +5342,6 @@
     <w:next w:val="Normal"/>
     <w:link w:val="Heading3Char"/>
     <w:uiPriority w:val="9"/>
-    <w:semiHidden/>
     <w:unhideWhenUsed/>
     <w:qFormat/>
     <w:rsid w:val="006A3610"/>
@@ -2661,7 +5493,6 @@
   <w:style w:type="character" w:default="1" w:styleId="DefaultParagraphFont">
     <w:name w:val="Default Paragraph Font"/>
     <w:uiPriority w:val="1"/>
-    <w:semiHidden/>
     <w:unhideWhenUsed/>
   </w:style>
   <w:style w:type="table" w:default="1" w:styleId="TableNormal">
@@ -2716,7 +5547,6 @@
     <w:basedOn w:val="DefaultParagraphFont"/>
     <w:link w:val="Heading3"/>
     <w:uiPriority w:val="9"/>
-    <w:semiHidden/>
     <w:rsid w:val="006A3610"/>
     <w:rPr>
       <w:rFonts w:eastAsiaTheme="majorEastAsia" w:cstheme="majorBidi"/>
@@ -3061,6 +5891,42 @@
       <w:szCs w:val="22"/>
       <w:lang w:val="en-US"/>
       <w14:ligatures w14:val="none"/>
+    </w:rPr>
+  </w:style>
+  <w:style w:type="paragraph" w:styleId="TOC3">
+    <w:name w:val="toc 3"/>
+    <w:basedOn w:val="Normal"/>
+    <w:next w:val="Normal"/>
+    <w:autoRedefine/>
+    <w:uiPriority w:val="39"/>
+    <w:unhideWhenUsed/>
+    <w:rsid w:val="0069293F"/>
+    <w:pPr>
+      <w:spacing w:after="100"/>
+      <w:ind w:left="480"/>
+    </w:pPr>
+  </w:style>
+  <w:style w:type="character" w:styleId="UnresolvedMention">
+    <w:name w:val="Unresolved Mention"/>
+    <w:basedOn w:val="DefaultParagraphFont"/>
+    <w:uiPriority w:val="99"/>
+    <w:semiHidden/>
+    <w:unhideWhenUsed/>
+    <w:rsid w:val="00E87105"/>
+    <w:rPr>
+      <w:color w:val="605E5C"/>
+      <w:shd w:val="clear" w:color="auto" w:fill="E1DFDD"/>
+    </w:rPr>
+  </w:style>
+  <w:style w:type="paragraph" w:styleId="NormalWeb">
+    <w:name w:val="Normal (Web)"/>
+    <w:basedOn w:val="Normal"/>
+    <w:uiPriority w:val="99"/>
+    <w:semiHidden/>
+    <w:unhideWhenUsed/>
+    <w:rsid w:val="001C009C"/>
+    <w:rPr>
+      <w:rFonts w:ascii="Times New Roman" w:hAnsi="Times New Roman" w:cs="Times New Roman"/>
     </w:rPr>
   </w:style>
 </w:styles>

</xml_diff>

<commit_message>
Update Jupytor Note book screenshot
</commit_message>
<xml_diff>
--- a/BDA CA 1 - Large Scale Data.docx
+++ b/BDA CA 1 - Large Scale Data.docx
@@ -4570,6 +4570,713 @@
         </w:rPr>
       </w:pPr>
     </w:p>
+    <w:p>
+      <w:pPr>
+        <w:pStyle w:val="ListParagraph"/>
+        <w:rPr>
+          <w:rFonts w:ascii="Arial" w:hAnsi="Arial" w:cs="Arial"/>
+          <w:sz w:val="16"/>
+          <w:szCs w:val="16"/>
+        </w:rPr>
+      </w:pPr>
+    </w:p>
+    <w:p>
+      <w:pPr>
+        <w:pStyle w:val="ListParagraph"/>
+        <w:rPr>
+          <w:rFonts w:ascii="Arial" w:hAnsi="Arial" w:cs="Arial"/>
+          <w:sz w:val="16"/>
+          <w:szCs w:val="16"/>
+        </w:rPr>
+      </w:pPr>
+    </w:p>
+    <w:p>
+      <w:pPr>
+        <w:pStyle w:val="ListParagraph"/>
+        <w:rPr>
+          <w:rFonts w:ascii="Arial" w:hAnsi="Arial" w:cs="Arial"/>
+          <w:sz w:val="16"/>
+          <w:szCs w:val="16"/>
+        </w:rPr>
+      </w:pPr>
+    </w:p>
+    <w:p>
+      <w:pPr>
+        <w:pStyle w:val="ListParagraph"/>
+        <w:rPr>
+          <w:rFonts w:ascii="Arial" w:hAnsi="Arial" w:cs="Arial"/>
+          <w:sz w:val="16"/>
+          <w:szCs w:val="16"/>
+        </w:rPr>
+      </w:pPr>
+    </w:p>
+    <w:p>
+      <w:pPr>
+        <w:pStyle w:val="ListParagraph"/>
+        <w:rPr>
+          <w:rFonts w:ascii="Arial" w:hAnsi="Arial" w:cs="Arial"/>
+          <w:sz w:val="16"/>
+          <w:szCs w:val="16"/>
+        </w:rPr>
+      </w:pPr>
+    </w:p>
+    <w:p>
+      <w:pPr>
+        <w:pStyle w:val="ListParagraph"/>
+        <w:rPr>
+          <w:rFonts w:ascii="Arial" w:hAnsi="Arial" w:cs="Arial"/>
+          <w:sz w:val="16"/>
+          <w:szCs w:val="16"/>
+        </w:rPr>
+      </w:pPr>
+    </w:p>
+    <w:p>
+      <w:pPr>
+        <w:pStyle w:val="ListParagraph"/>
+        <w:rPr>
+          <w:rFonts w:ascii="Arial" w:hAnsi="Arial" w:cs="Arial"/>
+          <w:sz w:val="16"/>
+          <w:szCs w:val="16"/>
+        </w:rPr>
+      </w:pPr>
+    </w:p>
+    <w:p>
+      <w:pPr>
+        <w:pStyle w:val="ListParagraph"/>
+        <w:rPr>
+          <w:rFonts w:ascii="Arial" w:hAnsi="Arial" w:cs="Arial"/>
+          <w:sz w:val="16"/>
+          <w:szCs w:val="16"/>
+        </w:rPr>
+      </w:pPr>
+    </w:p>
+    <w:p>
+      <w:pPr>
+        <w:pStyle w:val="ListParagraph"/>
+        <w:rPr>
+          <w:rFonts w:ascii="Arial" w:hAnsi="Arial" w:cs="Arial"/>
+          <w:sz w:val="16"/>
+          <w:szCs w:val="16"/>
+        </w:rPr>
+      </w:pPr>
+    </w:p>
+    <w:p>
+      <w:pPr>
+        <w:pStyle w:val="ListParagraph"/>
+        <w:rPr>
+          <w:rFonts w:ascii="Arial" w:hAnsi="Arial" w:cs="Arial"/>
+          <w:sz w:val="16"/>
+          <w:szCs w:val="16"/>
+        </w:rPr>
+      </w:pPr>
+    </w:p>
+    <w:p>
+      <w:pPr>
+        <w:pStyle w:val="ListParagraph"/>
+        <w:rPr>
+          <w:rFonts w:ascii="Arial" w:hAnsi="Arial" w:cs="Arial"/>
+          <w:sz w:val="16"/>
+          <w:szCs w:val="16"/>
+        </w:rPr>
+      </w:pPr>
+    </w:p>
+    <w:p>
+      <w:pPr>
+        <w:pStyle w:val="ListParagraph"/>
+        <w:rPr>
+          <w:rFonts w:ascii="Arial" w:hAnsi="Arial" w:cs="Arial"/>
+          <w:sz w:val="16"/>
+          <w:szCs w:val="16"/>
+        </w:rPr>
+      </w:pPr>
+    </w:p>
+    <w:p>
+      <w:pPr>
+        <w:pStyle w:val="ListParagraph"/>
+        <w:rPr>
+          <w:rFonts w:ascii="Arial" w:hAnsi="Arial" w:cs="Arial"/>
+          <w:sz w:val="16"/>
+          <w:szCs w:val="16"/>
+        </w:rPr>
+      </w:pPr>
+    </w:p>
+    <w:p>
+      <w:pPr>
+        <w:pStyle w:val="ListParagraph"/>
+        <w:rPr>
+          <w:rFonts w:ascii="Arial" w:hAnsi="Arial" w:cs="Arial"/>
+          <w:sz w:val="16"/>
+          <w:szCs w:val="16"/>
+        </w:rPr>
+      </w:pPr>
+    </w:p>
+    <w:p>
+      <w:pPr>
+        <w:pStyle w:val="ListParagraph"/>
+        <w:rPr>
+          <w:rFonts w:ascii="Arial" w:hAnsi="Arial" w:cs="Arial"/>
+          <w:sz w:val="16"/>
+          <w:szCs w:val="16"/>
+        </w:rPr>
+      </w:pPr>
+    </w:p>
+    <w:p>
+      <w:pPr>
+        <w:pStyle w:val="ListParagraph"/>
+        <w:rPr>
+          <w:rFonts w:ascii="Arial" w:hAnsi="Arial" w:cs="Arial"/>
+          <w:sz w:val="16"/>
+          <w:szCs w:val="16"/>
+        </w:rPr>
+      </w:pPr>
+    </w:p>
+    <w:p>
+      <w:pPr>
+        <w:pStyle w:val="ListParagraph"/>
+        <w:rPr>
+          <w:rFonts w:ascii="Arial" w:hAnsi="Arial" w:cs="Arial"/>
+          <w:sz w:val="16"/>
+          <w:szCs w:val="16"/>
+        </w:rPr>
+      </w:pPr>
+    </w:p>
+    <w:p>
+      <w:pPr>
+        <w:pStyle w:val="ListParagraph"/>
+        <w:rPr>
+          <w:rFonts w:ascii="Arial" w:hAnsi="Arial" w:cs="Arial"/>
+          <w:sz w:val="16"/>
+          <w:szCs w:val="16"/>
+        </w:rPr>
+      </w:pPr>
+    </w:p>
+    <w:p>
+      <w:pPr>
+        <w:pStyle w:val="ListParagraph"/>
+        <w:rPr>
+          <w:rFonts w:ascii="Arial" w:hAnsi="Arial" w:cs="Arial"/>
+          <w:sz w:val="16"/>
+          <w:szCs w:val="16"/>
+        </w:rPr>
+      </w:pPr>
+    </w:p>
+    <w:p>
+      <w:pPr>
+        <w:pStyle w:val="ListParagraph"/>
+        <w:rPr>
+          <w:rFonts w:ascii="Arial" w:hAnsi="Arial" w:cs="Arial"/>
+          <w:sz w:val="16"/>
+          <w:szCs w:val="16"/>
+        </w:rPr>
+      </w:pPr>
+    </w:p>
+    <w:p>
+      <w:pPr>
+        <w:pStyle w:val="ListParagraph"/>
+        <w:rPr>
+          <w:rFonts w:ascii="Arial" w:hAnsi="Arial" w:cs="Arial"/>
+          <w:sz w:val="16"/>
+          <w:szCs w:val="16"/>
+        </w:rPr>
+      </w:pPr>
+    </w:p>
+    <w:p>
+      <w:pPr>
+        <w:pStyle w:val="ListParagraph"/>
+        <w:rPr>
+          <w:rFonts w:ascii="Arial" w:hAnsi="Arial" w:cs="Arial"/>
+          <w:sz w:val="16"/>
+          <w:szCs w:val="16"/>
+        </w:rPr>
+      </w:pPr>
+    </w:p>
+    <w:p>
+      <w:pPr>
+        <w:pStyle w:val="ListParagraph"/>
+        <w:rPr>
+          <w:rFonts w:ascii="Arial" w:hAnsi="Arial" w:cs="Arial"/>
+          <w:sz w:val="16"/>
+          <w:szCs w:val="16"/>
+        </w:rPr>
+      </w:pPr>
+    </w:p>
+    <w:p>
+      <w:pPr>
+        <w:pStyle w:val="ListParagraph"/>
+        <w:rPr>
+          <w:rFonts w:ascii="Arial" w:hAnsi="Arial" w:cs="Arial"/>
+          <w:sz w:val="16"/>
+          <w:szCs w:val="16"/>
+        </w:rPr>
+      </w:pPr>
+    </w:p>
+    <w:p>
+      <w:pPr>
+        <w:pStyle w:val="ListParagraph"/>
+        <w:rPr>
+          <w:rFonts w:ascii="Arial" w:hAnsi="Arial" w:cs="Arial"/>
+          <w:sz w:val="16"/>
+          <w:szCs w:val="16"/>
+        </w:rPr>
+      </w:pPr>
+    </w:p>
+    <w:p>
+      <w:pPr>
+        <w:pStyle w:val="ListParagraph"/>
+        <w:rPr>
+          <w:rFonts w:ascii="Arial" w:hAnsi="Arial" w:cs="Arial"/>
+          <w:sz w:val="16"/>
+          <w:szCs w:val="16"/>
+        </w:rPr>
+      </w:pPr>
+    </w:p>
+    <w:p>
+      <w:pPr>
+        <w:pStyle w:val="ListParagraph"/>
+        <w:rPr>
+          <w:rFonts w:ascii="Arial" w:hAnsi="Arial" w:cs="Arial"/>
+          <w:sz w:val="16"/>
+          <w:szCs w:val="16"/>
+        </w:rPr>
+      </w:pPr>
+    </w:p>
+    <w:p>
+      <w:pPr>
+        <w:pStyle w:val="ListParagraph"/>
+        <w:rPr>
+          <w:rFonts w:ascii="Arial" w:hAnsi="Arial" w:cs="Arial"/>
+          <w:sz w:val="16"/>
+          <w:szCs w:val="16"/>
+        </w:rPr>
+      </w:pPr>
+    </w:p>
+    <w:p>
+      <w:pPr>
+        <w:pStyle w:val="ListParagraph"/>
+        <w:rPr>
+          <w:rFonts w:ascii="Arial" w:hAnsi="Arial" w:cs="Arial"/>
+          <w:sz w:val="16"/>
+          <w:szCs w:val="16"/>
+        </w:rPr>
+      </w:pPr>
+    </w:p>
+    <w:p>
+      <w:pPr>
+        <w:pStyle w:val="ListParagraph"/>
+        <w:rPr>
+          <w:rFonts w:ascii="Arial" w:hAnsi="Arial" w:cs="Arial"/>
+          <w:sz w:val="16"/>
+          <w:szCs w:val="16"/>
+        </w:rPr>
+      </w:pPr>
+    </w:p>
+    <w:p>
+      <w:pPr>
+        <w:pStyle w:val="ListParagraph"/>
+        <w:rPr>
+          <w:rFonts w:ascii="Arial" w:hAnsi="Arial" w:cs="Arial"/>
+          <w:sz w:val="16"/>
+          <w:szCs w:val="16"/>
+        </w:rPr>
+      </w:pPr>
+    </w:p>
+    <w:p>
+      <w:pPr>
+        <w:pStyle w:val="ListParagraph"/>
+        <w:rPr>
+          <w:rFonts w:ascii="Arial" w:hAnsi="Arial" w:cs="Arial"/>
+          <w:sz w:val="16"/>
+          <w:szCs w:val="16"/>
+        </w:rPr>
+      </w:pPr>
+    </w:p>
+    <w:p>
+      <w:pPr>
+        <w:pStyle w:val="Heading1"/>
+        <w:rPr>
+          <w:rStyle w:val="Heading2Char"/>
+          <w:rFonts w:ascii="Arial" w:hAnsi="Arial" w:cs="Arial"/>
+          <w:b/>
+          <w:bCs/>
+        </w:rPr>
+      </w:pPr>
+      <w:r>
+        <w:rPr>
+          <w:rStyle w:val="Heading2Char"/>
+          <w:rFonts w:ascii="Arial" w:hAnsi="Arial" w:cs="Arial"/>
+          <w:b/>
+          <w:bCs/>
+        </w:rPr>
+        <w:lastRenderedPageBreak/>
+        <w:t>MapR</w:t>
+      </w:r>
+      <w:r>
+        <w:rPr>
+          <w:rStyle w:val="Heading2Char"/>
+          <w:rFonts w:ascii="Arial" w:hAnsi="Arial" w:cs="Arial"/>
+          <w:b/>
+          <w:bCs/>
+        </w:rPr>
+        <w:t>e</w:t>
+      </w:r>
+      <w:r>
+        <w:rPr>
+          <w:rStyle w:val="Heading2Char"/>
+          <w:rFonts w:ascii="Arial" w:hAnsi="Arial" w:cs="Arial"/>
+          <w:b/>
+          <w:bCs/>
+        </w:rPr>
+        <w:t>duce Using Python</w:t>
+      </w:r>
+    </w:p>
+    <w:p>
+      <w:pPr>
+        <w:rPr>
+          <w:rFonts w:ascii="Arial" w:hAnsi="Arial" w:cs="Arial"/>
+        </w:rPr>
+      </w:pPr>
+      <w:r>
+        <w:rPr>
+          <w:rFonts w:ascii="Arial" w:hAnsi="Arial" w:cs="Arial"/>
+        </w:rPr>
+        <w:t xml:space="preserve">Create Data set and upload in Python then view data </w:t>
+      </w:r>
+    </w:p>
+    <w:p>
+      <w:pPr>
+        <w:rPr>
+          <w:rFonts w:ascii="Arial" w:hAnsi="Arial" w:cs="Arial"/>
+          <w:sz w:val="16"/>
+          <w:szCs w:val="16"/>
+        </w:rPr>
+      </w:pPr>
+      <w:r>
+        <w:rPr>
+          <w:rFonts w:ascii="Arial" w:hAnsi="Arial" w:cs="Arial"/>
+          <w:sz w:val="16"/>
+          <w:szCs w:val="16"/>
+        </w:rPr>
+        <w:drawing>
+          <wp:inline distT="0" distB="0" distL="0" distR="0" wp14:anchorId="23ADA209" wp14:editId="14D3DB03">
+            <wp:extent cx="5252539" cy="3536415"/>
+            <wp:effectExtent l="0" t="0" r="5715" b="6985"/>
+            <wp:docPr id="1380808156" name="Picture 1"/>
+            <wp:cNvGraphicFramePr>
+              <a:graphicFrameLocks xmlns:a="http://schemas.openxmlformats.org/drawingml/2006/main" noChangeAspect="1"/>
+            </wp:cNvGraphicFramePr>
+            <a:graphic xmlns:a="http://schemas.openxmlformats.org/drawingml/2006/main">
+              <a:graphicData uri="http://schemas.openxmlformats.org/drawingml/2006/picture">
+                <pic:pic xmlns:pic="http://schemas.openxmlformats.org/drawingml/2006/picture">
+                  <pic:nvPicPr>
+                    <pic:cNvPr id="1380808156" name=""/>
+                    <pic:cNvPicPr/>
+                  </pic:nvPicPr>
+                  <pic:blipFill>
+                    <a:blip r:embed="rId31"/>
+                    <a:stretch>
+                      <a:fillRect/>
+                    </a:stretch>
+                  </pic:blipFill>
+                  <pic:spPr>
+                    <a:xfrm>
+                      <a:off x="0" y="0"/>
+                      <a:ext cx="5266704" cy="3545952"/>
+                    </a:xfrm>
+                    <a:prstGeom prst="rect">
+                      <a:avLst/>
+                    </a:prstGeom>
+                  </pic:spPr>
+                </pic:pic>
+              </a:graphicData>
+            </a:graphic>
+          </wp:inline>
+        </w:drawing>
+      </w:r>
+    </w:p>
+    <w:p>
+      <w:pPr>
+        <w:rPr>
+          <w:rFonts w:ascii="Arial" w:hAnsi="Arial" w:cs="Arial"/>
+          <w:sz w:val="16"/>
+          <w:szCs w:val="16"/>
+        </w:rPr>
+      </w:pPr>
+    </w:p>
+    <w:p>
+      <w:pPr>
+        <w:rPr>
+          <w:rFonts w:ascii="Arial" w:hAnsi="Arial" w:cs="Arial"/>
+        </w:rPr>
+      </w:pPr>
+      <w:r>
+        <w:rPr>
+          <w:rFonts w:ascii="Arial" w:hAnsi="Arial" w:cs="Arial"/>
+        </w:rPr>
+        <w:t xml:space="preserve">Write a function including mapping, </w:t>
+      </w:r>
+      <w:proofErr w:type="gramStart"/>
+      <w:r>
+        <w:rPr>
+          <w:rFonts w:ascii="Arial" w:hAnsi="Arial" w:cs="Arial"/>
+        </w:rPr>
+        <w:t>shuffle ,</w:t>
+      </w:r>
+      <w:proofErr w:type="gramEnd"/>
+      <w:r>
+        <w:rPr>
+          <w:rFonts w:ascii="Arial" w:hAnsi="Arial" w:cs="Arial"/>
+        </w:rPr>
+        <w:t xml:space="preserve"> Reduce Sort and Main function to return data </w:t>
+      </w:r>
+    </w:p>
+    <w:p>
+      <w:pPr>
+        <w:rPr>
+          <w:rFonts w:ascii="Arial" w:hAnsi="Arial" w:cs="Arial"/>
+        </w:rPr>
+      </w:pPr>
+      <w:r>
+        <w:rPr>
+          <w:rFonts w:ascii="Arial" w:hAnsi="Arial" w:cs="Arial"/>
+        </w:rPr>
+        <w:drawing>
+          <wp:inline distT="0" distB="0" distL="0" distR="0" wp14:anchorId="45C21B10" wp14:editId="735A6302">
+            <wp:extent cx="5051153" cy="3515549"/>
+            <wp:effectExtent l="0" t="0" r="0" b="8890"/>
+            <wp:docPr id="2126813789" name="Picture 1"/>
+            <wp:cNvGraphicFramePr>
+              <a:graphicFrameLocks xmlns:a="http://schemas.openxmlformats.org/drawingml/2006/main" noChangeAspect="1"/>
+            </wp:cNvGraphicFramePr>
+            <a:graphic xmlns:a="http://schemas.openxmlformats.org/drawingml/2006/main">
+              <a:graphicData uri="http://schemas.openxmlformats.org/drawingml/2006/picture">
+                <pic:pic xmlns:pic="http://schemas.openxmlformats.org/drawingml/2006/picture">
+                  <pic:nvPicPr>
+                    <pic:cNvPr id="2126813789" name=""/>
+                    <pic:cNvPicPr/>
+                  </pic:nvPicPr>
+                  <pic:blipFill>
+                    <a:blip r:embed="rId32"/>
+                    <a:stretch>
+                      <a:fillRect/>
+                    </a:stretch>
+                  </pic:blipFill>
+                  <pic:spPr>
+                    <a:xfrm>
+                      <a:off x="0" y="0"/>
+                      <a:ext cx="5059587" cy="3521419"/>
+                    </a:xfrm>
+                    <a:prstGeom prst="rect">
+                      <a:avLst/>
+                    </a:prstGeom>
+                  </pic:spPr>
+                </pic:pic>
+              </a:graphicData>
+            </a:graphic>
+          </wp:inline>
+        </w:drawing>
+      </w:r>
+      <w:r>
+        <w:rPr>
+          <w:rFonts w:ascii="Arial" w:hAnsi="Arial" w:cs="Arial"/>
+        </w:rPr>
+        <w:t xml:space="preserve"> </w:t>
+      </w:r>
+    </w:p>
+    <w:p>
+      <w:pPr>
+        <w:rPr>
+          <w:rFonts w:ascii="Arial" w:hAnsi="Arial" w:cs="Arial"/>
+          <w:sz w:val="16"/>
+          <w:szCs w:val="16"/>
+        </w:rPr>
+      </w:pPr>
+    </w:p>
+    <w:p>
+      <w:pPr>
+        <w:rPr>
+          <w:rFonts w:ascii="Arial" w:hAnsi="Arial" w:cs="Arial"/>
+        </w:rPr>
+      </w:pPr>
+      <w:r>
+        <w:rPr>
+          <w:rFonts w:ascii="Arial" w:hAnsi="Arial" w:cs="Arial"/>
+        </w:rPr>
+        <w:lastRenderedPageBreak/>
+        <w:t>Run all the results</w:t>
+      </w:r>
+    </w:p>
+    <w:p>
+      <w:pPr>
+        <w:rPr>
+          <w:rFonts w:ascii="Arial" w:hAnsi="Arial" w:cs="Arial"/>
+          <w:sz w:val="16"/>
+          <w:szCs w:val="16"/>
+        </w:rPr>
+      </w:pPr>
+      <w:r>
+        <w:rPr>
+          <w:rFonts w:ascii="Arial" w:hAnsi="Arial" w:cs="Arial"/>
+          <w:sz w:val="16"/>
+          <w:szCs w:val="16"/>
+        </w:rPr>
+        <w:drawing>
+          <wp:inline distT="0" distB="0" distL="0" distR="0" wp14:anchorId="75B2C1B6" wp14:editId="170FB40E">
+            <wp:extent cx="4321810" cy="4049363"/>
+            <wp:effectExtent l="0" t="0" r="2540" b="8890"/>
+            <wp:docPr id="424176016" name="Picture 1"/>
+            <wp:cNvGraphicFramePr>
+              <a:graphicFrameLocks xmlns:a="http://schemas.openxmlformats.org/drawingml/2006/main" noChangeAspect="1"/>
+            </wp:cNvGraphicFramePr>
+            <a:graphic xmlns:a="http://schemas.openxmlformats.org/drawingml/2006/main">
+              <a:graphicData uri="http://schemas.openxmlformats.org/drawingml/2006/picture">
+                <pic:pic xmlns:pic="http://schemas.openxmlformats.org/drawingml/2006/picture">
+                  <pic:nvPicPr>
+                    <pic:cNvPr id="424176016" name=""/>
+                    <pic:cNvPicPr/>
+                  </pic:nvPicPr>
+                  <pic:blipFill>
+                    <a:blip r:embed="rId33"/>
+                    <a:stretch>
+                      <a:fillRect/>
+                    </a:stretch>
+                  </pic:blipFill>
+                  <pic:spPr>
+                    <a:xfrm>
+                      <a:off x="0" y="0"/>
+                      <a:ext cx="4328908" cy="4056014"/>
+                    </a:xfrm>
+                    <a:prstGeom prst="rect">
+                      <a:avLst/>
+                    </a:prstGeom>
+                  </pic:spPr>
+                </pic:pic>
+              </a:graphicData>
+            </a:graphic>
+          </wp:inline>
+        </w:drawing>
+      </w:r>
+    </w:p>
+    <w:p>
+      <w:pPr>
+        <w:rPr>
+          <w:rFonts w:ascii="Arial" w:hAnsi="Arial" w:cs="Arial"/>
+          <w:sz w:val="16"/>
+          <w:szCs w:val="16"/>
+        </w:rPr>
+      </w:pPr>
+      <w:r>
+        <w:rPr>
+          <w:rFonts w:ascii="Arial" w:hAnsi="Arial" w:cs="Arial"/>
+          <w:sz w:val="16"/>
+          <w:szCs w:val="16"/>
+        </w:rPr>
+        <w:drawing>
+          <wp:inline distT="0" distB="0" distL="0" distR="0" wp14:anchorId="04DEF67D" wp14:editId="016E81A3">
+            <wp:extent cx="4098109" cy="4098109"/>
+            <wp:effectExtent l="0" t="0" r="0" b="0"/>
+            <wp:docPr id="1006629904" name="Picture 1"/>
+            <wp:cNvGraphicFramePr>
+              <a:graphicFrameLocks xmlns:a="http://schemas.openxmlformats.org/drawingml/2006/main" noChangeAspect="1"/>
+            </wp:cNvGraphicFramePr>
+            <a:graphic xmlns:a="http://schemas.openxmlformats.org/drawingml/2006/main">
+              <a:graphicData uri="http://schemas.openxmlformats.org/drawingml/2006/picture">
+                <pic:pic xmlns:pic="http://schemas.openxmlformats.org/drawingml/2006/picture">
+                  <pic:nvPicPr>
+                    <pic:cNvPr id="1006629904" name=""/>
+                    <pic:cNvPicPr/>
+                  </pic:nvPicPr>
+                  <pic:blipFill>
+                    <a:blip r:embed="rId34"/>
+                    <a:stretch>
+                      <a:fillRect/>
+                    </a:stretch>
+                  </pic:blipFill>
+                  <pic:spPr>
+                    <a:xfrm>
+                      <a:off x="0" y="0"/>
+                      <a:ext cx="4102230" cy="4102230"/>
+                    </a:xfrm>
+                    <a:prstGeom prst="rect">
+                      <a:avLst/>
+                    </a:prstGeom>
+                  </pic:spPr>
+                </pic:pic>
+              </a:graphicData>
+            </a:graphic>
+          </wp:inline>
+        </w:drawing>
+      </w:r>
+    </w:p>
+    <w:p>
+      <w:pPr>
+        <w:rPr>
+          <w:rFonts w:ascii="Arial" w:hAnsi="Arial" w:cs="Arial"/>
+          <w:sz w:val="16"/>
+          <w:szCs w:val="16"/>
+        </w:rPr>
+      </w:pPr>
+    </w:p>
+    <w:p>
+      <w:pPr>
+        <w:rPr>
+          <w:rFonts w:ascii="Arial" w:hAnsi="Arial" w:cs="Arial"/>
+          <w:sz w:val="16"/>
+          <w:szCs w:val="16"/>
+        </w:rPr>
+      </w:pPr>
+      <w:r>
+        <w:rPr>
+          <w:rFonts w:ascii="Arial" w:hAnsi="Arial" w:cs="Arial"/>
+          <w:sz w:val="16"/>
+          <w:szCs w:val="16"/>
+        </w:rPr>
+        <w:lastRenderedPageBreak/>
+        <w:drawing>
+          <wp:inline distT="0" distB="0" distL="0" distR="0" wp14:anchorId="7F53E5C6" wp14:editId="0D6062B0">
+            <wp:extent cx="5731510" cy="2561590"/>
+            <wp:effectExtent l="0" t="0" r="2540" b="0"/>
+            <wp:docPr id="255223683" name="Picture 1"/>
+            <wp:cNvGraphicFramePr>
+              <a:graphicFrameLocks xmlns:a="http://schemas.openxmlformats.org/drawingml/2006/main" noChangeAspect="1"/>
+            </wp:cNvGraphicFramePr>
+            <a:graphic xmlns:a="http://schemas.openxmlformats.org/drawingml/2006/main">
+              <a:graphicData uri="http://schemas.openxmlformats.org/drawingml/2006/picture">
+                <pic:pic xmlns:pic="http://schemas.openxmlformats.org/drawingml/2006/picture">
+                  <pic:nvPicPr>
+                    <pic:cNvPr id="255223683" name=""/>
+                    <pic:cNvPicPr/>
+                  </pic:nvPicPr>
+                  <pic:blipFill>
+                    <a:blip r:embed="rId35"/>
+                    <a:stretch>
+                      <a:fillRect/>
+                    </a:stretch>
+                  </pic:blipFill>
+                  <pic:spPr>
+                    <a:xfrm>
+                      <a:off x="0" y="0"/>
+                      <a:ext cx="5731510" cy="2561590"/>
+                    </a:xfrm>
+                    <a:prstGeom prst="rect">
+                      <a:avLst/>
+                    </a:prstGeom>
+                  </pic:spPr>
+                </pic:pic>
+              </a:graphicData>
+            </a:graphic>
+          </wp:inline>
+        </w:drawing>
+      </w:r>
+    </w:p>
+    <w:p>
+      <w:pPr>
+        <w:rPr>
+          <w:rFonts w:ascii="Arial" w:hAnsi="Arial" w:cs="Arial"/>
+          <w:sz w:val="16"/>
+          <w:szCs w:val="16"/>
+        </w:rPr>
+      </w:pPr>
+    </w:p>
     <w:sectPr>
       <w:pgSz w:w="11906" w:h="16838"/>
       <w:pgMar w:top="1440" w:right="1440" w:bottom="1440" w:left="1440" w:header="708" w:footer="708" w:gutter="0"/>
@@ -6167,7 +6874,7 @@
   <w:style w:type="paragraph" w:default="1" w:styleId="Normal">
     <w:name w:val="Normal"/>
     <w:qFormat/>
-    <w:rsid w:val="00F96F6D"/>
+    <w:rsid w:val="0013203D"/>
   </w:style>
   <w:style w:type="paragraph" w:styleId="Heading1">
     <w:name w:val="heading 1"/>

</xml_diff>

<commit_message>
update word count in report
</commit_message>
<xml_diff>
--- a/BDA CA 1 - Large Scale Data.docx
+++ b/BDA CA 1 - Large Scale Data.docx
@@ -752,7 +752,7 @@
           <w:r>
             <w:fldChar w:fldCharType="separate"/>
           </w:r>
-          <w:hyperlink w:anchor="_Toc230521452" w:history="1">
+          <w:hyperlink w:anchor="_Toc230985065" w:history="1">
             <w:r>
               <w:rPr>
                 <w:rStyle w:val="Hyperlink"/>
@@ -782,7 +782,7 @@
                 <w:noProof/>
                 <w:webHidden/>
               </w:rPr>
-              <w:instrText xml:space="preserve"> PAGEREF _Toc230521452 \h </w:instrText>
+              <w:instrText xml:space="preserve"> PAGEREF _Toc230985065 \h </w:instrText>
             </w:r>
             <w:r>
               <w:rPr>
@@ -802,7 +802,7 @@
                 <w:noProof/>
                 <w:webHidden/>
               </w:rPr>
-              <w:t>1</w:t>
+              <w:t>2</w:t>
             </w:r>
             <w:r>
               <w:rPr>
@@ -825,7 +825,7 @@
               <w:lang w:eastAsia="en-IE"/>
             </w:rPr>
           </w:pPr>
-          <w:hyperlink w:anchor="_Toc230521453" w:history="1">
+          <w:hyperlink w:anchor="_Toc230985066" w:history="1">
             <w:r>
               <w:rPr>
                 <w:rStyle w:val="Hyperlink"/>
@@ -855,7 +855,7 @@
                 <w:noProof/>
                 <w:webHidden/>
               </w:rPr>
-              <w:instrText xml:space="preserve"> PAGEREF _Toc230521453 \h </w:instrText>
+              <w:instrText xml:space="preserve"> PAGEREF _Toc230985066 \h </w:instrText>
             </w:r>
             <w:r>
               <w:rPr>
@@ -898,7 +898,7 @@
               <w:lang w:eastAsia="en-IE"/>
             </w:rPr>
           </w:pPr>
-          <w:hyperlink w:anchor="_Toc230521454" w:history="1">
+          <w:hyperlink w:anchor="_Toc230985067" w:history="1">
             <w:r>
               <w:rPr>
                 <w:rStyle w:val="Hyperlink"/>
@@ -926,7 +926,7 @@
                 <w:noProof/>
                 <w:webHidden/>
               </w:rPr>
-              <w:instrText xml:space="preserve"> PAGEREF _Toc230521454 \h </w:instrText>
+              <w:instrText xml:space="preserve"> PAGEREF _Toc230985067 \h </w:instrText>
             </w:r>
             <w:r>
               <w:rPr>
@@ -946,7 +946,7 @@
                 <w:noProof/>
                 <w:webHidden/>
               </w:rPr>
-              <w:t>2</w:t>
+              <w:t>3</w:t>
             </w:r>
             <w:r>
               <w:rPr>
@@ -969,7 +969,7 @@
               <w:lang w:eastAsia="en-IE"/>
             </w:rPr>
           </w:pPr>
-          <w:hyperlink w:anchor="_Toc230521455" w:history="1">
+          <w:hyperlink w:anchor="_Toc230985068" w:history="1">
             <w:r>
               <w:rPr>
                 <w:rStyle w:val="Hyperlink"/>
@@ -997,7 +997,7 @@
                 <w:noProof/>
                 <w:webHidden/>
               </w:rPr>
-              <w:instrText xml:space="preserve"> PAGEREF _Toc230521455 \h </w:instrText>
+              <w:instrText xml:space="preserve"> PAGEREF _Toc230985068 \h </w:instrText>
             </w:r>
             <w:r>
               <w:rPr>
@@ -1017,7 +1017,7 @@
                 <w:noProof/>
                 <w:webHidden/>
               </w:rPr>
-              <w:t>2</w:t>
+              <w:t>3</w:t>
             </w:r>
             <w:r>
               <w:rPr>
@@ -1040,7 +1040,7 @@
               <w:lang w:eastAsia="en-IE"/>
             </w:rPr>
           </w:pPr>
-          <w:hyperlink w:anchor="_Toc230521456" w:history="1">
+          <w:hyperlink w:anchor="_Toc230985069" w:history="1">
             <w:r>
               <w:rPr>
                 <w:rStyle w:val="Hyperlink"/>
@@ -1068,7 +1068,7 @@
                 <w:noProof/>
                 <w:webHidden/>
               </w:rPr>
-              <w:instrText xml:space="preserve"> PAGEREF _Toc230521456 \h </w:instrText>
+              <w:instrText xml:space="preserve"> PAGEREF _Toc230985069 \h </w:instrText>
             </w:r>
             <w:r>
               <w:rPr>
@@ -1088,7 +1088,7 @@
                 <w:noProof/>
                 <w:webHidden/>
               </w:rPr>
-              <w:t>2</w:t>
+              <w:t>3</w:t>
             </w:r>
             <w:r>
               <w:rPr>
@@ -1111,7 +1111,7 @@
               <w:lang w:eastAsia="en-IE"/>
             </w:rPr>
           </w:pPr>
-          <w:hyperlink w:anchor="_Toc230521457" w:history="1">
+          <w:hyperlink w:anchor="_Toc230985070" w:history="1">
             <w:r>
               <w:rPr>
                 <w:rStyle w:val="Hyperlink"/>
@@ -1141,7 +1141,7 @@
                 <w:noProof/>
                 <w:webHidden/>
               </w:rPr>
-              <w:instrText xml:space="preserve"> PAGEREF _Toc230521457 \h </w:instrText>
+              <w:instrText xml:space="preserve"> PAGEREF _Toc230985070 \h </w:instrText>
             </w:r>
             <w:r>
               <w:rPr>
@@ -1162,6 +1162,77 @@
                 <w:webHidden/>
               </w:rPr>
               <w:t>3</w:t>
+            </w:r>
+            <w:r>
+              <w:rPr>
+                <w:noProof/>
+                <w:webHidden/>
+              </w:rPr>
+              <w:fldChar w:fldCharType="end"/>
+            </w:r>
+          </w:hyperlink>
+        </w:p>
+        <w:p>
+          <w:pPr>
+            <w:pStyle w:val="TOC1"/>
+            <w:tabs>
+              <w:tab w:val="right" w:leader="dot" w:pos="9016"/>
+            </w:tabs>
+            <w:rPr>
+              <w:rFonts w:eastAsiaTheme="minorEastAsia"/>
+              <w:noProof/>
+              <w:lang w:eastAsia="en-IE"/>
+            </w:rPr>
+          </w:pPr>
+          <w:hyperlink w:anchor="_Toc230985071" w:history="1">
+            <w:r>
+              <w:rPr>
+                <w:rStyle w:val="Hyperlink"/>
+                <w:rFonts w:ascii="Arial" w:hAnsi="Arial" w:cs="Arial"/>
+                <w:noProof/>
+              </w:rPr>
+              <w:t>Data Processing</w:t>
+            </w:r>
+            <w:r>
+              <w:rPr>
+                <w:noProof/>
+                <w:webHidden/>
+              </w:rPr>
+              <w:tab/>
+            </w:r>
+            <w:r>
+              <w:rPr>
+                <w:noProof/>
+                <w:webHidden/>
+              </w:rPr>
+              <w:fldChar w:fldCharType="begin"/>
+            </w:r>
+            <w:r>
+              <w:rPr>
+                <w:noProof/>
+                <w:webHidden/>
+              </w:rPr>
+              <w:instrText xml:space="preserve"> PAGEREF _Toc230985071 \h </w:instrText>
+            </w:r>
+            <w:r>
+              <w:rPr>
+                <w:noProof/>
+                <w:webHidden/>
+              </w:rPr>
+            </w:r>
+            <w:r>
+              <w:rPr>
+                <w:noProof/>
+                <w:webHidden/>
+              </w:rPr>
+              <w:fldChar w:fldCharType="separate"/>
+            </w:r>
+            <w:r>
+              <w:rPr>
+                <w:noProof/>
+                <w:webHidden/>
+              </w:rPr>
+              <w:t>4</w:t>
             </w:r>
             <w:r>
               <w:rPr>
@@ -1184,14 +1255,14 @@
               <w:lang w:eastAsia="en-IE"/>
             </w:rPr>
           </w:pPr>
-          <w:hyperlink w:anchor="_Toc230521458" w:history="1">
+          <w:hyperlink w:anchor="_Toc230985072" w:history="1">
             <w:r>
               <w:rPr>
                 <w:rStyle w:val="Hyperlink"/>
                 <w:rFonts w:ascii="Arial" w:hAnsi="Arial" w:cs="Arial"/>
                 <w:noProof/>
               </w:rPr>
-              <w:t>Data Processing</w:t>
+              <w:t>Data Security</w:t>
             </w:r>
             <w:r>
               <w:rPr>
@@ -1212,7 +1283,7 @@
                 <w:noProof/>
                 <w:webHidden/>
               </w:rPr>
-              <w:instrText xml:space="preserve"> PAGEREF _Toc230521458 \h </w:instrText>
+              <w:instrText xml:space="preserve"> PAGEREF _Toc230985072 \h </w:instrText>
             </w:r>
             <w:r>
               <w:rPr>
@@ -1232,7 +1303,80 @@
                 <w:noProof/>
                 <w:webHidden/>
               </w:rPr>
-              <w:t>3</w:t>
+              <w:t>4</w:t>
+            </w:r>
+            <w:r>
+              <w:rPr>
+                <w:noProof/>
+                <w:webHidden/>
+              </w:rPr>
+              <w:fldChar w:fldCharType="end"/>
+            </w:r>
+          </w:hyperlink>
+        </w:p>
+        <w:p>
+          <w:pPr>
+            <w:pStyle w:val="TOC1"/>
+            <w:tabs>
+              <w:tab w:val="right" w:leader="dot" w:pos="9016"/>
+            </w:tabs>
+            <w:rPr>
+              <w:rFonts w:eastAsiaTheme="minorEastAsia"/>
+              <w:noProof/>
+              <w:lang w:eastAsia="en-IE"/>
+            </w:rPr>
+          </w:pPr>
+          <w:hyperlink w:anchor="_Toc230985073" w:history="1">
+            <w:r>
+              <w:rPr>
+                <w:rStyle w:val="Hyperlink"/>
+                <w:rFonts w:ascii="Arial" w:hAnsi="Arial" w:cs="Arial"/>
+                <w:b/>
+                <w:bCs/>
+                <w:noProof/>
+              </w:rPr>
+              <w:t>Horizontal Vs Vertical Scaling</w:t>
+            </w:r>
+            <w:r>
+              <w:rPr>
+                <w:noProof/>
+                <w:webHidden/>
+              </w:rPr>
+              <w:tab/>
+            </w:r>
+            <w:r>
+              <w:rPr>
+                <w:noProof/>
+                <w:webHidden/>
+              </w:rPr>
+              <w:fldChar w:fldCharType="begin"/>
+            </w:r>
+            <w:r>
+              <w:rPr>
+                <w:noProof/>
+                <w:webHidden/>
+              </w:rPr>
+              <w:instrText xml:space="preserve"> PAGEREF _Toc230985073 \h </w:instrText>
+            </w:r>
+            <w:r>
+              <w:rPr>
+                <w:noProof/>
+                <w:webHidden/>
+              </w:rPr>
+            </w:r>
+            <w:r>
+              <w:rPr>
+                <w:noProof/>
+                <w:webHidden/>
+              </w:rPr>
+              <w:fldChar w:fldCharType="separate"/>
+            </w:r>
+            <w:r>
+              <w:rPr>
+                <w:noProof/>
+                <w:webHidden/>
+              </w:rPr>
+              <w:t>4</w:t>
             </w:r>
             <w:r>
               <w:rPr>
@@ -1255,14 +1399,16 @@
               <w:lang w:eastAsia="en-IE"/>
             </w:rPr>
           </w:pPr>
-          <w:hyperlink w:anchor="_Toc230521459" w:history="1">
+          <w:hyperlink w:anchor="_Toc230985074" w:history="1">
             <w:r>
               <w:rPr>
                 <w:rStyle w:val="Hyperlink"/>
                 <w:rFonts w:ascii="Arial" w:hAnsi="Arial" w:cs="Arial"/>
-                <w:noProof/>
-              </w:rPr>
-              <w:t>Data Security</w:t>
+                <w:b/>
+                <w:bCs/>
+                <w:noProof/>
+              </w:rPr>
+              <w:t>Key Differences Between Vertical and Horizontal Scaling</w:t>
             </w:r>
             <w:r>
               <w:rPr>
@@ -1283,7 +1429,7 @@
                 <w:noProof/>
                 <w:webHidden/>
               </w:rPr>
-              <w:instrText xml:space="preserve"> PAGEREF _Toc230521459 \h </w:instrText>
+              <w:instrText xml:space="preserve"> PAGEREF _Toc230985074 \h </w:instrText>
             </w:r>
             <w:r>
               <w:rPr>
@@ -1303,7 +1449,508 @@
                 <w:noProof/>
                 <w:webHidden/>
               </w:rPr>
-              <w:t>3</w:t>
+              <w:t>4</w:t>
+            </w:r>
+            <w:r>
+              <w:rPr>
+                <w:noProof/>
+                <w:webHidden/>
+              </w:rPr>
+              <w:fldChar w:fldCharType="end"/>
+            </w:r>
+          </w:hyperlink>
+        </w:p>
+        <w:p>
+          <w:pPr>
+            <w:pStyle w:val="TOC3"/>
+            <w:tabs>
+              <w:tab w:val="right" w:leader="dot" w:pos="9016"/>
+            </w:tabs>
+            <w:rPr>
+              <w:rFonts w:eastAsiaTheme="minorEastAsia"/>
+              <w:noProof/>
+              <w:lang w:eastAsia="en-IE"/>
+            </w:rPr>
+          </w:pPr>
+          <w:hyperlink w:anchor="_Toc230985075" w:history="1">
+            <w:r>
+              <w:rPr>
+                <w:rStyle w:val="Hyperlink"/>
+                <w:rFonts w:ascii="Arial" w:hAnsi="Arial" w:cs="Arial"/>
+                <w:noProof/>
+              </w:rPr>
+              <w:t>Scalability</w:t>
+            </w:r>
+            <w:r>
+              <w:rPr>
+                <w:noProof/>
+                <w:webHidden/>
+              </w:rPr>
+              <w:tab/>
+            </w:r>
+            <w:r>
+              <w:rPr>
+                <w:noProof/>
+                <w:webHidden/>
+              </w:rPr>
+              <w:fldChar w:fldCharType="begin"/>
+            </w:r>
+            <w:r>
+              <w:rPr>
+                <w:noProof/>
+                <w:webHidden/>
+              </w:rPr>
+              <w:instrText xml:space="preserve"> PAGEREF _Toc230985075 \h </w:instrText>
+            </w:r>
+            <w:r>
+              <w:rPr>
+                <w:noProof/>
+                <w:webHidden/>
+              </w:rPr>
+            </w:r>
+            <w:r>
+              <w:rPr>
+                <w:noProof/>
+                <w:webHidden/>
+              </w:rPr>
+              <w:fldChar w:fldCharType="separate"/>
+            </w:r>
+            <w:r>
+              <w:rPr>
+                <w:noProof/>
+                <w:webHidden/>
+              </w:rPr>
+              <w:t>4</w:t>
+            </w:r>
+            <w:r>
+              <w:rPr>
+                <w:noProof/>
+                <w:webHidden/>
+              </w:rPr>
+              <w:fldChar w:fldCharType="end"/>
+            </w:r>
+          </w:hyperlink>
+        </w:p>
+        <w:p>
+          <w:pPr>
+            <w:pStyle w:val="TOC3"/>
+            <w:tabs>
+              <w:tab w:val="right" w:leader="dot" w:pos="9016"/>
+            </w:tabs>
+            <w:rPr>
+              <w:rFonts w:eastAsiaTheme="minorEastAsia"/>
+              <w:noProof/>
+              <w:lang w:eastAsia="en-IE"/>
+            </w:rPr>
+          </w:pPr>
+          <w:hyperlink w:anchor="_Toc230985076" w:history="1">
+            <w:r>
+              <w:rPr>
+                <w:rStyle w:val="Hyperlink"/>
+                <w:rFonts w:ascii="Arial" w:hAnsi="Arial" w:cs="Arial"/>
+                <w:noProof/>
+              </w:rPr>
+              <w:t>System resiliency</w:t>
+            </w:r>
+            <w:r>
+              <w:rPr>
+                <w:noProof/>
+                <w:webHidden/>
+              </w:rPr>
+              <w:tab/>
+            </w:r>
+            <w:r>
+              <w:rPr>
+                <w:noProof/>
+                <w:webHidden/>
+              </w:rPr>
+              <w:fldChar w:fldCharType="begin"/>
+            </w:r>
+            <w:r>
+              <w:rPr>
+                <w:noProof/>
+                <w:webHidden/>
+              </w:rPr>
+              <w:instrText xml:space="preserve"> PAGEREF _Toc230985076 \h </w:instrText>
+            </w:r>
+            <w:r>
+              <w:rPr>
+                <w:noProof/>
+                <w:webHidden/>
+              </w:rPr>
+            </w:r>
+            <w:r>
+              <w:rPr>
+                <w:noProof/>
+                <w:webHidden/>
+              </w:rPr>
+              <w:fldChar w:fldCharType="separate"/>
+            </w:r>
+            <w:r>
+              <w:rPr>
+                <w:noProof/>
+                <w:webHidden/>
+              </w:rPr>
+              <w:t>5</w:t>
+            </w:r>
+            <w:r>
+              <w:rPr>
+                <w:noProof/>
+                <w:webHidden/>
+              </w:rPr>
+              <w:fldChar w:fldCharType="end"/>
+            </w:r>
+          </w:hyperlink>
+        </w:p>
+        <w:p>
+          <w:pPr>
+            <w:pStyle w:val="TOC3"/>
+            <w:tabs>
+              <w:tab w:val="right" w:leader="dot" w:pos="9016"/>
+            </w:tabs>
+            <w:rPr>
+              <w:rFonts w:eastAsiaTheme="minorEastAsia"/>
+              <w:noProof/>
+              <w:lang w:eastAsia="en-IE"/>
+            </w:rPr>
+          </w:pPr>
+          <w:hyperlink w:anchor="_Toc230985077" w:history="1">
+            <w:r>
+              <w:rPr>
+                <w:rStyle w:val="Hyperlink"/>
+                <w:rFonts w:ascii="Arial" w:hAnsi="Arial" w:cs="Arial"/>
+                <w:noProof/>
+              </w:rPr>
+              <w:t>Complexity</w:t>
+            </w:r>
+            <w:r>
+              <w:rPr>
+                <w:noProof/>
+                <w:webHidden/>
+              </w:rPr>
+              <w:tab/>
+            </w:r>
+            <w:r>
+              <w:rPr>
+                <w:noProof/>
+                <w:webHidden/>
+              </w:rPr>
+              <w:fldChar w:fldCharType="begin"/>
+            </w:r>
+            <w:r>
+              <w:rPr>
+                <w:noProof/>
+                <w:webHidden/>
+              </w:rPr>
+              <w:instrText xml:space="preserve"> PAGEREF _Toc230985077 \h </w:instrText>
+            </w:r>
+            <w:r>
+              <w:rPr>
+                <w:noProof/>
+                <w:webHidden/>
+              </w:rPr>
+            </w:r>
+            <w:r>
+              <w:rPr>
+                <w:noProof/>
+                <w:webHidden/>
+              </w:rPr>
+              <w:fldChar w:fldCharType="separate"/>
+            </w:r>
+            <w:r>
+              <w:rPr>
+                <w:noProof/>
+                <w:webHidden/>
+              </w:rPr>
+              <w:t>5</w:t>
+            </w:r>
+            <w:r>
+              <w:rPr>
+                <w:noProof/>
+                <w:webHidden/>
+              </w:rPr>
+              <w:fldChar w:fldCharType="end"/>
+            </w:r>
+          </w:hyperlink>
+        </w:p>
+        <w:p>
+          <w:pPr>
+            <w:pStyle w:val="TOC3"/>
+            <w:tabs>
+              <w:tab w:val="right" w:leader="dot" w:pos="9016"/>
+            </w:tabs>
+            <w:rPr>
+              <w:rFonts w:eastAsiaTheme="minorEastAsia"/>
+              <w:noProof/>
+              <w:lang w:eastAsia="en-IE"/>
+            </w:rPr>
+          </w:pPr>
+          <w:hyperlink w:anchor="_Toc230985078" w:history="1">
+            <w:r>
+              <w:rPr>
+                <w:rStyle w:val="Hyperlink"/>
+                <w:rFonts w:ascii="Arial" w:hAnsi="Arial" w:cs="Arial"/>
+                <w:noProof/>
+              </w:rPr>
+              <w:t>Skill requirements</w:t>
+            </w:r>
+            <w:r>
+              <w:rPr>
+                <w:noProof/>
+                <w:webHidden/>
+              </w:rPr>
+              <w:tab/>
+            </w:r>
+            <w:r>
+              <w:rPr>
+                <w:noProof/>
+                <w:webHidden/>
+              </w:rPr>
+              <w:fldChar w:fldCharType="begin"/>
+            </w:r>
+            <w:r>
+              <w:rPr>
+                <w:noProof/>
+                <w:webHidden/>
+              </w:rPr>
+              <w:instrText xml:space="preserve"> PAGEREF _Toc230985078 \h </w:instrText>
+            </w:r>
+            <w:r>
+              <w:rPr>
+                <w:noProof/>
+                <w:webHidden/>
+              </w:rPr>
+            </w:r>
+            <w:r>
+              <w:rPr>
+                <w:noProof/>
+                <w:webHidden/>
+              </w:rPr>
+              <w:fldChar w:fldCharType="separate"/>
+            </w:r>
+            <w:r>
+              <w:rPr>
+                <w:noProof/>
+                <w:webHidden/>
+              </w:rPr>
+              <w:t>5</w:t>
+            </w:r>
+            <w:r>
+              <w:rPr>
+                <w:noProof/>
+                <w:webHidden/>
+              </w:rPr>
+              <w:fldChar w:fldCharType="end"/>
+            </w:r>
+          </w:hyperlink>
+        </w:p>
+        <w:p>
+          <w:pPr>
+            <w:pStyle w:val="TOC3"/>
+            <w:tabs>
+              <w:tab w:val="right" w:leader="dot" w:pos="9016"/>
+            </w:tabs>
+            <w:rPr>
+              <w:rFonts w:eastAsiaTheme="minorEastAsia"/>
+              <w:noProof/>
+              <w:lang w:eastAsia="en-IE"/>
+            </w:rPr>
+          </w:pPr>
+          <w:hyperlink w:anchor="_Toc230985079" w:history="1">
+            <w:r>
+              <w:rPr>
+                <w:rStyle w:val="Hyperlink"/>
+                <w:rFonts w:ascii="Arial" w:hAnsi="Arial" w:cs="Arial"/>
+                <w:noProof/>
+              </w:rPr>
+              <w:t>Costs</w:t>
+            </w:r>
+            <w:r>
+              <w:rPr>
+                <w:noProof/>
+                <w:webHidden/>
+              </w:rPr>
+              <w:tab/>
+            </w:r>
+            <w:r>
+              <w:rPr>
+                <w:noProof/>
+                <w:webHidden/>
+              </w:rPr>
+              <w:fldChar w:fldCharType="begin"/>
+            </w:r>
+            <w:r>
+              <w:rPr>
+                <w:noProof/>
+                <w:webHidden/>
+              </w:rPr>
+              <w:instrText xml:space="preserve"> PAGEREF _Toc230985079 \h </w:instrText>
+            </w:r>
+            <w:r>
+              <w:rPr>
+                <w:noProof/>
+                <w:webHidden/>
+              </w:rPr>
+            </w:r>
+            <w:r>
+              <w:rPr>
+                <w:noProof/>
+                <w:webHidden/>
+              </w:rPr>
+              <w:fldChar w:fldCharType="separate"/>
+            </w:r>
+            <w:r>
+              <w:rPr>
+                <w:noProof/>
+                <w:webHidden/>
+              </w:rPr>
+              <w:t>5</w:t>
+            </w:r>
+            <w:r>
+              <w:rPr>
+                <w:noProof/>
+                <w:webHidden/>
+              </w:rPr>
+              <w:fldChar w:fldCharType="end"/>
+            </w:r>
+          </w:hyperlink>
+        </w:p>
+        <w:p>
+          <w:pPr>
+            <w:pStyle w:val="TOC2"/>
+            <w:tabs>
+              <w:tab w:val="right" w:leader="dot" w:pos="9016"/>
+            </w:tabs>
+            <w:rPr>
+              <w:rFonts w:eastAsiaTheme="minorEastAsia"/>
+              <w:noProof/>
+              <w:lang w:eastAsia="en-IE"/>
+            </w:rPr>
+          </w:pPr>
+          <w:hyperlink w:anchor="_Toc230985080" w:history="1">
+            <w:r>
+              <w:rPr>
+                <w:rStyle w:val="Hyperlink"/>
+                <w:rFonts w:ascii="Arial" w:hAnsi="Arial" w:cs="Arial"/>
+                <w:b/>
+                <w:bCs/>
+                <w:noProof/>
+              </w:rPr>
+              <w:t>Consideration for choosing Right Approach</w:t>
+            </w:r>
+            <w:r>
+              <w:rPr>
+                <w:noProof/>
+                <w:webHidden/>
+              </w:rPr>
+              <w:tab/>
+            </w:r>
+            <w:r>
+              <w:rPr>
+                <w:noProof/>
+                <w:webHidden/>
+              </w:rPr>
+              <w:fldChar w:fldCharType="begin"/>
+            </w:r>
+            <w:r>
+              <w:rPr>
+                <w:noProof/>
+                <w:webHidden/>
+              </w:rPr>
+              <w:instrText xml:space="preserve"> PAGEREF _Toc230985080 \h </w:instrText>
+            </w:r>
+            <w:r>
+              <w:rPr>
+                <w:noProof/>
+                <w:webHidden/>
+              </w:rPr>
+            </w:r>
+            <w:r>
+              <w:rPr>
+                <w:noProof/>
+                <w:webHidden/>
+              </w:rPr>
+              <w:fldChar w:fldCharType="separate"/>
+            </w:r>
+            <w:r>
+              <w:rPr>
+                <w:noProof/>
+                <w:webHidden/>
+              </w:rPr>
+              <w:t>5</w:t>
+            </w:r>
+            <w:r>
+              <w:rPr>
+                <w:noProof/>
+                <w:webHidden/>
+              </w:rPr>
+              <w:fldChar w:fldCharType="end"/>
+            </w:r>
+          </w:hyperlink>
+        </w:p>
+        <w:p>
+          <w:pPr>
+            <w:pStyle w:val="TOC2"/>
+            <w:tabs>
+              <w:tab w:val="right" w:leader="dot" w:pos="9016"/>
+            </w:tabs>
+            <w:rPr>
+              <w:rFonts w:eastAsiaTheme="minorEastAsia"/>
+              <w:noProof/>
+              <w:lang w:eastAsia="en-IE"/>
+            </w:rPr>
+          </w:pPr>
+          <w:hyperlink w:anchor="_Toc230985081" w:history="1">
+            <w:r>
+              <w:rPr>
+                <w:rStyle w:val="Hyperlink"/>
+                <w:rFonts w:ascii="Arial" w:hAnsi="Arial" w:cs="Arial"/>
+                <w:b/>
+                <w:bCs/>
+                <w:noProof/>
+              </w:rPr>
+              <w:t>Recommendation</w:t>
+            </w:r>
+            <w:r>
+              <w:rPr>
+                <w:noProof/>
+                <w:webHidden/>
+              </w:rPr>
+              <w:tab/>
+            </w:r>
+            <w:r>
+              <w:rPr>
+                <w:noProof/>
+                <w:webHidden/>
+              </w:rPr>
+              <w:fldChar w:fldCharType="begin"/>
+            </w:r>
+            <w:r>
+              <w:rPr>
+                <w:noProof/>
+                <w:webHidden/>
+              </w:rPr>
+              <w:instrText xml:space="preserve"> PAGEREF _Toc230985081 \h </w:instrText>
+            </w:r>
+            <w:r>
+              <w:rPr>
+                <w:noProof/>
+                <w:webHidden/>
+              </w:rPr>
+            </w:r>
+            <w:r>
+              <w:rPr>
+                <w:noProof/>
+                <w:webHidden/>
+              </w:rPr>
+              <w:fldChar w:fldCharType="separate"/>
+            </w:r>
+            <w:r>
+              <w:rPr>
+                <w:noProof/>
+                <w:webHidden/>
+              </w:rPr>
+              <w:t>6</w:t>
             </w:r>
             <w:r>
               <w:rPr>
@@ -1326,7 +1973,7 @@
               <w:lang w:eastAsia="en-IE"/>
             </w:rPr>
           </w:pPr>
-          <w:hyperlink w:anchor="_Toc230521460" w:history="1">
+          <w:hyperlink w:anchor="_Toc230985082" w:history="1">
             <w:r>
               <w:rPr>
                 <w:rStyle w:val="Hyperlink"/>
@@ -1335,7 +1982,7 @@
                 <w:bCs/>
                 <w:noProof/>
               </w:rPr>
-              <w:t>Horizontal Vs Vertical Scaling</w:t>
+              <w:t>Analysis of Real-World Organisations Using Big Data:</w:t>
             </w:r>
             <w:r>
               <w:rPr>
@@ -1356,7 +2003,7 @@
                 <w:noProof/>
                 <w:webHidden/>
               </w:rPr>
-              <w:instrText xml:space="preserve"> PAGEREF _Toc230521460 \h </w:instrText>
+              <w:instrText xml:space="preserve"> PAGEREF _Toc230985082 \h </w:instrText>
             </w:r>
             <w:r>
               <w:rPr>
@@ -1376,7 +2023,7 @@
                 <w:noProof/>
                 <w:webHidden/>
               </w:rPr>
-              <w:t>3</w:t>
+              <w:t>6</w:t>
             </w:r>
             <w:r>
               <w:rPr>
@@ -1399,7 +2046,7 @@
               <w:lang w:eastAsia="en-IE"/>
             </w:rPr>
           </w:pPr>
-          <w:hyperlink w:anchor="_Toc230521461" w:history="1">
+          <w:hyperlink w:anchor="_Toc230985083" w:history="1">
             <w:r>
               <w:rPr>
                 <w:rStyle w:val="Hyperlink"/>
@@ -1408,7 +2055,7 @@
                 <w:bCs/>
                 <w:noProof/>
               </w:rPr>
-              <w:t>Key Differences Between Vertical and Horizontal Scaling</w:t>
+              <w:t>Netfix</w:t>
             </w:r>
             <w:r>
               <w:rPr>
@@ -1429,7 +2076,7 @@
                 <w:noProof/>
                 <w:webHidden/>
               </w:rPr>
-              <w:instrText xml:space="preserve"> PAGEREF _Toc230521461 \h </w:instrText>
+              <w:instrText xml:space="preserve"> PAGEREF _Toc230985083 \h </w:instrText>
             </w:r>
             <w:r>
               <w:rPr>
@@ -1449,362 +2096,7 @@
                 <w:noProof/>
                 <w:webHidden/>
               </w:rPr>
-              <w:t>4</w:t>
-            </w:r>
-            <w:r>
-              <w:rPr>
-                <w:noProof/>
-                <w:webHidden/>
-              </w:rPr>
-              <w:fldChar w:fldCharType="end"/>
-            </w:r>
-          </w:hyperlink>
-        </w:p>
-        <w:p>
-          <w:pPr>
-            <w:pStyle w:val="TOC3"/>
-            <w:tabs>
-              <w:tab w:val="right" w:leader="dot" w:pos="9016"/>
-            </w:tabs>
-            <w:rPr>
-              <w:rFonts w:eastAsiaTheme="minorEastAsia"/>
-              <w:noProof/>
-              <w:lang w:eastAsia="en-IE"/>
-            </w:rPr>
-          </w:pPr>
-          <w:hyperlink w:anchor="_Toc230521462" w:history="1">
-            <w:r>
-              <w:rPr>
-                <w:rStyle w:val="Hyperlink"/>
-                <w:rFonts w:ascii="Arial" w:hAnsi="Arial" w:cs="Arial"/>
-                <w:noProof/>
-              </w:rPr>
-              <w:t>Scalability</w:t>
-            </w:r>
-            <w:r>
-              <w:rPr>
-                <w:noProof/>
-                <w:webHidden/>
-              </w:rPr>
-              <w:tab/>
-            </w:r>
-            <w:r>
-              <w:rPr>
-                <w:noProof/>
-                <w:webHidden/>
-              </w:rPr>
-              <w:fldChar w:fldCharType="begin"/>
-            </w:r>
-            <w:r>
-              <w:rPr>
-                <w:noProof/>
-                <w:webHidden/>
-              </w:rPr>
-              <w:instrText xml:space="preserve"> PAGEREF _Toc230521462 \h </w:instrText>
-            </w:r>
-            <w:r>
-              <w:rPr>
-                <w:noProof/>
-                <w:webHidden/>
-              </w:rPr>
-            </w:r>
-            <w:r>
-              <w:rPr>
-                <w:noProof/>
-                <w:webHidden/>
-              </w:rPr>
-              <w:fldChar w:fldCharType="separate"/>
-            </w:r>
-            <w:r>
-              <w:rPr>
-                <w:noProof/>
-                <w:webHidden/>
-              </w:rPr>
-              <w:t>4</w:t>
-            </w:r>
-            <w:r>
-              <w:rPr>
-                <w:noProof/>
-                <w:webHidden/>
-              </w:rPr>
-              <w:fldChar w:fldCharType="end"/>
-            </w:r>
-          </w:hyperlink>
-        </w:p>
-        <w:p>
-          <w:pPr>
-            <w:pStyle w:val="TOC3"/>
-            <w:tabs>
-              <w:tab w:val="right" w:leader="dot" w:pos="9016"/>
-            </w:tabs>
-            <w:rPr>
-              <w:rFonts w:eastAsiaTheme="minorEastAsia"/>
-              <w:noProof/>
-              <w:lang w:eastAsia="en-IE"/>
-            </w:rPr>
-          </w:pPr>
-          <w:hyperlink w:anchor="_Toc230521463" w:history="1">
-            <w:r>
-              <w:rPr>
-                <w:rStyle w:val="Hyperlink"/>
-                <w:rFonts w:ascii="Arial" w:hAnsi="Arial" w:cs="Arial"/>
-                <w:noProof/>
-              </w:rPr>
-              <w:t>System resiliency</w:t>
-            </w:r>
-            <w:r>
-              <w:rPr>
-                <w:noProof/>
-                <w:webHidden/>
-              </w:rPr>
-              <w:tab/>
-            </w:r>
-            <w:r>
-              <w:rPr>
-                <w:noProof/>
-                <w:webHidden/>
-              </w:rPr>
-              <w:fldChar w:fldCharType="begin"/>
-            </w:r>
-            <w:r>
-              <w:rPr>
-                <w:noProof/>
-                <w:webHidden/>
-              </w:rPr>
-              <w:instrText xml:space="preserve"> PAGEREF _Toc230521463 \h </w:instrText>
-            </w:r>
-            <w:r>
-              <w:rPr>
-                <w:noProof/>
-                <w:webHidden/>
-              </w:rPr>
-            </w:r>
-            <w:r>
-              <w:rPr>
-                <w:noProof/>
-                <w:webHidden/>
-              </w:rPr>
-              <w:fldChar w:fldCharType="separate"/>
-            </w:r>
-            <w:r>
-              <w:rPr>
-                <w:noProof/>
-                <w:webHidden/>
-              </w:rPr>
-              <w:t>4</w:t>
-            </w:r>
-            <w:r>
-              <w:rPr>
-                <w:noProof/>
-                <w:webHidden/>
-              </w:rPr>
-              <w:fldChar w:fldCharType="end"/>
-            </w:r>
-          </w:hyperlink>
-        </w:p>
-        <w:p>
-          <w:pPr>
-            <w:pStyle w:val="TOC3"/>
-            <w:tabs>
-              <w:tab w:val="right" w:leader="dot" w:pos="9016"/>
-            </w:tabs>
-            <w:rPr>
-              <w:rFonts w:eastAsiaTheme="minorEastAsia"/>
-              <w:noProof/>
-              <w:lang w:eastAsia="en-IE"/>
-            </w:rPr>
-          </w:pPr>
-          <w:hyperlink w:anchor="_Toc230521464" w:history="1">
-            <w:r>
-              <w:rPr>
-                <w:rStyle w:val="Hyperlink"/>
-                <w:rFonts w:ascii="Arial" w:hAnsi="Arial" w:cs="Arial"/>
-                <w:noProof/>
-              </w:rPr>
-              <w:t>Complexity</w:t>
-            </w:r>
-            <w:r>
-              <w:rPr>
-                <w:noProof/>
-                <w:webHidden/>
-              </w:rPr>
-              <w:tab/>
-            </w:r>
-            <w:r>
-              <w:rPr>
-                <w:noProof/>
-                <w:webHidden/>
-              </w:rPr>
-              <w:fldChar w:fldCharType="begin"/>
-            </w:r>
-            <w:r>
-              <w:rPr>
-                <w:noProof/>
-                <w:webHidden/>
-              </w:rPr>
-              <w:instrText xml:space="preserve"> PAGEREF _Toc230521464 \h </w:instrText>
-            </w:r>
-            <w:r>
-              <w:rPr>
-                <w:noProof/>
-                <w:webHidden/>
-              </w:rPr>
-            </w:r>
-            <w:r>
-              <w:rPr>
-                <w:noProof/>
-                <w:webHidden/>
-              </w:rPr>
-              <w:fldChar w:fldCharType="separate"/>
-            </w:r>
-            <w:r>
-              <w:rPr>
-                <w:noProof/>
-                <w:webHidden/>
-              </w:rPr>
-              <w:t>4</w:t>
-            </w:r>
-            <w:r>
-              <w:rPr>
-                <w:noProof/>
-                <w:webHidden/>
-              </w:rPr>
-              <w:fldChar w:fldCharType="end"/>
-            </w:r>
-          </w:hyperlink>
-        </w:p>
-        <w:p>
-          <w:pPr>
-            <w:pStyle w:val="TOC3"/>
-            <w:tabs>
-              <w:tab w:val="right" w:leader="dot" w:pos="9016"/>
-            </w:tabs>
-            <w:rPr>
-              <w:rFonts w:eastAsiaTheme="minorEastAsia"/>
-              <w:noProof/>
-              <w:lang w:eastAsia="en-IE"/>
-            </w:rPr>
-          </w:pPr>
-          <w:hyperlink w:anchor="_Toc230521465" w:history="1">
-            <w:r>
-              <w:rPr>
-                <w:rStyle w:val="Hyperlink"/>
-                <w:rFonts w:ascii="Arial" w:hAnsi="Arial" w:cs="Arial"/>
-                <w:noProof/>
-              </w:rPr>
-              <w:t>Skill requirements</w:t>
-            </w:r>
-            <w:r>
-              <w:rPr>
-                <w:noProof/>
-                <w:webHidden/>
-              </w:rPr>
-              <w:tab/>
-            </w:r>
-            <w:r>
-              <w:rPr>
-                <w:noProof/>
-                <w:webHidden/>
-              </w:rPr>
-              <w:fldChar w:fldCharType="begin"/>
-            </w:r>
-            <w:r>
-              <w:rPr>
-                <w:noProof/>
-                <w:webHidden/>
-              </w:rPr>
-              <w:instrText xml:space="preserve"> PAGEREF _Toc230521465 \h </w:instrText>
-            </w:r>
-            <w:r>
-              <w:rPr>
-                <w:noProof/>
-                <w:webHidden/>
-              </w:rPr>
-            </w:r>
-            <w:r>
-              <w:rPr>
-                <w:noProof/>
-                <w:webHidden/>
-              </w:rPr>
-              <w:fldChar w:fldCharType="separate"/>
-            </w:r>
-            <w:r>
-              <w:rPr>
-                <w:noProof/>
-                <w:webHidden/>
-              </w:rPr>
-              <w:t>4</w:t>
-            </w:r>
-            <w:r>
-              <w:rPr>
-                <w:noProof/>
-                <w:webHidden/>
-              </w:rPr>
-              <w:fldChar w:fldCharType="end"/>
-            </w:r>
-          </w:hyperlink>
-        </w:p>
-        <w:p>
-          <w:pPr>
-            <w:pStyle w:val="TOC3"/>
-            <w:tabs>
-              <w:tab w:val="right" w:leader="dot" w:pos="9016"/>
-            </w:tabs>
-            <w:rPr>
-              <w:rFonts w:eastAsiaTheme="minorEastAsia"/>
-              <w:noProof/>
-              <w:lang w:eastAsia="en-IE"/>
-            </w:rPr>
-          </w:pPr>
-          <w:hyperlink w:anchor="_Toc230521466" w:history="1">
-            <w:r>
-              <w:rPr>
-                <w:rStyle w:val="Hyperlink"/>
-                <w:rFonts w:ascii="Arial" w:hAnsi="Arial" w:cs="Arial"/>
-                <w:noProof/>
-              </w:rPr>
-              <w:t>Costs</w:t>
-            </w:r>
-            <w:r>
-              <w:rPr>
-                <w:noProof/>
-                <w:webHidden/>
-              </w:rPr>
-              <w:tab/>
-            </w:r>
-            <w:r>
-              <w:rPr>
-                <w:noProof/>
-                <w:webHidden/>
-              </w:rPr>
-              <w:fldChar w:fldCharType="begin"/>
-            </w:r>
-            <w:r>
-              <w:rPr>
-                <w:noProof/>
-                <w:webHidden/>
-              </w:rPr>
-              <w:instrText xml:space="preserve"> PAGEREF _Toc230521466 \h </w:instrText>
-            </w:r>
-            <w:r>
-              <w:rPr>
-                <w:noProof/>
-                <w:webHidden/>
-              </w:rPr>
-            </w:r>
-            <w:r>
-              <w:rPr>
-                <w:noProof/>
-                <w:webHidden/>
-              </w:rPr>
-              <w:fldChar w:fldCharType="separate"/>
-            </w:r>
-            <w:r>
-              <w:rPr>
-                <w:noProof/>
-                <w:webHidden/>
-              </w:rPr>
-              <w:t>5</w:t>
+              <w:t>6</w:t>
             </w:r>
             <w:r>
               <w:rPr>
@@ -1827,16 +2119,14 @@
               <w:lang w:eastAsia="en-IE"/>
             </w:rPr>
           </w:pPr>
-          <w:hyperlink w:anchor="_Toc230521467" w:history="1">
+          <w:hyperlink w:anchor="_Toc230985084" w:history="1">
             <w:r>
               <w:rPr>
                 <w:rStyle w:val="Hyperlink"/>
                 <w:rFonts w:ascii="Arial" w:hAnsi="Arial" w:cs="Arial"/>
-                <w:b/>
-                <w:bCs/>
-                <w:noProof/>
-              </w:rPr>
-              <w:t>Consideration for choosing Right Approach</w:t>
+                <w:noProof/>
+              </w:rPr>
+              <w:t>Netflix analyses billions of real-time user interactions, including clicks, searches, viewing behaviours, and streaming data.</w:t>
             </w:r>
             <w:r>
               <w:rPr>
@@ -1857,7 +2147,7 @@
                 <w:noProof/>
                 <w:webHidden/>
               </w:rPr>
-              <w:instrText xml:space="preserve"> PAGEREF _Toc230521467 \h </w:instrText>
+              <w:instrText xml:space="preserve"> PAGEREF _Toc230985084 \h </w:instrText>
             </w:r>
             <w:r>
               <w:rPr>
@@ -1877,7 +2167,7 @@
                 <w:noProof/>
                 <w:webHidden/>
               </w:rPr>
-              <w:t>5</w:t>
+              <w:t>6</w:t>
             </w:r>
             <w:r>
               <w:rPr>
@@ -1900,7 +2190,149 @@
               <w:lang w:eastAsia="en-IE"/>
             </w:rPr>
           </w:pPr>
-          <w:hyperlink w:anchor="_Toc230521468" w:history="1">
+          <w:hyperlink w:anchor="_Toc230985085" w:history="1">
+            <w:r>
+              <w:rPr>
+                <w:rStyle w:val="Hyperlink"/>
+                <w:rFonts w:ascii="Arial" w:hAnsi="Arial" w:cs="Arial"/>
+                <w:noProof/>
+              </w:rPr>
+              <w:t>It uses Apache Spark, Flink, Kafka, and AWS to power recommendations, improving accuracy, increasing watch time, and reducing customer loss (churn).</w:t>
+            </w:r>
+            <w:r>
+              <w:rPr>
+                <w:noProof/>
+                <w:webHidden/>
+              </w:rPr>
+              <w:tab/>
+            </w:r>
+            <w:r>
+              <w:rPr>
+                <w:noProof/>
+                <w:webHidden/>
+              </w:rPr>
+              <w:fldChar w:fldCharType="begin"/>
+            </w:r>
+            <w:r>
+              <w:rPr>
+                <w:noProof/>
+                <w:webHidden/>
+              </w:rPr>
+              <w:instrText xml:space="preserve"> PAGEREF _Toc230985085 \h </w:instrText>
+            </w:r>
+            <w:r>
+              <w:rPr>
+                <w:noProof/>
+                <w:webHidden/>
+              </w:rPr>
+            </w:r>
+            <w:r>
+              <w:rPr>
+                <w:noProof/>
+                <w:webHidden/>
+              </w:rPr>
+              <w:fldChar w:fldCharType="separate"/>
+            </w:r>
+            <w:r>
+              <w:rPr>
+                <w:noProof/>
+                <w:webHidden/>
+              </w:rPr>
+              <w:t>6</w:t>
+            </w:r>
+            <w:r>
+              <w:rPr>
+                <w:noProof/>
+                <w:webHidden/>
+              </w:rPr>
+              <w:fldChar w:fldCharType="end"/>
+            </w:r>
+          </w:hyperlink>
+        </w:p>
+        <w:p>
+          <w:pPr>
+            <w:pStyle w:val="TOC2"/>
+            <w:tabs>
+              <w:tab w:val="right" w:leader="dot" w:pos="9016"/>
+            </w:tabs>
+            <w:rPr>
+              <w:rFonts w:eastAsiaTheme="minorEastAsia"/>
+              <w:noProof/>
+              <w:lang w:eastAsia="en-IE"/>
+            </w:rPr>
+          </w:pPr>
+          <w:hyperlink w:anchor="_Toc230985086" w:history="1">
+            <w:r>
+              <w:rPr>
+                <w:rStyle w:val="Hyperlink"/>
+                <w:rFonts w:ascii="Arial" w:hAnsi="Arial" w:cs="Arial"/>
+                <w:noProof/>
+              </w:rPr>
+              <w:t>It enables real-time analytics and scalable, reliable cloud performance.</w:t>
+            </w:r>
+            <w:r>
+              <w:rPr>
+                <w:noProof/>
+                <w:webHidden/>
+              </w:rPr>
+              <w:tab/>
+            </w:r>
+            <w:r>
+              <w:rPr>
+                <w:noProof/>
+                <w:webHidden/>
+              </w:rPr>
+              <w:fldChar w:fldCharType="begin"/>
+            </w:r>
+            <w:r>
+              <w:rPr>
+                <w:noProof/>
+                <w:webHidden/>
+              </w:rPr>
+              <w:instrText xml:space="preserve"> PAGEREF _Toc230985086 \h </w:instrText>
+            </w:r>
+            <w:r>
+              <w:rPr>
+                <w:noProof/>
+                <w:webHidden/>
+              </w:rPr>
+            </w:r>
+            <w:r>
+              <w:rPr>
+                <w:noProof/>
+                <w:webHidden/>
+              </w:rPr>
+              <w:fldChar w:fldCharType="separate"/>
+            </w:r>
+            <w:r>
+              <w:rPr>
+                <w:noProof/>
+                <w:webHidden/>
+              </w:rPr>
+              <w:t>6</w:t>
+            </w:r>
+            <w:r>
+              <w:rPr>
+                <w:noProof/>
+                <w:webHidden/>
+              </w:rPr>
+              <w:fldChar w:fldCharType="end"/>
+            </w:r>
+          </w:hyperlink>
+        </w:p>
+        <w:p>
+          <w:pPr>
+            <w:pStyle w:val="TOC2"/>
+            <w:tabs>
+              <w:tab w:val="right" w:leader="dot" w:pos="9016"/>
+            </w:tabs>
+            <w:rPr>
+              <w:rFonts w:eastAsiaTheme="minorEastAsia"/>
+              <w:noProof/>
+              <w:lang w:eastAsia="en-IE"/>
+            </w:rPr>
+          </w:pPr>
+          <w:hyperlink w:anchor="_Toc230985087" w:history="1">
             <w:r>
               <w:rPr>
                 <w:rStyle w:val="Hyperlink"/>
@@ -1909,7 +2341,7 @@
                 <w:bCs/>
                 <w:noProof/>
               </w:rPr>
-              <w:t>Recommendation</w:t>
+              <w:t>Amazon</w:t>
             </w:r>
             <w:r>
               <w:rPr>
@@ -1930,7 +2362,7 @@
                 <w:noProof/>
                 <w:webHidden/>
               </w:rPr>
-              <w:instrText xml:space="preserve"> PAGEREF _Toc230521468 \h </w:instrText>
+              <w:instrText xml:space="preserve"> PAGEREF _Toc230985087 \h </w:instrText>
             </w:r>
             <w:r>
               <w:rPr>
@@ -1950,7 +2382,372 @@
                 <w:noProof/>
                 <w:webHidden/>
               </w:rPr>
-              <w:t>5</w:t>
+              <w:t>6</w:t>
+            </w:r>
+            <w:r>
+              <w:rPr>
+                <w:noProof/>
+                <w:webHidden/>
+              </w:rPr>
+              <w:fldChar w:fldCharType="end"/>
+            </w:r>
+          </w:hyperlink>
+        </w:p>
+        <w:p>
+          <w:pPr>
+            <w:pStyle w:val="TOC2"/>
+            <w:tabs>
+              <w:tab w:val="right" w:leader="dot" w:pos="9016"/>
+            </w:tabs>
+            <w:rPr>
+              <w:rFonts w:eastAsiaTheme="minorEastAsia"/>
+              <w:noProof/>
+              <w:lang w:eastAsia="en-IE"/>
+            </w:rPr>
+          </w:pPr>
+          <w:hyperlink w:anchor="_Toc230985088" w:history="1">
+            <w:r>
+              <w:rPr>
+                <w:rStyle w:val="Hyperlink"/>
+                <w:rFonts w:ascii="Arial" w:hAnsi="Arial" w:cs="Arial"/>
+                <w:b/>
+                <w:bCs/>
+                <w:noProof/>
+              </w:rPr>
+              <w:t>Google</w:t>
+            </w:r>
+            <w:r>
+              <w:rPr>
+                <w:noProof/>
+                <w:webHidden/>
+              </w:rPr>
+              <w:tab/>
+            </w:r>
+            <w:r>
+              <w:rPr>
+                <w:noProof/>
+                <w:webHidden/>
+              </w:rPr>
+              <w:fldChar w:fldCharType="begin"/>
+            </w:r>
+            <w:r>
+              <w:rPr>
+                <w:noProof/>
+                <w:webHidden/>
+              </w:rPr>
+              <w:instrText xml:space="preserve"> PAGEREF _Toc230985088 \h </w:instrText>
+            </w:r>
+            <w:r>
+              <w:rPr>
+                <w:noProof/>
+                <w:webHidden/>
+              </w:rPr>
+            </w:r>
+            <w:r>
+              <w:rPr>
+                <w:noProof/>
+                <w:webHidden/>
+              </w:rPr>
+              <w:fldChar w:fldCharType="separate"/>
+            </w:r>
+            <w:r>
+              <w:rPr>
+                <w:noProof/>
+                <w:webHidden/>
+              </w:rPr>
+              <w:t>7</w:t>
+            </w:r>
+            <w:r>
+              <w:rPr>
+                <w:noProof/>
+                <w:webHidden/>
+              </w:rPr>
+              <w:fldChar w:fldCharType="end"/>
+            </w:r>
+          </w:hyperlink>
+        </w:p>
+        <w:p>
+          <w:pPr>
+            <w:pStyle w:val="TOC2"/>
+            <w:tabs>
+              <w:tab w:val="right" w:leader="dot" w:pos="9016"/>
+            </w:tabs>
+            <w:rPr>
+              <w:rFonts w:eastAsiaTheme="minorEastAsia"/>
+              <w:noProof/>
+              <w:lang w:eastAsia="en-IE"/>
+            </w:rPr>
+          </w:pPr>
+          <w:hyperlink w:anchor="_Toc230985089" w:history="1">
+            <w:r>
+              <w:rPr>
+                <w:rStyle w:val="Hyperlink"/>
+                <w:rFonts w:ascii="Arial" w:hAnsi="Arial" w:cs="Arial"/>
+                <w:b/>
+                <w:bCs/>
+                <w:noProof/>
+              </w:rPr>
+              <w:t>Reference</w:t>
+            </w:r>
+            <w:r>
+              <w:rPr>
+                <w:noProof/>
+                <w:webHidden/>
+              </w:rPr>
+              <w:tab/>
+            </w:r>
+            <w:r>
+              <w:rPr>
+                <w:noProof/>
+                <w:webHidden/>
+              </w:rPr>
+              <w:fldChar w:fldCharType="begin"/>
+            </w:r>
+            <w:r>
+              <w:rPr>
+                <w:noProof/>
+                <w:webHidden/>
+              </w:rPr>
+              <w:instrText xml:space="preserve"> PAGEREF _Toc230985089 \h </w:instrText>
+            </w:r>
+            <w:r>
+              <w:rPr>
+                <w:noProof/>
+                <w:webHidden/>
+              </w:rPr>
+            </w:r>
+            <w:r>
+              <w:rPr>
+                <w:noProof/>
+                <w:webHidden/>
+              </w:rPr>
+              <w:fldChar w:fldCharType="separate"/>
+            </w:r>
+            <w:r>
+              <w:rPr>
+                <w:noProof/>
+                <w:webHidden/>
+              </w:rPr>
+              <w:t>7</w:t>
+            </w:r>
+            <w:r>
+              <w:rPr>
+                <w:noProof/>
+                <w:webHidden/>
+              </w:rPr>
+              <w:fldChar w:fldCharType="end"/>
+            </w:r>
+          </w:hyperlink>
+        </w:p>
+        <w:p>
+          <w:pPr>
+            <w:pStyle w:val="TOC1"/>
+            <w:tabs>
+              <w:tab w:val="right" w:leader="dot" w:pos="9016"/>
+            </w:tabs>
+            <w:rPr>
+              <w:rFonts w:eastAsiaTheme="minorEastAsia"/>
+              <w:noProof/>
+              <w:lang w:eastAsia="en-IE"/>
+            </w:rPr>
+          </w:pPr>
+          <w:hyperlink w:anchor="_Toc230985090" w:history="1">
+            <w:r>
+              <w:rPr>
+                <w:rStyle w:val="Hyperlink"/>
+                <w:rFonts w:ascii="Arial" w:hAnsi="Arial" w:cs="Arial"/>
+                <w:b/>
+                <w:bCs/>
+                <w:noProof/>
+              </w:rPr>
+              <w:t>Use of AI in Working</w:t>
+            </w:r>
+            <w:r>
+              <w:rPr>
+                <w:noProof/>
+                <w:webHidden/>
+              </w:rPr>
+              <w:tab/>
+            </w:r>
+            <w:r>
+              <w:rPr>
+                <w:noProof/>
+                <w:webHidden/>
+              </w:rPr>
+              <w:fldChar w:fldCharType="begin"/>
+            </w:r>
+            <w:r>
+              <w:rPr>
+                <w:noProof/>
+                <w:webHidden/>
+              </w:rPr>
+              <w:instrText xml:space="preserve"> PAGEREF _Toc230985090 \h </w:instrText>
+            </w:r>
+            <w:r>
+              <w:rPr>
+                <w:noProof/>
+                <w:webHidden/>
+              </w:rPr>
+            </w:r>
+            <w:r>
+              <w:rPr>
+                <w:noProof/>
+                <w:webHidden/>
+              </w:rPr>
+              <w:fldChar w:fldCharType="separate"/>
+            </w:r>
+            <w:r>
+              <w:rPr>
+                <w:noProof/>
+                <w:webHidden/>
+              </w:rPr>
+              <w:t>7</w:t>
+            </w:r>
+            <w:r>
+              <w:rPr>
+                <w:noProof/>
+                <w:webHidden/>
+              </w:rPr>
+              <w:fldChar w:fldCharType="end"/>
+            </w:r>
+          </w:hyperlink>
+        </w:p>
+        <w:p>
+          <w:pPr>
+            <w:pStyle w:val="TOC1"/>
+            <w:tabs>
+              <w:tab w:val="right" w:leader="dot" w:pos="9016"/>
+            </w:tabs>
+            <w:rPr>
+              <w:rFonts w:eastAsiaTheme="minorEastAsia"/>
+              <w:noProof/>
+              <w:lang w:eastAsia="en-IE"/>
+            </w:rPr>
+          </w:pPr>
+          <w:hyperlink w:anchor="_Toc230985091" w:history="1">
+            <w:r>
+              <w:rPr>
+                <w:rStyle w:val="Hyperlink"/>
+                <w:rFonts w:ascii="Arial" w:hAnsi="Arial" w:cs="Arial"/>
+                <w:b/>
+                <w:bCs/>
+                <w:noProof/>
+              </w:rPr>
+              <w:t>Word Count</w:t>
+            </w:r>
+            <w:r>
+              <w:rPr>
+                <w:noProof/>
+                <w:webHidden/>
+              </w:rPr>
+              <w:tab/>
+            </w:r>
+            <w:r>
+              <w:rPr>
+                <w:noProof/>
+                <w:webHidden/>
+              </w:rPr>
+              <w:fldChar w:fldCharType="begin"/>
+            </w:r>
+            <w:r>
+              <w:rPr>
+                <w:noProof/>
+                <w:webHidden/>
+              </w:rPr>
+              <w:instrText xml:space="preserve"> PAGEREF _Toc230985091 \h </w:instrText>
+            </w:r>
+            <w:r>
+              <w:rPr>
+                <w:noProof/>
+                <w:webHidden/>
+              </w:rPr>
+            </w:r>
+            <w:r>
+              <w:rPr>
+                <w:noProof/>
+                <w:webHidden/>
+              </w:rPr>
+              <w:fldChar w:fldCharType="separate"/>
+            </w:r>
+            <w:r>
+              <w:rPr>
+                <w:noProof/>
+                <w:webHidden/>
+              </w:rPr>
+              <w:t>8</w:t>
+            </w:r>
+            <w:r>
+              <w:rPr>
+                <w:noProof/>
+                <w:webHidden/>
+              </w:rPr>
+              <w:fldChar w:fldCharType="end"/>
+            </w:r>
+          </w:hyperlink>
+        </w:p>
+        <w:p>
+          <w:pPr>
+            <w:pStyle w:val="TOC1"/>
+            <w:tabs>
+              <w:tab w:val="right" w:leader="dot" w:pos="9016"/>
+            </w:tabs>
+            <w:rPr>
+              <w:rFonts w:eastAsiaTheme="minorEastAsia"/>
+              <w:noProof/>
+              <w:lang w:eastAsia="en-IE"/>
+            </w:rPr>
+          </w:pPr>
+          <w:hyperlink w:anchor="_Toc230985092" w:history="1">
+            <w:r>
+              <w:rPr>
+                <w:rStyle w:val="Hyperlink"/>
+                <w:rFonts w:ascii="Arial" w:hAnsi="Arial" w:cs="Arial"/>
+                <w:b/>
+                <w:bCs/>
+                <w:noProof/>
+              </w:rPr>
+              <w:t>MapReduce Using Python</w:t>
+            </w:r>
+            <w:r>
+              <w:rPr>
+                <w:noProof/>
+                <w:webHidden/>
+              </w:rPr>
+              <w:tab/>
+            </w:r>
+            <w:r>
+              <w:rPr>
+                <w:noProof/>
+                <w:webHidden/>
+              </w:rPr>
+              <w:fldChar w:fldCharType="begin"/>
+            </w:r>
+            <w:r>
+              <w:rPr>
+                <w:noProof/>
+                <w:webHidden/>
+              </w:rPr>
+              <w:instrText xml:space="preserve"> PAGEREF _Toc230985092 \h </w:instrText>
+            </w:r>
+            <w:r>
+              <w:rPr>
+                <w:noProof/>
+                <w:webHidden/>
+              </w:rPr>
+            </w:r>
+            <w:r>
+              <w:rPr>
+                <w:noProof/>
+                <w:webHidden/>
+              </w:rPr>
+              <w:fldChar w:fldCharType="separate"/>
+            </w:r>
+            <w:r>
+              <w:rPr>
+                <w:noProof/>
+                <w:webHidden/>
+              </w:rPr>
+              <w:t>8</w:t>
             </w:r>
             <w:r>
               <w:rPr>
@@ -1978,67 +2775,26 @@
             <w:fldChar w:fldCharType="end"/>
           </w:r>
         </w:p>
-        <w:p/>
+        <w:p>
+          <w:pPr>
+            <w:rPr>
+              <w:b/>
+              <w:bCs/>
+              <w:noProof/>
+            </w:rPr>
+          </w:pPr>
+        </w:p>
       </w:sdtContent>
     </w:sdt>
-    <w:p>
-      <w:pPr>
-        <w:pStyle w:val="Heading1"/>
-      </w:pPr>
-    </w:p>
-    <w:p>
-      <w:pPr>
-        <w:pStyle w:val="Heading1"/>
-      </w:pPr>
-    </w:p>
-    <w:p>
-      <w:pPr>
-        <w:pStyle w:val="Heading1"/>
-      </w:pPr>
-    </w:p>
-    <w:p>
-      <w:pPr>
+    <w:bookmarkStart w:id="0" w:name="_Toc230985065" w:displacedByCustomXml="prev"/>
+    <w:p>
+      <w:r>
         <w:rPr>
           <w:rStyle w:val="Heading1Char"/>
-          <w:rFonts w:ascii="Arial" w:hAnsi="Arial" w:cs="Arial"/>
-        </w:rPr>
-      </w:pPr>
-    </w:p>
-    <w:p>
-      <w:pPr>
-        <w:rPr>
-          <w:rStyle w:val="Heading1Char"/>
-          <w:rFonts w:ascii="Arial" w:hAnsi="Arial" w:cs="Arial"/>
-        </w:rPr>
-      </w:pPr>
-    </w:p>
-    <w:p>
-      <w:pPr>
-        <w:rPr>
-          <w:rStyle w:val="Heading1Char"/>
-          <w:rFonts w:ascii="Arial" w:hAnsi="Arial" w:cs="Arial"/>
-        </w:rPr>
-      </w:pPr>
-    </w:p>
-    <w:p>
-      <w:pPr>
-        <w:rPr>
           <w:rFonts w:ascii="Arial" w:hAnsi="Arial" w:cs="Arial"/>
           <w:b/>
           <w:bCs/>
-          <w:sz w:val="40"/>
-          <w:szCs w:val="40"/>
-        </w:rPr>
-      </w:pPr>
-      <w:bookmarkStart w:id="0" w:name="_Toc230521452"/>
-      <w:r>
-        <w:rPr>
-          <w:rStyle w:val="Heading1Char"/>
-          <w:rFonts w:ascii="Arial" w:hAnsi="Arial" w:cs="Arial"/>
-          <w:b/>
-          <w:bCs/>
-        </w:rPr>
-        <w:lastRenderedPageBreak/>
+        </w:rPr>
         <w:t>Introduction</w:t>
       </w:r>
       <w:bookmarkEnd w:id="0"/>
@@ -2157,7 +2913,7 @@
           <w:szCs w:val="40"/>
         </w:rPr>
       </w:pPr>
-      <w:bookmarkStart w:id="1" w:name="_Toc230521453"/>
+      <w:bookmarkStart w:id="1" w:name="_Toc230985066"/>
       <w:r>
         <w:rPr>
           <w:rStyle w:val="Heading1Char"/>
@@ -2203,7 +2959,7 @@
           <w:rFonts w:ascii="Arial" w:hAnsi="Arial" w:cs="Arial"/>
         </w:rPr>
       </w:pPr>
-      <w:bookmarkStart w:id="2" w:name="_Toc230521454"/>
+      <w:bookmarkStart w:id="2" w:name="_Toc230985067"/>
       <w:r>
         <w:rPr>
           <w:rStyle w:val="Heading1Char"/>
@@ -2247,7 +3003,7 @@
           <w:rFonts w:ascii="Arial" w:hAnsi="Arial" w:cs="Arial"/>
         </w:rPr>
       </w:pPr>
-      <w:bookmarkStart w:id="3" w:name="_Toc230521455"/>
+      <w:bookmarkStart w:id="3" w:name="_Toc230985068"/>
       <w:r>
         <w:rPr>
           <w:rStyle w:val="Heading1Char"/>
@@ -2308,7 +3064,14 @@
         <w:rPr>
           <w:rFonts w:ascii="Arial" w:hAnsi="Arial" w:cs="Arial"/>
         </w:rPr>
-        <w:t>describes the speed at which data is created, processed, and analysed. With real-time systems, social media activity, digital transactions, and IoT devices, data is continuously generated at extremely high speed, requiring fast processing for timely insights.</w:t>
+        <w:t xml:space="preserve">describes the speed at which data is created, processed, and analysed. With real-time systems, social media activity, digital transactions, and IoT devices, </w:t>
+      </w:r>
+      <w:r>
+        <w:rPr>
+          <w:rFonts w:ascii="Arial" w:hAnsi="Arial" w:cs="Arial"/>
+        </w:rPr>
+        <w:lastRenderedPageBreak/>
+        <w:t>data is continuously generated at extremely high speed, requiring fast processing for timely insights.</w:t>
       </w:r>
     </w:p>
     <w:p>
@@ -2325,7 +3088,7 @@
           <w:rFonts w:ascii="Arial" w:hAnsi="Arial" w:cs="Arial"/>
         </w:rPr>
       </w:pPr>
-      <w:bookmarkStart w:id="4" w:name="_Toc230521456"/>
+      <w:bookmarkStart w:id="4" w:name="_Toc230985069"/>
       <w:r>
         <w:rPr>
           <w:rStyle w:val="Heading1Char"/>
@@ -2464,7 +3227,7 @@
           <w:szCs w:val="40"/>
         </w:rPr>
       </w:pPr>
-      <w:bookmarkStart w:id="5" w:name="_Toc230521457"/>
+      <w:bookmarkStart w:id="5" w:name="_Toc230985070"/>
       <w:r>
         <w:rPr>
           <w:rStyle w:val="Heading1Char"/>
@@ -2498,7 +3261,6 @@
         </w:rPr>
         <w:t xml:space="preserve">In organizations </w:t>
       </w:r>
-      <w:bookmarkStart w:id="6" w:name="_Toc230521458"/>
       <w:r>
         <w:rPr>
           <w:rFonts w:ascii="Arial" w:hAnsi="Arial" w:cs="Arial"/>
@@ -2526,6 +3288,7 @@
           <w:rFonts w:ascii="Arial" w:hAnsi="Arial" w:cs="Arial"/>
         </w:rPr>
       </w:pPr>
+      <w:bookmarkStart w:id="6" w:name="_Toc230985071"/>
       <w:r>
         <w:rPr>
           <w:rStyle w:val="Heading1Char"/>
@@ -2609,7 +3372,7 @@
           <w:rFonts w:ascii="Arial" w:hAnsi="Arial" w:cs="Arial"/>
         </w:rPr>
       </w:pPr>
-      <w:bookmarkStart w:id="7" w:name="_Toc230521459"/>
+      <w:bookmarkStart w:id="7" w:name="_Toc230985072"/>
       <w:r>
         <w:rPr>
           <w:rStyle w:val="Heading1Char"/>
@@ -2659,6 +3422,7 @@
         <w:rPr>
           <w:rFonts w:ascii="Arial" w:hAnsi="Arial" w:cs="Arial"/>
         </w:rPr>
+        <w:lastRenderedPageBreak/>
         <w:t>Overall, handling big data requires advanced systems and careful management to ensure efficiency, security, and compliance.</w:t>
       </w:r>
     </w:p>
@@ -2672,7 +3436,7 @@
           <w:szCs w:val="40"/>
         </w:rPr>
       </w:pPr>
-      <w:bookmarkStart w:id="8" w:name="_Toc230521460"/>
+      <w:bookmarkStart w:id="8" w:name="_Toc230985073"/>
       <w:r>
         <w:rPr>
           <w:rStyle w:val="Heading1Char"/>
@@ -2680,7 +3444,6 @@
           <w:b/>
           <w:bCs/>
         </w:rPr>
-        <w:lastRenderedPageBreak/>
         <w:t xml:space="preserve">Horizontal Vs </w:t>
       </w:r>
       <w:r>
@@ -2806,7 +3569,7 @@
       </w:r>
     </w:p>
     <w:p>
-      <w:bookmarkStart w:id="9" w:name="_Toc230521461"/>
+      <w:bookmarkStart w:id="9" w:name="_Toc230985074"/>
       <w:r>
         <w:rPr>
           <w:rStyle w:val="Heading2Char"/>
@@ -2838,7 +3601,7 @@
           <w:color w:val="auto"/>
         </w:rPr>
       </w:pPr>
-      <w:bookmarkStart w:id="10" w:name="_Toc230521462"/>
+      <w:bookmarkStart w:id="10" w:name="_Toc230985075"/>
       <w:r>
         <w:rPr>
           <w:rFonts w:ascii="Arial" w:hAnsi="Arial" w:cs="Arial"/>
@@ -2885,7 +3648,7 @@
           <w:color w:val="auto"/>
         </w:rPr>
       </w:pPr>
-      <w:bookmarkStart w:id="11" w:name="_Toc230521463"/>
+      <w:bookmarkStart w:id="11" w:name="_Toc230985076"/>
       <w:r>
         <w:rPr>
           <w:rFonts w:ascii="Arial" w:hAnsi="Arial" w:cs="Arial"/>
@@ -2932,7 +3695,7 @@
           <w:color w:val="auto"/>
         </w:rPr>
       </w:pPr>
-      <w:bookmarkStart w:id="12" w:name="_Toc230521464"/>
+      <w:bookmarkStart w:id="12" w:name="_Toc230985077"/>
       <w:r>
         <w:rPr>
           <w:rFonts w:ascii="Arial" w:hAnsi="Arial" w:cs="Arial"/>
@@ -2979,7 +3742,7 @@
           <w:color w:val="auto"/>
         </w:rPr>
       </w:pPr>
-      <w:bookmarkStart w:id="13" w:name="_Toc230521465"/>
+      <w:bookmarkStart w:id="13" w:name="_Toc230985078"/>
       <w:r>
         <w:rPr>
           <w:rFonts w:ascii="Arial" w:hAnsi="Arial" w:cs="Arial"/>
@@ -3015,6 +3778,7 @@
         </w:numPr>
       </w:pPr>
       <w:r>
+        <w:lastRenderedPageBreak/>
         <w:t xml:space="preserve">Horizontal: Requires networking, distributed systems, load balancing, and orchestration skills. </w:t>
       </w:r>
     </w:p>
@@ -3025,13 +3789,12 @@
           <w:rFonts w:ascii="Arial" w:hAnsi="Arial" w:cs="Arial"/>
         </w:rPr>
       </w:pPr>
-      <w:bookmarkStart w:id="14" w:name="_Toc230521466"/>
+      <w:bookmarkStart w:id="14" w:name="_Toc230985079"/>
       <w:r>
         <w:rPr>
           <w:rFonts w:ascii="Arial" w:hAnsi="Arial" w:cs="Arial"/>
           <w:color w:val="auto"/>
         </w:rPr>
-        <w:lastRenderedPageBreak/>
         <w:t>Costs</w:t>
       </w:r>
       <w:bookmarkEnd w:id="14"/>
@@ -3116,7 +3879,7 @@
       </w:r>
     </w:p>
     <w:p>
-      <w:bookmarkStart w:id="15" w:name="_Toc230521467"/>
+      <w:bookmarkStart w:id="15" w:name="_Toc230985080"/>
       <w:r>
         <w:rPr>
           <w:rStyle w:val="Heading2Char"/>
@@ -3199,7 +3962,7 @@
       </w:pPr>
     </w:p>
     <w:p>
-      <w:bookmarkStart w:id="16" w:name="_Toc230521468"/>
+      <w:bookmarkStart w:id="16" w:name="_Toc230985081"/>
       <w:r>
         <w:rPr>
           <w:rStyle w:val="Heading2Char"/>
@@ -3259,6 +4022,7 @@
           <w:bCs/>
         </w:rPr>
       </w:pPr>
+      <w:bookmarkStart w:id="17" w:name="_Toc230985082"/>
       <w:r>
         <w:rPr>
           <w:rFonts w:ascii="Arial" w:hAnsi="Arial" w:cs="Arial"/>
@@ -3267,6 +4031,7 @@
         </w:rPr>
         <w:t>Analysis of Real-World Organisations Using Big Data:</w:t>
       </w:r>
+      <w:bookmarkEnd w:id="17"/>
     </w:p>
     <w:p>
       <w:pPr>
@@ -3291,6 +4056,7 @@
       <w:pPr>
         <w:pStyle w:val="Heading2"/>
       </w:pPr>
+      <w:bookmarkStart w:id="18" w:name="_Toc230985083"/>
       <w:proofErr w:type="spellStart"/>
       <w:r>
         <w:rPr>
@@ -3302,6 +4068,7 @@
         <w:lastRenderedPageBreak/>
         <w:t>Netfix</w:t>
       </w:r>
+      <w:bookmarkEnd w:id="18"/>
       <w:proofErr w:type="spellEnd"/>
     </w:p>
     <w:p>
@@ -3314,6 +4081,7 @@
           <w:szCs w:val="24"/>
         </w:rPr>
       </w:pPr>
+      <w:bookmarkStart w:id="19" w:name="_Toc230985084"/>
       <w:r>
         <w:rPr>
           <w:rFonts w:ascii="Arial" w:eastAsiaTheme="minorHAnsi" w:hAnsi="Arial" w:cs="Arial"/>
@@ -3321,39 +4089,40 @@
           <w:sz w:val="24"/>
           <w:szCs w:val="24"/>
         </w:rPr>
-        <w:t xml:space="preserve">Netflix analyses billions of real-time user interactions, including clicks, searches, viewing behaviours, and streaming data. </w:t>
-      </w:r>
-    </w:p>
-    <w:p>
-      <w:pPr>
-        <w:pStyle w:val="Heading2"/>
+        <w:t>Netflix analyses billions of real-time user interactions, including clicks, searches, viewing behaviours, and streaming data.</w:t>
+      </w:r>
+      <w:bookmarkEnd w:id="19"/>
+      <w:r>
         <w:rPr>
           <w:rFonts w:ascii="Arial" w:eastAsiaTheme="minorHAnsi" w:hAnsi="Arial" w:cs="Arial"/>
           <w:color w:val="auto"/>
           <w:sz w:val="24"/>
           <w:szCs w:val="24"/>
         </w:rPr>
-      </w:pPr>
-      <w:r>
+        <w:t xml:space="preserve"> </w:t>
+      </w:r>
+    </w:p>
+    <w:p>
+      <w:pPr>
+        <w:pStyle w:val="Heading2"/>
         <w:rPr>
           <w:rFonts w:ascii="Arial" w:eastAsiaTheme="minorHAnsi" w:hAnsi="Arial" w:cs="Arial"/>
           <w:color w:val="auto"/>
           <w:sz w:val="24"/>
           <w:szCs w:val="24"/>
         </w:rPr>
-        <w:t xml:space="preserve">It uses Apache Spark, Flink, Kafka, and AWS to power recommendations, improving accuracy, increasing watch time, and reducing customer loss (churn). </w:t>
-      </w:r>
-    </w:p>
-    <w:p>
-      <w:pPr>
-        <w:pStyle w:val="Heading2"/>
+      </w:pPr>
+      <w:bookmarkStart w:id="20" w:name="_Toc230985085"/>
+      <w:r>
         <w:rPr>
           <w:rFonts w:ascii="Arial" w:eastAsiaTheme="minorHAnsi" w:hAnsi="Arial" w:cs="Arial"/>
           <w:color w:val="auto"/>
           <w:sz w:val="24"/>
           <w:szCs w:val="24"/>
         </w:rPr>
-      </w:pPr>
+        <w:t>It uses Apache Spark, Flink, Kafka, and AWS to power recommendations, improving accuracy, increasing watch time, and reducing customer loss (churn).</w:t>
+      </w:r>
+      <w:bookmarkEnd w:id="20"/>
       <w:r>
         <w:rPr>
           <w:rFonts w:ascii="Arial" w:eastAsiaTheme="minorHAnsi" w:hAnsi="Arial" w:cs="Arial"/>
@@ -3361,8 +4130,30 @@
           <w:sz w:val="24"/>
           <w:szCs w:val="24"/>
         </w:rPr>
+        <w:t xml:space="preserve"> </w:t>
+      </w:r>
+    </w:p>
+    <w:p>
+      <w:pPr>
+        <w:pStyle w:val="Heading2"/>
+        <w:rPr>
+          <w:rFonts w:ascii="Arial" w:eastAsiaTheme="minorHAnsi" w:hAnsi="Arial" w:cs="Arial"/>
+          <w:color w:val="auto"/>
+          <w:sz w:val="24"/>
+          <w:szCs w:val="24"/>
+        </w:rPr>
+      </w:pPr>
+      <w:bookmarkStart w:id="21" w:name="_Toc230985086"/>
+      <w:r>
+        <w:rPr>
+          <w:rFonts w:ascii="Arial" w:eastAsiaTheme="minorHAnsi" w:hAnsi="Arial" w:cs="Arial"/>
+          <w:color w:val="auto"/>
+          <w:sz w:val="24"/>
+          <w:szCs w:val="24"/>
+        </w:rPr>
         <w:t>It enables real-time analytics and scalable, reliable cloud performance.</w:t>
       </w:r>
+      <w:bookmarkEnd w:id="21"/>
       <w:r>
         <w:rPr>
           <w:rFonts w:ascii="Arial" w:eastAsiaTheme="minorHAnsi" w:hAnsi="Arial" w:cs="Arial"/>
@@ -3431,6 +4222,7 @@
       <w:pPr>
         <w:pStyle w:val="Heading2"/>
       </w:pPr>
+      <w:bookmarkStart w:id="22" w:name="_Toc230985087"/>
       <w:r>
         <w:rPr>
           <w:rStyle w:val="Heading2Char"/>
@@ -3440,6 +4232,7 @@
         </w:rPr>
         <w:t>Amazon</w:t>
       </w:r>
+      <w:bookmarkEnd w:id="22"/>
     </w:p>
     <w:p>
       <w:pPr>
@@ -3629,6 +4422,7 @@
       <w:pPr>
         <w:pStyle w:val="Heading2"/>
       </w:pPr>
+      <w:bookmarkStart w:id="23" w:name="_Toc230985088"/>
       <w:r>
         <w:rPr>
           <w:rStyle w:val="Heading2Char"/>
@@ -3638,6 +4432,7 @@
         </w:rPr>
         <w:t>Google</w:t>
       </w:r>
+      <w:bookmarkEnd w:id="23"/>
       <w:r>
         <w:rPr>
           <w:rStyle w:val="Heading2Char"/>
@@ -3763,6 +4558,7 @@
           <w:bCs/>
         </w:rPr>
       </w:pPr>
+      <w:bookmarkStart w:id="24" w:name="_Toc230985089"/>
       <w:r>
         <w:rPr>
           <w:rStyle w:val="Heading2Char"/>
@@ -3773,6 +4569,7 @@
         <w:lastRenderedPageBreak/>
         <w:t>Reference</w:t>
       </w:r>
+      <w:bookmarkEnd w:id="24"/>
     </w:p>
     <w:p>
       <w:pPr>
@@ -4562,336 +5359,6 @@
     </w:p>
     <w:p>
       <w:pPr>
-        <w:pStyle w:val="ListParagraph"/>
-        <w:rPr>
-          <w:rFonts w:ascii="Arial" w:hAnsi="Arial" w:cs="Arial"/>
-          <w:sz w:val="16"/>
-          <w:szCs w:val="16"/>
-        </w:rPr>
-      </w:pPr>
-    </w:p>
-    <w:p>
-      <w:pPr>
-        <w:pStyle w:val="ListParagraph"/>
-        <w:rPr>
-          <w:rFonts w:ascii="Arial" w:hAnsi="Arial" w:cs="Arial"/>
-          <w:sz w:val="16"/>
-          <w:szCs w:val="16"/>
-        </w:rPr>
-      </w:pPr>
-    </w:p>
-    <w:p>
-      <w:pPr>
-        <w:pStyle w:val="ListParagraph"/>
-        <w:rPr>
-          <w:rFonts w:ascii="Arial" w:hAnsi="Arial" w:cs="Arial"/>
-          <w:sz w:val="16"/>
-          <w:szCs w:val="16"/>
-        </w:rPr>
-      </w:pPr>
-    </w:p>
-    <w:p>
-      <w:pPr>
-        <w:pStyle w:val="ListParagraph"/>
-        <w:rPr>
-          <w:rFonts w:ascii="Arial" w:hAnsi="Arial" w:cs="Arial"/>
-          <w:sz w:val="16"/>
-          <w:szCs w:val="16"/>
-        </w:rPr>
-      </w:pPr>
-    </w:p>
-    <w:p>
-      <w:pPr>
-        <w:pStyle w:val="ListParagraph"/>
-        <w:rPr>
-          <w:rFonts w:ascii="Arial" w:hAnsi="Arial" w:cs="Arial"/>
-          <w:sz w:val="16"/>
-          <w:szCs w:val="16"/>
-        </w:rPr>
-      </w:pPr>
-    </w:p>
-    <w:p>
-      <w:pPr>
-        <w:pStyle w:val="ListParagraph"/>
-        <w:rPr>
-          <w:rFonts w:ascii="Arial" w:hAnsi="Arial" w:cs="Arial"/>
-          <w:sz w:val="16"/>
-          <w:szCs w:val="16"/>
-        </w:rPr>
-      </w:pPr>
-    </w:p>
-    <w:p>
-      <w:pPr>
-        <w:pStyle w:val="ListParagraph"/>
-        <w:rPr>
-          <w:rFonts w:ascii="Arial" w:hAnsi="Arial" w:cs="Arial"/>
-          <w:sz w:val="16"/>
-          <w:szCs w:val="16"/>
-        </w:rPr>
-      </w:pPr>
-    </w:p>
-    <w:p>
-      <w:pPr>
-        <w:pStyle w:val="ListParagraph"/>
-        <w:rPr>
-          <w:rFonts w:ascii="Arial" w:hAnsi="Arial" w:cs="Arial"/>
-          <w:sz w:val="16"/>
-          <w:szCs w:val="16"/>
-        </w:rPr>
-      </w:pPr>
-    </w:p>
-    <w:p>
-      <w:pPr>
-        <w:pStyle w:val="ListParagraph"/>
-        <w:rPr>
-          <w:rFonts w:ascii="Arial" w:hAnsi="Arial" w:cs="Arial"/>
-          <w:sz w:val="16"/>
-          <w:szCs w:val="16"/>
-        </w:rPr>
-      </w:pPr>
-    </w:p>
-    <w:p>
-      <w:pPr>
-        <w:pStyle w:val="ListParagraph"/>
-        <w:rPr>
-          <w:rFonts w:ascii="Arial" w:hAnsi="Arial" w:cs="Arial"/>
-          <w:sz w:val="16"/>
-          <w:szCs w:val="16"/>
-        </w:rPr>
-      </w:pPr>
-    </w:p>
-    <w:p>
-      <w:pPr>
-        <w:pStyle w:val="ListParagraph"/>
-        <w:rPr>
-          <w:rFonts w:ascii="Arial" w:hAnsi="Arial" w:cs="Arial"/>
-          <w:sz w:val="16"/>
-          <w:szCs w:val="16"/>
-        </w:rPr>
-      </w:pPr>
-    </w:p>
-    <w:p>
-      <w:pPr>
-        <w:pStyle w:val="ListParagraph"/>
-        <w:rPr>
-          <w:rFonts w:ascii="Arial" w:hAnsi="Arial" w:cs="Arial"/>
-          <w:sz w:val="16"/>
-          <w:szCs w:val="16"/>
-        </w:rPr>
-      </w:pPr>
-    </w:p>
-    <w:p>
-      <w:pPr>
-        <w:pStyle w:val="ListParagraph"/>
-        <w:rPr>
-          <w:rFonts w:ascii="Arial" w:hAnsi="Arial" w:cs="Arial"/>
-          <w:sz w:val="16"/>
-          <w:szCs w:val="16"/>
-        </w:rPr>
-      </w:pPr>
-    </w:p>
-    <w:p>
-      <w:pPr>
-        <w:pStyle w:val="ListParagraph"/>
-        <w:rPr>
-          <w:rFonts w:ascii="Arial" w:hAnsi="Arial" w:cs="Arial"/>
-          <w:sz w:val="16"/>
-          <w:szCs w:val="16"/>
-        </w:rPr>
-      </w:pPr>
-    </w:p>
-    <w:p>
-      <w:pPr>
-        <w:pStyle w:val="ListParagraph"/>
-        <w:rPr>
-          <w:rFonts w:ascii="Arial" w:hAnsi="Arial" w:cs="Arial"/>
-          <w:sz w:val="16"/>
-          <w:szCs w:val="16"/>
-        </w:rPr>
-      </w:pPr>
-    </w:p>
-    <w:p>
-      <w:pPr>
-        <w:pStyle w:val="ListParagraph"/>
-        <w:rPr>
-          <w:rFonts w:ascii="Arial" w:hAnsi="Arial" w:cs="Arial"/>
-          <w:sz w:val="16"/>
-          <w:szCs w:val="16"/>
-        </w:rPr>
-      </w:pPr>
-    </w:p>
-    <w:p>
-      <w:pPr>
-        <w:pStyle w:val="ListParagraph"/>
-        <w:rPr>
-          <w:rFonts w:ascii="Arial" w:hAnsi="Arial" w:cs="Arial"/>
-          <w:sz w:val="16"/>
-          <w:szCs w:val="16"/>
-        </w:rPr>
-      </w:pPr>
-    </w:p>
-    <w:p>
-      <w:pPr>
-        <w:pStyle w:val="ListParagraph"/>
-        <w:rPr>
-          <w:rFonts w:ascii="Arial" w:hAnsi="Arial" w:cs="Arial"/>
-          <w:sz w:val="16"/>
-          <w:szCs w:val="16"/>
-        </w:rPr>
-      </w:pPr>
-    </w:p>
-    <w:p>
-      <w:pPr>
-        <w:pStyle w:val="ListParagraph"/>
-        <w:rPr>
-          <w:rFonts w:ascii="Arial" w:hAnsi="Arial" w:cs="Arial"/>
-          <w:sz w:val="16"/>
-          <w:szCs w:val="16"/>
-        </w:rPr>
-      </w:pPr>
-    </w:p>
-    <w:p>
-      <w:pPr>
-        <w:pStyle w:val="ListParagraph"/>
-        <w:rPr>
-          <w:rFonts w:ascii="Arial" w:hAnsi="Arial" w:cs="Arial"/>
-          <w:sz w:val="16"/>
-          <w:szCs w:val="16"/>
-        </w:rPr>
-      </w:pPr>
-    </w:p>
-    <w:p>
-      <w:pPr>
-        <w:pStyle w:val="ListParagraph"/>
-        <w:rPr>
-          <w:rFonts w:ascii="Arial" w:hAnsi="Arial" w:cs="Arial"/>
-          <w:sz w:val="16"/>
-          <w:szCs w:val="16"/>
-        </w:rPr>
-      </w:pPr>
-    </w:p>
-    <w:p>
-      <w:pPr>
-        <w:pStyle w:val="ListParagraph"/>
-        <w:rPr>
-          <w:rFonts w:ascii="Arial" w:hAnsi="Arial" w:cs="Arial"/>
-          <w:sz w:val="16"/>
-          <w:szCs w:val="16"/>
-        </w:rPr>
-      </w:pPr>
-    </w:p>
-    <w:p>
-      <w:pPr>
-        <w:pStyle w:val="ListParagraph"/>
-        <w:rPr>
-          <w:rFonts w:ascii="Arial" w:hAnsi="Arial" w:cs="Arial"/>
-          <w:sz w:val="16"/>
-          <w:szCs w:val="16"/>
-        </w:rPr>
-      </w:pPr>
-    </w:p>
-    <w:p>
-      <w:pPr>
-        <w:pStyle w:val="ListParagraph"/>
-        <w:rPr>
-          <w:rFonts w:ascii="Arial" w:hAnsi="Arial" w:cs="Arial"/>
-          <w:sz w:val="16"/>
-          <w:szCs w:val="16"/>
-        </w:rPr>
-      </w:pPr>
-    </w:p>
-    <w:p>
-      <w:pPr>
-        <w:pStyle w:val="ListParagraph"/>
-        <w:rPr>
-          <w:rFonts w:ascii="Arial" w:hAnsi="Arial" w:cs="Arial"/>
-          <w:sz w:val="16"/>
-          <w:szCs w:val="16"/>
-        </w:rPr>
-      </w:pPr>
-    </w:p>
-    <w:p>
-      <w:pPr>
-        <w:pStyle w:val="ListParagraph"/>
-        <w:rPr>
-          <w:rFonts w:ascii="Arial" w:hAnsi="Arial" w:cs="Arial"/>
-          <w:sz w:val="16"/>
-          <w:szCs w:val="16"/>
-        </w:rPr>
-      </w:pPr>
-    </w:p>
-    <w:p>
-      <w:pPr>
-        <w:pStyle w:val="ListParagraph"/>
-        <w:rPr>
-          <w:rFonts w:ascii="Arial" w:hAnsi="Arial" w:cs="Arial"/>
-          <w:sz w:val="16"/>
-          <w:szCs w:val="16"/>
-        </w:rPr>
-      </w:pPr>
-    </w:p>
-    <w:p>
-      <w:pPr>
-        <w:pStyle w:val="ListParagraph"/>
-        <w:rPr>
-          <w:rFonts w:ascii="Arial" w:hAnsi="Arial" w:cs="Arial"/>
-          <w:sz w:val="16"/>
-          <w:szCs w:val="16"/>
-        </w:rPr>
-      </w:pPr>
-    </w:p>
-    <w:p>
-      <w:pPr>
-        <w:pStyle w:val="ListParagraph"/>
-        <w:rPr>
-          <w:rFonts w:ascii="Arial" w:hAnsi="Arial" w:cs="Arial"/>
-          <w:sz w:val="16"/>
-          <w:szCs w:val="16"/>
-        </w:rPr>
-      </w:pPr>
-    </w:p>
-    <w:p>
-      <w:pPr>
-        <w:pStyle w:val="ListParagraph"/>
-        <w:rPr>
-          <w:rFonts w:ascii="Arial" w:hAnsi="Arial" w:cs="Arial"/>
-          <w:sz w:val="16"/>
-          <w:szCs w:val="16"/>
-        </w:rPr>
-      </w:pPr>
-    </w:p>
-    <w:p>
-      <w:pPr>
-        <w:pStyle w:val="ListParagraph"/>
-        <w:rPr>
-          <w:rFonts w:ascii="Arial" w:hAnsi="Arial" w:cs="Arial"/>
-          <w:sz w:val="16"/>
-          <w:szCs w:val="16"/>
-        </w:rPr>
-      </w:pPr>
-    </w:p>
-    <w:p>
-      <w:pPr>
-        <w:pStyle w:val="ListParagraph"/>
-        <w:rPr>
-          <w:rFonts w:ascii="Arial" w:hAnsi="Arial" w:cs="Arial"/>
-          <w:sz w:val="16"/>
-          <w:szCs w:val="16"/>
-        </w:rPr>
-      </w:pPr>
-    </w:p>
-    <w:p>
-      <w:pPr>
-        <w:pStyle w:val="ListParagraph"/>
-        <w:rPr>
-          <w:rFonts w:ascii="Arial" w:hAnsi="Arial" w:cs="Arial"/>
-          <w:sz w:val="16"/>
-          <w:szCs w:val="16"/>
-        </w:rPr>
-      </w:pPr>
-    </w:p>
-    <w:p>
-      <w:pPr>
         <w:pStyle w:val="Heading1"/>
         <w:rPr>
           <w:rStyle w:val="Heading2Char"/>
@@ -4900,6 +5367,7 @@
           <w:bCs/>
         </w:rPr>
       </w:pPr>
+      <w:bookmarkStart w:id="25" w:name="_Toc230985090"/>
       <w:r>
         <w:rPr>
           <w:rStyle w:val="Heading2Char"/>
@@ -4907,6 +5375,617 @@
           <w:b/>
           <w:bCs/>
         </w:rPr>
+        <w:t>Use of AI in Working</w:t>
+      </w:r>
+      <w:bookmarkEnd w:id="25"/>
+    </w:p>
+    <w:p>
+      <w:pPr>
+        <w:pStyle w:val="ListParagraph"/>
+        <w:numPr>
+          <w:ilvl w:val="0"/>
+          <w:numId w:val="8"/>
+        </w:numPr>
+        <w:rPr>
+          <w:rFonts w:ascii="Arial" w:hAnsi="Arial" w:cs="Arial"/>
+          <w:sz w:val="16"/>
+          <w:szCs w:val="16"/>
+        </w:rPr>
+      </w:pPr>
+      <w:r>
+        <w:rPr>
+          <w:rFonts w:ascii="Arial" w:hAnsi="Arial" w:cs="Arial"/>
+          <w:sz w:val="16"/>
+          <w:szCs w:val="16"/>
+        </w:rPr>
+        <w:t xml:space="preserve">AI is used to generate data for </w:t>
+      </w:r>
+      <w:proofErr w:type="spellStart"/>
+      <w:r>
+        <w:rPr>
+          <w:rFonts w:ascii="Arial" w:hAnsi="Arial" w:cs="Arial"/>
+          <w:sz w:val="16"/>
+          <w:szCs w:val="16"/>
+        </w:rPr>
+        <w:t>Ireflix</w:t>
+      </w:r>
+      <w:proofErr w:type="spellEnd"/>
+      <w:r>
+        <w:rPr>
+          <w:rFonts w:ascii="Arial" w:hAnsi="Arial" w:cs="Arial"/>
+          <w:sz w:val="16"/>
+          <w:szCs w:val="16"/>
+        </w:rPr>
+        <w:t xml:space="preserve"> screen </w:t>
+      </w:r>
+      <w:proofErr w:type="gramStart"/>
+      <w:r>
+        <w:rPr>
+          <w:rFonts w:ascii="Arial" w:hAnsi="Arial" w:cs="Arial"/>
+          <w:sz w:val="16"/>
+          <w:szCs w:val="16"/>
+        </w:rPr>
+        <w:t>watching .</w:t>
+      </w:r>
+      <w:proofErr w:type="gramEnd"/>
+      <w:r>
+        <w:rPr>
+          <w:rFonts w:ascii="Arial" w:hAnsi="Arial" w:cs="Arial"/>
+          <w:sz w:val="16"/>
+          <w:szCs w:val="16"/>
+        </w:rPr>
+        <w:t xml:space="preserve"> </w:t>
+      </w:r>
+    </w:p>
+    <w:p>
+      <w:pPr>
+        <w:pStyle w:val="ListParagraph"/>
+        <w:rPr>
+          <w:rFonts w:ascii="Arial" w:hAnsi="Arial" w:cs="Arial"/>
+          <w:sz w:val="16"/>
+          <w:szCs w:val="16"/>
+        </w:rPr>
+      </w:pPr>
+      <w:r>
+        <w:rPr>
+          <w:rFonts w:ascii="Arial" w:hAnsi="Arial" w:cs="Arial"/>
+          <w:sz w:val="16"/>
+          <w:szCs w:val="16"/>
+        </w:rPr>
+        <w:t xml:space="preserve">The prompt given: </w:t>
+      </w:r>
+      <w:r>
+        <w:rPr>
+          <w:rFonts w:ascii="Arial" w:hAnsi="Arial" w:cs="Arial"/>
+          <w:sz w:val="16"/>
+          <w:szCs w:val="16"/>
+        </w:rPr>
+        <w:t>ge</w:t>
+      </w:r>
+      <w:r>
+        <w:rPr>
+          <w:rFonts w:ascii="Arial" w:hAnsi="Arial" w:cs="Arial"/>
+          <w:sz w:val="16"/>
+          <w:szCs w:val="16"/>
+        </w:rPr>
+        <w:t>n</w:t>
+      </w:r>
+      <w:r>
+        <w:rPr>
+          <w:rFonts w:ascii="Arial" w:hAnsi="Arial" w:cs="Arial"/>
+          <w:sz w:val="16"/>
+          <w:szCs w:val="16"/>
+        </w:rPr>
+        <w:t xml:space="preserve">erate a </w:t>
+      </w:r>
+      <w:r>
+        <w:rPr>
+          <w:rFonts w:ascii="Arial" w:hAnsi="Arial" w:cs="Arial"/>
+          <w:sz w:val="16"/>
+          <w:szCs w:val="16"/>
+        </w:rPr>
+        <w:t>sample dataset of at least</w:t>
+      </w:r>
+      <w:r>
+        <w:rPr>
+          <w:rFonts w:ascii="Arial" w:hAnsi="Arial" w:cs="Arial"/>
+          <w:sz w:val="16"/>
+          <w:szCs w:val="16"/>
+        </w:rPr>
+        <w:t xml:space="preserve"> 25</w:t>
+      </w:r>
+      <w:r>
+        <w:rPr>
+          <w:rFonts w:ascii="Arial" w:hAnsi="Arial" w:cs="Arial"/>
+          <w:sz w:val="16"/>
+          <w:szCs w:val="16"/>
+        </w:rPr>
+        <w:t xml:space="preserve"> viewing records</w:t>
+      </w:r>
+      <w:r>
+        <w:rPr>
+          <w:rFonts w:ascii="Arial" w:hAnsi="Arial" w:cs="Arial"/>
+          <w:sz w:val="16"/>
+          <w:szCs w:val="16"/>
+        </w:rPr>
+        <w:t xml:space="preserve"> </w:t>
+      </w:r>
+      <w:r>
+        <w:rPr>
+          <w:rFonts w:ascii="Arial" w:hAnsi="Arial" w:cs="Arial"/>
+          <w:sz w:val="16"/>
+          <w:szCs w:val="16"/>
+        </w:rPr>
+        <w:t xml:space="preserve">in the format (genre, </w:t>
+      </w:r>
+      <w:proofErr w:type="spellStart"/>
+      <w:r>
+        <w:rPr>
+          <w:rFonts w:ascii="Arial" w:hAnsi="Arial" w:cs="Arial"/>
+          <w:sz w:val="16"/>
+          <w:szCs w:val="16"/>
+        </w:rPr>
+        <w:t>watchtime_minutes</w:t>
+      </w:r>
+      <w:proofErr w:type="spellEnd"/>
+      <w:r>
+        <w:rPr>
+          <w:rFonts w:ascii="Arial" w:hAnsi="Arial" w:cs="Arial"/>
+          <w:sz w:val="16"/>
+          <w:szCs w:val="16"/>
+        </w:rPr>
+        <w:t xml:space="preserve">) covering a minimum of 8 different </w:t>
+      </w:r>
+      <w:proofErr w:type="spellStart"/>
+      <w:r>
+        <w:rPr>
+          <w:rFonts w:ascii="Arial" w:hAnsi="Arial" w:cs="Arial"/>
+          <w:sz w:val="16"/>
+          <w:szCs w:val="16"/>
+        </w:rPr>
+        <w:t>genres</w:t>
+      </w:r>
+      <w:r>
+        <w:rPr>
+          <w:rFonts w:ascii="Arial" w:hAnsi="Arial" w:cs="Arial"/>
+          <w:sz w:val="16"/>
+          <w:szCs w:val="16"/>
+        </w:rPr>
+        <w:t>and</w:t>
+      </w:r>
+      <w:proofErr w:type="spellEnd"/>
+      <w:r>
+        <w:rPr>
+          <w:rFonts w:ascii="Arial" w:hAnsi="Arial" w:cs="Arial"/>
+          <w:sz w:val="16"/>
+          <w:szCs w:val="16"/>
+        </w:rPr>
+        <w:t xml:space="preserve"> include </w:t>
+      </w:r>
+      <w:r>
+        <w:rPr>
+          <w:rFonts w:ascii="Arial" w:hAnsi="Arial" w:cs="Arial"/>
+          <w:sz w:val="16"/>
+          <w:szCs w:val="16"/>
+        </w:rPr>
+        <w:t>suspense</w:t>
+      </w:r>
+      <w:r>
+        <w:rPr>
+          <w:rFonts w:ascii="Arial" w:hAnsi="Arial" w:cs="Arial"/>
+          <w:sz w:val="16"/>
+          <w:szCs w:val="16"/>
+        </w:rPr>
+        <w:t xml:space="preserve">, </w:t>
+      </w:r>
+      <w:proofErr w:type="gramStart"/>
+      <w:r>
+        <w:rPr>
+          <w:rFonts w:ascii="Arial" w:hAnsi="Arial" w:cs="Arial"/>
+          <w:sz w:val="16"/>
+          <w:szCs w:val="16"/>
+        </w:rPr>
+        <w:t>drama ,</w:t>
+      </w:r>
+      <w:proofErr w:type="gramEnd"/>
+      <w:r>
+        <w:rPr>
+          <w:rFonts w:ascii="Arial" w:hAnsi="Arial" w:cs="Arial"/>
+          <w:sz w:val="16"/>
+          <w:szCs w:val="16"/>
+        </w:rPr>
+        <w:t xml:space="preserve"> kids, action, comedy, </w:t>
+      </w:r>
+      <w:r>
+        <w:rPr>
+          <w:rFonts w:ascii="Arial" w:hAnsi="Arial" w:cs="Arial"/>
+          <w:sz w:val="16"/>
+          <w:szCs w:val="16"/>
+        </w:rPr>
+        <w:t>d</w:t>
+      </w:r>
+      <w:r>
+        <w:rPr>
+          <w:rFonts w:ascii="Arial" w:hAnsi="Arial" w:cs="Arial"/>
+          <w:sz w:val="16"/>
+          <w:szCs w:val="16"/>
+        </w:rPr>
+        <w:t>o</w:t>
+      </w:r>
+      <w:r>
+        <w:rPr>
+          <w:rFonts w:ascii="Arial" w:hAnsi="Arial" w:cs="Arial"/>
+          <w:sz w:val="16"/>
+          <w:szCs w:val="16"/>
+        </w:rPr>
+        <w:t>c</w:t>
+      </w:r>
+      <w:r>
+        <w:rPr>
+          <w:rFonts w:ascii="Arial" w:hAnsi="Arial" w:cs="Arial"/>
+          <w:sz w:val="16"/>
+          <w:szCs w:val="16"/>
+        </w:rPr>
+        <w:t>u</w:t>
+      </w:r>
+      <w:r>
+        <w:rPr>
+          <w:rFonts w:ascii="Arial" w:hAnsi="Arial" w:cs="Arial"/>
+          <w:sz w:val="16"/>
+          <w:szCs w:val="16"/>
+        </w:rPr>
+        <w:t>mentary</w:t>
+      </w:r>
+      <w:r>
+        <w:rPr>
+          <w:rFonts w:ascii="Arial" w:hAnsi="Arial" w:cs="Arial"/>
+          <w:sz w:val="16"/>
+          <w:szCs w:val="16"/>
+        </w:rPr>
+        <w:t xml:space="preserve"> genre. </w:t>
+      </w:r>
+    </w:p>
+    <w:p>
+      <w:pPr>
+        <w:pStyle w:val="ListParagraph"/>
+        <w:numPr>
+          <w:ilvl w:val="0"/>
+          <w:numId w:val="8"/>
+        </w:numPr>
+        <w:rPr>
+          <w:rFonts w:ascii="Arial" w:hAnsi="Arial" w:cs="Arial"/>
+          <w:sz w:val="16"/>
+          <w:szCs w:val="16"/>
+        </w:rPr>
+      </w:pPr>
+      <w:r>
+        <w:rPr>
+          <w:rFonts w:ascii="Arial" w:hAnsi="Arial" w:cs="Arial"/>
+          <w:sz w:val="16"/>
+          <w:szCs w:val="16"/>
+        </w:rPr>
+        <w:t xml:space="preserve">Help for and error in </w:t>
+      </w:r>
+      <w:proofErr w:type="spellStart"/>
+      <w:r>
+        <w:rPr>
+          <w:rFonts w:ascii="Arial" w:hAnsi="Arial" w:cs="Arial"/>
+          <w:sz w:val="16"/>
+          <w:szCs w:val="16"/>
+        </w:rPr>
+        <w:t>SQl</w:t>
+      </w:r>
+      <w:proofErr w:type="spellEnd"/>
+      <w:r>
+        <w:rPr>
+          <w:rFonts w:ascii="Arial" w:hAnsi="Arial" w:cs="Arial"/>
+          <w:sz w:val="16"/>
+          <w:szCs w:val="16"/>
+        </w:rPr>
+        <w:t>, which is defined under SQL report.</w:t>
+      </w:r>
+    </w:p>
+    <w:p>
+      <w:pPr>
+        <w:pStyle w:val="Heading1"/>
+        <w:rPr>
+          <w:rStyle w:val="Heading2Char"/>
+          <w:rFonts w:ascii="Arial" w:hAnsi="Arial" w:cs="Arial"/>
+          <w:b/>
+          <w:bCs/>
+        </w:rPr>
+      </w:pPr>
+      <w:bookmarkStart w:id="26" w:name="_Toc230985091"/>
+      <w:r>
+        <w:rPr>
+          <w:rStyle w:val="Heading2Char"/>
+          <w:rFonts w:ascii="Arial" w:hAnsi="Arial" w:cs="Arial"/>
+          <w:b/>
+          <w:bCs/>
+        </w:rPr>
+        <w:t>Word Count</w:t>
+      </w:r>
+      <w:bookmarkEnd w:id="26"/>
+    </w:p>
+    <w:p>
+      <w:pPr>
+        <w:pStyle w:val="ListParagraph"/>
+        <w:rPr>
+          <w:rFonts w:ascii="Arial" w:hAnsi="Arial" w:cs="Arial"/>
+          <w:sz w:val="16"/>
+          <w:szCs w:val="16"/>
+        </w:rPr>
+      </w:pPr>
+      <w:r>
+        <w:rPr>
+          <w:rFonts w:ascii="Arial" w:hAnsi="Arial" w:cs="Arial"/>
+          <w:sz w:val="16"/>
+          <w:szCs w:val="16"/>
+        </w:rPr>
+        <w:t xml:space="preserve">Toal word count included in the report 787, It does not include Title page, content, </w:t>
+      </w:r>
+      <w:proofErr w:type="gramStart"/>
+      <w:r>
+        <w:rPr>
+          <w:rFonts w:ascii="Arial" w:hAnsi="Arial" w:cs="Arial"/>
+          <w:sz w:val="16"/>
+          <w:szCs w:val="16"/>
+        </w:rPr>
+        <w:t>references ,</w:t>
+      </w:r>
+      <w:proofErr w:type="gramEnd"/>
+      <w:r>
+        <w:rPr>
+          <w:rFonts w:ascii="Arial" w:hAnsi="Arial" w:cs="Arial"/>
+          <w:sz w:val="16"/>
+          <w:szCs w:val="16"/>
+        </w:rPr>
+        <w:t xml:space="preserve"> word count detail, Use of </w:t>
+      </w:r>
+      <w:proofErr w:type="gramStart"/>
+      <w:r>
+        <w:rPr>
+          <w:rFonts w:ascii="Arial" w:hAnsi="Arial" w:cs="Arial"/>
+          <w:sz w:val="16"/>
+          <w:szCs w:val="16"/>
+        </w:rPr>
+        <w:t>AI ,</w:t>
+      </w:r>
+      <w:proofErr w:type="gramEnd"/>
+      <w:r>
+        <w:rPr>
+          <w:rFonts w:ascii="Arial" w:hAnsi="Arial" w:cs="Arial"/>
+          <w:sz w:val="16"/>
+          <w:szCs w:val="16"/>
+        </w:rPr>
+        <w:t xml:space="preserve"> description of </w:t>
+      </w:r>
+      <w:proofErr w:type="spellStart"/>
+      <w:r>
+        <w:rPr>
+          <w:rFonts w:ascii="Arial" w:hAnsi="Arial" w:cs="Arial"/>
+          <w:sz w:val="16"/>
+          <w:szCs w:val="16"/>
+        </w:rPr>
+        <w:t>Jupytor</w:t>
+      </w:r>
+      <w:proofErr w:type="spellEnd"/>
+      <w:r>
+        <w:rPr>
+          <w:rFonts w:ascii="Arial" w:hAnsi="Arial" w:cs="Arial"/>
+          <w:sz w:val="16"/>
+          <w:szCs w:val="16"/>
+        </w:rPr>
+        <w:t xml:space="preserve"> </w:t>
+      </w:r>
+      <w:proofErr w:type="gramStart"/>
+      <w:r>
+        <w:rPr>
+          <w:rFonts w:ascii="Arial" w:hAnsi="Arial" w:cs="Arial"/>
+          <w:sz w:val="16"/>
+          <w:szCs w:val="16"/>
+        </w:rPr>
+        <w:t>note book</w:t>
+      </w:r>
+      <w:proofErr w:type="gramEnd"/>
+    </w:p>
+    <w:p>
+      <w:pPr>
+        <w:pStyle w:val="ListParagraph"/>
+        <w:rPr>
+          <w:rFonts w:ascii="Arial" w:hAnsi="Arial" w:cs="Arial"/>
+          <w:sz w:val="16"/>
+          <w:szCs w:val="16"/>
+        </w:rPr>
+      </w:pPr>
+    </w:p>
+    <w:p>
+      <w:pPr>
+        <w:pStyle w:val="ListParagraph"/>
+        <w:rPr>
+          <w:rFonts w:ascii="Arial" w:hAnsi="Arial" w:cs="Arial"/>
+          <w:sz w:val="16"/>
+          <w:szCs w:val="16"/>
+        </w:rPr>
+      </w:pPr>
+    </w:p>
+    <w:p>
+      <w:pPr>
+        <w:pStyle w:val="ListParagraph"/>
+        <w:rPr>
+          <w:rFonts w:ascii="Arial" w:hAnsi="Arial" w:cs="Arial"/>
+          <w:sz w:val="16"/>
+          <w:szCs w:val="16"/>
+        </w:rPr>
+      </w:pPr>
+    </w:p>
+    <w:p>
+      <w:pPr>
+        <w:pStyle w:val="ListParagraph"/>
+        <w:rPr>
+          <w:rFonts w:ascii="Arial" w:hAnsi="Arial" w:cs="Arial"/>
+          <w:sz w:val="16"/>
+          <w:szCs w:val="16"/>
+        </w:rPr>
+      </w:pPr>
+    </w:p>
+    <w:p>
+      <w:pPr>
+        <w:pStyle w:val="ListParagraph"/>
+        <w:rPr>
+          <w:rFonts w:ascii="Arial" w:hAnsi="Arial" w:cs="Arial"/>
+          <w:sz w:val="16"/>
+          <w:szCs w:val="16"/>
+        </w:rPr>
+      </w:pPr>
+    </w:p>
+    <w:p>
+      <w:pPr>
+        <w:rPr>
+          <w:rFonts w:ascii="Arial" w:hAnsi="Arial" w:cs="Arial"/>
+          <w:sz w:val="16"/>
+          <w:szCs w:val="16"/>
+        </w:rPr>
+      </w:pPr>
+    </w:p>
+    <w:p>
+      <w:pPr>
+        <w:pStyle w:val="ListParagraph"/>
+        <w:rPr>
+          <w:rFonts w:ascii="Arial" w:hAnsi="Arial" w:cs="Arial"/>
+          <w:sz w:val="16"/>
+          <w:szCs w:val="16"/>
+        </w:rPr>
+      </w:pPr>
+    </w:p>
+    <w:p>
+      <w:pPr>
+        <w:pStyle w:val="ListParagraph"/>
+        <w:rPr>
+          <w:rFonts w:ascii="Arial" w:hAnsi="Arial" w:cs="Arial"/>
+          <w:sz w:val="16"/>
+          <w:szCs w:val="16"/>
+        </w:rPr>
+      </w:pPr>
+    </w:p>
+    <w:p>
+      <w:pPr>
+        <w:pStyle w:val="ListParagraph"/>
+        <w:rPr>
+          <w:rFonts w:ascii="Arial" w:hAnsi="Arial" w:cs="Arial"/>
+          <w:sz w:val="16"/>
+          <w:szCs w:val="16"/>
+        </w:rPr>
+      </w:pPr>
+    </w:p>
+    <w:p>
+      <w:pPr>
+        <w:pStyle w:val="ListParagraph"/>
+        <w:rPr>
+          <w:rFonts w:ascii="Arial" w:hAnsi="Arial" w:cs="Arial"/>
+          <w:sz w:val="16"/>
+          <w:szCs w:val="16"/>
+        </w:rPr>
+      </w:pPr>
+    </w:p>
+    <w:p>
+      <w:pPr>
+        <w:pStyle w:val="ListParagraph"/>
+        <w:rPr>
+          <w:rFonts w:ascii="Arial" w:hAnsi="Arial" w:cs="Arial"/>
+          <w:sz w:val="16"/>
+          <w:szCs w:val="16"/>
+        </w:rPr>
+      </w:pPr>
+    </w:p>
+    <w:p>
+      <w:pPr>
+        <w:pStyle w:val="ListParagraph"/>
+        <w:rPr>
+          <w:rFonts w:ascii="Arial" w:hAnsi="Arial" w:cs="Arial"/>
+          <w:sz w:val="16"/>
+          <w:szCs w:val="16"/>
+        </w:rPr>
+      </w:pPr>
+    </w:p>
+    <w:p>
+      <w:pPr>
+        <w:pStyle w:val="ListParagraph"/>
+        <w:rPr>
+          <w:rFonts w:ascii="Arial" w:hAnsi="Arial" w:cs="Arial"/>
+          <w:sz w:val="16"/>
+          <w:szCs w:val="16"/>
+        </w:rPr>
+      </w:pPr>
+    </w:p>
+    <w:p>
+      <w:pPr>
+        <w:pStyle w:val="ListParagraph"/>
+        <w:rPr>
+          <w:rFonts w:ascii="Arial" w:hAnsi="Arial" w:cs="Arial"/>
+          <w:sz w:val="16"/>
+          <w:szCs w:val="16"/>
+        </w:rPr>
+      </w:pPr>
+    </w:p>
+    <w:p>
+      <w:pPr>
+        <w:pStyle w:val="ListParagraph"/>
+        <w:rPr>
+          <w:rFonts w:ascii="Arial" w:hAnsi="Arial" w:cs="Arial"/>
+          <w:sz w:val="16"/>
+          <w:szCs w:val="16"/>
+        </w:rPr>
+      </w:pPr>
+    </w:p>
+    <w:p>
+      <w:pPr>
+        <w:pStyle w:val="ListParagraph"/>
+        <w:rPr>
+          <w:rFonts w:ascii="Arial" w:hAnsi="Arial" w:cs="Arial"/>
+          <w:sz w:val="16"/>
+          <w:szCs w:val="16"/>
+        </w:rPr>
+      </w:pPr>
+    </w:p>
+    <w:p>
+      <w:pPr>
+        <w:pStyle w:val="ListParagraph"/>
+        <w:rPr>
+          <w:rFonts w:ascii="Arial" w:hAnsi="Arial" w:cs="Arial"/>
+          <w:sz w:val="16"/>
+          <w:szCs w:val="16"/>
+        </w:rPr>
+      </w:pPr>
+    </w:p>
+    <w:p>
+      <w:pPr>
+        <w:pStyle w:val="ListParagraph"/>
+        <w:rPr>
+          <w:rFonts w:ascii="Arial" w:hAnsi="Arial" w:cs="Arial"/>
+          <w:sz w:val="16"/>
+          <w:szCs w:val="16"/>
+        </w:rPr>
+      </w:pPr>
+    </w:p>
+    <w:p>
+      <w:pPr>
+        <w:pStyle w:val="Heading1"/>
+        <w:rPr>
+          <w:rStyle w:val="Heading2Char"/>
+          <w:rFonts w:ascii="Arial" w:hAnsi="Arial" w:cs="Arial"/>
+          <w:b/>
+          <w:bCs/>
+        </w:rPr>
+      </w:pPr>
+      <w:bookmarkStart w:id="27" w:name="_Toc230985092"/>
+      <w:r>
+        <w:rPr>
+          <w:rStyle w:val="Heading2Char"/>
+          <w:rFonts w:ascii="Arial" w:hAnsi="Arial" w:cs="Arial"/>
+          <w:b/>
+          <w:bCs/>
+        </w:rPr>
         <w:lastRenderedPageBreak/>
         <w:t>MapR</w:t>
       </w:r>
@@ -4928,6 +6007,7 @@
         </w:rPr>
         <w:t>duce Using Python</w:t>
       </w:r>
+      <w:bookmarkEnd w:id="27"/>
     </w:p>
     <w:p>
       <w:pPr>
@@ -5443,7 +6523,7 @@
   <w:abstractNum w:abstractNumId="1" w15:restartNumberingAfterBreak="0">
     <w:nsid w:val="12B430E0"/>
     <w:multiLevelType w:val="hybridMultilevel"/>
-    <w:tmpl w:val="588E92AE"/>
+    <w:tmpl w:val="E1201BEC"/>
     <w:lvl w:ilvl="0" w:tplc="18090001">
       <w:start w:val="1"/>
       <w:numFmt w:val="bullet"/>
@@ -6874,7 +7954,7 @@
   <w:style w:type="paragraph" w:default="1" w:styleId="Normal">
     <w:name w:val="Normal"/>
     <w:qFormat/>
-    <w:rsid w:val="0013203D"/>
+    <w:rsid w:val="00A92F12"/>
   </w:style>
   <w:style w:type="paragraph" w:styleId="Heading1">
     <w:name w:val="heading 1"/>

</xml_diff>